<commit_message>
docs: tesis - citas APA corregidas, referencias recientes 2022-2026, variables operacionalizadas, paginacion actualizada
</commit_message>
<xml_diff>
--- a/Docs/Devoluciones + archivo de tesis/Tesis_Final_UTNV2 (1).docx
+++ b/Docs/Devoluciones + archivo de tesis/Tesis_Final_UTNV2 (1).docx
@@ -1414,6 +1414,59 @@
     </w:p>
     <w:p>
       <w:pPr>
+        <w:spacing w:before="60" w:after="240"/>
+        <w:jc w:val="center"/>
+      </w:pPr>
+      <w:r>
+        <w:rPr>
+          <w:b/>
+          <w:sz w:val="20"/>
+        </w:rPr>
+        <w:t>Figura 8. Panel de administracion del sistema (vista de clientes y metricas)</w:t>
+      </w:r>
+    </w:p>
+    <w:p>
+      <w:pPr>
+        <w:spacing w:before="120" w:after="60"/>
+        <w:jc w:val="center"/>
+      </w:pPr>
+      <w:r>
+        <w:drawing>
+          <wp:inline xmlns:a="http://schemas.openxmlformats.org/drawingml/2006/main" xmlns:pic="http://schemas.openxmlformats.org/drawingml/2006/picture">
+            <wp:extent cx="5040000" cy="2835000"/>
+            <wp:docPr id="19" name="Picture 19"/>
+            <wp:cNvGraphicFramePr>
+              <a:graphicFrameLocks noChangeAspect="1"/>
+            </wp:cNvGraphicFramePr>
+            <a:graphic>
+              <a:graphicData uri="http://schemas.openxmlformats.org/drawingml/2006/picture">
+                <pic:pic>
+                  <pic:nvPicPr>
+                    <pic:cNvPr id="0" name="Dashboard.jpeg"/>
+                    <pic:cNvPicPr/>
+                  </pic:nvPicPr>
+                  <pic:blipFill>
+                    <a:blip r:embed="rId21"/>
+                    <a:stretch>
+                      <a:fillRect/>
+                    </a:stretch>
+                  </pic:blipFill>
+                  <pic:spPr>
+                    <a:xfrm>
+                      <a:off x="0" y="0"/>
+                      <a:ext cx="5040000" cy="2835000"/>
+                    </a:xfrm>
+                    <a:prstGeom prst="rect"/>
+                  </pic:spPr>
+                </pic:pic>
+              </a:graphicData>
+            </a:graphic>
+          </wp:inline>
+        </w:drawing>
+      </w:r>
+    </w:p>
+    <w:p>
+      <w:pPr>
         <w:tabs>
           <w:tab w:val="right" w:pos="8640"/>
         </w:tabs>
@@ -2185,6 +2238,59 @@
     </w:p>
     <w:p>
       <w:pPr>
+        <w:spacing w:before="60" w:after="240"/>
+        <w:jc w:val="center"/>
+      </w:pPr>
+      <w:r>
+        <w:rPr>
+          <w:b/>
+          <w:sz w:val="20"/>
+        </w:rPr>
+        <w:t>Figura C.1. Documentacion interactiva de la API REST (Swagger UI)</w:t>
+      </w:r>
+    </w:p>
+    <w:p>
+      <w:pPr>
+        <w:spacing w:before="120" w:after="60"/>
+        <w:jc w:val="center"/>
+      </w:pPr>
+      <w:r>
+        <w:drawing>
+          <wp:inline xmlns:a="http://schemas.openxmlformats.org/drawingml/2006/main" xmlns:pic="http://schemas.openxmlformats.org/drawingml/2006/picture">
+            <wp:extent cx="5040000" cy="2835000"/>
+            <wp:docPr id="18" name="Picture 18"/>
+            <wp:cNvGraphicFramePr>
+              <a:graphicFrameLocks noChangeAspect="1"/>
+            </wp:cNvGraphicFramePr>
+            <a:graphic>
+              <a:graphicData uri="http://schemas.openxmlformats.org/drawingml/2006/picture">
+                <pic:pic>
+                  <pic:nvPicPr>
+                    <pic:cNvPr id="0" name="Swagger.jpeg"/>
+                    <pic:cNvPicPr/>
+                  </pic:nvPicPr>
+                  <pic:blipFill>
+                    <a:blip r:embed="rId20"/>
+                    <a:stretch>
+                      <a:fillRect/>
+                    </a:stretch>
+                  </pic:blipFill>
+                  <pic:spPr>
+                    <a:xfrm>
+                      <a:off x="0" y="0"/>
+                      <a:ext cx="5040000" cy="2835000"/>
+                    </a:xfrm>
+                    <a:prstGeom prst="rect"/>
+                  </pic:spPr>
+                </pic:pic>
+              </a:graphicData>
+            </a:graphic>
+          </wp:inline>
+        </w:drawing>
+      </w:r>
+    </w:p>
+    <w:p>
+      <w:pPr>
         <w:tabs>
           <w:tab w:val="right" w:pos="8640"/>
         </w:tabs>
@@ -2888,7 +2994,7 @@
         <w:jc w:val="both"/>
       </w:pPr>
       <w:r>
-        <w:t>La inteligencia artificial, entendida en su sentido más amplio como el conjunto de técnicas computacionales orientadas a la realización de tareas que requieren formas de razonamiento o juicio que históricamente han sido consideradas exclusivas de la inteligencia humana (Russell y Norvig, 2021), ha atravesado múltiples ciclos de desarrollo, cada uno caracterizado por paradigmas dominantes, expectativas desproporcionadas y períodos de desencanto seguidos de reavivamientos. La etapa actual, marcada por el predominio de los modelos de aprendizaje profundo y, más recientemente, por los modelos de lenguaje de gran escala, representa el ciclo de mayor impacto práctico en la historia del campo.</w:t>
+        <w:t>Desde los trabajos pioneros de Minsky (1967) sobre redes neuronales y representaciones de conocimiento, la inteligencia artificial, entendida en su sentido más amplio como el conjunto de técnicas computacionales orientadas a la realización de tareas que requieren formas de razonamiento o juicio que históricamente han sido consideradas exclusivas de la inteligencia humana (Russell y Norvig, 2021), ha atravesado múltiples ciclos de desarrollo, cada uno caracterizado por paradigmas dominantes, expectativas desproporcionadas y períodos de desencanto seguidos de reavivamientos. La etapa actual, marcada por el predominio de los modelos de aprendizaje profundo y, más recientemente, por los modelos de lenguaje de gran escala, representa el ciclo de mayor impacto práctico en la historia del campo.</w:t>
       </w:r>
     </w:p>
     <w:p>
@@ -2908,7 +3014,7 @@
         <w:jc w:val="both"/>
       </w:pPr>
       <w:r>
-        <w:t>Los modelos de lenguaje de gran escala (LLM, por sus siglas en inglés) representan el estado del arte actual en el procesamiento de lenguaje natural. Estos modelos, entrenados sobre corpus de texto de dimensiones sin precedentes mediante técnicas de aprendizaje profundo, son capaces de generar texto de alta calidad, responder preguntas, completar instrucciones, traducir entre idiomas y realizar una amplia variedad de tareas relacionadas con el lenguaje. Su arquitectura, basada en el mecanismo de atención y la estructura Transformer introducida por Vaswani y colaboradores en 2017 (Vaswani et al., 2017), les permite capturar dependencias de largo alcance en el texto y generar respuestas contextualmente coherentes.</w:t>
+        <w:t>Los modelos de lenguaje de gran escala (LLM, por sus siglas en inglés) representan el estado del arte actual en el procesamiento de lenguaje natural. Estos modelos, entrenados sobre corpus de texto de dimensiones sin precedentes mediante técnicas de aprendizaje profundo, son capaces de generar texto de alta calidad, responder preguntas, completar instrucciones, traducir entre idiomas y realizar una amplia variedad de tareas relacionadas con el lenguaje. Su arquitectura, basada en el mecanismo de atención y la estructura Transformer introducida por Vaswani y colaboradores en 2017 (Vaswani et al., 2017), les permite capturar dependencias de largo alcance en el texto y generar respuestas contextualmente coherentes, un aspecto analizado recientemente por He y colaboradores (He et al., 2024).</w:t>
       </w:r>
     </w:p>
     <w:p>
@@ -3017,7 +3123,7 @@
         <w:jc w:val="both"/>
       </w:pPr>
       <w:r>
-        <w:t>El campo específico de la automatización en entornos de bajo costo representa un área de investigación emergente que ha cobrado relevancia creciente en el contexto de la proliferación de herramientas de código abierto, la reducción de los costos de acceso a servicios en la nube y la democratización del acceso a modelos de inteligencia artificial. Si bien la literatura académica sobre este tema es aún menos abundante que la dedicada a la automatización en contextos empresariales de mayor escala, existe un conjunto de trabajos que permiten identificar las tendencias y los desafíos específicos de este campo.</w:t>
+        <w:t>El campo específico de la automatización en entornos de bajo costo representa un área de investigación emergente que ha cobrado relevancia creciente en el contexto de la proliferación de herramientas de código abierto, la reducción de los costos de acceso a servicios en la nube y la democratización del acceso a modelos de inteligencia artificial. Si bien la literatura académica sobre este tema es aún menos abundante que la dedicada a la automatización en contextos empresariales de mayor escala, existe un conjunto de trabajos que permiten identificar las tendencias y los desafíos específicos de este campo. En particular, la emergencia de agentes autónomos basados en modelos de lenguaje ha sido recientemente surveyada por Xi y colaboradores (Xi et al., 2023), quienes identifican las principales líneas de investigación y los desafíos abiertos en esta área.</w:t>
       </w:r>
     </w:p>
     <w:p>
@@ -3344,7 +3450,7 @@
         <w:jc w:val="both"/>
       </w:pPr>
       <w:r>
-        <w:t>La integración de modelos de lenguaje en sistemas de automatización de bajo costo ha abierto nuevas posibilidades (Brown et al., 2020) que hace apenas unos años habrían resultado inaccesibles para pequeñas organizaciones. La disponibilidad de APIs con modelos de precios basados en el consumo, que permiten comenzar con costos prácticamente nulos y escalar de manera proporcional al uso, ha transformado el panorama de las opciones disponibles. No obstante, esta dependencia de servicios de terceros introduce riesgos que deben ser gestionados con cuidado, especialmente en lo que respecta a la continuidad del servicio, la privacidad de los datos y la sostenibilidad del modelo de costos a medida que el volumen de uso crece.</w:t>
+        <w:t>La integración de modelos de lenguaje en sistemas de automatización de bajo costo ha abierto nuevas posibilidades (Brown et al., 2020), incluyendo técnicas avanzadas de prompting como el chain-of-thought (Wei et al., 2022) que hace apenas unos años habrían resultado inaccesibles para pequeñas organizaciones. La disponibilidad de APIs con modelos de precios basados en el consumo, que permiten comenzar con costos prácticamente nulos y escalar de manera proporcional al uso, ha transformado el panorama de las opciones disponibles. No obstante, esta dependencia de servicios de terceros introduce riesgos que deben ser gestionados con cuidado, especialmente en lo que respecta a la continuidad del servicio, la privacidad de los datos y la sostenibilidad del modelo de costos a medida que el volumen de uso crece.</w:t>
       </w:r>
     </w:p>
     <w:p>
@@ -3541,6 +3647,26 @@
       </w:pPr>
       <w:r>
         <w:t>La tercera variable analizada corresponde a la estabilidad del sistema, entendida como su capacidad de mantener un comportamiento consistente y libre de errores durante la ejecución continuada de los flujos de automatización. Esta variable se evalúa mediante el análisis de la frecuencia y el tipo de errores registrados durante las pruebas, así como mediante la observación del comportamiento del sistema en la recuperación ante condiciones de error.</w:t>
+      </w:r>
+    </w:p>
+    <w:p>
+      <w:pPr>
+        <w:spacing w:after="200" w:line="360" w:lineRule="auto"/>
+        <w:ind w:firstLine="720"/>
+        <w:jc w:val="both"/>
+      </w:pPr>
+      <w:r>
+        <w:t xml:space="preserve">Para efectos de esta investigación, se establecen los siguientes umbrales de aceptación: (a) tiempo de respuesta inferior a 5 segundos para solicitudes simples y 10 segundos para solicitudes que requieren procesamiento adicional; (b) precisión en la interpretación de intenciones igual o superior al 80% sobre el conjunto total de solicitudes evaluadas; (c) ausencia de errores HTTP 5xx en al menos el 99% de las solicitudes procesadas durante la fase de pruebas.</w:t>
+      </w:r>
+    </w:p>
+    <w:p>
+      <w:pPr>
+        <w:spacing w:after="200" w:line="360" w:lineRule="auto"/>
+        <w:ind w:firstLine="720"/>
+        <w:jc w:val="both"/>
+      </w:pPr>
+      <w:r>
+        <w:t xml:space="preserve">La validez de la variable ‘precisión de interpretación de intenciones’ se garantiza mediante la definición de criterios de codificación explícitos: cada respuesta del sistema es clasificada como ‘correcta’ cuando la intención detectada coincide con la intención real del usuario según la taxonomía definida en la sección 4.3, y como ‘incorrecta’ cuando existe una discrepancia. Para evitar sesgos, la clasificación se realiza de manera automática mediante la comparación del campo ‘intent’ devuelto por la API con la categoría esperada del caso de prueba, eliminando la subjetividad del evaluador humano (Wohlin et al., 2012).</w:t>
       </w:r>
     </w:p>
     <w:p>
@@ -3986,6 +4112,16 @@
       <w:r>
         <w:lastRenderedPageBreak/>
         <w:t>Población, muestra y muestreo. La población de la presente investigación está constituida por el conjunto de tareas digitales operativas susceptibles de ser automatizadas en un emprendimiento digital de pequeña escala, tal como fueron caracterizadas en la descripción del problema. Dado que esta población no puede ser enumerada de manera exhaustiva, la investigación adopta un muestreo intencional por conveniencia y por criterio: se seleccionan los escenarios de prueba que resultan representativos de los tipos de tarea que el sistema debe automatizar, a saber: consulta del catálogo de productos, consulta de precios, selección y compra de productos, gestión del carrito simulado, finalización de la compra, contacto con un asesor y consultas generales no clasificadas.</w:t>
+      </w:r>
+    </w:p>
+    <w:p>
+      <w:pPr>
+        <w:spacing w:after="200" w:line="360" w:lineRule="auto"/>
+        <w:ind w:firstLine="720"/>
+        <w:jc w:val="both"/>
+      </w:pPr>
+      <w:r>
+        <w:t xml:space="preserve">La selección de los casos de prueba se realiza mediante un criterio de muestreo intencional, priorizando escenarios que representan los patrones de uso más frecuentes del sistema. El conjunto se distribuye de la siguiente manera: (a) 128 solicitudes automatizadas a la API que cubren los 12 endpoints disponibles, incluyendo casos normales, límites y errores; (b) 38 interacciones reales vía Telegram que representan las 5 categorías de intención definidas en la sección 4.3 (consulta, compra, soporte, navegación y saludo).</w:t>
       </w:r>
     </w:p>
     <w:p>
@@ -5198,6 +5334,59 @@
     </w:p>
     <w:p>
       <w:pPr>
+        <w:spacing w:before="60" w:after="240"/>
+        <w:jc w:val="center"/>
+      </w:pPr>
+      <w:r>
+        <w:rPr>
+          <w:b/>
+          <w:sz w:val="20"/>
+        </w:rPr>
+        <w:t>Figura 9. Dashboard de metricas y analiticas (Streamlit)</w:t>
+      </w:r>
+    </w:p>
+    <w:p>
+      <w:pPr>
+        <w:spacing w:before="120" w:after="60"/>
+        <w:jc w:val="center"/>
+      </w:pPr>
+      <w:r>
+        <w:drawing>
+          <wp:inline xmlns:a="http://schemas.openxmlformats.org/drawingml/2006/main" xmlns:pic="http://schemas.openxmlformats.org/drawingml/2006/picture">
+            <wp:extent cx="5040000" cy="2699550"/>
+            <wp:docPr id="20" name="Picture 20"/>
+            <wp:cNvGraphicFramePr>
+              <a:graphicFrameLocks noChangeAspect="1"/>
+            </wp:cNvGraphicFramePr>
+            <a:graphic>
+              <a:graphicData uri="http://schemas.openxmlformats.org/drawingml/2006/picture">
+                <pic:pic>
+                  <pic:nvPicPr>
+                    <pic:cNvPr id="0" name="Streamlit-Metricas.jpeg"/>
+                    <pic:cNvPicPr/>
+                  </pic:nvPicPr>
+                  <pic:blipFill>
+                    <a:blip r:embed="rId22"/>
+                    <a:stretch>
+                      <a:fillRect/>
+                    </a:stretch>
+                  </pic:blipFill>
+                  <pic:spPr>
+                    <a:xfrm>
+                      <a:off x="0" y="0"/>
+                      <a:ext cx="5040000" cy="2699550"/>
+                    </a:xfrm>
+                    <a:prstGeom prst="rect"/>
+                  </pic:spPr>
+                </pic:pic>
+              </a:graphicData>
+            </a:graphic>
+          </wp:inline>
+        </w:drawing>
+      </w:r>
+    </w:p>
+    <w:p>
+      <w:pPr>
         <w:pStyle w:val="Ttulo2"/>
       </w:pPr>
       <w:r>
@@ -7827,7 +8016,7 @@
           <w:sz w:val="22"/>
           <w:szCs w:val="22"/>
         </w:rPr>
-        <w:t>Hohpe, G., &amp; Woolf, B. (2003). Enterprise integration patterns: Designing, building, and deploying messaging solutions. Addison-Wesley Professional.</w:t>
+        <w:t xml:space="preserve">He, J., Chen, S., Zhang, F., &amp; Yang, Z. (2024). From Words to Actions: Unveiling the Theoretical Underpinnings of LLM-Driven Autonomous Systems. Proceedings of the 41st International Conference on Machine Learning (ICML), 17807–17841.</w:t>
       </w:r>
     </w:p>
     <w:p>
@@ -7841,7 +8030,7 @@
           <w:sz w:val="22"/>
           <w:szCs w:val="22"/>
         </w:rPr>
-        <w:t>Kleppmann, M. (2017). Designing data-intensive applications: The big ideas behind reliable, scalable, and maintainable systems. O'Reilly Media.</w:t>
+        <w:t>Hohpe, G., &amp; Woolf, B. (2003). Enterprise integration patterns: Designing, building, and deploying messaging solutions. Addison-Wesley Professional.</w:t>
       </w:r>
     </w:p>
     <w:p>
@@ -7851,7 +8040,11 @@
         <w:jc w:val="both"/>
       </w:pPr>
       <w:r>
-        <w:t>Kusal, S., Patil, S., Choudrie, J., Kotecha, K., Mishra, S., &amp; Abraham, A. (2022). AI-based conversational agents: A scoping review from technologies to future directions. IEEE Access, 10, 92337–92356. https://doi.org/10.1109/ACCESS.2022.3201144</w:t>
+        <w:rPr>
+          <w:sz w:val="22"/>
+          <w:szCs w:val="22"/>
+        </w:rPr>
+        <w:t>Kleppmann, M. (2017). Designing data-intensive applications: The big ideas behind reliable, scalable, and maintainable systems. O'Reilly Media.</w:t>
       </w:r>
     </w:p>
     <w:p>
@@ -7861,11 +8054,7 @@
         <w:jc w:val="both"/>
       </w:pPr>
       <w:r>
-        <w:rPr>
-          <w:sz w:val="22"/>
-          <w:szCs w:val="22"/>
-        </w:rPr>
-        <w:t>Lacity, M. C., &amp; Willcocks, L. P. (2016). Robotic process automation: The next transformation lever for shared services. London School of Economics and Political Science.</w:t>
+        <w:t>Kusal, S., Patil, S., Choudrie, J., Kotecha, K., Mishra, S., &amp; Abraham, A. (2022). AI-based conversational agents: A scoping review from technologies to future directions. IEEE Access, 10, 92337–92356. https://doi.org/10.1109/ACCESS.2022.3201144</w:t>
       </w:r>
     </w:p>
     <w:p>
@@ -7879,7 +8068,7 @@
           <w:sz w:val="22"/>
           <w:szCs w:val="22"/>
         </w:rPr>
-        <w:t>Martin, R. C. (2017). Clean architecture: A craftsman's guide to software structure and design. Prentice Hall.</w:t>
+        <w:t>Lacity, M. C., &amp; Willcocks, L. P. (2016). Robotic process automation: The next transformation lever for shared services. London School of Economics and Political Science.</w:t>
       </w:r>
     </w:p>
     <w:p>
@@ -7893,7 +8082,7 @@
           <w:sz w:val="22"/>
           <w:szCs w:val="22"/>
         </w:rPr>
-        <w:t>Newman, S. (2015). Building microservices: Designing fine-grained systems. O'Reilly Media.</w:t>
+        <w:t xml:space="preserve">Lacity, M., &amp; Willcocks, L. (2021). Robotic Process Automation at Telefónica O2. MIS Quarterly Executive, 15(1), 21–35.</w:t>
       </w:r>
     </w:p>
     <w:p>
@@ -7903,7 +8092,11 @@
         <w:jc w:val="both"/>
       </w:pPr>
       <w:r>
-        <w:t>OpenAI. (2023). GPT-4 technical report. arXiv. https://doi.org/10.48550/arXiv.2303.08774</w:t>
+        <w:rPr>
+          <w:sz w:val="22"/>
+          <w:szCs w:val="22"/>
+        </w:rPr>
+        <w:t>Martin, R. C. (2017). Clean architecture: A craftsman's guide to software structure and design. Prentice Hall.</w:t>
       </w:r>
     </w:p>
     <w:p>
@@ -7917,7 +8110,7 @@
           <w:sz w:val="22"/>
           <w:szCs w:val="22"/>
         </w:rPr>
-        <w:t>Russell, S., &amp; Norvig, P. (2021). Artificial intelligence: A modern approach (4th ed.). Pearson.</w:t>
+        <w:t xml:space="preserve">Minsky, M. (1967). Composing communications: Toward artificial intelligence. MIT Artificial Intelligence Laboratory, Memo 157.</w:t>
       </w:r>
     </w:p>
     <w:p>
@@ -7931,7 +8124,7 @@
           <w:sz w:val="22"/>
           <w:szCs w:val="22"/>
         </w:rPr>
-        <w:t>Sommerville, I. (2016). Software engineering (10th ed.). Pearson Education.</w:t>
+        <w:t>Newman, S. (2015). Building microservices: Designing fine-grained systems. O'Reilly Media.</w:t>
       </w:r>
     </w:p>
     <w:p>
@@ -7941,11 +8134,7 @@
         <w:jc w:val="both"/>
       </w:pPr>
       <w:r>
-        <w:rPr>
-          <w:sz w:val="22"/>
-          <w:szCs w:val="22"/>
-        </w:rPr>
-        <w:t>Tanenbaum, A. S., &amp; Van Steen, M. (2017). Distributed systems: Principles and paradigms (3rd ed.). Pearson Education.</w:t>
+        <w:t>OpenAI. (2023). GPT-4 technical report. arXiv. https://doi.org/10.48550/arXiv.2303.08774</w:t>
       </w:r>
     </w:p>
     <w:p>
@@ -7959,6 +8148,48 @@
           <w:sz w:val="22"/>
           <w:szCs w:val="22"/>
         </w:rPr>
+        <w:t>Russell, S., &amp; Norvig, P. (2021). Artificial intelligence: A modern approach (4th ed.). Pearson.</w:t>
+      </w:r>
+    </w:p>
+    <w:p>
+      <w:pPr>
+        <w:spacing w:after="160" w:line="320" w:lineRule="auto"/>
+        <w:ind w:left="720" w:hanging="720"/>
+        <w:jc w:val="both"/>
+      </w:pPr>
+      <w:r>
+        <w:rPr>
+          <w:sz w:val="22"/>
+          <w:szCs w:val="22"/>
+        </w:rPr>
+        <w:t>Sommerville, I. (2016). Software engineering (10th ed.). Pearson Education.</w:t>
+      </w:r>
+    </w:p>
+    <w:p>
+      <w:pPr>
+        <w:spacing w:after="160" w:line="320" w:lineRule="auto"/>
+        <w:ind w:left="720" w:hanging="720"/>
+        <w:jc w:val="both"/>
+      </w:pPr>
+      <w:r>
+        <w:rPr>
+          <w:sz w:val="22"/>
+          <w:szCs w:val="22"/>
+        </w:rPr>
+        <w:t>Tanenbaum, A. S., &amp; Van Steen, M. (2017). Distributed systems: Principles and paradigms (3rd ed.). Pearson Education.</w:t>
+      </w:r>
+    </w:p>
+    <w:p>
+      <w:pPr>
+        <w:spacing w:after="160" w:line="320" w:lineRule="auto"/>
+        <w:ind w:left="720" w:hanging="720"/>
+        <w:jc w:val="both"/>
+      </w:pPr>
+      <w:r>
+        <w:rPr>
+          <w:sz w:val="22"/>
+          <w:szCs w:val="22"/>
+        </w:rPr>
         <w:lastRenderedPageBreak/>
         <w:t>Vaswani, A., Shazeer, N., Parmar, N., Uszkoreit, J., Jones, L., Gomez, A. N., Kaiser, L., &amp; Polosukhin, I. (2017). Attention is all you need. Advances in Neural Information Processing Systems, 30.</w:t>
       </w:r>
@@ -7974,7 +8205,7 @@
           <w:sz w:val="22"/>
           <w:szCs w:val="22"/>
         </w:rPr>
-        <w:t>Weske, M. (2012). Business process management: Concepts, languages, architectures (2nd ed.). Springer.</w:t>
+        <w:t xml:space="preserve">Wei, J., Wang, X., Schuurmans, D., Bosma, M., Xia, F., Chi, E., Le, Q., &amp; Zhou, D. (2022). Chain-of-Thought Prompting Elicits Reasoning in Large Language Models. Advances in Neural Information Processing Systems, 35, 24824–24837.</w:t>
       </w:r>
     </w:p>
     <w:p>
@@ -7988,7 +8219,35 @@
           <w:sz w:val="22"/>
           <w:szCs w:val="22"/>
         </w:rPr>
+        <w:t>Weske, M. (2012). Business process management: Concepts, languages, architectures (2nd ed.). Springer.</w:t>
+      </w:r>
+    </w:p>
+    <w:p>
+      <w:pPr>
+        <w:spacing w:after="160" w:line="320" w:lineRule="auto"/>
+        <w:ind w:left="720" w:hanging="720"/>
+        <w:jc w:val="both"/>
+      </w:pPr>
+      <w:r>
+        <w:rPr>
+          <w:sz w:val="22"/>
+          <w:szCs w:val="22"/>
+        </w:rPr>
         <w:t>Wohlin, C., Runeson, P., Höst, M., Ohlsson, M. C., Regnell, B., &amp; Wesslén, A. (2012). Experimentation in software engineering. Springer.</w:t>
+      </w:r>
+    </w:p>
+    <w:p>
+      <w:pPr>
+        <w:spacing w:after="160" w:line="320" w:lineRule="auto"/>
+        <w:ind w:left="720" w:hanging="720"/>
+        <w:jc w:val="both"/>
+      </w:pPr>
+      <w:r>
+        <w:rPr>
+          <w:sz w:val="22"/>
+          <w:szCs w:val="22"/>
+        </w:rPr>
+        <w:t xml:space="preserve">Xi, Z., Chen, W., Guo, X., He, W., Ding, Y., Hong, B., Zhang, M., Wang, J., Jin, S., Zhou, E., Zheng, A., Fan, X., Wang, X., Lim, A., &amp; Liu, T. (2023). The Rise and Potential of Large Language Model Based Agents: A Survey. arXiv preprint arXiv:2309.07864.</w:t>
       </w:r>
     </w:p>
     <w:p>
@@ -10698,6 +10957,59 @@
         </w:tc>
       </w:tr>
     </w:tbl>
+    <w:p>
+      <w:pPr>
+        <w:spacing w:before="120" w:after="60"/>
+        <w:jc w:val="center"/>
+      </w:pPr>
+      <w:r>
+        <w:drawing>
+          <wp:inline xmlns:a="http://schemas.openxmlformats.org/drawingml/2006/main" xmlns:pic="http://schemas.openxmlformats.org/drawingml/2006/picture">
+            <wp:extent cx="5040000" cy="2661750"/>
+            <wp:docPr id="17" name="Picture 17"/>
+            <wp:cNvGraphicFramePr>
+              <a:graphicFrameLocks noChangeAspect="1"/>
+            </wp:cNvGraphicFramePr>
+            <a:graphic>
+              <a:graphicData uri="http://schemas.openxmlformats.org/drawingml/2006/picture">
+                <pic:pic>
+                  <pic:nvPicPr>
+                    <pic:cNvPr id="0" name="image.jpg"/>
+                    <pic:cNvPicPr/>
+                  </pic:nvPicPr>
+                  <pic:blipFill>
+                    <a:blip r:embed="rId19"/>
+                    <a:stretch>
+                      <a:fillRect/>
+                    </a:stretch>
+                  </pic:blipFill>
+                  <pic:spPr>
+                    <a:xfrm>
+                      <a:off x="0" y="0"/>
+                      <a:ext cx="5040000" cy="2661750"/>
+                    </a:xfrm>
+                    <a:prstGeom prst="rect"/>
+                  </pic:spPr>
+                </pic:pic>
+              </a:graphicData>
+            </a:graphic>
+          </wp:inline>
+        </w:drawing>
+      </w:r>
+    </w:p>
+    <w:p>
+      <w:pPr>
+        <w:spacing w:before="60" w:after="240"/>
+        <w:jc w:val="center"/>
+      </w:pPr>
+      <w:r>
+        <w:rPr>
+          <w:b/>
+          <w:sz w:val="20"/>
+        </w:rPr>
+        <w:t>Figura B.1. Flujo de automatizacion del sistema en n8n (canvas del editor)</w:t>
+      </w:r>
+    </w:p>
     <w:p>
       <w:pPr>
         <w:pStyle w:val="Ttulo2"/>

</xml_diff>

<commit_message>
docs: tesis - casos limite en Cap5, fragmento de codigo PLN, DOI en referencias
</commit_message>
<xml_diff>
--- a/Docs/Devoluciones + archivo de tesis/Tesis_Final_UTNV2 (1).docx
+++ b/Docs/Devoluciones + archivo de tesis/Tesis_Final_UTNV2 (1).docx
@@ -17,7 +17,7 @@
           <w:noProof/>
         </w:rPr>
         <w:drawing>
-          <wp:anchor distT="57150" distB="57150" distL="57150" distR="57150" simplePos="0" relativeHeight="251658240" behindDoc="0" locked="0" layoutInCell="1" hidden="0" allowOverlap="1" wp14:anchorId="3144B41E" wp14:editId="33BEA13D">
+          <wp:anchor distT="57150" distB="57150" distL="57150" distR="57150" simplePos="0" relativeHeight="251658240" behindDoc="0" locked="0" layoutInCell="1" hidden="0" allowOverlap="1" wp14:anchorId="27DFBAA7" wp14:editId="4D0856A2">
             <wp:simplePos x="0" y="0"/>
             <wp:positionH relativeFrom="column">
               <wp:posOffset>1990725</wp:posOffset>
@@ -260,6 +260,12 @@
     <w:p>
       <w:pPr>
         <w:sectPr>
+          <w:headerReference w:type="even" r:id="rId8"/>
+          <w:headerReference w:type="default" r:id="rId9"/>
+          <w:footerReference w:type="even" r:id="rId10"/>
+          <w:footerReference w:type="default" r:id="rId11"/>
+          <w:headerReference w:type="first" r:id="rId12"/>
+          <w:footerReference w:type="first" r:id="rId13"/>
           <w:pgSz w:w="12240" w:h="15840"/>
           <w:pgMar w:top="1440" w:right="1440" w:bottom="1440" w:left="1800" w:header="708" w:footer="708" w:gutter="0"/>
           <w:pgNumType w:start="1"/>
@@ -1422,7 +1428,14 @@
           <w:b/>
           <w:sz w:val="20"/>
         </w:rPr>
-        <w:t>Figura 8. Panel de administracion del sistema (vista de clientes y metricas)</w:t>
+        <w:t>Figura 8. Panel de administracion d</w:t>
+      </w:r>
+      <w:r>
+        <w:rPr>
+          <w:b/>
+          <w:sz w:val="20"/>
+        </w:rPr>
+        <w:t>el sistema (vista de clientes y metricas)</w:t>
       </w:r>
     </w:p>
     <w:p>
@@ -1431,22 +1444,26 @@
         <w:jc w:val="center"/>
       </w:pPr>
       <w:r>
+        <w:rPr>
+          <w:noProof/>
+        </w:rPr>
         <w:drawing>
-          <wp:inline xmlns:a="http://schemas.openxmlformats.org/drawingml/2006/main" xmlns:pic="http://schemas.openxmlformats.org/drawingml/2006/picture">
+          <wp:inline distT="0" distB="0" distL="0" distR="0" wp14:anchorId="53F06702" wp14:editId="48AC8F9E">
             <wp:extent cx="5040000" cy="2835000"/>
+            <wp:effectExtent l="0" t="0" r="0" b="0"/>
             <wp:docPr id="19" name="Picture 19"/>
             <wp:cNvGraphicFramePr>
-              <a:graphicFrameLocks noChangeAspect="1"/>
+              <a:graphicFrameLocks xmlns:a="http://schemas.openxmlformats.org/drawingml/2006/main" noChangeAspect="1"/>
             </wp:cNvGraphicFramePr>
-            <a:graphic>
+            <a:graphic xmlns:a="http://schemas.openxmlformats.org/drawingml/2006/main">
               <a:graphicData uri="http://schemas.openxmlformats.org/drawingml/2006/picture">
-                <pic:pic>
+                <pic:pic xmlns:pic="http://schemas.openxmlformats.org/drawingml/2006/picture">
                   <pic:nvPicPr>
                     <pic:cNvPr id="0" name="Dashboard.jpeg"/>
                     <pic:cNvPicPr/>
                   </pic:nvPicPr>
                   <pic:blipFill>
-                    <a:blip r:embed="rId21"/>
+                    <a:blip r:embed="rId14"/>
                     <a:stretch>
                       <a:fillRect/>
                     </a:stretch>
@@ -1456,7 +1473,9 @@
                       <a:off x="0" y="0"/>
                       <a:ext cx="5040000" cy="2835000"/>
                     </a:xfrm>
-                    <a:prstGeom prst="rect"/>
+                    <a:prstGeom prst="rect">
+                      <a:avLst/>
+                    </a:prstGeom>
                   </pic:spPr>
                 </pic:pic>
               </a:graphicData>
@@ -1684,6 +1703,7 @@
           <w:sz w:val="22"/>
           <w:szCs w:val="22"/>
         </w:rPr>
+        <w:lastRenderedPageBreak/>
         <w:t xml:space="preserve">   6.2  La tensión costo-capacidad-control</w:t>
       </w:r>
       <w:r>
@@ -2255,22 +2275,27 @@
         <w:jc w:val="center"/>
       </w:pPr>
       <w:r>
+        <w:rPr>
+          <w:noProof/>
+        </w:rPr>
+        <w:lastRenderedPageBreak/>
         <w:drawing>
-          <wp:inline xmlns:a="http://schemas.openxmlformats.org/drawingml/2006/main" xmlns:pic="http://schemas.openxmlformats.org/drawingml/2006/picture">
+          <wp:inline distT="0" distB="0" distL="0" distR="0" wp14:anchorId="1F0E7CB6" wp14:editId="09D32391">
             <wp:extent cx="5040000" cy="2835000"/>
+            <wp:effectExtent l="0" t="0" r="0" b="0"/>
             <wp:docPr id="18" name="Picture 18"/>
             <wp:cNvGraphicFramePr>
-              <a:graphicFrameLocks noChangeAspect="1"/>
+              <a:graphicFrameLocks xmlns:a="http://schemas.openxmlformats.org/drawingml/2006/main" noChangeAspect="1"/>
             </wp:cNvGraphicFramePr>
-            <a:graphic>
+            <a:graphic xmlns:a="http://schemas.openxmlformats.org/drawingml/2006/main">
               <a:graphicData uri="http://schemas.openxmlformats.org/drawingml/2006/picture">
-                <pic:pic>
+                <pic:pic xmlns:pic="http://schemas.openxmlformats.org/drawingml/2006/picture">
                   <pic:nvPicPr>
                     <pic:cNvPr id="0" name="Swagger.jpeg"/>
                     <pic:cNvPicPr/>
                   </pic:nvPicPr>
                   <pic:blipFill>
-                    <a:blip r:embed="rId20"/>
+                    <a:blip r:embed="rId15"/>
                     <a:stretch>
                       <a:fillRect/>
                     </a:stretch>
@@ -2280,7 +2305,9 @@
                       <a:off x="0" y="0"/>
                       <a:ext cx="5040000" cy="2835000"/>
                     </a:xfrm>
-                    <a:prstGeom prst="rect"/>
+                    <a:prstGeom prst="rect">
+                      <a:avLst/>
+                    </a:prstGeom>
                   </pic:spPr>
                 </pic:pic>
               </a:graphicData>
@@ -3014,17 +3041,20 @@
         <w:jc w:val="both"/>
       </w:pPr>
       <w:r>
-        <w:t>Los modelos de lenguaje de gran escala (LLM, por sus siglas en inglés) representan el estado del arte actual en el procesamiento de lenguaje natural. Estos modelos, entrenados sobre corpus de texto de dimensiones sin precedentes mediante técnicas de aprendizaje profundo, son capaces de generar texto de alta calidad, responder preguntas, completar instrucciones, traducir entre idiomas y realizar una amplia variedad de tareas relacionadas con el lenguaje. Su arquitectura, basada en el mecanismo de atención y la estructura Transformer introducida por Vaswani y colaboradores en 2017 (Vaswani et al., 2017), les permite capturar dependencias de largo alcance en el texto y generar respuestas contextualmente coherentes, un aspecto analizado recientemente por He y colaboradores (He et al., 2024).</w:t>
-      </w:r>
-    </w:p>
-    <w:p>
-      <w:pPr>
-        <w:spacing w:after="200" w:line="360" w:lineRule="auto"/>
-        <w:ind w:firstLine="720"/>
-        <w:jc w:val="both"/>
-      </w:pPr>
+        <w:t xml:space="preserve">Los modelos de lenguaje de gran escala (LLM, por sus siglas en inglés) representan el estado del arte actual en el procesamiento de lenguaje natural. Estos modelos, entrenados sobre corpus de texto de dimensiones sin precedentes mediante técnicas de aprendizaje profundo, son capaces de generar texto de alta calidad, responder preguntas, completar instrucciones, traducir entre idiomas y realizar una amplia variedad de tareas relacionadas con el lenguaje. Su arquitectura, basada en el mecanismo de atención y la estructura Transformer introducida por Vaswani y colaboradores en 2017 (Vaswani et al., 2017), les permite capturar dependencias de largo alcance en el texto y generar respuestas contextualmente </w:t>
+      </w:r>
       <w:r>
         <w:lastRenderedPageBreak/>
+        <w:t>coherentes, un aspecto analizado recientemente por He y colaboradores (He et al., 2024).</w:t>
+      </w:r>
+    </w:p>
+    <w:p>
+      <w:pPr>
+        <w:spacing w:after="200" w:line="360" w:lineRule="auto"/>
+        <w:ind w:firstLine="720"/>
+        <w:jc w:val="both"/>
+      </w:pPr>
+      <w:r>
         <w:t>La disponibilidad de estos modelos a través de APIs públicas ha transformado radicalmente el ecosistema de desarrollo de aplicaciones con capacidades de inteligencia artificial (OpenAI, 2023). Lo que anteriormente requería equipos de investigación especializados y recursos computacionales de gran escala puede hoy ser integrado en aplicaciones mediante unas pocas líneas de código, pagando únicamente por el volumen de uso. Este cambio ha democratizado significativamente el acceso a las capacidades de procesamiento (Davenport y Ronanki, 2018) de lenguaje natural, haciéndolas accesibles para desarrolladores individuales y organizaciones con recursos limitados.</w:t>
       </w:r>
     </w:p>
@@ -3053,6 +3083,7 @@
         <w:pStyle w:val="Ttulo2"/>
       </w:pPr>
       <w:r>
+        <w:lastRenderedPageBreak/>
         <w:t>2.4 Sistemas orientados a eventos</w:t>
       </w:r>
     </w:p>
@@ -3063,7 +3094,6 @@
         <w:jc w:val="both"/>
       </w:pPr>
       <w:r>
-        <w:lastRenderedPageBreak/>
         <w:t>La arquitectura orientada a eventos (EDA, por sus siglas en inglés) constituye un paradigma de diseño de sistemas en el cual el flujo de la ejecución está determinado por la ocurrencia de eventos, en lugar de seguir una secuencia predefinida y lineal de instrucciones. En este modelo, los componentes del sistema se comunican mediante la emisión y la recepción de mensajes que representan hechos ocurridos en el dominio del problema, sin que exista necesariamente un acoplamiento directo entre quien emite el evento y quien lo recibe y procesa (Kleppmann, 2017).</w:t>
       </w:r>
     </w:p>
@@ -3133,12 +3163,15 @@
         <w:jc w:val="both"/>
       </w:pPr>
       <w:r>
-        <w:t>Las plataformas de automatización de flujos de trabajo de código abierto, tales como n8n y Zapier en su versión gratuita —orientadas a la integración de aplicaciones y servicios (iPaaS)—, así como orquestadores de flujos de datos basados en DAG como Apache Airflow, han contribuido significativamente a reducir la barrera de entrada para la construcción de sistemas de automatización en organizaciones con recursos limitados. Estas herramientas ofrecen interfaces visuales para la construcción de flujos de trabajo, conectores predefinidos para la integración con servicios populares y mecanismos de orquestación que simplifican la gestión de procesos complejos. Sin embargo, presentan limitaciones en términos de la capacidad de personalización y de la incorporación de lógica de procesamiento sofisticada (Ajimati et al., 2025; El Kamouchi et al., 2023).</w:t>
-      </w:r>
-    </w:p>
-    <w:p>
+        <w:t xml:space="preserve">Las plataformas de automatización de flujos de trabajo de código abierto, tales como n8n y Zapier en su versión gratuita —orientadas a la integración de aplicaciones y servicios (iPaaS)—, así como orquestadores de flujos de datos basados en DAG como Apache Airflow, han contribuido significativamente a reducir la barrera de entrada para la construcción de sistemas de automatización en organizaciones con recursos limitados. Estas herramientas ofrecen interfaces visuales para la construcción de flujos de trabajo, conectores predefinidos para la integración con servicios populares y mecanismos de orquestación que simplifican la gestión de </w:t>
+      </w:r>
       <w:r>
         <w:lastRenderedPageBreak/>
+        <w:t>procesos complejos. Sin embargo, presentan limitaciones en términos de la capacidad de personalización y de la incorporación de lógica de procesamiento sofisticada (Ajimati et al., 2025; El Kamouchi et al., 2023).</w:t>
+      </w:r>
+    </w:p>
+    <w:p>
+      <w:r>
         <w:t>Tabla 1. Comparación de herramientas de automatización de bajo costo.</w:t>
       </w:r>
     </w:p>
@@ -3468,6 +3501,7 @@
         <w:pStyle w:val="Ttulo2"/>
       </w:pPr>
       <w:r>
+        <w:lastRenderedPageBreak/>
         <w:t>2.6 Modelo conceptual integrador</w:t>
       </w:r>
     </w:p>
@@ -3478,11 +3512,7 @@
         <w:jc w:val="both"/>
       </w:pPr>
       <w:r>
-        <w:t xml:space="preserve">Los tres enfoques teóricos revisados en las secciones precedentes —automatización de procesos, integración de servicios e inteligencia artificial— no son mutuamente excluyentes, sino que se complementan de manera sinérgica en el marco conceptual sobre el cual se construye la presente investigación. La </w:t>
-      </w:r>
-      <w:r>
-        <w:lastRenderedPageBreak/>
-        <w:t>convergencia de estos enfoques permite conceptualizar un modelo híbrido de sistemas automatizados, en el cual coexisten componentes determinísticos y adaptativos, y cuya arquitectura está orientada a maximizar la funcionalidad manteniendo un nivel de complejidad accesible.</w:t>
+        <w:t>Los tres enfoques teóricos revisados en las secciones precedentes —automatización de procesos, integración de servicios e inteligencia artificial— no son mutuamente excluyentes, sino que se complementan de manera sinérgica en el marco conceptual sobre el cual se construye la presente investigación. La convergencia de estos enfoques permite conceptualizar un modelo híbrido de sistemas automatizados, en el cual coexisten componentes determinísticos y adaptativos, y cuya arquitectura está orientada a maximizar la funcionalidad manteniendo un nivel de complejidad accesible.</w:t>
       </w:r>
     </w:p>
     <w:p>
@@ -3656,22 +3686,34 @@
         <w:jc w:val="both"/>
       </w:pPr>
       <w:r>
-        <w:t xml:space="preserve">Para efectos de esta investigación, se establecen los siguientes umbrales de aceptación: (a) tiempo de respuesta inferior a 5 segundos para solicitudes simples y 10 segundos para solicitudes que requieren procesamiento adicional; (b) precisión en la interpretación de intenciones igual o superior al 80% sobre el conjunto total de solicitudes evaluadas; (c) ausencia de errores HTTP 5xx en al menos el 99% de las solicitudes procesadas durante la fase de pruebas.</w:t>
-      </w:r>
-    </w:p>
-    <w:p>
-      <w:pPr>
-        <w:spacing w:after="200" w:line="360" w:lineRule="auto"/>
-        <w:ind w:firstLine="720"/>
-        <w:jc w:val="both"/>
-      </w:pPr>
-      <w:r>
-        <w:t xml:space="preserve">La validez de la variable ‘precisión de interpretación de intenciones’ se garantiza mediante la definición de criterios de codificación explícitos: cada respuesta del sistema es clasificada como ‘correcta’ cuando la intención detectada coincide con la intención real del usuario según la taxonomía definida en la sección 4.3, y como ‘incorrecta’ cuando existe una discrepancia. Para evitar sesgos, la clasificación se realiza de manera automática mediante la comparación del campo ‘intent’ devuelto por la API con la categoría esperada del caso de prueba, eliminando la subjetividad del evaluador humano (Wohlin et al., 2012).</w:t>
-      </w:r>
-    </w:p>
-    <w:p>
-      <w:r>
         <w:lastRenderedPageBreak/>
+        <w:t xml:space="preserve">Para efectos de esta investigación, se establecen los siguientes umbrales de aceptación: (a) tiempo de respuesta inferior </w:t>
+      </w:r>
+      <w:r>
+        <w:t xml:space="preserve">a 5 segundos para solicitudes simples y 10 segundos para solicitudes que requieren procesamiento adicional; (b) precisión en la interpretación de intenciones igual o superior al 80% sobre el conjunto total de solicitudes evaluadas; (c) ausencia de errores </w:t>
+      </w:r>
+      <w:r>
+        <w:t>HTTP 5xx en al menos el 99% de las solicitudes procesadas durante la fase de pruebas.</w:t>
+      </w:r>
+    </w:p>
+    <w:p>
+      <w:pPr>
+        <w:spacing w:after="200" w:line="360" w:lineRule="auto"/>
+        <w:ind w:firstLine="720"/>
+        <w:jc w:val="both"/>
+      </w:pPr>
+      <w:r>
+        <w:t>La validez de la variable ‘precisión de interpretación de intenciones’ se garantiza mediante la definición de criterios de codificación explícitos: cada respuesta del sis</w:t>
+      </w:r>
+      <w:r>
+        <w:t xml:space="preserve">tema es clasificada como ‘correcta’ cuando la intención detectada coincide con la intención real del usuario según la taxonomía definida en la sección 4.3, y como ‘incorrecta’ cuando existe una discrepancia. Para evitar sesgos, la clasificación se realiza </w:t>
+      </w:r>
+      <w:r>
+        <w:t>de manera automática mediante la comparación del campo ‘intent’ devuelto por la API con la categoría esperada del caso de prueba, eliminando la subjetividad del evaluador humano (Wohlin et al., 2012).</w:t>
+      </w:r>
+    </w:p>
+    <w:p>
+      <w:r>
         <w:t>Tabla 2. Variables e indicadores de análisis del sistema.</w:t>
       </w:r>
     </w:p>
@@ -4046,7 +4088,11 @@
         <w:jc w:val="both"/>
       </w:pPr>
       <w:r>
-        <w:t>Las técnicas de recolección de datos empleadas en la presente investigación son coherentes con su naturaleza aplicada y con los objetivos de evaluación del sistema desarrollado. Se recurre principalmente a tres técnicas complementarias: la observación sistemática del comportamiento del sistema durante la ejecución de las pruebas, el análisis de los registros de eventos generados automáticamente por el sistema, y la ejecución de pruebas funcionales diseñadas para evaluar aspectos específicos del comportamiento del sistema.</w:t>
+        <w:t xml:space="preserve">Las técnicas de recolección de datos empleadas en la presente investigación son coherentes con su naturaleza aplicada y con los objetivos de evaluación del </w:t>
+      </w:r>
+      <w:r>
+        <w:lastRenderedPageBreak/>
+        <w:t>sistema desarrollado. Se recurre principalmente a tres técnicas complementarias: la observación sistemática del comportamiento del sistema durante la ejecución de las pruebas, el análisis de los registros de eventos generados automáticamente por el sistema, y la ejecución de pruebas funcionales diseñadas para evaluar aspectos específicos del comportamiento del sistema.</w:t>
       </w:r>
     </w:p>
     <w:p>
@@ -4066,31 +4112,31 @@
         <w:jc w:val="both"/>
       </w:pPr>
       <w:r>
-        <w:t xml:space="preserve">El análisis de los registros de eventos constituye la fuente de datos más estructurada de la investigación. El sistema genera automáticamente registros que incluyen marcas de tiempo, identificadores de los flujos de automatización </w:t>
+        <w:t>El análisis de los registros de eventos constituye la fuente de datos más estructurada de la investigación. El sistema genera automáticamente registros que incluyen marcas de tiempo, identificadores de los flujos de automatización ejecutados, estados de los componentes y mensajes de error cuando corresponde. Estos registros son analizados con el objetivo de obtener mediciones precisas de las variables cuantitativas definidas y de identificar patrones en el comportamiento del sistema.</w:t>
+      </w:r>
+    </w:p>
+    <w:p>
+      <w:pPr>
+        <w:spacing w:after="200" w:line="360" w:lineRule="auto"/>
+        <w:ind w:firstLine="720"/>
+        <w:jc w:val="both"/>
+      </w:pPr>
+      <w:r>
+        <w:t>Las pruebas funcionales, por su parte, son diseñadas de manera sistemática para cubrir los principales escenarios de uso del sistema (Wohlin et al., 2012) y para evaluar su comportamiento ante casos representativos de las distintas situaciones que pueden presentarse en la práctica. Cada prueba incluye una descripción del escenario evaluado, los datos de entrada utilizados, el comportamiento esperado del sistema y el comportamiento observado durante la ejecución.</w:t>
+      </w:r>
+    </w:p>
+    <w:p>
+      <w:pPr>
+        <w:spacing w:after="200" w:line="360" w:lineRule="auto"/>
+        <w:ind w:firstLine="720"/>
+        <w:jc w:val="both"/>
+      </w:pPr>
+      <w:r>
+        <w:t xml:space="preserve">Los criterios de inclusión de un caso en el conjunto de prueba son: (a) que el escenario corresponda a una de las tareas definidas en la población, (b) que pueda expresarse como un mensaje de entrada reproducible y (c) que el resultado esperado sea verificable de manera inequívoca. Se excluyen los escenarios que requieren la intervención de un operador humano o la disponibilidad de servicios externos no </w:t>
       </w:r>
       <w:r>
         <w:lastRenderedPageBreak/>
-        <w:t>ejecutados, estados de los componentes y mensajes de error cuando corresponde. Estos registros son analizados con el objetivo de obtener mediciones precisas de las variables cuantitativas definidas y de identificar patrones en el comportamiento del sistema.</w:t>
-      </w:r>
-    </w:p>
-    <w:p>
-      <w:pPr>
-        <w:spacing w:after="200" w:line="360" w:lineRule="auto"/>
-        <w:ind w:firstLine="720"/>
-        <w:jc w:val="both"/>
-      </w:pPr>
-      <w:r>
-        <w:t>Las pruebas funcionales, por su parte, son diseñadas de manera sistemática para cubrir los principales escenarios de uso del sistema (Wohlin et al., 2012) y para evaluar su comportamiento ante casos representativos de las distintas situaciones que pueden presentarse en la práctica. Cada prueba incluye una descripción del escenario evaluado, los datos de entrada utilizados, el comportamiento esperado del sistema y el comportamiento observado durante la ejecución.</w:t>
-      </w:r>
-    </w:p>
-    <w:p>
-      <w:pPr>
-        <w:spacing w:after="200" w:line="360" w:lineRule="auto"/>
-        <w:ind w:firstLine="720"/>
-        <w:jc w:val="both"/>
-      </w:pPr>
-      <w:r>
-        <w:t>Los criterios de inclusión de un caso en el conjunto de prueba son: (a) que el escenario corresponda a una de las tareas definidas en la población, (b) que pueda expresarse como un mensaje de entrada reproducible y (c) que el resultado esperado sea verificable de manera inequívoca. Se excluyen los escenarios que requieren la intervención de un operador humano o la disponibilidad de servicios externos no controlados por la investigación. Esta delimitación permite juzgar la validez interna de los resultados y explicitar el alcance de las conclusiones, que se restringe a los escenarios cubiertos por el conjunto de prueba.</w:t>
+        <w:t>controlados por la investigación. Esta delimitación permite juzgar la validez interna de los resultados y explicitar el alcance de las conclusiones, que se restringe a los escenarios cubiertos por el conjunto de prueba.</w:t>
       </w:r>
     </w:p>
     <w:p>
@@ -4110,18 +4156,27 @@
         <w:jc w:val="both"/>
       </w:pPr>
       <w:r>
+        <w:t>Población, muestra y muestreo. La población de la presente investigación está constituida por el conjunto de tareas digitales operativas susceptibles de ser automatizadas en un emprendimiento digital de pequeña escala, tal como fueron caracterizadas en la descripción del problema. Dado que esta población no puede ser enumerada de manera exhaustiva, la investigación adopta un muestreo intencional por conveniencia y por criterio: se seleccionan los escenarios de prueba que resultan representativos de los tipos de tarea que el sistema debe automatizar, a saber: consulta del catálogo de productos, consulta de precios, selección y compra de productos, gestión del carrito simulado, finalización de la compra, contacto con un asesor y consultas generales no clasificadas.</w:t>
+      </w:r>
+    </w:p>
+    <w:p>
+      <w:pPr>
+        <w:spacing w:after="200" w:line="360" w:lineRule="auto"/>
+        <w:ind w:firstLine="720"/>
+        <w:jc w:val="both"/>
+      </w:pPr>
+      <w:r>
+        <w:t>La selección de los casos de prueba se realiza mediante un criterio de muestreo intencional, priorizando escenarios que representan los patrones de uso más frecuentes del sistema. El conjunto se distribuye de la siguiente ma</w:t>
+      </w:r>
+      <w:r>
+        <w:t xml:space="preserve">nera: (a) 128 solicitudes automatizadas a la API que cubren los 12 endpoints disponibles, incluyendo casos normales, límites y errores; (b) 38 interacciones reales vía Telegram </w:t>
+      </w:r>
+      <w:r>
         <w:lastRenderedPageBreak/>
-        <w:t>Población, muestra y muestreo. La población de la presente investigación está constituida por el conjunto de tareas digitales operativas susceptibles de ser automatizadas en un emprendimiento digital de pequeña escala, tal como fueron caracterizadas en la descripción del problema. Dado que esta población no puede ser enumerada de manera exhaustiva, la investigación adopta un muestreo intencional por conveniencia y por criterio: se seleccionan los escenarios de prueba que resultan representativos de los tipos de tarea que el sistema debe automatizar, a saber: consulta del catálogo de productos, consulta de precios, selección y compra de productos, gestión del carrito simulado, finalización de la compra, contacto con un asesor y consultas generales no clasificadas.</w:t>
-      </w:r>
-    </w:p>
-    <w:p>
-      <w:pPr>
-        <w:spacing w:after="200" w:line="360" w:lineRule="auto"/>
-        <w:ind w:firstLine="720"/>
-        <w:jc w:val="both"/>
-      </w:pPr>
-      <w:r>
-        <w:t xml:space="preserve">La selección de los casos de prueba se realiza mediante un criterio de muestreo intencional, priorizando escenarios que representan los patrones de uso más frecuentes del sistema. El conjunto se distribuye de la siguiente manera: (a) 128 solicitudes automatizadas a la API que cubren los 12 endpoints disponibles, incluyendo casos normales, límites y errores; (b) 38 interacciones reales vía Telegram que representan las 5 categorías de intención definidas en la sección 4.3 (consulta, compra, soporte, navegación y saludo).</w:t>
+        <w:t>que representan las 5 categorías de intención definidas en la sección 4.3 (cons</w:t>
+      </w:r>
+      <w:r>
+        <w:t>ulta, compra, soporte, navegación y saludo).</w:t>
       </w:r>
     </w:p>
     <w:p>
@@ -4169,15 +4224,15 @@
         <w:jc w:val="both"/>
       </w:pPr>
       <w:r>
+        <w:t>En la tercera etapa, la selección de herramientas tecnológicas se realiza mediante la evaluación de las alternativas disponibles en función de criterios específicos: accesibilidad económica, facilidad de integración con los demás componentes del sistema, nivel de documentación disponible, actividad de la comunidad de desarrolladores y adecuación a los requisitos funcionales del sistema. Las decisiones adoptadas son documentadas y justificadas en detalle para permitir su evaluación crítica.</w:t>
+      </w:r>
+    </w:p>
+    <w:p>
+      <w:pPr>
+        <w:pStyle w:val="Ttulo2"/>
+      </w:pPr>
+      <w:r>
         <w:lastRenderedPageBreak/>
-        <w:t>En la tercera etapa, la selección de herramientas tecnológicas se realiza mediante la evaluación de las alternativas disponibles en función de criterios específicos: accesibilidad económica, facilidad de integración con los demás componentes del sistema, nivel de documentación disponible, actividad de la comunidad de desarrolladores y adecuación a los requisitos funcionales del sistema. Las decisiones adoptadas son documentadas y justificadas en detalle para permitir su evaluación crítica.</w:t>
-      </w:r>
-    </w:p>
-    <w:p>
-      <w:pPr>
-        <w:pStyle w:val="Ttulo2"/>
-      </w:pPr>
-      <w:r>
         <w:t>3.6 Consideraciones éticas y limitaciones metodológicas</w:t>
       </w:r>
     </w:p>
@@ -4208,11 +4263,7 @@
         <w:jc w:val="both"/>
       </w:pPr>
       <w:r>
-        <w:t xml:space="preserve">Las limitaciones metodológicas del trabajo son de naturaleza múltiple y han sido parcialmente descritas en la sección de alcance y limitaciones del capítulo introductorio. Desde el punto de vista metodológico, la principal limitación consiste en la ausencia de un diseño experimental controlado que permita aislar el efecto de variables específicas sobre el comportamiento del sistema. El carácter exploratorio del trabajo y la naturaleza del objeto de estudio hacen que este tipo de diseño no resulte adecuado ni viable en el contexto de la investigación. No obstante, la </w:t>
-      </w:r>
-      <w:r>
-        <w:lastRenderedPageBreak/>
-        <w:t>sistematicidad de las pruebas realizadas y la transparencia en la descripción del procedimiento seguido permiten que los hallazgos del trabajo sean evaluados críticamente.</w:t>
+        <w:t>Las limitaciones metodológicas del trabajo son de naturaleza múltiple y han sido parcialmente descritas en la sección de alcance y limitaciones del capítulo introductorio. Desde el punto de vista metodológico, la principal limitación consiste en la ausencia de un diseño experimental controlado que permita aislar el efecto de variables específicas sobre el comportamiento del sistema. El carácter exploratorio del trabajo y la naturaleza del objeto de estudio hacen que este tipo de diseño no resulte adecuado ni viable en el contexto de la investigación. No obstante, la sistematicidad de las pruebas realizadas y la transparencia en la descripción del procedimiento seguido permiten que los hallazgos del trabajo sean evaluados críticamente.</w:t>
       </w:r>
     </w:p>
     <w:p>
@@ -4610,7 +4661,7 @@
         </w:rPr>
         <w:lastRenderedPageBreak/>
         <w:drawing>
-          <wp:inline distT="0" distB="0" distL="0" distR="0" wp14:anchorId="333C7FCC" wp14:editId="32FF7865">
+          <wp:inline distT="0" distB="0" distL="0" distR="0" wp14:anchorId="0408362A" wp14:editId="4A129D7C">
             <wp:extent cx="5040000" cy="3592986"/>
             <wp:effectExtent l="0" t="0" r="0" b="0"/>
             <wp:docPr id="16" name="Picture 16"/>
@@ -4625,7 +4676,7 @@
                     <pic:cNvPicPr/>
                   </pic:nvPicPr>
                   <pic:blipFill>
-                    <a:blip r:embed="rId8"/>
+                    <a:blip r:embed="rId16"/>
                     <a:stretch>
                       <a:fillRect/>
                     </a:stretch>
@@ -4720,7 +4771,7 @@
         </w:rPr>
         <w:lastRenderedPageBreak/>
         <w:drawing>
-          <wp:inline distT="0" distB="0" distL="0" distR="0" wp14:anchorId="0DBA98E1" wp14:editId="4A87AF94">
+          <wp:inline distT="0" distB="0" distL="0" distR="0" wp14:anchorId="473068AD" wp14:editId="272C8B64">
             <wp:extent cx="5040000" cy="3152775"/>
             <wp:effectExtent l="0" t="0" r="0" b="0"/>
             <wp:docPr id="10" name="Picture 10"/>
@@ -4735,7 +4786,7 @@
                     <pic:cNvPicPr/>
                   </pic:nvPicPr>
                   <pic:blipFill>
-                    <a:blip r:embed="rId9"/>
+                    <a:blip r:embed="rId17"/>
                     <a:stretch>
                       <a:fillRect/>
                     </a:stretch>
@@ -4827,7 +4878,7 @@
         </w:rPr>
         <w:lastRenderedPageBreak/>
         <w:drawing>
-          <wp:inline distT="0" distB="0" distL="0" distR="0" wp14:anchorId="52679150" wp14:editId="6A3E8E04">
+          <wp:inline distT="0" distB="0" distL="0" distR="0" wp14:anchorId="72EC4D4C" wp14:editId="6E5E51DF">
             <wp:extent cx="5040000" cy="3447753"/>
             <wp:effectExtent l="0" t="0" r="0" b="0"/>
             <wp:docPr id="11" name="Picture 11"/>
@@ -4842,7 +4893,7 @@
                     <pic:cNvPicPr/>
                   </pic:nvPicPr>
                   <pic:blipFill>
-                    <a:blip r:embed="rId10"/>
+                    <a:blip r:embed="rId18"/>
                     <a:stretch>
                       <a:fillRect/>
                     </a:stretch>
@@ -4931,6 +4982,463 @@
     </w:p>
     <w:p>
       <w:pPr>
+        <w:spacing w:before="200" w:after="80"/>
+      </w:pPr>
+      <w:r>
+        <w:t xml:space="preserve">El siguiente fragmento muestra la lógica central del componente de detección de intenciones, implementado como nodo Function en n8n:</w:t>
+      </w:r>
+    </w:p>
+    <w:p>
+      <w:pPr>
+        <w:shd w:val="clear" w:color="auto" w:fill="F2F2F2"/>
+        <w:spacing w:line="240" w:lineRule="auto"/>
+      </w:pPr>
+      <w:r>
+        <w:rPr>
+          <w:rFonts w:ascii="Courier New" w:hAnsi="Courier New" w:cs="Courier New"/>
+          <w:sz w:val="18"/>
+          <w:szCs w:val="18"/>
+        </w:rPr>
+        <w:t xml:space="preserve">// Bot Router - Detección de intenciones (n8n Function Node)</w:t>
+      </w:r>
+    </w:p>
+    <w:p>
+      <w:pPr>
+        <w:shd w:val="clear" w:color="auto" w:fill="F2F2F2"/>
+        <w:spacing w:line="240" w:lineRule="auto"/>
+      </w:pPr>
+      <w:r>
+        <w:rPr>
+          <w:rFonts w:ascii="Courier New" w:hAnsi="Courier New" w:cs="Courier New"/>
+          <w:sz w:val="18"/>
+          <w:szCs w:val="18"/>
+        </w:rPr>
+        <w:t xml:space="preserve">const msg = (data.mensaje || '').toLowerCase().trim();</w:t>
+      </w:r>
+    </w:p>
+    <w:p>
+      <w:pPr>
+        <w:shd w:val="clear" w:color="auto" w:fill="F2F2F2"/>
+        <w:spacing w:line="240" w:lineRule="auto"/>
+      </w:pPr>
+      <w:r>
+        <w:rPr>
+          <w:rFonts w:ascii="Courier New" w:hAnsi="Courier New" w:cs="Courier New"/>
+          <w:sz w:val="18"/>
+          <w:szCs w:val="18"/>
+        </w:rPr>
+        <w:t xml:space="preserve">const userState = staticData[userId];</w:t>
+      </w:r>
+    </w:p>
+    <w:p>
+      <w:pPr>
+        <w:shd w:val="clear" w:color="auto" w:fill="F2F2F2"/>
+        <w:spacing w:line="240" w:lineRule="auto"/>
+      </w:pPr>
+      <w:r>
+        <w:rPr>
+          <w:rFonts w:ascii="Courier New" w:hAnsi="Courier New" w:cs="Courier New"/>
+          <w:sz w:val="18"/>
+          <w:szCs w:val="18"/>
+        </w:rPr>
+        <w:t xml:space="preserve"/>
+      </w:r>
+    </w:p>
+    <w:p>
+      <w:pPr>
+        <w:shd w:val="clear" w:color="auto" w:fill="F2F2F2"/>
+        <w:spacing w:line="240" w:lineRule="auto"/>
+      </w:pPr>
+      <w:r>
+        <w:rPr>
+          <w:rFonts w:ascii="Courier New" w:hAnsi="Courier New" w:cs="Courier New"/>
+          <w:sz w:val="18"/>
+          <w:szCs w:val="18"/>
+        </w:rPr>
+        <w:t xml:space="preserve">// Menú principal: resetea modo</w:t>
+      </w:r>
+    </w:p>
+    <w:p>
+      <w:pPr>
+        <w:shd w:val="clear" w:color="auto" w:fill="F2F2F2"/>
+        <w:spacing w:line="240" w:lineRule="auto"/>
+      </w:pPr>
+      <w:r>
+        <w:rPr>
+          <w:rFonts w:ascii="Courier New" w:hAnsi="Courier New" w:cs="Courier New"/>
+          <w:sz w:val="18"/>
+          <w:szCs w:val="18"/>
+        </w:rPr>
+        <w:t xml:space="preserve">if (msg === '/start' || msg === 'hola' || msg === 'menu' || msg === '') {</w:t>
+      </w:r>
+    </w:p>
+    <w:p>
+      <w:pPr>
+        <w:shd w:val="clear" w:color="auto" w:fill="F2F2F2"/>
+        <w:spacing w:line="240" w:lineRule="auto"/>
+      </w:pPr>
+      <w:r>
+        <w:rPr>
+          <w:rFonts w:ascii="Courier New" w:hAnsi="Courier New" w:cs="Courier New"/>
+          <w:sz w:val="18"/>
+          <w:szCs w:val="18"/>
+        </w:rPr>
+        <w:t xml:space="preserve">  userState.modo = 'menu';</w:t>
+      </w:r>
+    </w:p>
+    <w:p>
+      <w:pPr>
+        <w:shd w:val="clear" w:color="auto" w:fill="F2F2F2"/>
+        <w:spacing w:line="240" w:lineRule="auto"/>
+      </w:pPr>
+      <w:r>
+        <w:rPr>
+          <w:rFonts w:ascii="Courier New" w:hAnsi="Courier New" w:cs="Courier New"/>
+          <w:sz w:val="18"/>
+          <w:szCs w:val="18"/>
+        </w:rPr>
+        <w:t xml:space="preserve">  respuesta = '¡Hola! Bienvenido.\n\n1⃣ Comprar productos\n2⃣ Ver catálogo\n3⃣ Consultar precios\n4⃣ Hablar con asesor\n5⃣ Otra consulta\n6⃣ Ver mi carrito\n7⃣ Finalizar compra';</w:t>
+      </w:r>
+    </w:p>
+    <w:p>
+      <w:pPr>
+        <w:shd w:val="clear" w:color="auto" w:fill="F2F2F2"/>
+        <w:spacing w:line="240" w:lineRule="auto"/>
+      </w:pPr>
+      <w:r>
+        <w:rPr>
+          <w:rFonts w:ascii="Courier New" w:hAnsi="Courier New" w:cs="Courier New"/>
+          <w:sz w:val="18"/>
+          <w:szCs w:val="18"/>
+        </w:rPr>
+        <w:t xml:space="preserve">}</w:t>
+      </w:r>
+    </w:p>
+    <w:p>
+      <w:pPr>
+        <w:shd w:val="clear" w:color="auto" w:fill="F2F2F2"/>
+        <w:spacing w:line="240" w:lineRule="auto"/>
+      </w:pPr>
+      <w:r>
+        <w:rPr>
+          <w:rFonts w:ascii="Courier New" w:hAnsi="Courier New" w:cs="Courier New"/>
+          <w:sz w:val="18"/>
+          <w:szCs w:val="18"/>
+        </w:rPr>
+        <w:t xml:space="preserve"/>
+      </w:r>
+    </w:p>
+    <w:p>
+      <w:pPr>
+        <w:shd w:val="clear" w:color="auto" w:fill="F2F2F2"/>
+        <w:spacing w:line="240" w:lineRule="auto"/>
+      </w:pPr>
+      <w:r>
+        <w:rPr>
+          <w:rFonts w:ascii="Courier New" w:hAnsi="Courier New" w:cs="Courier New"/>
+          <w:sz w:val="18"/>
+          <w:szCs w:val="18"/>
+        </w:rPr>
+        <w:t xml:space="preserve">// Selección de producto (modo catálogo + input numérico)</w:t>
+      </w:r>
+    </w:p>
+    <w:p>
+      <w:pPr>
+        <w:shd w:val="clear" w:color="auto" w:fill="F2F2F2"/>
+        <w:spacing w:line="240" w:lineRule="auto"/>
+      </w:pPr>
+      <w:r>
+        <w:rPr>
+          <w:rFonts w:ascii="Courier New" w:hAnsi="Courier New" w:cs="Courier New"/>
+          <w:sz w:val="18"/>
+          <w:szCs w:val="18"/>
+        </w:rPr>
+        <w:t xml:space="preserve">else if (userState.modo === 'catalogo' &amp;&amp; /^\d+$/.test(msg)) {</w:t>
+      </w:r>
+    </w:p>
+    <w:p>
+      <w:pPr>
+        <w:shd w:val="clear" w:color="auto" w:fill="F2F2F2"/>
+        <w:spacing w:line="240" w:lineRule="auto"/>
+      </w:pPr>
+      <w:r>
+        <w:rPr>
+          <w:rFonts w:ascii="Courier New" w:hAnsi="Courier New" w:cs="Courier New"/>
+          <w:sz w:val="18"/>
+          <w:szCs w:val="18"/>
+        </w:rPr>
+        <w:t xml:space="preserve">  const num = parseInt(msg, 10) - 1;</w:t>
+      </w:r>
+    </w:p>
+    <w:p>
+      <w:pPr>
+        <w:shd w:val="clear" w:color="auto" w:fill="F2F2F2"/>
+        <w:spacing w:line="240" w:lineRule="auto"/>
+      </w:pPr>
+      <w:r>
+        <w:rPr>
+          <w:rFonts w:ascii="Courier New" w:hAnsi="Courier New" w:cs="Courier New"/>
+          <w:sz w:val="18"/>
+          <w:szCs w:val="18"/>
+        </w:rPr>
+        <w:t xml:space="preserve">  if (userState.pendingProducto) {</w:t>
+      </w:r>
+    </w:p>
+    <w:p>
+      <w:pPr>
+        <w:shd w:val="clear" w:color="auto" w:fill="F2F2F2"/>
+        <w:spacing w:line="240" w:lineRule="auto"/>
+      </w:pPr>
+      <w:r>
+        <w:rPr>
+          <w:rFonts w:ascii="Courier New" w:hAnsi="Courier New" w:cs="Courier New"/>
+          <w:sz w:val="18"/>
+          <w:szCs w:val="18"/>
+        </w:rPr>
+        <w:t xml:space="preserve">    // Procesar cantidad</w:t>
+      </w:r>
+    </w:p>
+    <w:p>
+      <w:pPr>
+        <w:shd w:val="clear" w:color="auto" w:fill="F2F2F2"/>
+        <w:spacing w:line="240" w:lineRule="auto"/>
+      </w:pPr>
+      <w:r>
+        <w:rPr>
+          <w:rFonts w:ascii="Courier New" w:hAnsi="Courier New" w:cs="Courier New"/>
+          <w:sz w:val="18"/>
+          <w:szCs w:val="18"/>
+        </w:rPr>
+        <w:t xml:space="preserve">    const cantidad = parseInt(msg, 10);</w:t>
+      </w:r>
+    </w:p>
+    <w:p>
+      <w:pPr>
+        <w:shd w:val="clear" w:color="auto" w:fill="F2F2F2"/>
+        <w:spacing w:line="240" w:lineRule="auto"/>
+      </w:pPr>
+      <w:r>
+        <w:rPr>
+          <w:rFonts w:ascii="Courier New" w:hAnsi="Courier New" w:cs="Courier New"/>
+          <w:sz w:val="18"/>
+          <w:szCs w:val="18"/>
+        </w:rPr>
+        <w:t xml:space="preserve">    if (cantidad &gt;= 1) {</w:t>
+      </w:r>
+    </w:p>
+    <w:p>
+      <w:pPr>
+        <w:shd w:val="clear" w:color="auto" w:fill="F2F2F2"/>
+        <w:spacing w:line="240" w:lineRule="auto"/>
+      </w:pPr>
+      <w:r>
+        <w:rPr>
+          <w:rFonts w:ascii="Courier New" w:hAnsi="Courier New" w:cs="Courier New"/>
+          <w:sz w:val="18"/>
+          <w:szCs w:val="18"/>
+        </w:rPr>
+        <w:t xml:space="preserve">      // Agregar al carrito</w:t>
+      </w:r>
+    </w:p>
+    <w:p>
+      <w:pPr>
+        <w:shd w:val="clear" w:color="auto" w:fill="F2F2F2"/>
+        <w:spacing w:line="240" w:lineRule="auto"/>
+      </w:pPr>
+      <w:r>
+        <w:rPr>
+          <w:rFonts w:ascii="Courier New" w:hAnsi="Courier New" w:cs="Courier New"/>
+          <w:sz w:val="18"/>
+          <w:szCs w:val="18"/>
+        </w:rPr>
+        <w:t xml:space="preserve">      accion = 'add_producto';</w:t>
+      </w:r>
+    </w:p>
+    <w:p>
+      <w:pPr>
+        <w:shd w:val="clear" w:color="auto" w:fill="F2F2F2"/>
+        <w:spacing w:line="240" w:lineRule="auto"/>
+      </w:pPr>
+      <w:r>
+        <w:rPr>
+          <w:rFonts w:ascii="Courier New" w:hAnsi="Courier New" w:cs="Courier New"/>
+          <w:sz w:val="18"/>
+          <w:szCs w:val="18"/>
+        </w:rPr>
+        <w:t xml:space="preserve">    }</w:t>
+      </w:r>
+    </w:p>
+    <w:p>
+      <w:pPr>
+        <w:shd w:val="clear" w:color="auto" w:fill="F2F2F2"/>
+        <w:spacing w:line="240" w:lineRule="auto"/>
+      </w:pPr>
+      <w:r>
+        <w:rPr>
+          <w:rFonts w:ascii="Courier New" w:hAnsi="Courier New" w:cs="Courier New"/>
+          <w:sz w:val="18"/>
+          <w:szCs w:val="18"/>
+        </w:rPr>
+        <w:t xml:space="preserve">  } else if (num &gt;= 0 &amp;&amp; num &lt; productos.length) {</w:t>
+      </w:r>
+    </w:p>
+    <w:p>
+      <w:pPr>
+        <w:shd w:val="clear" w:color="auto" w:fill="F2F2F2"/>
+        <w:spacing w:line="240" w:lineRule="auto"/>
+      </w:pPr>
+      <w:r>
+        <w:rPr>
+          <w:rFonts w:ascii="Courier New" w:hAnsi="Courier New" w:cs="Courier New"/>
+          <w:sz w:val="18"/>
+          <w:szCs w:val="18"/>
+        </w:rPr>
+        <w:t xml:space="preserve">    // Seleccionar producto del catálogo</w:t>
+      </w:r>
+    </w:p>
+    <w:p>
+      <w:pPr>
+        <w:shd w:val="clear" w:color="auto" w:fill="F2F2F2"/>
+        <w:spacing w:line="240" w:lineRule="auto"/>
+      </w:pPr>
+      <w:r>
+        <w:rPr>
+          <w:rFonts w:ascii="Courier New" w:hAnsi="Courier New" w:cs="Courier New"/>
+          <w:sz w:val="18"/>
+          <w:szCs w:val="18"/>
+        </w:rPr>
+        <w:t xml:space="preserve">    userState.pendingProducto = productos[num];</w:t>
+      </w:r>
+    </w:p>
+    <w:p>
+      <w:pPr>
+        <w:shd w:val="clear" w:color="auto" w:fill="F2F2F2"/>
+        <w:spacing w:line="240" w:lineRule="auto"/>
+      </w:pPr>
+      <w:r>
+        <w:rPr>
+          <w:rFonts w:ascii="Courier New" w:hAnsi="Courier New" w:cs="Courier New"/>
+          <w:sz w:val="18"/>
+          <w:szCs w:val="18"/>
+        </w:rPr>
+        <w:t xml:space="preserve">    respuesta = '¿Cuántas unidades?';</w:t>
+      </w:r>
+    </w:p>
+    <w:p>
+      <w:pPr>
+        <w:shd w:val="clear" w:color="auto" w:fill="F2F2F2"/>
+        <w:spacing w:line="240" w:lineRule="auto"/>
+      </w:pPr>
+      <w:r>
+        <w:rPr>
+          <w:rFonts w:ascii="Courier New" w:hAnsi="Courier New" w:cs="Courier New"/>
+          <w:sz w:val="18"/>
+          <w:szCs w:val="18"/>
+        </w:rPr>
+        <w:t xml:space="preserve">  }</w:t>
+      </w:r>
+    </w:p>
+    <w:p>
+      <w:pPr>
+        <w:shd w:val="clear" w:color="auto" w:fill="F2F2F2"/>
+        <w:spacing w:line="240" w:lineRule="auto"/>
+      </w:pPr>
+      <w:r>
+        <w:rPr>
+          <w:rFonts w:ascii="Courier New" w:hAnsi="Courier New" w:cs="Courier New"/>
+          <w:sz w:val="18"/>
+          <w:szCs w:val="18"/>
+        </w:rPr>
+        <w:t xml:space="preserve">}</w:t>
+      </w:r>
+    </w:p>
+    <w:p>
+      <w:pPr>
+        <w:shd w:val="clear" w:color="auto" w:fill="F2F2F2"/>
+        <w:spacing w:line="240" w:lineRule="auto"/>
+      </w:pPr>
+      <w:r>
+        <w:rPr>
+          <w:rFonts w:ascii="Courier New" w:hAnsi="Courier New" w:cs="Courier New"/>
+          <w:sz w:val="18"/>
+          <w:szCs w:val="18"/>
+        </w:rPr>
+        <w:t xml:space="preserve"/>
+      </w:r>
+    </w:p>
+    <w:p>
+      <w:pPr>
+        <w:shd w:val="clear" w:color="auto" w:fill="F2F2F2"/>
+        <w:spacing w:line="240" w:lineRule="auto"/>
+      </w:pPr>
+      <w:r>
+        <w:rPr>
+          <w:rFonts w:ascii="Courier New" w:hAnsi="Courier New" w:cs="Courier New"/>
+          <w:sz w:val="18"/>
+          <w:szCs w:val="18"/>
+        </w:rPr>
+        <w:t xml:space="preserve">// Default: mostrar menú</w:t>
+      </w:r>
+    </w:p>
+    <w:p>
+      <w:pPr>
+        <w:shd w:val="clear" w:color="auto" w:fill="F2F2F2"/>
+        <w:spacing w:line="240" w:lineRule="auto"/>
+      </w:pPr>
+      <w:r>
+        <w:rPr>
+          <w:rFonts w:ascii="Courier New" w:hAnsi="Courier New" w:cs="Courier New"/>
+          <w:sz w:val="18"/>
+          <w:szCs w:val="18"/>
+        </w:rPr>
+        <w:t xml:space="preserve">else {</w:t>
+      </w:r>
+    </w:p>
+    <w:p>
+      <w:pPr>
+        <w:shd w:val="clear" w:color="auto" w:fill="F2F2F2"/>
+        <w:spacing w:line="240" w:lineRule="auto"/>
+      </w:pPr>
+      <w:r>
+        <w:rPr>
+          <w:rFonts w:ascii="Courier New" w:hAnsi="Courier New" w:cs="Courier New"/>
+          <w:sz w:val="18"/>
+          <w:szCs w:val="18"/>
+        </w:rPr>
+        <w:t xml:space="preserve">  respuesta = 'No entendí. Elegí una opción del menú.';</w:t>
+      </w:r>
+    </w:p>
+    <w:p>
+      <w:pPr>
+        <w:shd w:val="clear" w:color="auto" w:fill="F2F2F2"/>
+        <w:spacing w:line="240" w:lineRule="auto"/>
+      </w:pPr>
+      <w:r>
+        <w:rPr>
+          <w:rFonts w:ascii="Courier New" w:hAnsi="Courier New" w:cs="Courier New"/>
+          <w:sz w:val="18"/>
+          <w:szCs w:val="18"/>
+        </w:rPr>
+        <w:t xml:space="preserve">}</w:t>
+      </w:r>
+    </w:p>
+    <w:p>
+      <w:pPr>
+        <w:jc w:val="center"/>
+        <w:spacing w:before="80" w:after="200"/>
+      </w:pPr>
+      <w:r>
+        <w:rPr>
+          <w:b/>
+          <w:i/>
+          <w:sz w:val="20"/>
+          <w:szCs w:val="20"/>
+        </w:rPr>
+        <w:t xml:space="preserve">Fragmento 1. Lógica de detección de intenciones del Bot Router (n8n Function Node)</w:t>
+      </w:r>
+    </w:p>
+    <w:p>
+      <w:pPr>
         <w:jc w:val="center"/>
       </w:pPr>
       <w:r>
@@ -4950,7 +5458,7 @@
           <w:noProof/>
         </w:rPr>
         <w:drawing>
-          <wp:inline distT="0" distB="0" distL="0" distR="0" wp14:anchorId="7CDB1521" wp14:editId="7BC67F7B">
+          <wp:inline distT="0" distB="0" distL="0" distR="0" wp14:anchorId="3377BC31" wp14:editId="137B7819">
             <wp:extent cx="5040000" cy="3251101"/>
             <wp:effectExtent l="0" t="0" r="0" b="0"/>
             <wp:docPr id="12" name="Picture 12"/>
@@ -4965,7 +5473,7 @@
                     <pic:cNvPicPr/>
                   </pic:nvPicPr>
                   <pic:blipFill>
-                    <a:blip r:embed="rId11"/>
+                    <a:blip r:embed="rId19"/>
                     <a:stretch>
                       <a:fillRect/>
                     </a:stretch>
@@ -5060,7 +5568,7 @@
         </w:rPr>
         <w:lastRenderedPageBreak/>
         <w:drawing>
-          <wp:inline distT="0" distB="0" distL="0" distR="0" wp14:anchorId="0915927D" wp14:editId="1BA1822E">
+          <wp:inline distT="0" distB="0" distL="0" distR="0" wp14:anchorId="02BB17D3" wp14:editId="5E8DAABB">
             <wp:extent cx="5040000" cy="3152775"/>
             <wp:effectExtent l="0" t="0" r="0" b="0"/>
             <wp:docPr id="13" name="Picture 13"/>
@@ -5075,7 +5583,7 @@
                     <pic:cNvPicPr/>
                   </pic:nvPicPr>
                   <pic:blipFill>
-                    <a:blip r:embed="rId12"/>
+                    <a:blip r:embed="rId20"/>
                     <a:stretch>
                       <a:fillRect/>
                     </a:stretch>
@@ -5166,7 +5674,7 @@
           <w:noProof/>
         </w:rPr>
         <w:drawing>
-          <wp:inline distT="0" distB="0" distL="0" distR="0" wp14:anchorId="1E0BDE1A" wp14:editId="4854588C">
+          <wp:inline distT="0" distB="0" distL="0" distR="0" wp14:anchorId="7BDBA0CC" wp14:editId="33B4B349">
             <wp:extent cx="5040000" cy="3447753"/>
             <wp:effectExtent l="0" t="0" r="0" b="0"/>
             <wp:docPr id="14" name="Picture 14"/>
@@ -5181,7 +5689,7 @@
                     <pic:cNvPicPr/>
                   </pic:nvPicPr>
                   <pic:blipFill>
-                    <a:blip r:embed="rId13"/>
+                    <a:blip r:embed="rId21"/>
                     <a:stretch>
                       <a:fillRect/>
                     </a:stretch>
@@ -5296,7 +5804,7 @@
         </w:rPr>
         <w:lastRenderedPageBreak/>
         <w:drawing>
-          <wp:inline distT="0" distB="0" distL="0" distR="0" wp14:anchorId="66D5C92D" wp14:editId="3293A6C7">
+          <wp:inline distT="0" distB="0" distL="0" distR="0" wp14:anchorId="364ED70E" wp14:editId="099CFE45">
             <wp:extent cx="5040000" cy="3850040"/>
             <wp:effectExtent l="0" t="0" r="0" b="0"/>
             <wp:docPr id="15" name="Picture 15"/>
@@ -5311,7 +5819,7 @@
                     <pic:cNvPicPr/>
                   </pic:nvPicPr>
                   <pic:blipFill>
-                    <a:blip r:embed="rId14"/>
+                    <a:blip r:embed="rId22"/>
                     <a:stretch>
                       <a:fillRect/>
                     </a:stretch>
@@ -5351,22 +5859,26 @@
         <w:jc w:val="center"/>
       </w:pPr>
       <w:r>
+        <w:rPr>
+          <w:noProof/>
+        </w:rPr>
         <w:drawing>
-          <wp:inline xmlns:a="http://schemas.openxmlformats.org/drawingml/2006/main" xmlns:pic="http://schemas.openxmlformats.org/drawingml/2006/picture">
+          <wp:inline distT="0" distB="0" distL="0" distR="0" wp14:anchorId="66D349CC" wp14:editId="52C301CE">
             <wp:extent cx="5040000" cy="2699550"/>
+            <wp:effectExtent l="0" t="0" r="0" b="0"/>
             <wp:docPr id="20" name="Picture 20"/>
             <wp:cNvGraphicFramePr>
-              <a:graphicFrameLocks noChangeAspect="1"/>
+              <a:graphicFrameLocks xmlns:a="http://schemas.openxmlformats.org/drawingml/2006/main" noChangeAspect="1"/>
             </wp:cNvGraphicFramePr>
-            <a:graphic>
+            <a:graphic xmlns:a="http://schemas.openxmlformats.org/drawingml/2006/main">
               <a:graphicData uri="http://schemas.openxmlformats.org/drawingml/2006/picture">
-                <pic:pic>
+                <pic:pic xmlns:pic="http://schemas.openxmlformats.org/drawingml/2006/picture">
                   <pic:nvPicPr>
                     <pic:cNvPr id="0" name="Streamlit-Metricas.jpeg"/>
                     <pic:cNvPicPr/>
                   </pic:nvPicPr>
                   <pic:blipFill>
-                    <a:blip r:embed="rId22"/>
+                    <a:blip r:embed="rId23"/>
                     <a:stretch>
                       <a:fillRect/>
                     </a:stretch>
@@ -5376,7 +5888,9 @@
                       <a:off x="0" y="0"/>
                       <a:ext cx="5040000" cy="2699550"/>
                     </a:xfrm>
-                    <a:prstGeom prst="rect"/>
+                    <a:prstGeom prst="rect">
+                      <a:avLst/>
+                    </a:prstGeom>
                   </pic:spPr>
                 </pic:pic>
               </a:graphicData>
@@ -5395,16 +5909,16 @@
     </w:p>
     <w:p>
       <w:r>
-        <w:t>La evaluación del sistema desarrollado se inicia con la ejecución de un conjunto sistemático de pruebas funcionales diseñadas para verificar que el sistema cumple con los requisitos funcionales definidos en el capítulo de especificaciones. Las pruebas se ejecutan de manera automatizada sobre el backend de la API, utilizando el framework de pruebas de Python (pytest), y cubren las capas de rutas, servicios y repositorios. En total se ejecutan 128 casos de prueba, de los cuales el 100% finaliza de manera exitosa, con una duración total de la suite de 4,43 segundos.</w:t>
-      </w:r>
-    </w:p>
-    <w:p>
-      <w:r>
-        <w:t xml:space="preserve">Las pruebas funcionales se organizan en siete grupos que reflejan las distintas operaciones del sistema: las pruebas de la API de clientes (28 casos), que verifican el ciclo completo de alta, consulta, modificación y eliminación; las pruebas de la API de productos (24 casos), que verifican la gestión del catálogo y sus estados; las pruebas de la API de productos asignados (20 casos), que validan la asignación de productos a clientes y la obtención de las facturas simuladas; las pruebas de la API de interacciones (9 casos), que verifican el registro de los mensajes provenientes de la plataforma de mensajería; las pruebas de servicios (19 casos) y de repositorios (18 casos), que cubren la lógica de negocio y el acceso a datos de manera aislada; las pruebas de autenticación (5 casos), que verifican el control de acceso mediante la clave de API; y las pruebas de métricas (4 casos), que validan los indicadores expuestos en el tablero. A este conjunto se suma una prueba de integración de extremo a extremo (1 caso), que verifica la comunicación entre capas mediante una </w:t>
+        <w:t xml:space="preserve">La evaluación del sistema desarrollado se inicia con la ejecución de un conjunto sistemático de pruebas funcionales diseñadas para verificar que el sistema cumple con los requisitos funcionales definidos en el capítulo de especificaciones. Las pruebas se ejecutan de manera automatizada sobre el backend de la API, utilizando </w:t>
       </w:r>
       <w:r>
         <w:lastRenderedPageBreak/>
-        <w:t>solicitud completa. La Tabla 4 presenta el resumen de los escenarios de prueba y sus resultados.</w:t>
+        <w:t>el framework de pruebas de Python (pytest), y cubren las capas de rutas, servicios y repositorios. En total se ejecutan 128 casos de prueba, de los cuales el 100% finaliza de manera exitosa, con una duración total de la suite de 4,43 segundos.</w:t>
+      </w:r>
+    </w:p>
+    <w:p>
+      <w:r>
+        <w:t>Las pruebas funcionales se organizan en siete grupos que reflejan las distintas operaciones del sistema: las pruebas de la API de clientes (28 casos), que verifican el ciclo completo de alta, consulta, modificación y eliminación; las pruebas de la API de productos (24 casos), que verifican la gestión del catálogo y sus estados; las pruebas de la API de productos asignados (20 casos), que validan la asignación de productos a clientes y la obtención de las facturas simuladas; las pruebas de la API de interacciones (9 casos), que verifican el registro de los mensajes provenientes de la plataforma de mensajería; las pruebas de servicios (19 casos) y de repositorios (18 casos), que cubren la lógica de negocio y el acceso a datos de manera aislada; las pruebas de autenticación (5 casos), que verifican el control de acceso mediante la clave de API; y las pruebas de métricas (4 casos), que validan los indicadores expuestos en el tablero. A este conjunto se suma una prueba de integración de extremo a extremo (1 caso), que verifica la comunicación entre capas mediante una solicitud completa. La Tabla 4 presenta el resumen de los escenarios de prueba y sus resultados.</w:t>
       </w:r>
     </w:p>
     <w:p>
@@ -5731,6 +6245,7 @@
               <w:rPr>
                 <w:sz w:val="18"/>
               </w:rPr>
+              <w:lastRenderedPageBreak/>
               <w:t>Servicios (lógica de negocio)</w:t>
             </w:r>
           </w:p>
@@ -6060,11 +6575,7 @@
     </w:p>
     <w:p>
       <w:r>
-        <w:t xml:space="preserve">El análisis del tiempo de respuesta del sistema constituye uno de los aspectos más relevantes de la evaluación de resultados, dado que este indicador condiciona </w:t>
-      </w:r>
-      <w:r>
-        <w:lastRenderedPageBreak/>
-        <w:t>directamente la experiencia del usuario en la interacción conversacional. Para su medición se ejecutan 30 solicitudes consecutivas por cada uno de los cinco endpoints principales de la API, en un entorno local de desarrollo, y se registran los tiempos de respuesta completos, es decir, desde el envío de la solicitud hasta la recepción de la respuesta.</w:t>
+        <w:t>El análisis del tiempo de respuesta del sistema constituye uno de los aspectos más relevantes de la evaluación de resultados, dado que este indicador condiciona directamente la experiencia del usuario en la interacción conversacional. Para su medición se ejecutan 30 solicitudes consecutivas por cada uno de los cinco endpoints principales de la API, en un entorno local de desarrollo, y se registran los tiempos de respuesta completos, es decir, desde el envío de la solicitud hasta la recepción de la respuesta.</w:t>
       </w:r>
     </w:p>
     <w:p>
@@ -6127,6 +6638,7 @@
                 <w:b/>
                 <w:sz w:val="18"/>
               </w:rPr>
+              <w:lastRenderedPageBreak/>
               <w:t>Operación</w:t>
             </w:r>
           </w:p>
@@ -6618,11 +7130,7 @@
     </w:p>
     <w:p>
       <w:r>
-        <w:t xml:space="preserve">La evaluación de la precisión en la interpretación de las intenciones del usuario constituye el aspecto más complejo y conceptualmente relevante del análisis de </w:t>
-      </w:r>
-      <w:r>
-        <w:lastRenderedPageBreak/>
-        <w:t>resultados, dado que determina la utilidad práctica del sistema como interfaz conversacional. En la presente implementación, la interpretación se realiza mediante reglas determinísticas de normalización y clasificación, por lo que la precisión puede verificarse de manera exhaustiva y no queda sujeta a la variabilidad de un modelo probabilístico.</w:t>
+        <w:t>La evaluación de la precisión en la interpretación de las intenciones del usuario constituye el aspecto más complejo y conceptualmente relevante del análisis de resultados, dado que determina la utilidad práctica del sistema como interfaz conversacional. En la presente implementación, la interpretación se realiza mediante reglas determinísticas de normalización y clasificación, por lo que la precisión puede verificarse de manera exhaustiva y no queda sujeta a la variabilidad de un modelo probabilístico.</w:t>
       </w:r>
     </w:p>
     <w:p>
@@ -6728,6 +7236,7 @@
               <w:rPr>
                 <w:sz w:val="18"/>
               </w:rPr>
+              <w:lastRenderedPageBreak/>
               <w:t>Menú principal</w:t>
             </w:r>
           </w:p>
@@ -7210,23 +7719,46 @@
         <w:pStyle w:val="Ttulo2"/>
       </w:pPr>
       <w:r>
+        <w:t>5.4 Estabilidad y robustez del sistema</w:t>
+      </w:r>
+    </w:p>
+    <w:p>
+      <w:r>
+        <w:t>La evaluación de la estabilidad del sistema se centra en la identificación de fallas y comportamientos inesperados durante la ejecución continuada de las pruebas y los flujos. Se verifica la tolerancia del sistema ante entradas inválidas, la consistencia del estado de la conversación a lo largo de múltiples mensajes y el comportamiento de los flujos de orquestación ante respuestas erróneas de los servicios externos.</w:t>
+      </w:r>
+    </w:p>
+    <w:p>
+      <w:r>
+        <w:t>Los resultados de esta evaluación muestran que el sistema presenta un comportamiento estable durante la ejecución de las pruebas: no se registraron fallas de ejecución ni terminaciones inesperadas de los flujos en los escenarios cubiertos. El manejo de errores en la capa de orquestación, previsto en la etapa de diseño, responde correctamente ante los casos de prueba que simulan productos sin stock, cantidades inválidas y mensajes no reconocidos, generando en todos los casos un mensaje de orientación hacia el usuario en lugar de un fallo silencioso.</w:t>
+      </w:r>
+    </w:p>
+    <w:p>
+      <w:r>
+        <w:t>Durante la implementación y las pruebas del flujo de orquestación se documentaron incidencias menores, correspondientes a limitaciones de la plataforma n8n en el entorno gratuito: demoras en la activación de los disparadores de Telegram y cortes ocasionales de la conexión con los servicios externos. Estas incidencias no afectan la lógica del sistema desarrollado, sino la disponibilidad del entorno de orquestación, y fueron mitigadas mediante el respaldo del registro de interacciones en una planilla de Google Sheets, que actúa como almacenamiento secundario tolerante a fallas.</w:t>
+      </w:r>
+    </w:p>
+    <w:p>
+      <w:pPr>
+        <w:pStyle w:val="Ttulo2"/>
+      </w:pPr>
+      <w:r>
+        <w:t>5.5 Persistencia y gestión de datos</w:t>
+      </w:r>
+    </w:p>
+    <w:p>
+      <w:r>
         <w:lastRenderedPageBreak/>
-        <w:t>5.4 Estabilidad y robustez del sistema</w:t>
-      </w:r>
-    </w:p>
-    <w:p>
-      <w:r>
-        <w:t>La evaluación de la estabilidad del sistema se centra en la identificación de fallas y comportamientos inesperados durante la ejecución continuada de las pruebas y los flujos. Se verifica la tolerancia del sistema ante entradas inválidas, la consistencia del estado de la conversación a lo largo de múltiples mensajes y el comportamiento de los flujos de orquestación ante respuestas erróneas de los servicios externos.</w:t>
-      </w:r>
-    </w:p>
-    <w:p>
-      <w:r>
-        <w:t>Los resultados de esta evaluación muestran que el sistema presenta un comportamiento estable durante la ejecución de las pruebas: no se registraron fallas de ejecución ni terminaciones inesperadas de los flujos en los escenarios cubiertos. El manejo de errores en la capa de orquestación, previsto en la etapa de diseño, responde correctamente ante los casos de prueba que simulan productos sin stock, cantidades inválidas y mensajes no reconocidos, generando en todos los casos un mensaje de orientación hacia el usuario en lugar de un fallo silencioso.</w:t>
-      </w:r>
-    </w:p>
-    <w:p>
-      <w:r>
-        <w:t>Durante la implementación y las pruebas del flujo de orquestación se documentaron incidencias menores, correspondientes a limitaciones de la plataforma n8n en el entorno gratuito: demoras en la activación de los disparadores de Telegram y cortes ocasionales de la conexión con los servicios externos. Estas incidencias no afectan la lógica del sistema desarrollado, sino la disponibilidad del entorno de orquestación, y fueron mitigadas mediante el respaldo del registro de interacciones en una planilla de Google Sheets, que actúa como almacenamiento secundario tolerante a fallas.</w:t>
+        <w:t>La evaluación del componente de persistencia de datos se centra en la verificación de la correcta ejecución de las operaciones de almacenamiento y recuperación de la información gestionada por el sistema: clientes, productos, productos asignados e interacciones. Las pruebas correspondientes cubren la totalidad de las operaciones CRUD expuestas por la API, tanto a nivel de rutas como de servicios y repositorios, verificando además las reglas de negocio asociadas.</w:t>
+      </w:r>
+    </w:p>
+    <w:p>
+      <w:r>
+        <w:t>Los resultados de esta evaluación muestran que el sistema es capaz de almacenar y recuperar información de manera consistente en las condiciones evaluadas. La creación de un cliente persiste el registro con un identificador único, su consulta devuelve los datos esperados, y las operaciones de actualización y eliminación modifican el estado de manera coherente con el diseño del modelo de datos. La asignación de productos a clientes se registra correctamente y la consulta de las facturas simuladas agrega los importes de manera exacta.</w:t>
+      </w:r>
+    </w:p>
+    <w:p>
+      <w:r>
+        <w:t>La solución de almacenamiento adoptada (un motor de base de datos relacional ligero embebido) cumple con los requisitos funcionales y de rendimiento del prototipo, como lo evidencian los tiempos de respuesta presentados en la sección 5.2. Sus limitaciones en cuanto a concurrencia y escalabilidad son conocidas y aceptadas para el alcance de esta investigación, y son discutidas en el capítulo siguiente como parte de las líneas de trabajo futuro.</w:t>
       </w:r>
     </w:p>
     <w:p>
@@ -7234,22 +7766,22 @@
         <w:pStyle w:val="Ttulo2"/>
       </w:pPr>
       <w:r>
-        <w:t>5.5 Persistencia y gestión de datos</w:t>
-      </w:r>
-    </w:p>
-    <w:p>
-      <w:r>
-        <w:t>La evaluación del componente de persistencia de datos se centra en la verificación de la correcta ejecución de las operaciones de almacenamiento y recuperación de la información gestionada por el sistema: clientes, productos, productos asignados e interacciones. Las pruebas correspondientes cubren la totalidad de las operaciones CRUD expuestas por la API, tanto a nivel de rutas como de servicios y repositorios, verificando además las reglas de negocio asociadas.</w:t>
-      </w:r>
-    </w:p>
-    <w:p>
-      <w:r>
-        <w:t>Los resultados de esta evaluación muestran que el sistema es capaz de almacenar y recuperar información de manera consistente en las condiciones evaluadas. La creación de un cliente persiste el registro con un identificador único, su consulta devuelve los datos esperados, y las operaciones de actualización y eliminación modifican el estado de manera coherente con el diseño del modelo de datos. La asignación de productos a clientes se registra correctamente y la consulta de las facturas simuladas agrega los importes de manera exacta.</w:t>
-      </w:r>
-    </w:p>
-    <w:p>
-      <w:r>
-        <w:t>La solución de almacenamiento adoptada (un motor de base de datos relacional ligero embebido) cumple con los requisitos funcionales y de rendimiento del prototipo, como lo evidencian los tiempos de respuesta presentados en la sección 5.2. Sus limitaciones en cuanto a concurrencia y escalabilidad son conocidas y aceptadas para el alcance de esta investigación, y son discutidas en el capítulo siguiente como parte de las líneas de trabajo futuro.</w:t>
+        <w:t>5.6 Síntesis de resultados</w:t>
+      </w:r>
+    </w:p>
+    <w:p>
+      <w:r>
+        <w:t>La síntesis de los resultados obtenidos en las distintas dimensiones de evaluación permite formular una valoración integral del sistema desarrollado. En el plano funcional, la suite de 128 pruebas automatizadas evidencia que la API cumple con la totalidad de los requisitos funcionales definidos, y los escenarios de interacción conversacional verifican la ejecución correcta de los flujos del bot en las rutas cubiertas por las reglas de interpretación.</w:t>
+      </w:r>
+    </w:p>
+    <w:p>
+      <w:r>
+        <w:t>En el plano del rendimiento, los tiempos de respuesta medidos se encuentran por debajo de los umbrales perceptibles para la interacción conversacional, con promedios que van de 2,76 ms para la consulta de detalle a 13,94 ms para el registro de interacciones. En el plano de la interpretación, el enfoque determinístico garantiza una precisión del 100% en las rutas definidas y un comportamiento de fallo controlado y predecible ante las entradas no previstas.</w:t>
+      </w:r>
+    </w:p>
+    <w:p>
+      <w:r>
+        <w:t>Al mismo tiempo, la evaluación permite identificar un conjunto de limitaciones que delimitan el alcance del modelo propuesto y orientan las líneas de trabajo futuro: la cobertura de la interpretación queda restringida al catálogo de intenciones predefinido, la solución de persistencia ligera presenta límites de concurrencia, y la disponibilidad del entorno de orquestación gratuito introduce incidencias menores documentadas. Estas limitaciones, junto con las implicancias generales del estudio, se discuten en el capítulo siguiente.</w:t>
       </w:r>
     </w:p>
     <w:p>
@@ -7257,26 +7789,531 @@
         <w:pStyle w:val="Ttulo2"/>
       </w:pPr>
       <w:r>
-        <w:t>5.6 Síntesis de resultados</w:t>
-      </w:r>
-    </w:p>
-    <w:p>
-      <w:r>
-        <w:lastRenderedPageBreak/>
-        <w:t>La síntesis de los resultados obtenidos en las distintas dimensiones de evaluación permite formular una valoración integral del sistema desarrollado. En el plano funcional, la suite de 128 pruebas automatizadas evidencia que la API cumple con la totalidad de los requisitos funcionales definidos, y los escenarios de interacción conversacional verifican la ejecución correcta de los flujos del bot en las rutas cubiertas por las reglas de interpretación.</w:t>
-      </w:r>
-    </w:p>
-    <w:p>
-      <w:r>
-        <w:t>En el plano del rendimiento, los tiempos de respuesta medidos se encuentran por debajo de los umbrales perceptibles para la interacción conversacional, con promedios que van de 2,76 ms para la consulta de detalle a 13,94 ms para el registro de interacciones. En el plano de la interpretación, el enfoque determinístico garantiza una precisión del 100% en las rutas definidas y un comportamiento de fallo controlado y predecible ante las entradas no previstas.</w:t>
-      </w:r>
-    </w:p>
-    <w:p>
-      <w:r>
-        <w:t>Al mismo tiempo, la evaluación permite identificar un conjunto de limitaciones que delimitan el alcance del modelo propuesto y orientan las líneas de trabajo futuro: la cobertura de la interpretación queda restringida al catálogo de intenciones predefinido, la solución de persistencia ligera presenta límites de concurrencia, y la disponibilidad del entorno de orquestación gratuito introduce incidencias menores documentadas. Estas limitaciones, junto con las implicancias generales del estudio, se discuten en el capítulo siguiente.</w:t>
+        <w:t xml:space="preserve">5.7 Análisis de casos límite</w:t>
       </w:r>
     </w:p>
     <w:p/>
+    <w:p>
+      <w:pPr>
+        <w:pStyle w:val="Normal"/>
+      </w:pPr>
+      <w:r>
+        <w:t xml:space="preserve">Aunque la evaluación reportada en las secciones precedentes demuestra una precisión del 100 % sobre el catálogo predefinido de intenciones, es necesario examinar el comportamiento del sistema ante entradas que exceden los casos cubiertos por las reglas de interpretación. Los siguientes casos límite ilustran situaciones en las que el mecanismo de pattern matching del Bot Router no alcanza a clasificar la intención del usuario de manera adecuada. Estos escenarios no fueron incluidos en la suite principal de pruebas porque corresponden a patrones de uso no contemplados en el catálogo de intenciones, pero su análisis permite delimitar con precisión el alcance real del modelo de interpretación implementado.</w:t>
+      </w:r>
+    </w:p>
+    <w:p/>
+    <w:p>
+      <w:pPr>
+        <w:pStyle w:val="Normal"/>
+      </w:pPr>
+      <w:r>
+        <w:t xml:space="preserve">Tabla 7. Análisis de casos límite del Bot Router: entradas que revelan limitaciones del enfoque determinístico.</w:t>
+      </w:r>
+    </w:p>
+    <w:p/>
+    <w:tbl>
+      <w:tblPr>
+        <w:tblStyle w:val="TableNormal"/>
+        <w:tblpPr/>
+        <w:tblOverlap w:val="never"/>
+        <w:tblW w:w="0" w:type="auto"/>
+        <w:tblInd w:w="0" w:type="dxa"/>
+        <w:tblBorders>
+          <w:top w:val="single" w:sz="4" w:space="0" w:color="auto"/>
+          <w:left w:val="single" w:sz="4" w:space="0" w:color="auto"/>
+          <w:bottom w:val="single" w:sz="4" w:space="0" w:color="auto"/>
+          <w:right w:val="single" w:sz="4" w:space="0" w:color="auto"/>
+          <w:insideH w:val="single" w:sz="4" w:space="0" w:color="auto"/>
+          <w:insideV w:val="single" w:sz="4" w:space="0" w:color="auto"/>
+        </w:tblBorders>
+        <w:tblLook w:val="04a0" w:firstRow="1" w:lastRow="0" w:firstColumn="1" w:lastColumn="0" w:noHBand="0" w:noVBand="1"/>
+      </w:tblPr>
+      <w:tblGrid>
+        <w:gridCol w:w="600"/>
+        <w:gridCol w:w="1500"/>
+        <w:gridCol w:w="1300"/>
+        <w:gridCol w:w="1500"/>
+        <w:gridCol w:w="800"/>
+        <w:gridCol w:w="3300"/>
+      </w:tblGrid>
+      <w:tr>
+        <w:tc>
+          <w:tcPr>
+            <w:tcW w:w="0" w:type="auto"/>
+            <w:vAlign w:val="center"/>
+          </w:tcPr>
+          <w:p>
+            <w:pPr>
+              <w:spacing w:before="0" w:after="0" w:line="240" w:lineRule="auto"/>
+            </w:pPr>
+            <w:r>
+              <w:rPr>
+                <w:b/>
+                <w:sz w:val="180"/>
+                <w:szCs w:val="180"/>
+              </w:rPr>
+              <w:t xml:space="preserve">Caso</w:t>
+            </w:r>
+          </w:p>
+        </w:tc>
+        <w:tc>
+          <w:tcPr>
+            <w:tcW w:w="0" w:type="auto"/>
+            <w:vAlign w:val="center"/>
+          </w:tcPr>
+          <w:p>
+            <w:pPr>
+              <w:spacing w:before="0" w:after="0" w:line="240" w:lineRule="auto"/>
+            </w:pPr>
+            <w:r>
+              <w:rPr>
+                <w:b/>
+                <w:sz w:val="180"/>
+                <w:szCs w:val="180"/>
+              </w:rPr>
+              <w:t xml:space="preserve">Input del usuario</w:t>
+            </w:r>
+          </w:p>
+        </w:tc>
+        <w:tc>
+          <w:tcPr>
+            <w:tcW w:w="0" w:type="auto"/>
+            <w:vAlign w:val="center"/>
+          </w:tcPr>
+          <w:p>
+            <w:pPr>
+              <w:spacing w:before="0" w:after="0" w:line="240" w:lineRule="auto"/>
+            </w:pPr>
+            <w:r>
+              <w:rPr>
+                <w:b/>
+                <w:sz w:val="180"/>
+                <w:szCs w:val="180"/>
+              </w:rPr>
+              <w:t xml:space="preserve">Intención esperada</w:t>
+            </w:r>
+          </w:p>
+        </w:tc>
+        <w:tc>
+          <w:tcPr>
+            <w:tcW w:w="0" w:type="auto"/>
+            <w:vAlign w:val="center"/>
+          </w:tcPr>
+          <w:p>
+            <w:pPr>
+              <w:spacing w:before="0" w:after="0" w:line="240" w:lineRule="auto"/>
+            </w:pPr>
+            <w:r>
+              <w:rPr>
+                <w:b/>
+                <w:sz w:val="180"/>
+                <w:szCs w:val="180"/>
+              </w:rPr>
+              <w:t xml:space="preserve">Intención detectada</w:t>
+            </w:r>
+          </w:p>
+        </w:tc>
+        <w:tc>
+          <w:tcPr>
+            <w:tcW w:w="0" w:type="auto"/>
+            <w:vAlign w:val="center"/>
+          </w:tcPr>
+          <w:p>
+            <w:pPr>
+              <w:spacing w:before="0" w:after="0" w:line="240" w:lineRule="auto"/>
+            </w:pPr>
+            <w:r>
+              <w:rPr>
+                <w:b/>
+                <w:sz w:val="180"/>
+                <w:szCs w:val="180"/>
+              </w:rPr>
+              <w:t xml:space="preserve">Precisión</w:t>
+            </w:r>
+          </w:p>
+        </w:tc>
+        <w:tc>
+          <w:tcPr>
+            <w:tcW w:w="0" w:type="auto"/>
+            <w:vAlign w:val="center"/>
+          </w:tcPr>
+          <w:p>
+            <w:pPr>
+              <w:spacing w:before="0" w:after="0" w:line="240" w:lineRule="auto"/>
+            </w:pPr>
+            <w:r>
+              <w:rPr>
+                <w:b/>
+                <w:sz w:val="180"/>
+                <w:szCs w:val="180"/>
+              </w:rPr>
+              <w:t xml:space="preserve">Observación</w:t>
+            </w:r>
+          </w:p>
+        </w:tc>
+      </w:tr>
+      <w:tr>
+        <w:tc>
+          <w:tcPr>
+            <w:tcW w:w="0" w:type="auto"/>
+            <w:vAlign w:val="center"/>
+          </w:tcPr>
+          <w:p>
+            <w:pPr>
+              <w:spacing w:before="0" w:after="0" w:line="240" w:lineRule="auto"/>
+            </w:pPr>
+            <w:r>
+              <w:rPr>
+                <w:sz w:val="180"/>
+                <w:szCs w:val="180"/>
+              </w:rPr>
+              <w:t xml:space="preserve">1</w:t>
+            </w:r>
+          </w:p>
+        </w:tc>
+        <w:tc>
+          <w:tcPr>
+            <w:tcW w:w="0" w:type="auto"/>
+            <w:vAlign w:val="center"/>
+          </w:tcPr>
+          <w:p>
+            <w:pPr>
+              <w:spacing w:before="0" w:after="0" w:line="240" w:lineRule="auto"/>
+            </w:pPr>
+            <w:r>
+              <w:rPr>
+                <w:sz w:val="180"/>
+                <w:szCs w:val="180"/>
+              </w:rPr>
+              <w:t xml:space="preserve">“Quiero comprar jabón”</w:t>
+            </w:r>
+          </w:p>
+        </w:tc>
+        <w:tc>
+          <w:tcPr>
+            <w:tcW w:w="0" w:type="auto"/>
+            <w:vAlign w:val="center"/>
+          </w:tcPr>
+          <w:p>
+            <w:pPr>
+              <w:spacing w:before="0" w:after="0" w:line="240" w:lineRule="auto"/>
+            </w:pPr>
+            <w:r>
+              <w:rPr>
+                <w:sz w:val="180"/>
+                <w:szCs w:val="180"/>
+              </w:rPr>
+              <w:t xml:space="preserve">Compra</w:t>
+            </w:r>
+          </w:p>
+        </w:tc>
+        <w:tc>
+          <w:tcPr>
+            <w:tcW w:w="0" w:type="auto"/>
+            <w:vAlign w:val="center"/>
+          </w:tcPr>
+          <w:p>
+            <w:pPr>
+              <w:spacing w:before="0" w:after="0" w:line="240" w:lineRule="auto"/>
+            </w:pPr>
+            <w:r>
+              <w:rPr>
+                <w:sz w:val="180"/>
+                <w:szCs w:val="180"/>
+              </w:rPr>
+              <w:t xml:space="preserve">Menú (fallback)</w:t>
+            </w:r>
+          </w:p>
+        </w:tc>
+        <w:tc>
+          <w:tcPr>
+            <w:tcW w:w="0" w:type="auto"/>
+            <w:vAlign w:val="center"/>
+          </w:tcPr>
+          <w:p>
+            <w:pPr>
+              <w:spacing w:before="0" w:after="0" w:line="240" w:lineRule="auto"/>
+            </w:pPr>
+            <w:r>
+              <w:rPr>
+                <w:sz w:val="180"/>
+                <w:szCs w:val="180"/>
+              </w:rPr>
+              <w:t xml:space="preserve">0 %</w:t>
+            </w:r>
+          </w:p>
+        </w:tc>
+        <w:tc>
+          <w:tcPr>
+            <w:tcW w:w="0" w:type="auto"/>
+            <w:vAlign w:val="center"/>
+          </w:tcPr>
+          <w:p>
+            <w:pPr>
+              <w:spacing w:before="0" w:after="0" w:line="240" w:lineRule="auto"/>
+            </w:pPr>
+            <w:r>
+              <w:rPr>
+                <w:sz w:val="180"/>
+                <w:szCs w:val="180"/>
+              </w:rPr>
+              <w:t xml:space="preserve">Lenguaje natural no matchea patrones predefinidos</w:t>
+            </w:r>
+          </w:p>
+        </w:tc>
+      </w:tr>
+      <w:tr>
+        <w:tc>
+          <w:tcPr>
+            <w:tcW w:w="0" w:type="auto"/>
+            <w:vAlign w:val="center"/>
+          </w:tcPr>
+          <w:p>
+            <w:pPr>
+              <w:spacing w:before="0" w:after="0" w:line="240" w:lineRule="auto"/>
+            </w:pPr>
+            <w:r>
+              <w:rPr>
+                <w:sz w:val="180"/>
+                <w:szCs w:val="180"/>
+              </w:rPr>
+              <w:t xml:space="preserve">2</w:t>
+            </w:r>
+          </w:p>
+        </w:tc>
+        <w:tc>
+          <w:tcPr>
+            <w:tcW w:w="0" w:type="auto"/>
+            <w:vAlign w:val="center"/>
+          </w:tcPr>
+          <w:p>
+            <w:pPr>
+              <w:spacing w:before="0" w:after="0" w:line="240" w:lineRule="auto"/>
+            </w:pPr>
+            <w:r>
+              <w:rPr>
+                <w:sz w:val="180"/>
+                <w:szCs w:val="180"/>
+              </w:rPr>
+              <w:t xml:space="preserve">“HOLA!”</w:t>
+            </w:r>
+          </w:p>
+        </w:tc>
+        <w:tc>
+          <w:tcPr>
+            <w:tcW w:w="0" w:type="auto"/>
+            <w:vAlign w:val="center"/>
+          </w:tcPr>
+          <w:p>
+            <w:pPr>
+              <w:spacing w:before="0" w:after="0" w:line="240" w:lineRule="auto"/>
+            </w:pPr>
+            <w:r>
+              <w:rPr>
+                <w:sz w:val="180"/>
+                <w:szCs w:val="180"/>
+              </w:rPr>
+              <w:t xml:space="preserve">Menú</w:t>
+            </w:r>
+          </w:p>
+        </w:tc>
+        <w:tc>
+          <w:tcPr>
+            <w:tcW w:w="0" w:type="auto"/>
+            <w:vAlign w:val="center"/>
+          </w:tcPr>
+          <w:p>
+            <w:pPr>
+              <w:spacing w:before="0" w:after="0" w:line="240" w:lineRule="auto"/>
+            </w:pPr>
+            <w:r>
+              <w:rPr>
+                <w:sz w:val="180"/>
+                <w:szCs w:val="180"/>
+              </w:rPr>
+              <w:t xml:space="preserve">Menú (fallback)</w:t>
+            </w:r>
+          </w:p>
+        </w:tc>
+        <w:tc>
+          <w:tcPr>
+            <w:tcW w:w="0" w:type="auto"/>
+            <w:vAlign w:val="center"/>
+          </w:tcPr>
+          <w:p>
+            <w:pPr>
+              <w:spacing w:before="0" w:after="0" w:line="240" w:lineRule="auto"/>
+            </w:pPr>
+            <w:r>
+              <w:rPr>
+                <w:sz w:val="180"/>
+                <w:szCs w:val="180"/>
+              </w:rPr>
+              <w:t xml:space="preserve">100 %*</w:t>
+            </w:r>
+          </w:p>
+        </w:tc>
+        <w:tc>
+          <w:tcPr>
+            <w:tcW w:w="0" w:type="auto"/>
+            <w:vAlign w:val="center"/>
+          </w:tcPr>
+          <w:p>
+            <w:pPr>
+              <w:spacing w:before="0" w:after="0" w:line="240" w:lineRule="auto"/>
+            </w:pPr>
+            <w:r>
+              <w:rPr>
+                <w:sz w:val="180"/>
+                <w:szCs w:val="180"/>
+              </w:rPr>
+              <w:t xml:space="preserve">Puntuación impide match exacto; resuelto por caso por defecto</w:t>
+            </w:r>
+          </w:p>
+        </w:tc>
+      </w:tr>
+      <w:tr>
+        <w:tc>
+          <w:tcPr>
+            <w:tcW w:w="0" w:type="auto"/>
+            <w:vAlign w:val="center"/>
+          </w:tcPr>
+          <w:p>
+            <w:pPr>
+              <w:spacing w:before="0" w:after="0" w:line="240" w:lineRule="auto"/>
+            </w:pPr>
+            <w:r>
+              <w:rPr>
+                <w:sz w:val="180"/>
+                <w:szCs w:val="180"/>
+              </w:rPr>
+              <w:t xml:space="preserve">3</w:t>
+            </w:r>
+          </w:p>
+        </w:tc>
+        <w:tc>
+          <w:tcPr>
+            <w:tcW w:w="0" w:type="auto"/>
+            <w:vAlign w:val="center"/>
+          </w:tcPr>
+          <w:p>
+            <w:pPr>
+              <w:spacing w:before="0" w:after="0" w:line="240" w:lineRule="auto"/>
+            </w:pPr>
+            <w:r>
+              <w:rPr>
+                <w:sz w:val="180"/>
+                <w:szCs w:val="180"/>
+              </w:rPr>
+              <w:t xml:space="preserve">“5” (catálogo con 3 productos)</w:t>
+            </w:r>
+          </w:p>
+        </w:tc>
+        <w:tc>
+          <w:tcPr>
+            <w:tcW w:w="0" w:type="auto"/>
+            <w:vAlign w:val="center"/>
+          </w:tcPr>
+          <w:p>
+            <w:pPr>
+              <w:spacing w:before="0" w:after="0" w:line="240" w:lineRule="auto"/>
+            </w:pPr>
+            <w:r>
+              <w:rPr>
+                <w:sz w:val="180"/>
+                <w:szCs w:val="180"/>
+              </w:rPr>
+              <w:t xml:space="preserve">Seleccionar producto</w:t>
+            </w:r>
+          </w:p>
+        </w:tc>
+        <w:tc>
+          <w:tcPr>
+            <w:tcW w:w="0" w:type="auto"/>
+            <w:vAlign w:val="center"/>
+          </w:tcPr>
+          <w:p>
+            <w:pPr>
+              <w:spacing w:before="0" w:after="0" w:line="240" w:lineRule="auto"/>
+            </w:pPr>
+            <w:r>
+              <w:rPr>
+                <w:sz w:val="180"/>
+                <w:szCs w:val="180"/>
+              </w:rPr>
+              <w:t xml:space="preserve">Menú (fallback)</w:t>
+            </w:r>
+          </w:p>
+        </w:tc>
+        <w:tc>
+          <w:tcPr>
+            <w:tcW w:w="0" w:type="auto"/>
+            <w:vAlign w:val="center"/>
+          </w:tcPr>
+          <w:p>
+            <w:pPr>
+              <w:spacing w:before="0" w:after="0" w:line="240" w:lineRule="auto"/>
+            </w:pPr>
+            <w:r>
+              <w:rPr>
+                <w:sz w:val="180"/>
+                <w:szCs w:val="180"/>
+              </w:rPr>
+              <w:t xml:space="preserve">0 %</w:t>
+            </w:r>
+          </w:p>
+        </w:tc>
+        <w:tc>
+          <w:tcPr>
+            <w:tcW w:w="0" w:type="auto"/>
+            <w:vAlign w:val="center"/>
+          </w:tcPr>
+          <w:p>
+            <w:pPr>
+              <w:spacing w:before="0" w:after="0" w:line="240" w:lineRule="auto"/>
+            </w:pPr>
+            <w:r>
+              <w:rPr>
+                <w:sz w:val="180"/>
+                <w:szCs w:val="180"/>
+              </w:rPr>
+              <w:t xml:space="preserve">Fuera de rango del catálogo disponible</w:t>
+            </w:r>
+          </w:p>
+        </w:tc>
+      </w:tr>
+    </w:tbl>
+    <w:p>
+      <w:pPr>
+        <w:pStyle w:val="Normal"/>
+      </w:pPr>
+      <w:r>
+        <w:rPr>
+          <w:i/>
+          <w:sz w:val="16"/>
+          <w:szCs w:val="16"/>
+        </w:rPr>
+        <w:t xml:space="preserve">* Precisión correcta por coincidencia, no por detección adecuada. El sistema resuelve la intención por el caso por defecto, no por un match exitoso del patrón.</w:t>
+      </w:r>
+    </w:p>
+    <w:p/>
+    <w:p>
+      <w:pPr>
+        <w:pStyle w:val="Normal"/>
+      </w:pPr>
+      <w:r>
+        <w:t xml:space="preserve">Estas limitaciones son inherentes al diseño del sistema: al tratarse de un intérprete determinístico basado en reglas de pattern matching, el Bot Router no posee capacidad de generalización semántica. Cada entrada debe ajustarse a un patrón predefinido para ser clasificada correctamente. El caso 2 evidencia una coincidencia fortuita: aunque la clasificación es correcta, el mecanismo de detección no funciona como se espera, ya que la puntuación impide el match exacto y la intención se resuelve por el caso por defecto. Este tipo de comportamiento, aunque funcional en el corto plazo, representa un riesgo en escenarios donde la intención por defecto pudiera diferir de la intención del usuario.</w:t>
+      </w:r>
+    </w:p>
+    <w:p/>
+    <w:p>
+      <w:pPr>
+        <w:pStyle w:val="Normal"/>
+      </w:pPr>
+      <w:r>
+        <w:t xml:space="preserve">Estas limitaciones del enfoque determinístico refuerzan la pertinencia de las líneas de mejora propuestas en el Capítulo 8, particularmente la integración de modelos de lenguaje natural (NLP/LLM) como capa de interpretación semántica. La incorporación de un modelo de clasificación de intenciones basado en aprendizaje automático permitiría superar las restricciones del matcheo por patrones exactos, habilitando la comprensión de solicitudes en lenguaje natural y la validación contextual de selecciones fuera de rango.</w:t>
+      </w:r>
+    </w:p>
     <w:p>
       <w:pPr>
         <w:pStyle w:val="Ttulo1"/>
@@ -7294,6 +8331,7 @@
         <w:pStyle w:val="Ttulo2"/>
       </w:pPr>
       <w:r>
+        <w:lastRenderedPageBreak/>
         <w:t>6.1 Interpretación de los resultados en el marco teórico</w:t>
       </w:r>
     </w:p>
@@ -7314,31 +8352,31 @@
         <w:jc w:val="both"/>
       </w:pPr>
       <w:r>
-        <w:t xml:space="preserve">La capacidad del sistema para coordinar la interacción entre múltiples componentes heterogéneos —la plataforma de orquestación, el componente de interpretación de solicitudes, los servicios externos y el sistema de almacenamiento— sin que los errores en uno de ellos comprometan el funcionamiento de los demás </w:t>
+        <w:t>La capacidad del sistema para coordinar la interacción entre múltiples componentes heterogéneos —la plataforma de orquestación, el componente de interpretación de solicitudes, los servicios externos y el sistema de almacenamiento— sin que los errores en uno de ellos comprometan el funcionamiento de los demás valida empíricamente los principios teóricos que fundamentan este enfoque arquitectónico.</w:t>
+      </w:r>
+    </w:p>
+    <w:p>
+      <w:pPr>
+        <w:spacing w:after="200" w:line="360" w:lineRule="auto"/>
+        <w:ind w:firstLine="720"/>
+        <w:jc w:val="both"/>
+      </w:pPr>
+      <w:r>
+        <w:t>Este hallazgo es coherente con los postulados de Newman (2015) sobre las arquitecturas de microservicios y con los principios de integración de sistemas formulados por Hohpe y Woolf (2003). La modularidad del sistema facilita su comprensión, su mantenimiento y su evolución, al tiempo que reduce la complejidad de las decisiones de diseño al permitir que cada componente sea considerado de manera relativamente independiente. Sin embargo, la implementación también revela que el desacoplamiento tiene un costo en términos de complejidad operativa: la coordinación entre componentes independientes requiere mecanismos de manejo de errores más sofisticados y hace más difícil la trazabilidad de los procesos.</w:t>
+      </w:r>
+    </w:p>
+    <w:p>
+      <w:pPr>
+        <w:spacing w:after="200" w:line="360" w:lineRule="auto"/>
+        <w:ind w:firstLine="720"/>
+        <w:jc w:val="both"/>
+      </w:pPr>
+      <w:r>
+        <w:t xml:space="preserve">El segundo resultado de particular relevancia teórica es el relacionado con el componente de interpretación de lenguaje natural. Los resultados demuestran que la implementación de este componente mediante reglas determinísticas de normalización y clasificación de intenciones permite alcanzar un comportamiento predecible y verificable, con una precisión del 100% en las rutas cubiertas, validando </w:t>
       </w:r>
       <w:r>
         <w:lastRenderedPageBreak/>
-        <w:t>valida empíricamente los principios teóricos que fundamentan este enfoque arquitectónico.</w:t>
-      </w:r>
-    </w:p>
-    <w:p>
-      <w:pPr>
-        <w:spacing w:after="200" w:line="360" w:lineRule="auto"/>
-        <w:ind w:firstLine="720"/>
-        <w:jc w:val="both"/>
-      </w:pPr>
-      <w:r>
-        <w:t>Este hallazgo es coherente con los postulados de Newman (2015) sobre las arquitecturas de microservicios y con los principios de integración de sistemas formulados por Hohpe y Woolf (2003). La modularidad del sistema facilita su comprensión, su mantenimiento y su evolución, al tiempo que reduce la complejidad de las decisiones de diseño al permitir que cada componente sea considerado de manera relativamente independiente. Sin embargo, la implementación también revela que el desacoplamiento tiene un costo en términos de complejidad operativa: la coordinación entre componentes independientes requiere mecanismos de manejo de errores más sofisticados y hace más difícil la trazabilidad de los procesos.</w:t>
-      </w:r>
-    </w:p>
-    <w:p>
-      <w:pPr>
-        <w:spacing w:after="200" w:line="360" w:lineRule="auto"/>
-        <w:ind w:firstLine="720"/>
-        <w:jc w:val="both"/>
-      </w:pPr>
-      <w:r>
-        <w:t>El segundo resultado de particular relevancia teórica es el relacionado con el componente de interpretación de lenguaje natural. Los resultados demuestran que la implementación de este componente mediante reglas determinísticas de normalización y clasificación de intenciones permite alcanzar un comportamiento predecible y verificable, con una precisión del 100% en las rutas cubiertas, validando los postulados de Russell y Norvig (2021) sobre la adecuación de los enfoques basados en reglas para dominios acotados. La discusión sobre la incorporación de modelos de lenguaje de gran escala queda planteada en términos de extensión futura: la variabilidad del comportamiento ante entradas similares y la dependencia de servicios externos que estos modelos introducen constituyen restricciones que el diseñador de sistemas de automatización debe considerar y gestionar explícitamente.</w:t>
+        <w:t>los postulados de Russell y Norvig (2021) sobre la adecuación de los enfoques basados en reglas para dominios acotados. La discusión sobre la incorporación de modelos de lenguaje de gran escala queda planteada en términos de extensión futura: la variabilidad del comportamiento ante entradas similares y la dependencia de servicios externos que estos modelos introducen constituyen restricciones que el diseñador de sistemas de automatización debe considerar y gestionar explícitamente.</w:t>
       </w:r>
     </w:p>
     <w:p>
@@ -7356,31 +8394,31 @@
         <w:jc w:val="both"/>
       </w:pPr>
       <w:r>
-        <w:t xml:space="preserve">Uno de los aportes conceptuales más significativos del presente trabajo es la identificación y caracterización de una tensión estructural que atraviesa el diseño de sistemas de automatización en entornos de bajo costo: la tensión entre costo, capacidad y control. Esta tensión no es exclusiva del contexto estudiado, sino que constituye una constante en el diseño de sistemas tecnológicos, pero adquiere </w:t>
+        <w:t>Uno de los aportes conceptuales más significativos del presente trabajo es la identificación y caracterización de una tensión estructural que atraviesa el diseño de sistemas de automatización en entornos de bajo costo: la tensión entre costo, capacidad y control. Esta tensión no es exclusiva del contexto estudiado, sino que constituye una constante en el diseño de sistemas tecnológicos, pero adquiere características particulares en el contexto de los sistemas de automatización que incorporan componentes de inteligencia artificial.</w:t>
+      </w:r>
+    </w:p>
+    <w:p>
+      <w:pPr>
+        <w:spacing w:after="200" w:line="360" w:lineRule="auto"/>
+        <w:ind w:firstLine="720"/>
+        <w:jc w:val="both"/>
+      </w:pPr>
+      <w:r>
+        <w:t>La dimensión del costo refiere a los recursos económicos y computacionales necesarios para la construcción, el despliegue y el mantenimiento del sistema. En el contexto de la presente investigación, la minimización del costo es una restricción explícita que orienta todas las decisiones de diseño: se prioriza el uso de herramientas de código abierto, servicios con modelos de precios basados en el consumo y soluciones que pueden ser operadas en infraestructuras de bajo costo. Esta restricción condiciona directamente las opciones disponibles en las otras dos dimensiones.</w:t>
+      </w:r>
+    </w:p>
+    <w:p>
+      <w:pPr>
+        <w:spacing w:after="200" w:line="360" w:lineRule="auto"/>
+        <w:ind w:firstLine="720"/>
+        <w:jc w:val="both"/>
+      </w:pPr>
+      <w:r>
+        <w:t>La dimensión de la capacidad refiere al alcance funcional del sistema, es decir, al conjunto de tareas que el sistema es capaz de realizar y al nivel de calidad con que las realiza. En el sistema desarrollado, la incorporación del componente de inteligencia artificial es la decisión de diseño que más contribuye a ampliar la capacidad del sistema, al introducir la posibilidad de procesar lenguaje natural de manera flexible. Sin embargo, el uso de un modelo de lenguaje de gran escala a través de una API introduce un costo significativo en términos económicos —</w:t>
       </w:r>
       <w:r>
         <w:lastRenderedPageBreak/>
-        <w:t>características particulares en el contexto de los sistemas de automatización que incorporan componentes de inteligencia artificial.</w:t>
-      </w:r>
-    </w:p>
-    <w:p>
-      <w:pPr>
-        <w:spacing w:after="200" w:line="360" w:lineRule="auto"/>
-        <w:ind w:firstLine="720"/>
-        <w:jc w:val="both"/>
-      </w:pPr>
-      <w:r>
-        <w:t>La dimensión del costo refiere a los recursos económicos y computacionales necesarios para la construcción, el despliegue y el mantenimiento del sistema. En el contexto de la presente investigación, la minimización del costo es una restricción explícita que orienta todas las decisiones de diseño: se prioriza el uso de herramientas de código abierto, servicios con modelos de precios basados en el consumo y soluciones que pueden ser operadas en infraestructuras de bajo costo. Esta restricción condiciona directamente las opciones disponibles en las otras dos dimensiones.</w:t>
-      </w:r>
-    </w:p>
-    <w:p>
-      <w:pPr>
-        <w:spacing w:after="200" w:line="360" w:lineRule="auto"/>
-        <w:ind w:firstLine="720"/>
-        <w:jc w:val="both"/>
-      </w:pPr>
-      <w:r>
-        <w:t>La dimensión de la capacidad refiere al alcance funcional del sistema, es decir, al conjunto de tareas que el sistema es capaz de realizar y al nivel de calidad con que las realiza. En el sistema desarrollado, la incorporación del componente de inteligencia artificial es la decisión de diseño que más contribuye a ampliar la capacidad del sistema, al introducir la posibilidad de procesar lenguaje natural de manera flexible. Sin embargo, el uso de un modelo de lenguaje de gran escala a través de una API introduce un costo significativo en términos económicos —cuantificable en el costo por solicitud— y computacionales —manifestado en la latencia del componente.</w:t>
+        <w:t>cuantificable en el costo por solicitud— y computacionales —manifestado en la latencia del componente.</w:t>
       </w:r>
     </w:p>
     <w:p>
@@ -7400,8 +8438,56 @@
         <w:jc w:val="both"/>
       </w:pPr>
       <w:r>
+        <w:t>La gestión de esta tensión no consiste en la eliminación de alguna de sus dimensiones, lo cual resultaría imposible, sino en la adopción de compromisos explícitos y fundamentados entre ellas. El sistema desarrollado representa una opción específica dentro del espacio de compromiso definido por esta tensión: prioriza la accesibilidad económica y la amplitud de capacidades, aceptando un nivel de control reducido como consecuencia de la incorporación del componente de inteligencia artificial. Esta opción puede no ser la más adecuada para todos los contextos posibles, pero se adapta bien a los requisitos del entorno considerado en la investigación.</w:t>
+      </w:r>
+    </w:p>
+    <w:p>
+      <w:pPr>
+        <w:pStyle w:val="Ttulo2"/>
+      </w:pPr>
+      <w:r>
+        <w:t>6.3 El modelo híbrido de automatización</w:t>
+      </w:r>
+    </w:p>
+    <w:p>
+      <w:pPr>
+        <w:spacing w:after="200" w:line="360" w:lineRule="auto"/>
+        <w:ind w:firstLine="720"/>
+        <w:jc w:val="both"/>
+      </w:pPr>
+      <w:r>
+        <w:t>Uno de los aportes más relevantes de la presente investigación en términos conceptuales es la formulación de un modelo híbrido de automatización, en el cual se integran de manera coherente componentes determinísticos y componentes adaptativos. Este modelo trasciende la dicotomía tradicional entre sistemas de automatización basados en reglas, que ofrecen control y predictibilidad, y sistemas basados en inteligencia artificial, que ofrecen flexibilidad y adaptabilidad, proponiendo una arquitectura que combina las ventajas de ambos paradigmas.</w:t>
+      </w:r>
+    </w:p>
+    <w:p>
+      <w:pPr>
+        <w:spacing w:after="200" w:line="360" w:lineRule="auto"/>
+        <w:ind w:firstLine="720"/>
+        <w:jc w:val="both"/>
+      </w:pPr>
+      <w:r>
         <w:lastRenderedPageBreak/>
-        <w:t>La gestión de esta tensión no consiste en la eliminación de alguna de sus dimensiones, lo cual resultaría imposible, sino en la adopción de compromisos explícitos y fundamentados entre ellas. El sistema desarrollado representa una opción específica dentro del espacio de compromiso definido por esta tensión: prioriza la accesibilidad económica y la amplitud de capacidades, aceptando un nivel de control reducido como consecuencia de la incorporación del componente de inteligencia artificial. Esta opción puede no ser la más adecuada para todos los contextos posibles, pero se adapta bien a los requisitos del entorno considerado en la investigación.</w:t>
+        <w:t>En el modelo híbrido propuesto, los componentes determinísticos son responsables de la ejecución de los flujos de automatización predefinidos, de la integración con los servicios externos y de la gestión de la persistencia de datos. Estos componentes operan bajo reglas explícitas que garantizan un comportamiento predecible y verificable. Los componentes adaptativos, por su parte, son responsables de la interpretación del lenguaje natural del usuario y de la generación de respuestas contextualmente coherentes, aprovechando las capacidades de los modelos de lenguaje de gran escala.</w:t>
+      </w:r>
+    </w:p>
+    <w:p>
+      <w:pPr>
+        <w:spacing w:after="200" w:line="360" w:lineRule="auto"/>
+        <w:ind w:firstLine="720"/>
+        <w:jc w:val="both"/>
+      </w:pPr>
+      <w:r>
+        <w:t>La interfaz entre ambos tipos de componentes es el punto crítico del modelo híbrido. La conversión de la salida probabilística del componente adaptativo en instrucciones determinísticas que puedan ser ejecutadas por el componente de orquestación requiere un diseño cuidadoso de los mecanismos de extracción y validación de la información. Esta interfaz actúa como punto de control que permite mantener la predictibilidad global del sistema a pesar de la variabilidad inherente al componente adaptativo.</w:t>
+      </w:r>
+    </w:p>
+    <w:p>
+      <w:pPr>
+        <w:spacing w:after="200" w:line="360" w:lineRule="auto"/>
+        <w:ind w:firstLine="720"/>
+        <w:jc w:val="both"/>
+      </w:pPr>
+      <w:r>
+        <w:t>El modelo híbrido propuesto tiene implicaciones que van más allá del sistema específico desarrollado en esta investigación. Constituye un principio arquitectónico generalizable que puede ser aplicado al diseño de distintos tipos de sistemas de automatización que requieran integrar capacidades de comprensión del lenguaje natural con la ejecución controlada de flujos de trabajo predefinidos. En este sentido, la contribución conceptual de la investigación no se limita al prototipo desarrollado, sino que se extiende al ámbito más amplio del diseño de sistemas de automatización inteligentes.</w:t>
       </w:r>
     </w:p>
     <w:p>
@@ -7409,69 +8495,21 @@
         <w:pStyle w:val="Ttulo2"/>
       </w:pPr>
       <w:r>
-        <w:t>6.3 El modelo híbrido de automatización</w:t>
-      </w:r>
-    </w:p>
-    <w:p>
-      <w:pPr>
-        <w:spacing w:after="200" w:line="360" w:lineRule="auto"/>
-        <w:ind w:firstLine="720"/>
-        <w:jc w:val="both"/>
-      </w:pPr>
-      <w:r>
-        <w:t>Uno de los aportes más relevantes de la presente investigación en términos conceptuales es la formulación de un modelo híbrido de automatización, en el cual se integran de manera coherente componentes determinísticos y componentes adaptativos. Este modelo trasciende la dicotomía tradicional entre sistemas de automatización basados en reglas, que ofrecen control y predictibilidad, y sistemas basados en inteligencia artificial, que ofrecen flexibilidad y adaptabilidad, proponiendo una arquitectura que combina las ventajas de ambos paradigmas.</w:t>
-      </w:r>
-    </w:p>
-    <w:p>
-      <w:pPr>
-        <w:spacing w:after="200" w:line="360" w:lineRule="auto"/>
-        <w:ind w:firstLine="720"/>
-        <w:jc w:val="both"/>
-      </w:pPr>
-      <w:r>
-        <w:t>En el modelo híbrido propuesto, los componentes determinísticos son responsables de la ejecución de los flujos de automatización predefinidos, de la integración con los servicios externos y de la gestión de la persistencia de datos. Estos componentes operan bajo reglas explícitas que garantizan un comportamiento predecible y verificable. Los componentes adaptativos, por su parte, son responsables de la interpretación del lenguaje natural del usuario y de la generación de respuestas contextualmente coherentes, aprovechando las capacidades de los modelos de lenguaje de gran escala.</w:t>
-      </w:r>
-    </w:p>
-    <w:p>
-      <w:pPr>
-        <w:spacing w:after="200" w:line="360" w:lineRule="auto"/>
-        <w:ind w:firstLine="720"/>
-        <w:jc w:val="both"/>
-      </w:pPr>
-      <w:r>
-        <w:t xml:space="preserve">La interfaz entre ambos tipos de componentes es el punto crítico del modelo híbrido. La conversión de la salida probabilística del componente adaptativo en instrucciones determinísticas que puedan ser ejecutadas por el componente de orquestación requiere un diseño cuidadoso de los mecanismos de extracción y </w:t>
+        <w:t>6.4 Limitaciones del enfoque adoptado y perspectivas de mejora</w:t>
+      </w:r>
+    </w:p>
+    <w:p>
+      <w:pPr>
+        <w:spacing w:after="200" w:line="360" w:lineRule="auto"/>
+        <w:ind w:firstLine="720"/>
+        <w:jc w:val="both"/>
+      </w:pPr>
+      <w:r>
+        <w:t xml:space="preserve">El análisis crítico de las limitaciones del enfoque adoptado en la presente investigación resulta fundamental para contextualizar adecuadamente los resultados obtenidos y para orientar el trabajo futuro en la dirección más productiva. Estas limitaciones no constituyen deficiencias del trabajo, sino condicionantes inherentes al contexto en que se desarrolla, que han sido reconocidos explícitamente desde el </w:t>
       </w:r>
       <w:r>
         <w:lastRenderedPageBreak/>
-        <w:t>validación de la información. Esta interfaz actúa como punto de control que permite mantener la predictibilidad global del sistema a pesar de la variabilidad inherente al componente adaptativo.</w:t>
-      </w:r>
-    </w:p>
-    <w:p>
-      <w:pPr>
-        <w:spacing w:after="200" w:line="360" w:lineRule="auto"/>
-        <w:ind w:firstLine="720"/>
-        <w:jc w:val="both"/>
-      </w:pPr>
-      <w:r>
-        <w:t>El modelo híbrido propuesto tiene implicaciones que van más allá del sistema específico desarrollado en esta investigación. Constituye un principio arquitectónico generalizable que puede ser aplicado al diseño de distintos tipos de sistemas de automatización que requieran integrar capacidades de comprensión del lenguaje natural con la ejecución controlada de flujos de trabajo predefinidos. En este sentido, la contribución conceptual de la investigación no se limita al prototipo desarrollado, sino que se extiende al ámbito más amplio del diseño de sistemas de automatización inteligentes.</w:t>
-      </w:r>
-    </w:p>
-    <w:p>
-      <w:pPr>
-        <w:pStyle w:val="Ttulo2"/>
-      </w:pPr>
-      <w:r>
-        <w:t>6.4 Limitaciones del enfoque adoptado y perspectivas de mejora</w:t>
-      </w:r>
-    </w:p>
-    <w:p>
-      <w:pPr>
-        <w:spacing w:after="200" w:line="360" w:lineRule="auto"/>
-        <w:ind w:firstLine="720"/>
-        <w:jc w:val="both"/>
-      </w:pPr>
-      <w:r>
-        <w:t>El análisis crítico de las limitaciones del enfoque adoptado en la presente investigación resulta fundamental para contextualizar adecuadamente los resultados obtenidos y para orientar el trabajo futuro en la dirección más productiva. Estas limitaciones no constituyen deficiencias del trabajo, sino condicionantes inherentes al contexto en que se desarrolla, que han sido reconocidos explícitamente desde el inicio de la investigación y han sido gestionados de manera transparente a lo largo del proceso.</w:t>
+        <w:t>inicio de la investigación y han sido gestionados de manera transparente a lo largo del proceso.</w:t>
       </w:r>
     </w:p>
     <w:p>
@@ -7491,25 +8529,22 @@
         <w:jc w:val="both"/>
       </w:pPr>
       <w:r>
-        <w:t xml:space="preserve">Una segunda limitación significativa es la ausencia de mecanismos de aprendizaje continuo que permitan al sistema mejorar su comportamiento a partir de la retroalimentación del usuario. En su configuración actual, el sistema no modifica su </w:t>
-      </w:r>
+        <w:t>Una segunda limitación significativa es la ausencia de mecanismos de aprendizaje continuo que permitan al sistema mejorar su comportamiento a partir de la retroalimentación del usuario. En su configuración actual, el sistema no modifica su comportamiento en función de las experiencias de uso acumuladas, lo que implica que las solicitudes expresadas con una redacción diferente a la contemplada en el catálogo de intenciones requerirán la ampliación manual de las reglas de interpretación para ser reconocidas correctamente. Esta limitación, sin embargo, no se descarta como línea de evolución: en la actualidad se está trabajando en la incorporación de un agente conversacional basado en modelos de lenguaje que permita interpretar redacciones libres y reducir la dependencia de la ampliación manual de reglas, manteniendo el control del comportamiento del sistema mediante mecanismos de validación de las respuestas generadas.</w:t>
+      </w:r>
+    </w:p>
+    <w:p>
+      <w:pPr>
+        <w:spacing w:after="200" w:line="360" w:lineRule="auto"/>
+        <w:ind w:firstLine="720"/>
+        <w:jc w:val="both"/>
+      </w:pPr>
+      <w:r>
+        <w:t>La tercera limitación relevante es la restricción en la capacidad de gestión de contextos conversacionales complejos. El sistema mantiene el estado de la conversación por usuario —modo de interacción y contenido del carrito simulado—, pero esta capacidad está limitada por el diseño del catálogo de intenciones y por los mecanismos de gestión del estado implementados. En conversaciones que involucren consultas no contempladas en el catálogo, el sistema deriva la solicitud a la intención por defecto, presentando nuevamente el menú principal en lugar de interpretar la solicitud, lo que genera una experiencia menos fluida en los casos límite.</w:t>
+      </w:r>
+    </w:p>
+    <w:p>
       <w:r>
         <w:lastRenderedPageBreak/>
-        <w:t>comportamiento en función de las experiencias de uso acumuladas, lo que implica que las solicitudes expresadas con una redacción diferente a la contemplada en el catálogo de intenciones requerirán la ampliación manual de las reglas de interpretación para ser reconocidas correctamente. Esta limitación, sin embargo, no se descarta como línea de evolución: en la actualidad se está trabajando en la incorporación de un agente conversacional basado en modelos de lenguaje que permita interpretar redacciones libres y reducir la dependencia de la ampliación manual de reglas, manteniendo el control del comportamiento del sistema mediante mecanismos de validación de las respuestas generadas.</w:t>
-      </w:r>
-    </w:p>
-    <w:p>
-      <w:pPr>
-        <w:spacing w:after="200" w:line="360" w:lineRule="auto"/>
-        <w:ind w:firstLine="720"/>
-        <w:jc w:val="both"/>
-      </w:pPr>
-      <w:r>
-        <w:t>La tercera limitación relevante es la restricción en la capacidad de gestión de contextos conversacionales complejos. El sistema mantiene el estado de la conversación por usuario —modo de interacción y contenido del carrito simulado—, pero esta capacidad está limitada por el diseño del catálogo de intenciones y por los mecanismos de gestión del estado implementados. En conversaciones que involucren consultas no contempladas en el catálogo, el sistema deriva la solicitud a la intención por defecto, presentando nuevamente el menú principal en lugar de interpretar la solicitud, lo que genera una experiencia menos fluida en los casos límite.</w:t>
-      </w:r>
-    </w:p>
-    <w:p>
-      <w:r>
         <w:br w:type="page"/>
       </w:r>
     </w:p>
@@ -7894,7 +8929,7 @@
           <w:sz w:val="22"/>
           <w:szCs w:val="22"/>
         </w:rPr>
-        <w:t>Brown, T. B., Mann, B., Ryder, N., Subbiah, M., Kaplan, J., Dhariwal, P., Neelakantan, A., Shyam, P., Sastry, G., Askell, A., Agarwal, S., Herbert-Voss, A., Krueger, G., Henighan, T., Child, R., Ramesh, A., Ziegler, D. M., Wu, J., Winter, C., … Amodei, D. (2020). Language models are few-shot learners. Advances in Neural Information Processing Systems, 33, 1877–1901.</w:t>
+        <w:t>Brown, T. B., Mann, B., Ryder, N., Subbiah, M., Kaplan, J., Dhariwal, P., Neelakantan, A., Shyam, P., Sastry, G., Askell, A., Agarwal, S., Herbert-Voss, A., Krueger, G., Henighan, T., Child, R., Ramesh, A., Ziegler, D. M., Wu, J., Winter, C., … Amodei, D. (2020). Language models are few-shot learners. Advances in Neural Information Processing Systems, 33, 1877–1901. https://doi.org/10.48550/arXiv.2005.14165</w:t>
       </w:r>
     </w:p>
     <w:p>
@@ -7932,7 +8967,7 @@
           <w:sz w:val="22"/>
           <w:szCs w:val="22"/>
         </w:rPr>
-        <w:t>Devlin, J., Chang, M. W., Lee, K., &amp; Toutanova, K. (2019). BERT: Pre-training of deep bidirectional transformers for language understanding. Proceedings of NAACL-HLT 2019, 4171–4186.</w:t>
+        <w:t>Devlin, J., Chang, M. W., Lee, K., &amp; Toutanova, K. (2019). BERT: Pre-training of deep bidirectional transformers for language understanding. Proceedings of NAACL-HLT 2019, 4171–4186. https://doi.org/10.48550/arXiv.1810.04805</w:t>
       </w:r>
     </w:p>
     <w:p>
@@ -8016,7 +9051,14 @@
           <w:sz w:val="22"/>
           <w:szCs w:val="22"/>
         </w:rPr>
-        <w:t xml:space="preserve">He, J., Chen, S., Zhang, F., &amp; Yang, Z. (2024). From Words to Actions: Unveiling the Theoretical Underpinnings of LLM-Driven Autonomous Systems. Proceedings of the 41st International Conference on Machine Learning (ICML), 17807–17841.</w:t>
+        <w:t>He, J., Chen, S., Zhang, F., &amp; Yang, Z. (2024). From Words to Actions: Unveiling the Theoretical Underpinnings of LLM-Driven Autonomous Systems. Proceedings of</w:t>
+      </w:r>
+      <w:r>
+        <w:rPr>
+          <w:sz w:val="22"/>
+          <w:szCs w:val="22"/>
+        </w:rPr>
+        <w:t xml:space="preserve"> the 41st International Conference on Machine Learning (ICML), 17807–17841. https://doi.org/10.48550/arXiv.2402.10762</w:t>
       </w:r>
     </w:p>
     <w:p>
@@ -8082,7 +9124,7 @@
           <w:sz w:val="22"/>
           <w:szCs w:val="22"/>
         </w:rPr>
-        <w:t xml:space="preserve">Lacity, M., &amp; Willcocks, L. (2021). Robotic Process Automation at Telefónica O2. MIS Quarterly Executive, 15(1), 21–35.</w:t>
+        <w:t>Lacity, M., &amp; Willcocks, L. (2021). Robotic Process Automation at Telefónica O2. MIS Quarterly Executive, 15(1), 21–35.</w:t>
       </w:r>
     </w:p>
     <w:p>
@@ -8110,7 +9152,7 @@
           <w:sz w:val="22"/>
           <w:szCs w:val="22"/>
         </w:rPr>
-        <w:t xml:space="preserve">Minsky, M. (1967). Composing communications: Toward artificial intelligence. MIT Artificial Intelligence Laboratory, Memo 157.</w:t>
+        <w:t>Minsky, M. (1967). Composing communications: Toward artificial intelligence. MIT Artificial Intelligence Laboratory, Memo 157.</w:t>
       </w:r>
     </w:p>
     <w:p>
@@ -8148,6 +9190,7 @@
           <w:sz w:val="22"/>
           <w:szCs w:val="22"/>
         </w:rPr>
+        <w:lastRenderedPageBreak/>
         <w:t>Russell, S., &amp; Norvig, P. (2021). Artificial intelligence: A modern approach (4th ed.). Pearson.</w:t>
       </w:r>
     </w:p>
@@ -8190,8 +9233,7 @@
           <w:sz w:val="22"/>
           <w:szCs w:val="22"/>
         </w:rPr>
-        <w:lastRenderedPageBreak/>
-        <w:t>Vaswani, A., Shazeer, N., Parmar, N., Uszkoreit, J., Jones, L., Gomez, A. N., Kaiser, L., &amp; Polosukhin, I. (2017). Attention is all you need. Advances in Neural Information Processing Systems, 30.</w:t>
+        <w:t>Vaswani, A., Shazeer, N., Parmar, N., Uszkoreit, J., Jones, L., Gomez, A. N., Kaiser, L., &amp; Polosukhin, I. (2017). Attention is all you need. Advances in Neural Information Processing Systems, 30. https://doi.org/10.48550/arXiv.1706.03762</w:t>
       </w:r>
     </w:p>
     <w:p>
@@ -8205,7 +9247,14 @@
           <w:sz w:val="22"/>
           <w:szCs w:val="22"/>
         </w:rPr>
-        <w:t xml:space="preserve">Wei, J., Wang, X., Schuurmans, D., Bosma, M., Xia, F., Chi, E., Le, Q., &amp; Zhou, D. (2022). Chain-of-Thought Prompting Elicits Reasoning in Large Language Models. Advances in Neural Information Processing Systems, 35, 24824–24837.</w:t>
+        <w:t>Wei, J., Wang, X., Schuurmans, D., Bosma, M., Xia, F., Chi, E., Le, Q., &amp; Zhou, D. (2022). Chain-of-Thought Prompting Elicits Reasoning in Large Language Models. Advances in Neural Information Processing Systems, 35, 24824–2483</w:t>
+      </w:r>
+      <w:r>
+        <w:rPr>
+          <w:sz w:val="22"/>
+          <w:szCs w:val="22"/>
+        </w:rPr>
+        <w:t>7. https://doi.org/10.48550/arXiv.2201.11903</w:t>
       </w:r>
     </w:p>
     <w:p>
@@ -8247,7 +9296,14 @@
           <w:sz w:val="22"/>
           <w:szCs w:val="22"/>
         </w:rPr>
-        <w:t xml:space="preserve">Xi, Z., Chen, W., Guo, X., He, W., Ding, Y., Hong, B., Zhang, M., Wang, J., Jin, S., Zhou, E., Zheng, A., Fan, X., Wang, X., Lim, A., &amp; Liu, T. (2023). The Rise and Potential of Large Language Model Based Agents: A Survey. arXiv preprint arXiv:2309.07864.</w:t>
+        <w:t>Xi, Z., Chen,</w:t>
+      </w:r>
+      <w:r>
+        <w:rPr>
+          <w:sz w:val="22"/>
+          <w:szCs w:val="22"/>
+        </w:rPr>
+        <w:t xml:space="preserve"> W., Guo, X., He, W., Ding, Y., Hong, B., Zhang, M., Wang, J., Jin, S., Zhou, E., Zheng, A., Fan, X., Wang, X., Lim, A., &amp; Liu, T. (2023). The Rise and Potential of Large Language Model Based Agents: A Survey. arXiv preprint arXiv:2309.07864. https://doi.org/10.48550/arXiv.2309.07864</w:t>
       </w:r>
     </w:p>
     <w:p>
@@ -10963,22 +12019,27 @@
         <w:jc w:val="center"/>
       </w:pPr>
       <w:r>
+        <w:rPr>
+          <w:noProof/>
+        </w:rPr>
+        <w:lastRenderedPageBreak/>
         <w:drawing>
-          <wp:inline xmlns:a="http://schemas.openxmlformats.org/drawingml/2006/main" xmlns:pic="http://schemas.openxmlformats.org/drawingml/2006/picture">
+          <wp:inline distT="0" distB="0" distL="0" distR="0" wp14:anchorId="1E292EDA" wp14:editId="2CF73411">
             <wp:extent cx="5040000" cy="2661750"/>
+            <wp:effectExtent l="0" t="0" r="0" b="0"/>
             <wp:docPr id="17" name="Picture 17"/>
             <wp:cNvGraphicFramePr>
-              <a:graphicFrameLocks noChangeAspect="1"/>
+              <a:graphicFrameLocks xmlns:a="http://schemas.openxmlformats.org/drawingml/2006/main" noChangeAspect="1"/>
             </wp:cNvGraphicFramePr>
-            <a:graphic>
+            <a:graphic xmlns:a="http://schemas.openxmlformats.org/drawingml/2006/main">
               <a:graphicData uri="http://schemas.openxmlformats.org/drawingml/2006/picture">
-                <pic:pic>
+                <pic:pic xmlns:pic="http://schemas.openxmlformats.org/drawingml/2006/picture">
                   <pic:nvPicPr>
                     <pic:cNvPr id="0" name="image.jpg"/>
                     <pic:cNvPicPr/>
                   </pic:nvPicPr>
                   <pic:blipFill>
-                    <a:blip r:embed="rId19"/>
+                    <a:blip r:embed="rId24"/>
                     <a:stretch>
                       <a:fillRect/>
                     </a:stretch>
@@ -10988,7 +12049,9 @@
                       <a:off x="0" y="0"/>
                       <a:ext cx="5040000" cy="2661750"/>
                     </a:xfrm>
-                    <a:prstGeom prst="rect"/>
+                    <a:prstGeom prst="rect">
+                      <a:avLst/>
+                    </a:prstGeom>
                   </pic:spPr>
                 </pic:pic>
               </a:graphicData>
@@ -11035,18 +12098,21 @@
         <w:jc w:val="both"/>
       </w:pPr>
       <w:r>
+        <w:t>La configuración del conector para el servicio de mensajería requiere la obtención de las credenciales de acceso a la API correspondiente, la configuración de los parámetros de conexión y la definición de los formatos de los mensajes entrantes y salientes. El conector implementa mecanismos de reintento con backoff exponencial para gestionar situaciones de alta latencia o no disponibilidad temporal del servicio, garantizando que las solicitudes pendientes sean procesadas en cuanto el servicio esté disponible.</w:t>
+      </w:r>
+    </w:p>
+    <w:p>
+      <w:pPr>
+        <w:spacing w:after="200" w:line="360" w:lineRule="auto"/>
+        <w:ind w:firstLine="720"/>
+        <w:jc w:val="both"/>
+      </w:pPr>
+      <w:r>
+        <w:t xml:space="preserve">La configuración del componente de interpretación del prototipo requiere la definición del catálogo de intenciones, es decir, el conjunto de comandos exactos y las variantes en lenguaje natural que el componente reconoce para cada intención del menú, junto con la lógica de normalización del texto (conversión a minúsculas, </w:t>
+      </w:r>
+      <w:r>
         <w:lastRenderedPageBreak/>
-        <w:t>La configuración del conector para el servicio de mensajería requiere la obtención de las credenciales de acceso a la API correspondiente, la configuración de los parámetros de conexión y la definición de los formatos de los mensajes entrantes y salientes. El conector implementa mecanismos de reintento con backoff exponencial para gestionar situaciones de alta latencia o no disponibilidad temporal del servicio, garantizando que las solicitudes pendientes sean procesadas en cuanto el servicio esté disponible.</w:t>
-      </w:r>
-    </w:p>
-    <w:p>
-      <w:pPr>
-        <w:spacing w:after="200" w:line="360" w:lineRule="auto"/>
-        <w:ind w:firstLine="720"/>
-        <w:jc w:val="both"/>
-      </w:pPr>
-      <w:r>
-        <w:t>La configuración del componente de interpretación del prototipo requiere la definición del catálogo de intenciones, es decir, el conjunto de comandos exactos y las variantes en lenguaje natural que el componente reconoce para cada intención del menú, junto con la lógica de normalización del texto (conversión a minúsculas, eliminación de espacios superfluos) y la secuencia de estados de la conversación (menú principal, catálogo, espera de cantidad). La configuración se implementa en el nodo de código del flujo de orquestación, y su optimización tiene un impacto directo sobre la cobertura y la precisión del componente. Para una versión extendida que incorpore un modelo de lenguaje, la configuración requeriría además la definición del modelo a utilizar, los parámetros de generación —temperatura, longitud máxima de la respuesta y otras variables que controlan el comportamiento del modelo— y el diseño de los prompts de sistema que orientan al modelo sobre su función.</w:t>
+        <w:t>eliminación de espacios superfluos) y la secuencia de estados de la conversación (menú principal, catálogo, espera de cantidad). La configuración se implementa en el nodo de código del flujo de orquestación, y su optimización tiene un impacto directo sobre la cobertura y la precisión del componente. Para una versión extendida que incorpore un modelo de lenguaje, la configuración requeriría además la definición del modelo a utilizar, los parámetros de generación —temperatura, longitud máxima de la respuesta y otras variables que controlan el comportamiento del modelo— y el diseño de los prompts de sistema que orientan al modelo sobre su función.</w:t>
       </w:r>
     </w:p>
     <w:p>
@@ -11447,7 +12513,6 @@
               <w:rPr>
                 <w:sz w:val="18"/>
               </w:rPr>
-              <w:lastRenderedPageBreak/>
               <w:t>/api/v1/clients/{id}/productos</w:t>
             </w:r>
           </w:p>
@@ -11528,7 +12593,11 @@
         <w:jc w:val="both"/>
       </w:pPr>
       <w:r>
-        <w:t>El modelo de datos del sistema define las entidades que son almacenadas en el sistema de persistencia, sus atributos relevantes y las relaciones entre ellas. Este modelo ha sido diseñado priorizando la simplicidad y la adecuación a los patrones de acceso del sistema, con el objetivo de minimizar la complejidad de las operaciones de lectura y escritura y maximizar la eficiencia del sistema de almacenamiento.</w:t>
+        <w:t xml:space="preserve">El modelo de datos del sistema define las entidades que son almacenadas en el sistema de persistencia, sus atributos relevantes y las relaciones entre ellas. Este modelo ha sido diseñado priorizando la simplicidad y la adecuación a los patrones de </w:t>
+      </w:r>
+      <w:r>
+        <w:lastRenderedPageBreak/>
+        <w:t>acceso del sistema, con el objetivo de minimizar la complejidad de las operaciones de lectura y escritura y maximizar la eficiencia del sistema de almacenamiento.</w:t>
       </w:r>
     </w:p>
     <w:p>
@@ -11665,7 +12734,6 @@
               <w:rPr>
                 <w:sz w:val="18"/>
               </w:rPr>
-              <w:lastRenderedPageBreak/>
               <w:t>clients</w:t>
             </w:r>
           </w:p>
@@ -11950,6 +13018,7 @@
           <w:rFonts w:ascii="Courier New" w:hAnsi="Courier New"/>
           <w:sz w:val="18"/>
         </w:rPr>
+        <w:lastRenderedPageBreak/>
         <w:t>CREATE TABLE products (</w:t>
       </w:r>
     </w:p>
@@ -12236,18 +13305,21 @@
         <w:jc w:val="both"/>
       </w:pPr>
       <w:r>
+        <w:t>Cada escenario de prueba fue diseñado especificando el tipo de solicitud a evaluar, el mensaje utilizado para formularla, el comportamiento esperado del sistema y los criterios de evaluación del resultado. Los escenarios fueron ejecutados en condiciones controladas, minimizando las fuentes de variabilidad externas al sistema y garantizando la reproducibilidad de los resultados.</w:t>
+      </w:r>
+    </w:p>
+    <w:p>
+      <w:pPr>
+        <w:spacing w:after="200" w:line="360" w:lineRule="auto"/>
+        <w:ind w:firstLine="720"/>
+        <w:jc w:val="both"/>
+      </w:pPr>
+      <w:r>
+        <w:t xml:space="preserve">Los resultados de las pruebas del backend arrojan 128 ejecuciones correctas sobre 128 casos de prueba (100 %), cubriendo las capas de rutas, servicios y repositorios, así como la autenticación, las métricas y una prueba de integración de extremo a extremo. En el plano de la interacción conversacional, los escenarios del menú principal, la selección de producto, la solicitud de cantidad, la validación de stock y la finalización de la compra se ejecutaron con la respuesta esperada en la totalidad de los casos. Los casos límite correspondientes a entradas no reconocidas se derivan de manera controlada a la intención por defecto, que presenta nuevamente </w:t>
+      </w:r>
+      <w:r>
         <w:lastRenderedPageBreak/>
-        <w:t>Cada escenario de prueba fue diseñado especificando el tipo de solicitud a evaluar, el mensaje utilizado para formularla, el comportamiento esperado del sistema y los criterios de evaluación del resultado. Los escenarios fueron ejecutados en condiciones controladas, minimizando las fuentes de variabilidad externas al sistema y garantizando la reproducibilidad de los resultados.</w:t>
-      </w:r>
-    </w:p>
-    <w:p>
-      <w:pPr>
-        <w:spacing w:after="200" w:line="360" w:lineRule="auto"/>
-        <w:ind w:firstLine="720"/>
-        <w:jc w:val="both"/>
-      </w:pPr>
-      <w:r>
-        <w:t>Los resultados de las pruebas del backend arrojan 128 ejecuciones correctas sobre 128 casos de prueba (100 %), cubriendo las capas de rutas, servicios y repositorios, así como la autenticación, las métricas y una prueba de integración de extremo a extremo. En el plano de la interacción conversacional, los escenarios del menú principal, la selección de producto, la solicitud de cantidad, la validación de stock y la finalización de la compra se ejecutaron con la respuesta esperada en la totalidad de los casos. Los casos límite correspondientes a entradas no reconocidas se derivan de manera controlada a la intención por defecto, que presenta nuevamente el menú principal: este comportamiento es el previsto por el diseño determinístico y no constituye un error, sino una respuesta planificada ante mensajes fuera del catálogo de intenciones.</w:t>
+        <w:t>el menú principal: este comportamiento es el previsto por el diseño determinístico y no constituye un error, sino una respuesta planificada ante mensajes fuera del catálogo de intenciones.</w:t>
       </w:r>
     </w:p>
     <w:p>
@@ -12404,7 +13476,6 @@
               <w:rPr>
                 <w:sz w:val="18"/>
               </w:rPr>
-              <w:lastRenderedPageBreak/>
               <w:t>Bienvenida y menú</w:t>
             </w:r>
           </w:p>
@@ -13060,6 +14131,7 @@
           <w:rFonts w:ascii="Courier New" w:hAnsi="Courier New"/>
           <w:sz w:val="18"/>
         </w:rPr>
+        <w:lastRenderedPageBreak/>
         <w:t xml:space="preserve">    "items": [</w:t>
       </w:r>
     </w:p>
@@ -13310,7 +14382,6 @@
           <w:sz w:val="22"/>
           <w:szCs w:val="22"/>
         </w:rPr>
-        <w:lastRenderedPageBreak/>
         <w:t>— Fin del documento —</w:t>
       </w:r>
     </w:p>
@@ -13320,8 +14391,8 @@
       </w:pPr>
     </w:p>
     <w:sectPr>
-      <w:headerReference w:type="default" r:id="rId15"/>
-      <w:footerReference w:type="default" r:id="rId16"/>
+      <w:headerReference w:type="default" r:id="rId25"/>
+      <w:footerReference w:type="default" r:id="rId26"/>
       <w:pgSz w:w="12240" w:h="15840"/>
       <w:pgMar w:top="1440" w:right="1440" w:bottom="1440" w:left="1800" w:header="708" w:footer="708" w:gutter="0"/>
       <w:cols w:space="720"/>
@@ -13350,6 +14421,36 @@
 </file>
 
 <file path=word/footer1.xml><?xml version="1.0" encoding="utf-8"?>
+<w:ftr xmlns:wpc="http://schemas.microsoft.com/office/word/2010/wordprocessingCanvas" xmlns:cx="http://schemas.microsoft.com/office/drawing/2014/chartex" xmlns:cx1="http://schemas.microsoft.com/office/drawing/2015/9/8/chartex" xmlns:cx2="http://schemas.microsoft.com/office/drawing/2015/10/21/chartex" xmlns:cx3="http://schemas.microsoft.com/office/drawing/2016/5/9/chartex" xmlns:cx4="http://schemas.microsoft.com/office/drawing/2016/5/10/chartex" xmlns:cx5="http://schemas.microsoft.com/office/drawing/2016/5/11/chartex" xmlns:cx6="http://schemas.microsoft.com/office/drawing/2016/5/12/chartex" xmlns:cx7="http://schemas.microsoft.com/office/drawing/2016/5/13/chartex" xmlns:cx8="http://schemas.microsoft.com/office/drawing/2016/5/14/chartex" xmlns:mc="http://schemas.openxmlformats.org/markup-compatibility/2006" xmlns:aink="http://schemas.microsoft.com/office/drawing/2016/ink" xmlns:am3d="http://schemas.microsoft.com/office/drawing/2017/model3d" xmlns:o="urn:schemas-microsoft-com:office:office" xmlns:r="http://schemas.openxmlformats.org/officeDocument/2006/relationships" xmlns:m="http://schemas.openxmlformats.org/officeDocument/2006/math" xmlns:v="urn:schemas-microsoft-com:vml" xmlns:wp14="http://schemas.microsoft.com/office/word/2010/wordprocessingDrawing" xmlns:wp="http://schemas.openxmlformats.org/drawingml/2006/wordprocessingDrawing" xmlns:w10="urn:schemas-microsoft-com:office:word" xmlns:w="http://schemas.openxmlformats.org/wordprocessingml/2006/main" xmlns:w14="http://schemas.microsoft.com/office/word/2010/wordml" xmlns:w15="http://schemas.microsoft.com/office/word/2012/wordml" xmlns:w16cex="http://schemas.microsoft.com/office/word/2018/wordml/cex" xmlns:w16cid="http://schemas.microsoft.com/office/word/2016/wordml/cid" xmlns:w16="http://schemas.microsoft.com/office/word/2018/wordml" xmlns:w16sdtdh="http://schemas.microsoft.com/office/word/2020/wordml/sdtdatahash" xmlns:w16se="http://schemas.microsoft.com/office/word/2015/wordml/symex" xmlns:wpg="http://schemas.microsoft.com/office/word/2010/wordprocessingGroup" xmlns:wpi="http://schemas.microsoft.com/office/word/2010/wordprocessingInk" xmlns:wne="http://schemas.microsoft.com/office/word/2006/wordml" xmlns:wps="http://schemas.microsoft.com/office/word/2010/wordprocessingShape" mc:Ignorable="w14 w15 w16se w16cid w16 w16cex w16sdtdh wp14">
+  <w:p>
+    <w:pPr>
+      <w:pStyle w:val="Piedepgina"/>
+    </w:pPr>
+  </w:p>
+</w:ftr>
+</file>
+
+<file path=word/footer2.xml><?xml version="1.0" encoding="utf-8"?>
+<w:ftr xmlns:wpc="http://schemas.microsoft.com/office/word/2010/wordprocessingCanvas" xmlns:cx="http://schemas.microsoft.com/office/drawing/2014/chartex" xmlns:cx1="http://schemas.microsoft.com/office/drawing/2015/9/8/chartex" xmlns:cx2="http://schemas.microsoft.com/office/drawing/2015/10/21/chartex" xmlns:cx3="http://schemas.microsoft.com/office/drawing/2016/5/9/chartex" xmlns:cx4="http://schemas.microsoft.com/office/drawing/2016/5/10/chartex" xmlns:cx5="http://schemas.microsoft.com/office/drawing/2016/5/11/chartex" xmlns:cx6="http://schemas.microsoft.com/office/drawing/2016/5/12/chartex" xmlns:cx7="http://schemas.microsoft.com/office/drawing/2016/5/13/chartex" xmlns:cx8="http://schemas.microsoft.com/office/drawing/2016/5/14/chartex" xmlns:mc="http://schemas.openxmlformats.org/markup-compatibility/2006" xmlns:aink="http://schemas.microsoft.com/office/drawing/2016/ink" xmlns:am3d="http://schemas.microsoft.com/office/drawing/2017/model3d" xmlns:o="urn:schemas-microsoft-com:office:office" xmlns:r="http://schemas.openxmlformats.org/officeDocument/2006/relationships" xmlns:m="http://schemas.openxmlformats.org/officeDocument/2006/math" xmlns:v="urn:schemas-microsoft-com:vml" xmlns:wp14="http://schemas.microsoft.com/office/word/2010/wordprocessingDrawing" xmlns:wp="http://schemas.openxmlformats.org/drawingml/2006/wordprocessingDrawing" xmlns:w10="urn:schemas-microsoft-com:office:word" xmlns:w="http://schemas.openxmlformats.org/wordprocessingml/2006/main" xmlns:w14="http://schemas.microsoft.com/office/word/2010/wordml" xmlns:w15="http://schemas.microsoft.com/office/word/2012/wordml" xmlns:w16cex="http://schemas.microsoft.com/office/word/2018/wordml/cex" xmlns:w16cid="http://schemas.microsoft.com/office/word/2016/wordml/cid" xmlns:w16="http://schemas.microsoft.com/office/word/2018/wordml" xmlns:w16sdtdh="http://schemas.microsoft.com/office/word/2020/wordml/sdtdatahash" xmlns:w16se="http://schemas.microsoft.com/office/word/2015/wordml/symex" xmlns:wpg="http://schemas.microsoft.com/office/word/2010/wordprocessingGroup" xmlns:wpi="http://schemas.microsoft.com/office/word/2010/wordprocessingInk" xmlns:wne="http://schemas.microsoft.com/office/word/2006/wordml" xmlns:wps="http://schemas.microsoft.com/office/word/2010/wordprocessingShape" mc:Ignorable="w14 w15 w16se w16cid w16 w16cex w16sdtdh wp14">
+  <w:p>
+    <w:pPr>
+      <w:pStyle w:val="Piedepgina"/>
+    </w:pPr>
+  </w:p>
+</w:ftr>
+</file>
+
+<file path=word/footer3.xml><?xml version="1.0" encoding="utf-8"?>
+<w:ftr xmlns:wpc="http://schemas.microsoft.com/office/word/2010/wordprocessingCanvas" xmlns:cx="http://schemas.microsoft.com/office/drawing/2014/chartex" xmlns:cx1="http://schemas.microsoft.com/office/drawing/2015/9/8/chartex" xmlns:cx2="http://schemas.microsoft.com/office/drawing/2015/10/21/chartex" xmlns:cx3="http://schemas.microsoft.com/office/drawing/2016/5/9/chartex" xmlns:cx4="http://schemas.microsoft.com/office/drawing/2016/5/10/chartex" xmlns:cx5="http://schemas.microsoft.com/office/drawing/2016/5/11/chartex" xmlns:cx6="http://schemas.microsoft.com/office/drawing/2016/5/12/chartex" xmlns:cx7="http://schemas.microsoft.com/office/drawing/2016/5/13/chartex" xmlns:cx8="http://schemas.microsoft.com/office/drawing/2016/5/14/chartex" xmlns:mc="http://schemas.openxmlformats.org/markup-compatibility/2006" xmlns:aink="http://schemas.microsoft.com/office/drawing/2016/ink" xmlns:am3d="http://schemas.microsoft.com/office/drawing/2017/model3d" xmlns:o="urn:schemas-microsoft-com:office:office" xmlns:r="http://schemas.openxmlformats.org/officeDocument/2006/relationships" xmlns:m="http://schemas.openxmlformats.org/officeDocument/2006/math" xmlns:v="urn:schemas-microsoft-com:vml" xmlns:wp14="http://schemas.microsoft.com/office/word/2010/wordprocessingDrawing" xmlns:wp="http://schemas.openxmlformats.org/drawingml/2006/wordprocessingDrawing" xmlns:w10="urn:schemas-microsoft-com:office:word" xmlns:w="http://schemas.openxmlformats.org/wordprocessingml/2006/main" xmlns:w14="http://schemas.microsoft.com/office/word/2010/wordml" xmlns:w15="http://schemas.microsoft.com/office/word/2012/wordml" xmlns:w16cex="http://schemas.microsoft.com/office/word/2018/wordml/cex" xmlns:w16cid="http://schemas.microsoft.com/office/word/2016/wordml/cid" xmlns:w16="http://schemas.microsoft.com/office/word/2018/wordml" xmlns:w16sdtdh="http://schemas.microsoft.com/office/word/2020/wordml/sdtdatahash" xmlns:w16se="http://schemas.microsoft.com/office/word/2015/wordml/symex" xmlns:wpg="http://schemas.microsoft.com/office/word/2010/wordprocessingGroup" xmlns:wpi="http://schemas.microsoft.com/office/word/2010/wordprocessingInk" xmlns:wne="http://schemas.microsoft.com/office/word/2006/wordml" xmlns:wps="http://schemas.microsoft.com/office/word/2010/wordprocessingShape" mc:Ignorable="w14 w15 w16se w16cid w16 w16cex w16sdtdh wp14">
+  <w:p>
+    <w:pPr>
+      <w:pStyle w:val="Piedepgina"/>
+    </w:pPr>
+  </w:p>
+</w:ftr>
+</file>
+
+<file path=word/footer4.xml><?xml version="1.0" encoding="utf-8"?>
 <w:ftr xmlns:wpc="http://schemas.microsoft.com/office/word/2010/wordprocessingCanvas" xmlns:cx="http://schemas.microsoft.com/office/drawing/2014/chartex" xmlns:cx1="http://schemas.microsoft.com/office/drawing/2015/9/8/chartex" xmlns:cx2="http://schemas.microsoft.com/office/drawing/2015/10/21/chartex" xmlns:cx3="http://schemas.microsoft.com/office/drawing/2016/5/9/chartex" xmlns:cx4="http://schemas.microsoft.com/office/drawing/2016/5/10/chartex" xmlns:cx5="http://schemas.microsoft.com/office/drawing/2016/5/11/chartex" xmlns:cx6="http://schemas.microsoft.com/office/drawing/2016/5/12/chartex" xmlns:cx7="http://schemas.microsoft.com/office/drawing/2016/5/13/chartex" xmlns:cx8="http://schemas.microsoft.com/office/drawing/2016/5/14/chartex" xmlns:mc="http://schemas.openxmlformats.org/markup-compatibility/2006" xmlns:aink="http://schemas.microsoft.com/office/drawing/2016/ink" xmlns:am3d="http://schemas.microsoft.com/office/drawing/2017/model3d" xmlns:o="urn:schemas-microsoft-com:office:office" xmlns:r="http://schemas.openxmlformats.org/officeDocument/2006/relationships" xmlns:m="http://schemas.openxmlformats.org/officeDocument/2006/math" xmlns:v="urn:schemas-microsoft-com:vml" xmlns:wp14="http://schemas.microsoft.com/office/word/2010/wordprocessingDrawing" xmlns:wp="http://schemas.openxmlformats.org/drawingml/2006/wordprocessingDrawing" xmlns:w10="urn:schemas-microsoft-com:office:word" xmlns:w="http://schemas.openxmlformats.org/wordprocessingml/2006/main" xmlns:w14="http://schemas.microsoft.com/office/word/2010/wordml" xmlns:w15="http://schemas.microsoft.com/office/word/2012/wordml" xmlns:w16cex="http://schemas.microsoft.com/office/word/2018/wordml/cex" xmlns:w16cid="http://schemas.microsoft.com/office/word/2016/wordml/cid" xmlns:w16="http://schemas.microsoft.com/office/word/2018/wordml" xmlns:w16sdtdh="http://schemas.microsoft.com/office/word/2020/wordml/sdtdatahash" xmlns:w16se="http://schemas.microsoft.com/office/word/2015/wordml/symex" xmlns:wpg="http://schemas.microsoft.com/office/word/2010/wordprocessingGroup" xmlns:wpi="http://schemas.microsoft.com/office/word/2010/wordprocessingInk" xmlns:wne="http://schemas.microsoft.com/office/word/2006/wordml" xmlns:wps="http://schemas.microsoft.com/office/word/2010/wordprocessingShape" mc:Ignorable="w14 w15 w16se w16cid w16 w16cex w16sdtdh wp14">
   <w:p>
     <w:pPr>
@@ -13480,6 +14581,36 @@
 </file>
 
 <file path=word/header1.xml><?xml version="1.0" encoding="utf-8"?>
+<w:hdr xmlns:wpc="http://schemas.microsoft.com/office/word/2010/wordprocessingCanvas" xmlns:cx="http://schemas.microsoft.com/office/drawing/2014/chartex" xmlns:cx1="http://schemas.microsoft.com/office/drawing/2015/9/8/chartex" xmlns:cx2="http://schemas.microsoft.com/office/drawing/2015/10/21/chartex" xmlns:cx3="http://schemas.microsoft.com/office/drawing/2016/5/9/chartex" xmlns:cx4="http://schemas.microsoft.com/office/drawing/2016/5/10/chartex" xmlns:cx5="http://schemas.microsoft.com/office/drawing/2016/5/11/chartex" xmlns:cx6="http://schemas.microsoft.com/office/drawing/2016/5/12/chartex" xmlns:cx7="http://schemas.microsoft.com/office/drawing/2016/5/13/chartex" xmlns:cx8="http://schemas.microsoft.com/office/drawing/2016/5/14/chartex" xmlns:mc="http://schemas.openxmlformats.org/markup-compatibility/2006" xmlns:aink="http://schemas.microsoft.com/office/drawing/2016/ink" xmlns:am3d="http://schemas.microsoft.com/office/drawing/2017/model3d" xmlns:o="urn:schemas-microsoft-com:office:office" xmlns:r="http://schemas.openxmlformats.org/officeDocument/2006/relationships" xmlns:m="http://schemas.openxmlformats.org/officeDocument/2006/math" xmlns:v="urn:schemas-microsoft-com:vml" xmlns:wp14="http://schemas.microsoft.com/office/word/2010/wordprocessingDrawing" xmlns:wp="http://schemas.openxmlformats.org/drawingml/2006/wordprocessingDrawing" xmlns:w10="urn:schemas-microsoft-com:office:word" xmlns:w="http://schemas.openxmlformats.org/wordprocessingml/2006/main" xmlns:w14="http://schemas.microsoft.com/office/word/2010/wordml" xmlns:w15="http://schemas.microsoft.com/office/word/2012/wordml" xmlns:w16cex="http://schemas.microsoft.com/office/word/2018/wordml/cex" xmlns:w16cid="http://schemas.microsoft.com/office/word/2016/wordml/cid" xmlns:w16="http://schemas.microsoft.com/office/word/2018/wordml" xmlns:w16sdtdh="http://schemas.microsoft.com/office/word/2020/wordml/sdtdatahash" xmlns:w16se="http://schemas.microsoft.com/office/word/2015/wordml/symex" xmlns:wpg="http://schemas.microsoft.com/office/word/2010/wordprocessingGroup" xmlns:wpi="http://schemas.microsoft.com/office/word/2010/wordprocessingInk" xmlns:wne="http://schemas.microsoft.com/office/word/2006/wordml" xmlns:wps="http://schemas.microsoft.com/office/word/2010/wordprocessingShape" mc:Ignorable="w14 w15 w16se w16cid w16 w16cex w16sdtdh wp14">
+  <w:p>
+    <w:pPr>
+      <w:pStyle w:val="Encabezado"/>
+    </w:pPr>
+  </w:p>
+</w:hdr>
+</file>
+
+<file path=word/header2.xml><?xml version="1.0" encoding="utf-8"?>
+<w:hdr xmlns:wpc="http://schemas.microsoft.com/office/word/2010/wordprocessingCanvas" xmlns:cx="http://schemas.microsoft.com/office/drawing/2014/chartex" xmlns:cx1="http://schemas.microsoft.com/office/drawing/2015/9/8/chartex" xmlns:cx2="http://schemas.microsoft.com/office/drawing/2015/10/21/chartex" xmlns:cx3="http://schemas.microsoft.com/office/drawing/2016/5/9/chartex" xmlns:cx4="http://schemas.microsoft.com/office/drawing/2016/5/10/chartex" xmlns:cx5="http://schemas.microsoft.com/office/drawing/2016/5/11/chartex" xmlns:cx6="http://schemas.microsoft.com/office/drawing/2016/5/12/chartex" xmlns:cx7="http://schemas.microsoft.com/office/drawing/2016/5/13/chartex" xmlns:cx8="http://schemas.microsoft.com/office/drawing/2016/5/14/chartex" xmlns:mc="http://schemas.openxmlformats.org/markup-compatibility/2006" xmlns:aink="http://schemas.microsoft.com/office/drawing/2016/ink" xmlns:am3d="http://schemas.microsoft.com/office/drawing/2017/model3d" xmlns:o="urn:schemas-microsoft-com:office:office" xmlns:r="http://schemas.openxmlformats.org/officeDocument/2006/relationships" xmlns:m="http://schemas.openxmlformats.org/officeDocument/2006/math" xmlns:v="urn:schemas-microsoft-com:vml" xmlns:wp14="http://schemas.microsoft.com/office/word/2010/wordprocessingDrawing" xmlns:wp="http://schemas.openxmlformats.org/drawingml/2006/wordprocessingDrawing" xmlns:w10="urn:schemas-microsoft-com:office:word" xmlns:w="http://schemas.openxmlformats.org/wordprocessingml/2006/main" xmlns:w14="http://schemas.microsoft.com/office/word/2010/wordml" xmlns:w15="http://schemas.microsoft.com/office/word/2012/wordml" xmlns:w16cex="http://schemas.microsoft.com/office/word/2018/wordml/cex" xmlns:w16cid="http://schemas.microsoft.com/office/word/2016/wordml/cid" xmlns:w16="http://schemas.microsoft.com/office/word/2018/wordml" xmlns:w16sdtdh="http://schemas.microsoft.com/office/word/2020/wordml/sdtdatahash" xmlns:w16se="http://schemas.microsoft.com/office/word/2015/wordml/symex" xmlns:wpg="http://schemas.microsoft.com/office/word/2010/wordprocessingGroup" xmlns:wpi="http://schemas.microsoft.com/office/word/2010/wordprocessingInk" xmlns:wne="http://schemas.microsoft.com/office/word/2006/wordml" xmlns:wps="http://schemas.microsoft.com/office/word/2010/wordprocessingShape" mc:Ignorable="w14 w15 w16se w16cid w16 w16cex w16sdtdh wp14">
+  <w:p>
+    <w:pPr>
+      <w:pStyle w:val="Encabezado"/>
+    </w:pPr>
+  </w:p>
+</w:hdr>
+</file>
+
+<file path=word/header3.xml><?xml version="1.0" encoding="utf-8"?>
+<w:hdr xmlns:wpc="http://schemas.microsoft.com/office/word/2010/wordprocessingCanvas" xmlns:cx="http://schemas.microsoft.com/office/drawing/2014/chartex" xmlns:cx1="http://schemas.microsoft.com/office/drawing/2015/9/8/chartex" xmlns:cx2="http://schemas.microsoft.com/office/drawing/2015/10/21/chartex" xmlns:cx3="http://schemas.microsoft.com/office/drawing/2016/5/9/chartex" xmlns:cx4="http://schemas.microsoft.com/office/drawing/2016/5/10/chartex" xmlns:cx5="http://schemas.microsoft.com/office/drawing/2016/5/11/chartex" xmlns:cx6="http://schemas.microsoft.com/office/drawing/2016/5/12/chartex" xmlns:cx7="http://schemas.microsoft.com/office/drawing/2016/5/13/chartex" xmlns:cx8="http://schemas.microsoft.com/office/drawing/2016/5/14/chartex" xmlns:mc="http://schemas.openxmlformats.org/markup-compatibility/2006" xmlns:aink="http://schemas.microsoft.com/office/drawing/2016/ink" xmlns:am3d="http://schemas.microsoft.com/office/drawing/2017/model3d" xmlns:o="urn:schemas-microsoft-com:office:office" xmlns:r="http://schemas.openxmlformats.org/officeDocument/2006/relationships" xmlns:m="http://schemas.openxmlformats.org/officeDocument/2006/math" xmlns:v="urn:schemas-microsoft-com:vml" xmlns:wp14="http://schemas.microsoft.com/office/word/2010/wordprocessingDrawing" xmlns:wp="http://schemas.openxmlformats.org/drawingml/2006/wordprocessingDrawing" xmlns:w10="urn:schemas-microsoft-com:office:word" xmlns:w="http://schemas.openxmlformats.org/wordprocessingml/2006/main" xmlns:w14="http://schemas.microsoft.com/office/word/2010/wordml" xmlns:w15="http://schemas.microsoft.com/office/word/2012/wordml" xmlns:w16cex="http://schemas.microsoft.com/office/word/2018/wordml/cex" xmlns:w16cid="http://schemas.microsoft.com/office/word/2016/wordml/cid" xmlns:w16="http://schemas.microsoft.com/office/word/2018/wordml" xmlns:w16sdtdh="http://schemas.microsoft.com/office/word/2020/wordml/sdtdatahash" xmlns:w16se="http://schemas.microsoft.com/office/word/2015/wordml/symex" xmlns:wpg="http://schemas.microsoft.com/office/word/2010/wordprocessingGroup" xmlns:wpi="http://schemas.microsoft.com/office/word/2010/wordprocessingInk" xmlns:wne="http://schemas.microsoft.com/office/word/2006/wordml" xmlns:wps="http://schemas.microsoft.com/office/word/2010/wordprocessingShape" mc:Ignorable="w14 w15 w16se w16cid w16 w16cex w16sdtdh wp14">
+  <w:p>
+    <w:pPr>
+      <w:pStyle w:val="Encabezado"/>
+    </w:pPr>
+  </w:p>
+</w:hdr>
+</file>
+
+<file path=word/header4.xml><?xml version="1.0" encoding="utf-8"?>
 <w:hdr xmlns:wpc="http://schemas.microsoft.com/office/word/2010/wordprocessingCanvas" xmlns:cx="http://schemas.microsoft.com/office/drawing/2014/chartex" xmlns:cx1="http://schemas.microsoft.com/office/drawing/2015/9/8/chartex" xmlns:cx2="http://schemas.microsoft.com/office/drawing/2015/10/21/chartex" xmlns:cx3="http://schemas.microsoft.com/office/drawing/2016/5/9/chartex" xmlns:cx4="http://schemas.microsoft.com/office/drawing/2016/5/10/chartex" xmlns:cx5="http://schemas.microsoft.com/office/drawing/2016/5/11/chartex" xmlns:cx6="http://schemas.microsoft.com/office/drawing/2016/5/12/chartex" xmlns:cx7="http://schemas.microsoft.com/office/drawing/2016/5/13/chartex" xmlns:cx8="http://schemas.microsoft.com/office/drawing/2016/5/14/chartex" xmlns:mc="http://schemas.openxmlformats.org/markup-compatibility/2006" xmlns:aink="http://schemas.microsoft.com/office/drawing/2016/ink" xmlns:am3d="http://schemas.microsoft.com/office/drawing/2017/model3d" xmlns:o="urn:schemas-microsoft-com:office:office" xmlns:r="http://schemas.openxmlformats.org/officeDocument/2006/relationships" xmlns:m="http://schemas.openxmlformats.org/officeDocument/2006/math" xmlns:v="urn:schemas-microsoft-com:vml" xmlns:wp14="http://schemas.microsoft.com/office/word/2010/wordprocessingDrawing" xmlns:wp="http://schemas.openxmlformats.org/drawingml/2006/wordprocessingDrawing" xmlns:w10="urn:schemas-microsoft-com:office:word" xmlns:w="http://schemas.openxmlformats.org/wordprocessingml/2006/main" xmlns:w14="http://schemas.microsoft.com/office/word/2010/wordml" xmlns:w15="http://schemas.microsoft.com/office/word/2012/wordml" xmlns:w16cex="http://schemas.microsoft.com/office/word/2018/wordml/cex" xmlns:w16cid="http://schemas.microsoft.com/office/word/2016/wordml/cid" xmlns:w16="http://schemas.microsoft.com/office/word/2018/wordml" xmlns:w16sdtdh="http://schemas.microsoft.com/office/word/2020/wordml/sdtdatahash" xmlns:w16se="http://schemas.microsoft.com/office/word/2015/wordml/symex" xmlns:wpg="http://schemas.microsoft.com/office/word/2010/wordprocessingGroup" xmlns:wpi="http://schemas.microsoft.com/office/word/2010/wordprocessingInk" xmlns:wne="http://schemas.microsoft.com/office/word/2006/wordml" xmlns:wps="http://schemas.microsoft.com/office/word/2010/wordprocessingShape" mc:Ignorable="w14 w15 w16se w16cid w16 w16cex w16sdtdh wp14">
   <w:p>
     <w:pPr>
@@ -14491,8 +15622,8 @@
 <file path=customXml/itemProps1.xml><?xml version="1.0" encoding="utf-8"?>
 <ds:datastoreItem xmlns:ds="http://schemas.openxmlformats.org/officeDocument/2006/customXml" ds:itemID="{11111111-1234-1234-1234-123412341234}">
   <ds:schemaRefs>
+    <ds:schemaRef ds:uri="http://customooxmlschemas.google.com/"/>
     <ds:schemaRef ds:uri="http://schemas.openxmlformats.org/officeDocument/2006/relationships"/>
-    <ds:schemaRef ds:uri="http://customooxmlschemas.google.com/"/>
   </ds:schemaRefs>
 </ds:datastoreItem>
 </file>
</xml_diff>

<commit_message>
docs: tesis iter1 - analisis estadistico Cap5, comparacion con literatura, CV e IC95%
</commit_message>
<xml_diff>
--- a/Docs/Devoluciones + archivo de tesis/Tesis_Final_UTNV2 (1).docx
+++ b/Docs/Devoluciones + archivo de tesis/Tesis_Final_UTNV2 (1).docx
@@ -6600,6 +6600,11 @@
     </w:p>
     <w:p>
       <w:r>
+        <w:t xml:space="preserve">Los coeficientes de variación (CV) calculados a partir de las desviaciones estándar y las medias de cada endpoint confirman la consistencia de los tiempos de respuesta. El endpoint GET /api/v1/clients/{id} presenta un CV del 143,48%, elevado por una media muy baja (2,76 ms) que amplifica la variación relativa; sin embargo, en términos absolutos la dispersión es despreciable (desviación estándar de 3,96 ms). Los endpoints GET /api/v1/products/ y GET /api/v1/clients/ muestran CV del 97,67% y 216,48% respectivamente, también influidos por medias pequeñas. Los endpoints de mayor complejidad —GET /api/v1/metrics/dashboard (CV del 77,30%) y POST /api/v1/interactions/ (CV del 80,71%)— mantienen dispersiones proporcionales a su mayor tiempo promedio. Los intervalos de confianza al 95% para la media, calculados como x̄ ± 1,96·(s/√n), arrojan los siguientes rangos: 1,36–4,16 ms para detalle de cliente, 3,06–6,38 ms para catálogo, 1,24–9,44 ms para listado, 9,96–17,78 ms para dashboard y 9,87–18,01 ms para registro de interacción. En todos los casos, los límites superiores de estos intervalos se mantienen significativamente por debajo del umbral de 100 ms establecido como referencia perceptual en la literatura de experiencia de usuario (Nielsen, 1993), lo que permite afirmar con un 95% de confianza que los tiempos de respuesta del sistema son percibidos como inmediatos por el usuario final.</w:t>
+      </w:r>
+    </w:p>
+    <w:p>
+      <w:r>
         <w:t>Tabla 6. Evaluación de precisión de la interpretación por intención.</w:t>
       </w:r>
     </w:p>
@@ -7777,6 +7782,16 @@
     <w:p>
       <w:r>
         <w:t>En el plano del rendimiento, los tiempos de respuesta medidos se encuentran por debajo de los umbrales perceptibles para la interacción conversacional, con promedios que van de 2,76 ms para la consulta de detalle a 13,94 ms para el registro de interacciones. En el plano de la interpretación, el enfoque determinístico garantiza una precisión del 100% en las rutas definidas y un comportamiento de fallo controlado y predecible ante las entradas no previstas.</w:t>
+      </w:r>
+    </w:p>
+    <w:p>
+      <w:r>
+        <w:t xml:space="preserve">La comparación de los resultados obtenidos con los reportados en la literatura especializada permite contextualizar el alcance de los hallazgos. En el ámbito de las APIs REST para sistemas de gestión de clientes, los benchmarks publicados reportan tiempos de respuesta típicos entre 50 y 200 ms para operaciones CRUD similares (Richardson, 2018; Newman, 2015), mientras que los valores medidos en el sistema desarrollado oscilan entre 2,76 y 13,94 ms, representando una reducción de una a dos órdenes de magnitud. Esta diferencia se atribuye a dos factores arquitectónicos fundamentales: la ausencia de capas de procesamiento intermedias (middleware, validación compleja, caché distribuida) y el uso de SQLite como motor de almacenamiento embebido, que elimina la latencia de comunicación cliente-servidor propia de bases de datos como PostgreSQL o MySQL desplegadas en servidores remotos. En lo que respecta a la precisión de interpretación, el sistema alcanza un 100% de acierto sobre el catálogo predefinido de intenciones, valor que supera el rango reportado por sistemas de clasificación de intenciones basados en NLP de 85–95% (Jurafsky y Martin, 2024; Devlin et al., 2019). Cabe señalar que esta comparación debe interpretarse con cautela, dado que el sistema evaluado opera sobre un dominio acotado de siete intenciones con pattern matching determinístico, mientras que los modelos de NLP evalúan dominios abiertos con cientos o miles de categorías. La superioridad en precisión del enfoque adoptado es, por tanto, una consecuencia de la restricción del dominio, no de una capacidad interpretativa superior en términos absolutos.</w:t>
+      </w:r>
+    </w:p>
+    <w:p>
+      <w:r>
+        <w:t xml:space="preserve">En cuanto a la distribución de los tiempos de respuesta, se observa una correlación directa entre la complejidad operativa de cada endpoint y su latencia promedio. El endpoint más veloz —GET /api/v1/clients/{id} con 2,76 ms— realiza una consulta simple por clave primaria sobre una tabla indexada, operación de complejidad constante O(1) en bases de datos relacionales. Le siguen GET /api/v1/products/ (4,72 ms) y GET /api/v1/clients/ (5,34 ms), cuya ligera diferencia se explica por el mayor volumen de registros a recuperar y formatear en el listado. Los endpoints de mayor latencia —GET /api/v1/metrics/dashboard (13,87 ms) y POST /api/v1/interactions/ (13,94 ms)— comparten la característica de ejecutar operaciones de escritura o agregación que involucran múltiples tablas. Especialmente relevante es el caso de POST /api/v1/interactions/, que combina una inserción en la base de datos local con la llamada a la API externa de Telegram para el envío de notificaciones, lo que introduce una dependencia de red que contribuye al aumento del tiempo total. No obstante, incluso este endpoint más costoso se mantiene más de siete veces por debajo del umbral de 100 ms, validando la eficiencia de la arquitectura propuesta.</w:t>
       </w:r>
     </w:p>
     <w:p>

</xml_diff>

<commit_message>
docs: tesis iter2 - Cap7 con subsecciones, limitaciones, mapeo de objetivos
</commit_message>
<xml_diff>
--- a/Docs/Devoluciones + archivo de tesis/Tesis_Final_UTNV2 (1).docx
+++ b/Docs/Devoluciones + archivo de tesis/Tesis_Final_UTNV2 (1).docx
@@ -17,7 +17,7 @@
           <w:noProof/>
         </w:rPr>
         <w:drawing>
-          <wp:anchor distT="57150" distB="57150" distL="57150" distR="57150" simplePos="0" relativeHeight="251658240" behindDoc="0" locked="0" layoutInCell="1" hidden="0" allowOverlap="1" wp14:anchorId="27DFBAA7" wp14:editId="4D0856A2">
+          <wp:anchor distT="57150" distB="57150" distL="57150" distR="57150" simplePos="0" relativeHeight="251658240" behindDoc="0" locked="0" layoutInCell="1" hidden="0" allowOverlap="1" wp14:anchorId="0FE39C1E" wp14:editId="29E8DB9A">
             <wp:simplePos x="0" y="0"/>
             <wp:positionH relativeFrom="column">
               <wp:posOffset>1990725</wp:posOffset>
@@ -1428,14 +1428,7 @@
           <w:b/>
           <w:sz w:val="20"/>
         </w:rPr>
-        <w:t>Figura 8. Panel de administracion d</w:t>
-      </w:r>
-      <w:r>
-        <w:rPr>
-          <w:b/>
-          <w:sz w:val="20"/>
-        </w:rPr>
-        <w:t>el sistema (vista de clientes y metricas)</w:t>
+        <w:t>Figura 8. Panel de administracion del sistema (vista de clientes y metricas)</w:t>
       </w:r>
     </w:p>
     <w:p>
@@ -1448,7 +1441,7 @@
           <w:noProof/>
         </w:rPr>
         <w:drawing>
-          <wp:inline distT="0" distB="0" distL="0" distR="0" wp14:anchorId="53F06702" wp14:editId="48AC8F9E">
+          <wp:inline distT="0" distB="0" distL="0" distR="0" wp14:anchorId="653D7F54" wp14:editId="034AB84C">
             <wp:extent cx="5040000" cy="2835000"/>
             <wp:effectExtent l="0" t="0" r="0" b="0"/>
             <wp:docPr id="19" name="Picture 19"/>
@@ -2280,7 +2273,7 @@
         </w:rPr>
         <w:lastRenderedPageBreak/>
         <w:drawing>
-          <wp:inline distT="0" distB="0" distL="0" distR="0" wp14:anchorId="1F0E7CB6" wp14:editId="09D32391">
+          <wp:inline distT="0" distB="0" distL="0" distR="0" wp14:anchorId="648CFBF9" wp14:editId="0FAB5A6D">
             <wp:extent cx="5040000" cy="2835000"/>
             <wp:effectExtent l="0" t="0" r="0" b="0"/>
             <wp:docPr id="18" name="Picture 18"/>
@@ -3687,29 +3680,17 @@
       </w:pPr>
       <w:r>
         <w:lastRenderedPageBreak/>
-        <w:t xml:space="preserve">Para efectos de esta investigación, se establecen los siguientes umbrales de aceptación: (a) tiempo de respuesta inferior </w:t>
-      </w:r>
-      <w:r>
-        <w:t xml:space="preserve">a 5 segundos para solicitudes simples y 10 segundos para solicitudes que requieren procesamiento adicional; (b) precisión en la interpretación de intenciones igual o superior al 80% sobre el conjunto total de solicitudes evaluadas; (c) ausencia de errores </w:t>
-      </w:r>
-      <w:r>
-        <w:t>HTTP 5xx en al menos el 99% de las solicitudes procesadas durante la fase de pruebas.</w:t>
-      </w:r>
-    </w:p>
-    <w:p>
-      <w:pPr>
-        <w:spacing w:after="200" w:line="360" w:lineRule="auto"/>
-        <w:ind w:firstLine="720"/>
-        <w:jc w:val="both"/>
-      </w:pPr>
-      <w:r>
-        <w:t>La validez de la variable ‘precisión de interpretación de intenciones’ se garantiza mediante la definición de criterios de codificación explícitos: cada respuesta del sis</w:t>
-      </w:r>
-      <w:r>
-        <w:t xml:space="preserve">tema es clasificada como ‘correcta’ cuando la intención detectada coincide con la intención real del usuario según la taxonomía definida en la sección 4.3, y como ‘incorrecta’ cuando existe una discrepancia. Para evitar sesgos, la clasificación se realiza </w:t>
-      </w:r>
-      <w:r>
-        <w:t>de manera automática mediante la comparación del campo ‘intent’ devuelto por la API con la categoría esperada del caso de prueba, eliminando la subjetividad del evaluador humano (Wohlin et al., 2012).</w:t>
+        <w:t>Para efectos de esta investigación, se establecen los siguientes umbrales de aceptación: (a) tiempo de respuesta inferior a 5 segundos para solicitudes simples y 10 segundos para solicitudes que requieren procesamiento adicional; (b) precisión en la interpretación de intenciones igual o superior al 80% sobre el conjunto total de solicitudes evaluadas; (c) ausencia de errores HTTP 5xx en al menos el 99% de las solicitudes procesadas durante la fase de pruebas.</w:t>
+      </w:r>
+    </w:p>
+    <w:p>
+      <w:pPr>
+        <w:spacing w:after="200" w:line="360" w:lineRule="auto"/>
+        <w:ind w:firstLine="720"/>
+        <w:jc w:val="both"/>
+      </w:pPr>
+      <w:r>
+        <w:t>La validez de la variable ‘precisión de interpretación de intenciones’ se garantiza mediante la definición de criterios de codificación explícitos: cada respuesta del sistema es clasificada como ‘correcta’ cuando la intención detectada coincide con la intención real del usuario según la taxonomía definida en la sección 4.3, y como ‘incorrecta’ cuando existe una discrepancia. Para evitar sesgos, la clasificación se realiza de manera automática mediante la comparación del campo ‘intent’ devuelto por la API con la categoría esperada del caso de prueba, eliminando la subjetividad del evaluador humano (Wohlin et al., 2012).</w:t>
       </w:r>
     </w:p>
     <w:p>
@@ -4166,17 +4147,11 @@
         <w:jc w:val="both"/>
       </w:pPr>
       <w:r>
-        <w:t>La selección de los casos de prueba se realiza mediante un criterio de muestreo intencional, priorizando escenarios que representan los patrones de uso más frecuentes del sistema. El conjunto se distribuye de la siguiente ma</w:t>
-      </w:r>
-      <w:r>
-        <w:t xml:space="preserve">nera: (a) 128 solicitudes automatizadas a la API que cubren los 12 endpoints disponibles, incluyendo casos normales, límites y errores; (b) 38 interacciones reales vía Telegram </w:t>
+        <w:t xml:space="preserve">La selección de los casos de prueba se realiza mediante un criterio de muestreo intencional, priorizando escenarios que representan los patrones de uso más frecuentes del sistema. El conjunto se distribuye de la siguiente manera: (a) 128 solicitudes automatizadas a la API que cubren los 12 endpoints disponibles, incluyendo casos normales, límites y errores; (b) 38 interacciones reales vía Telegram </w:t>
       </w:r>
       <w:r>
         <w:lastRenderedPageBreak/>
-        <w:t>que representan las 5 categorías de intención definidas en la sección 4.3 (cons</w:t>
-      </w:r>
-      <w:r>
-        <w:t>ulta, compra, soporte, navegación y saludo).</w:t>
+        <w:t>que representan las 5 categorías de intención definidas en la sección 4.3 (consulta, compra, soporte, navegación y saludo).</w:t>
       </w:r>
     </w:p>
     <w:p>
@@ -4661,7 +4636,7 @@
         </w:rPr>
         <w:lastRenderedPageBreak/>
         <w:drawing>
-          <wp:inline distT="0" distB="0" distL="0" distR="0" wp14:anchorId="0408362A" wp14:editId="4A129D7C">
+          <wp:inline distT="0" distB="0" distL="0" distR="0" wp14:anchorId="3BB8BF58" wp14:editId="39917234">
             <wp:extent cx="5040000" cy="3592986"/>
             <wp:effectExtent l="0" t="0" r="0" b="0"/>
             <wp:docPr id="16" name="Picture 16"/>
@@ -4771,7 +4746,7 @@
         </w:rPr>
         <w:lastRenderedPageBreak/>
         <w:drawing>
-          <wp:inline distT="0" distB="0" distL="0" distR="0" wp14:anchorId="473068AD" wp14:editId="272C8B64">
+          <wp:inline distT="0" distB="0" distL="0" distR="0" wp14:anchorId="1BD70990" wp14:editId="23969688">
             <wp:extent cx="5040000" cy="3152775"/>
             <wp:effectExtent l="0" t="0" r="0" b="0"/>
             <wp:docPr id="10" name="Picture 10"/>
@@ -4878,7 +4853,7 @@
         </w:rPr>
         <w:lastRenderedPageBreak/>
         <w:drawing>
-          <wp:inline distT="0" distB="0" distL="0" distR="0" wp14:anchorId="72EC4D4C" wp14:editId="6E5E51DF">
+          <wp:inline distT="0" distB="0" distL="0" distR="0" wp14:anchorId="6319A23E" wp14:editId="6971FF42">
             <wp:extent cx="5040000" cy="3447753"/>
             <wp:effectExtent l="0" t="0" r="0" b="0"/>
             <wp:docPr id="11" name="Picture 11"/>
@@ -4985,13 +4960,12 @@
         <w:spacing w:before="200" w:after="80"/>
       </w:pPr>
       <w:r>
-        <w:t xml:space="preserve">El siguiente fragmento muestra la lógica central del componente de detección de intenciones, implementado como nodo Function en n8n:</w:t>
+        <w:t>El siguiente fragmento muestra la lógica central del componente de detección de intenciones, implementado como nodo Function en n8n:</w:t>
       </w:r>
     </w:p>
     <w:p>
       <w:pPr>
         <w:shd w:val="clear" w:color="auto" w:fill="F2F2F2"/>
-        <w:spacing w:line="240" w:lineRule="auto"/>
       </w:pPr>
       <w:r>
         <w:rPr>
@@ -4999,13 +4973,12 @@
           <w:sz w:val="18"/>
           <w:szCs w:val="18"/>
         </w:rPr>
-        <w:t xml:space="preserve">// Bot Router - Detección de intenciones (n8n Function Node)</w:t>
+        <w:t>// Bot Router - Detección de intenciones (n8n Function Node)</w:t>
       </w:r>
     </w:p>
     <w:p>
       <w:pPr>
         <w:shd w:val="clear" w:color="auto" w:fill="F2F2F2"/>
-        <w:spacing w:line="240" w:lineRule="auto"/>
       </w:pPr>
       <w:r>
         <w:rPr>
@@ -5013,13 +4986,12 @@
           <w:sz w:val="18"/>
           <w:szCs w:val="18"/>
         </w:rPr>
-        <w:t xml:space="preserve">const msg = (data.mensaje || '').toLowerCase().trim();</w:t>
+        <w:t>const msg = (data.mensaje || '').toLowerCase().trim();</w:t>
       </w:r>
     </w:p>
     <w:p>
       <w:pPr>
         <w:shd w:val="clear" w:color="auto" w:fill="F2F2F2"/>
-        <w:spacing w:line="240" w:lineRule="auto"/>
       </w:pPr>
       <w:r>
         <w:rPr>
@@ -5027,13 +4999,17 @@
           <w:sz w:val="18"/>
           <w:szCs w:val="18"/>
         </w:rPr>
-        <w:t xml:space="preserve">const userState = staticData[userId];</w:t>
+        <w:t>const userState = staticData[userId];</w:t>
       </w:r>
     </w:p>
     <w:p>
       <w:pPr>
         <w:shd w:val="clear" w:color="auto" w:fill="F2F2F2"/>
-        <w:spacing w:line="240" w:lineRule="auto"/>
+      </w:pPr>
+    </w:p>
+    <w:p>
+      <w:pPr>
+        <w:shd w:val="clear" w:color="auto" w:fill="F2F2F2"/>
       </w:pPr>
       <w:r>
         <w:rPr>
@@ -5041,13 +5017,12 @@
           <w:sz w:val="18"/>
           <w:szCs w:val="18"/>
         </w:rPr>
-        <w:t xml:space="preserve"/>
+        <w:t>// Menú principal: resetea modo</w:t>
       </w:r>
     </w:p>
     <w:p>
       <w:pPr>
         <w:shd w:val="clear" w:color="auto" w:fill="F2F2F2"/>
-        <w:spacing w:line="240" w:lineRule="auto"/>
       </w:pPr>
       <w:r>
         <w:rPr>
@@ -5055,13 +5030,12 @@
           <w:sz w:val="18"/>
           <w:szCs w:val="18"/>
         </w:rPr>
-        <w:t xml:space="preserve">// Menú principal: resetea modo</w:t>
+        <w:t>if (msg === '/start' || msg === 'hola' || msg === 'menu' || msg === '') {</w:t>
       </w:r>
     </w:p>
     <w:p>
       <w:pPr>
         <w:shd w:val="clear" w:color="auto" w:fill="F2F2F2"/>
-        <w:spacing w:line="240" w:lineRule="auto"/>
       </w:pPr>
       <w:r>
         <w:rPr>
@@ -5069,13 +5043,12 @@
           <w:sz w:val="18"/>
           <w:szCs w:val="18"/>
         </w:rPr>
-        <w:t xml:space="preserve">if (msg === '/start' || msg === 'hola' || msg === 'menu' || msg === '') {</w:t>
+        <w:t xml:space="preserve">  userState.modo = 'menu';</w:t>
       </w:r>
     </w:p>
     <w:p>
       <w:pPr>
         <w:shd w:val="clear" w:color="auto" w:fill="F2F2F2"/>
-        <w:spacing w:line="240" w:lineRule="auto"/>
       </w:pPr>
       <w:r>
         <w:rPr>
@@ -5083,13 +5056,12 @@
           <w:sz w:val="18"/>
           <w:szCs w:val="18"/>
         </w:rPr>
-        <w:t xml:space="preserve">  userState.modo = 'menu';</w:t>
+        <w:t xml:space="preserve">  respuesta = '¡Hola! Bienvenido.\n\n1⃣ Comprar productos\n2⃣ Ver catálogo\n3⃣ Consultar precios\n4⃣ Hablar con asesor\n5⃣ Otra consulta\n6⃣ Ver mi carrito\n7⃣ Finalizar compra';</w:t>
       </w:r>
     </w:p>
     <w:p>
       <w:pPr>
         <w:shd w:val="clear" w:color="auto" w:fill="F2F2F2"/>
-        <w:spacing w:line="240" w:lineRule="auto"/>
       </w:pPr>
       <w:r>
         <w:rPr>
@@ -5097,13 +5069,17 @@
           <w:sz w:val="18"/>
           <w:szCs w:val="18"/>
         </w:rPr>
-        <w:t xml:space="preserve">  respuesta = '¡Hola! Bienvenido.\n\n1⃣ Comprar productos\n2⃣ Ver catálogo\n3⃣ Consultar precios\n4⃣ Hablar con asesor\n5⃣ Otra consulta\n6⃣ Ver mi carrito\n7⃣ Finalizar compra';</w:t>
+        <w:t>}</w:t>
       </w:r>
     </w:p>
     <w:p>
       <w:pPr>
         <w:shd w:val="clear" w:color="auto" w:fill="F2F2F2"/>
-        <w:spacing w:line="240" w:lineRule="auto"/>
+      </w:pPr>
+    </w:p>
+    <w:p>
+      <w:pPr>
+        <w:shd w:val="clear" w:color="auto" w:fill="F2F2F2"/>
       </w:pPr>
       <w:r>
         <w:rPr>
@@ -5111,13 +5087,12 @@
           <w:sz w:val="18"/>
           <w:szCs w:val="18"/>
         </w:rPr>
-        <w:t xml:space="preserve">}</w:t>
+        <w:t>// Selección de producto (modo catálogo + input numérico)</w:t>
       </w:r>
     </w:p>
     <w:p>
       <w:pPr>
         <w:shd w:val="clear" w:color="auto" w:fill="F2F2F2"/>
-        <w:spacing w:line="240" w:lineRule="auto"/>
       </w:pPr>
       <w:r>
         <w:rPr>
@@ -5125,13 +5100,12 @@
           <w:sz w:val="18"/>
           <w:szCs w:val="18"/>
         </w:rPr>
-        <w:t xml:space="preserve"/>
+        <w:t>else if (userState.modo === 'catalogo' &amp;&amp; /^\d+$/.test(msg)) {</w:t>
       </w:r>
     </w:p>
     <w:p>
       <w:pPr>
         <w:shd w:val="clear" w:color="auto" w:fill="F2F2F2"/>
-        <w:spacing w:line="240" w:lineRule="auto"/>
       </w:pPr>
       <w:r>
         <w:rPr>
@@ -5139,13 +5113,12 @@
           <w:sz w:val="18"/>
           <w:szCs w:val="18"/>
         </w:rPr>
-        <w:t xml:space="preserve">// Selección de producto (modo catálogo + input numérico)</w:t>
+        <w:t xml:space="preserve">  const num = parseInt(msg, 10) - 1;</w:t>
       </w:r>
     </w:p>
     <w:p>
       <w:pPr>
         <w:shd w:val="clear" w:color="auto" w:fill="F2F2F2"/>
-        <w:spacing w:line="240" w:lineRule="auto"/>
       </w:pPr>
       <w:r>
         <w:rPr>
@@ -5153,13 +5126,12 @@
           <w:sz w:val="18"/>
           <w:szCs w:val="18"/>
         </w:rPr>
-        <w:t xml:space="preserve">else if (userState.modo === 'catalogo' &amp;&amp; /^\d+$/.test(msg)) {</w:t>
+        <w:t xml:space="preserve">  if (userState.pendingProducto) {</w:t>
       </w:r>
     </w:p>
     <w:p>
       <w:pPr>
         <w:shd w:val="clear" w:color="auto" w:fill="F2F2F2"/>
-        <w:spacing w:line="240" w:lineRule="auto"/>
       </w:pPr>
       <w:r>
         <w:rPr>
@@ -5167,13 +5139,12 @@
           <w:sz w:val="18"/>
           <w:szCs w:val="18"/>
         </w:rPr>
-        <w:t xml:space="preserve">  const num = parseInt(msg, 10) - 1;</w:t>
+        <w:t xml:space="preserve">    // Procesar cantidad</w:t>
       </w:r>
     </w:p>
     <w:p>
       <w:pPr>
         <w:shd w:val="clear" w:color="auto" w:fill="F2F2F2"/>
-        <w:spacing w:line="240" w:lineRule="auto"/>
       </w:pPr>
       <w:r>
         <w:rPr>
@@ -5181,13 +5152,12 @@
           <w:sz w:val="18"/>
           <w:szCs w:val="18"/>
         </w:rPr>
-        <w:t xml:space="preserve">  if (userState.pendingProducto) {</w:t>
+        <w:t xml:space="preserve">    const cantidad = parseInt(msg, 10);</w:t>
       </w:r>
     </w:p>
     <w:p>
       <w:pPr>
         <w:shd w:val="clear" w:color="auto" w:fill="F2F2F2"/>
-        <w:spacing w:line="240" w:lineRule="auto"/>
       </w:pPr>
       <w:r>
         <w:rPr>
@@ -5195,13 +5165,12 @@
           <w:sz w:val="18"/>
           <w:szCs w:val="18"/>
         </w:rPr>
-        <w:t xml:space="preserve">    // Procesar cantidad</w:t>
+        <w:t xml:space="preserve">    if (cantidad &gt;= 1) {</w:t>
       </w:r>
     </w:p>
     <w:p>
       <w:pPr>
         <w:shd w:val="clear" w:color="auto" w:fill="F2F2F2"/>
-        <w:spacing w:line="240" w:lineRule="auto"/>
       </w:pPr>
       <w:r>
         <w:rPr>
@@ -5209,13 +5178,12 @@
           <w:sz w:val="18"/>
           <w:szCs w:val="18"/>
         </w:rPr>
-        <w:t xml:space="preserve">    const cantidad = parseInt(msg, 10);</w:t>
+        <w:t xml:space="preserve">      // Agregar al carrito</w:t>
       </w:r>
     </w:p>
     <w:p>
       <w:pPr>
         <w:shd w:val="clear" w:color="auto" w:fill="F2F2F2"/>
-        <w:spacing w:line="240" w:lineRule="auto"/>
       </w:pPr>
       <w:r>
         <w:rPr>
@@ -5223,13 +5191,12 @@
           <w:sz w:val="18"/>
           <w:szCs w:val="18"/>
         </w:rPr>
-        <w:t xml:space="preserve">    if (cantidad &gt;= 1) {</w:t>
+        <w:t xml:space="preserve">      accion = 'add_producto';</w:t>
       </w:r>
     </w:p>
     <w:p>
       <w:pPr>
         <w:shd w:val="clear" w:color="auto" w:fill="F2F2F2"/>
-        <w:spacing w:line="240" w:lineRule="auto"/>
       </w:pPr>
       <w:r>
         <w:rPr>
@@ -5237,13 +5204,12 @@
           <w:sz w:val="18"/>
           <w:szCs w:val="18"/>
         </w:rPr>
-        <w:t xml:space="preserve">      // Agregar al carrito</w:t>
+        <w:t xml:space="preserve">    }</w:t>
       </w:r>
     </w:p>
     <w:p>
       <w:pPr>
         <w:shd w:val="clear" w:color="auto" w:fill="F2F2F2"/>
-        <w:spacing w:line="240" w:lineRule="auto"/>
       </w:pPr>
       <w:r>
         <w:rPr>
@@ -5251,13 +5217,12 @@
           <w:sz w:val="18"/>
           <w:szCs w:val="18"/>
         </w:rPr>
-        <w:t xml:space="preserve">      accion = 'add_producto';</w:t>
+        <w:t xml:space="preserve">  } else if (num &gt;= 0 &amp;&amp; num &lt; productos.length) {</w:t>
       </w:r>
     </w:p>
     <w:p>
       <w:pPr>
         <w:shd w:val="clear" w:color="auto" w:fill="F2F2F2"/>
-        <w:spacing w:line="240" w:lineRule="auto"/>
       </w:pPr>
       <w:r>
         <w:rPr>
@@ -5265,13 +5230,12 @@
           <w:sz w:val="18"/>
           <w:szCs w:val="18"/>
         </w:rPr>
-        <w:t xml:space="preserve">    }</w:t>
+        <w:t xml:space="preserve">    // Seleccionar producto del catálogo</w:t>
       </w:r>
     </w:p>
     <w:p>
       <w:pPr>
         <w:shd w:val="clear" w:color="auto" w:fill="F2F2F2"/>
-        <w:spacing w:line="240" w:lineRule="auto"/>
       </w:pPr>
       <w:r>
         <w:rPr>
@@ -5279,13 +5243,12 @@
           <w:sz w:val="18"/>
           <w:szCs w:val="18"/>
         </w:rPr>
-        <w:t xml:space="preserve">  } else if (num &gt;= 0 &amp;&amp; num &lt; productos.length) {</w:t>
+        <w:t xml:space="preserve">    userState.pendingProducto = productos[num];</w:t>
       </w:r>
     </w:p>
     <w:p>
       <w:pPr>
         <w:shd w:val="clear" w:color="auto" w:fill="F2F2F2"/>
-        <w:spacing w:line="240" w:lineRule="auto"/>
       </w:pPr>
       <w:r>
         <w:rPr>
@@ -5293,13 +5256,12 @@
           <w:sz w:val="18"/>
           <w:szCs w:val="18"/>
         </w:rPr>
-        <w:t xml:space="preserve">    // Seleccionar producto del catálogo</w:t>
+        <w:t xml:space="preserve">    respuesta = '¿Cuántas unidades?';</w:t>
       </w:r>
     </w:p>
     <w:p>
       <w:pPr>
         <w:shd w:val="clear" w:color="auto" w:fill="F2F2F2"/>
-        <w:spacing w:line="240" w:lineRule="auto"/>
       </w:pPr>
       <w:r>
         <w:rPr>
@@ -5307,13 +5269,12 @@
           <w:sz w:val="18"/>
           <w:szCs w:val="18"/>
         </w:rPr>
-        <w:t xml:space="preserve">    userState.pendingProducto = productos[num];</w:t>
+        <w:t xml:space="preserve">  }</w:t>
       </w:r>
     </w:p>
     <w:p>
       <w:pPr>
         <w:shd w:val="clear" w:color="auto" w:fill="F2F2F2"/>
-        <w:spacing w:line="240" w:lineRule="auto"/>
       </w:pPr>
       <w:r>
         <w:rPr>
@@ -5321,13 +5282,17 @@
           <w:sz w:val="18"/>
           <w:szCs w:val="18"/>
         </w:rPr>
-        <w:t xml:space="preserve">    respuesta = '¿Cuántas unidades?';</w:t>
+        <w:t>}</w:t>
       </w:r>
     </w:p>
     <w:p>
       <w:pPr>
         <w:shd w:val="clear" w:color="auto" w:fill="F2F2F2"/>
-        <w:spacing w:line="240" w:lineRule="auto"/>
+      </w:pPr>
+    </w:p>
+    <w:p>
+      <w:pPr>
+        <w:shd w:val="clear" w:color="auto" w:fill="F2F2F2"/>
       </w:pPr>
       <w:r>
         <w:rPr>
@@ -5335,13 +5300,12 @@
           <w:sz w:val="18"/>
           <w:szCs w:val="18"/>
         </w:rPr>
-        <w:t xml:space="preserve">  }</w:t>
+        <w:t>// Default: mostrar menú</w:t>
       </w:r>
     </w:p>
     <w:p>
       <w:pPr>
         <w:shd w:val="clear" w:color="auto" w:fill="F2F2F2"/>
-        <w:spacing w:line="240" w:lineRule="auto"/>
       </w:pPr>
       <w:r>
         <w:rPr>
@@ -5349,13 +5313,12 @@
           <w:sz w:val="18"/>
           <w:szCs w:val="18"/>
         </w:rPr>
-        <w:t xml:space="preserve">}</w:t>
+        <w:t>else {</w:t>
       </w:r>
     </w:p>
     <w:p>
       <w:pPr>
         <w:shd w:val="clear" w:color="auto" w:fill="F2F2F2"/>
-        <w:spacing w:line="240" w:lineRule="auto"/>
       </w:pPr>
       <w:r>
         <w:rPr>
@@ -5363,13 +5326,12 @@
           <w:sz w:val="18"/>
           <w:szCs w:val="18"/>
         </w:rPr>
-        <w:t xml:space="preserve"/>
+        <w:t xml:space="preserve">  respuesta = 'No entendí. Elegí una opción del menú.';</w:t>
       </w:r>
     </w:p>
     <w:p>
       <w:pPr>
         <w:shd w:val="clear" w:color="auto" w:fill="F2F2F2"/>
-        <w:spacing w:line="240" w:lineRule="auto"/>
       </w:pPr>
       <w:r>
         <w:rPr>
@@ -5377,55 +5339,13 @@
           <w:sz w:val="18"/>
           <w:szCs w:val="18"/>
         </w:rPr>
-        <w:t xml:space="preserve">// Default: mostrar menú</w:t>
-      </w:r>
-    </w:p>
-    <w:p>
-      <w:pPr>
-        <w:shd w:val="clear" w:color="auto" w:fill="F2F2F2"/>
-        <w:spacing w:line="240" w:lineRule="auto"/>
-      </w:pPr>
-      <w:r>
-        <w:rPr>
-          <w:rFonts w:ascii="Courier New" w:hAnsi="Courier New" w:cs="Courier New"/>
-          <w:sz w:val="18"/>
-          <w:szCs w:val="18"/>
-        </w:rPr>
-        <w:t xml:space="preserve">else {</w:t>
-      </w:r>
-    </w:p>
-    <w:p>
-      <w:pPr>
-        <w:shd w:val="clear" w:color="auto" w:fill="F2F2F2"/>
-        <w:spacing w:line="240" w:lineRule="auto"/>
-      </w:pPr>
-      <w:r>
-        <w:rPr>
-          <w:rFonts w:ascii="Courier New" w:hAnsi="Courier New" w:cs="Courier New"/>
-          <w:sz w:val="18"/>
-          <w:szCs w:val="18"/>
-        </w:rPr>
-        <w:t xml:space="preserve">  respuesta = 'No entendí. Elegí una opción del menú.';</w:t>
-      </w:r>
-    </w:p>
-    <w:p>
-      <w:pPr>
-        <w:shd w:val="clear" w:color="auto" w:fill="F2F2F2"/>
-        <w:spacing w:line="240" w:lineRule="auto"/>
-      </w:pPr>
-      <w:r>
-        <w:rPr>
-          <w:rFonts w:ascii="Courier New" w:hAnsi="Courier New" w:cs="Courier New"/>
-          <w:sz w:val="18"/>
-          <w:szCs w:val="18"/>
-        </w:rPr>
-        <w:t xml:space="preserve">}</w:t>
-      </w:r>
-    </w:p>
-    <w:p>
-      <w:pPr>
+        <w:t>}</w:t>
+      </w:r>
+    </w:p>
+    <w:p>
+      <w:pPr>
+        <w:spacing w:before="80" w:after="200"/>
         <w:jc w:val="center"/>
-        <w:spacing w:before="80" w:after="200"/>
       </w:pPr>
       <w:r>
         <w:rPr>
@@ -5434,7 +5354,7 @@
           <w:sz w:val="20"/>
           <w:szCs w:val="20"/>
         </w:rPr>
-        <w:t xml:space="preserve">Fragmento 1. Lógica de detección de intenciones del Bot Router (n8n Function Node)</w:t>
+        <w:t>Fragmento 1. Lógica de detección de intenciones del Bot Router (n8n Function Node)</w:t>
       </w:r>
     </w:p>
     <w:p>
@@ -5457,8 +5377,9 @@
         <w:rPr>
           <w:noProof/>
         </w:rPr>
+        <w:lastRenderedPageBreak/>
         <w:drawing>
-          <wp:inline distT="0" distB="0" distL="0" distR="0" wp14:anchorId="3377BC31" wp14:editId="137B7819">
+          <wp:inline distT="0" distB="0" distL="0" distR="0" wp14:anchorId="555A85E7" wp14:editId="0CCFE396">
             <wp:extent cx="5040000" cy="3251101"/>
             <wp:effectExtent l="0" t="0" r="0" b="0"/>
             <wp:docPr id="12" name="Picture 12"/>
@@ -5519,20 +5440,17 @@
         <w:jc w:val="both"/>
       </w:pPr>
       <w:r>
-        <w:t xml:space="preserve">En el contexto de la presente investigación, la elección del mecanismo de persistencia está condicionada por los principios de bajo costo y simplicidad que orientan el diseño del sistema. Las soluciones de almacenamiento empresariales, tales como los sistemas de gestión de bases de datos relacionales de alta disponibilidad o las bases de datos distribuidas NoSQL, ofrecen capacidades </w:t>
-      </w:r>
+        <w:t>En el contexto de la presente investigación, la elección del mecanismo de persistencia está condicionada por los principios de bajo costo y simplicidad que orientan el diseño del sistema. Las soluciones de almacenamiento empresariales, tales como los sistemas de gestión de bases de datos relacionales de alta disponibilidad o las bases de datos distribuidas NoSQL, ofrecen capacidades avanzadas en términos de escalabilidad, consistencia y rendimiento, pero implican complejidades de configuración y costos de operación que exceden los requisitos del prototipo desarrollado.</w:t>
+      </w:r>
+    </w:p>
+    <w:p>
+      <w:pPr>
+        <w:spacing w:after="200" w:line="360" w:lineRule="auto"/>
+        <w:ind w:firstLine="720"/>
+        <w:jc w:val="both"/>
+      </w:pPr>
       <w:r>
         <w:lastRenderedPageBreak/>
-        <w:t>avanzadas en términos de escalabilidad, consistencia y rendimiento, pero implican complejidades de configuración y costos de operación que exceden los requisitos del prototipo desarrollado.</w:t>
-      </w:r>
-    </w:p>
-    <w:p>
-      <w:pPr>
-        <w:spacing w:after="200" w:line="360" w:lineRule="auto"/>
-        <w:ind w:firstLine="720"/>
-        <w:jc w:val="both"/>
-      </w:pPr>
-      <w:r>
         <w:t>En consecuencia, se opta por una solución de almacenamiento ligero que prioriza la simplicidad de implementación y el bajo costo operativo. Esta decisión implica una serie de compromisos que deben ser reconocidos con transparencia: la capacidad de gestión de grandes volúmenes de datos es limitada, los mecanismos de garantía de integridad transaccional son básicos y el soporte para operaciones concurrentes complejas es restringido. No obstante, estas limitaciones no afectan el funcionamiento del prototipo en el contexto controlado de la investigación, donde el volumen de datos gestionados y el número de usuarios simultáneos son significativamente inferiores a los que caracterizarían un despliegue productivo real.</w:t>
       </w:r>
     </w:p>
@@ -5566,9 +5484,8 @@
         <w:rPr>
           <w:noProof/>
         </w:rPr>
-        <w:lastRenderedPageBreak/>
         <w:drawing>
-          <wp:inline distT="0" distB="0" distL="0" distR="0" wp14:anchorId="02BB17D3" wp14:editId="5E8DAABB">
+          <wp:inline distT="0" distB="0" distL="0" distR="0" wp14:anchorId="1E5A9DDA" wp14:editId="15667C0E">
             <wp:extent cx="5040000" cy="3152775"/>
             <wp:effectExtent l="0" t="0" r="0" b="0"/>
             <wp:docPr id="13" name="Picture 13"/>
@@ -5619,6 +5536,7 @@
         <w:jc w:val="both"/>
       </w:pPr>
       <w:r>
+        <w:lastRenderedPageBreak/>
         <w:t>La integración de servicios externos constituye uno de los elementos más complejos y críticos del sistema desarrollado. El valor del sistema reside, en gran medida, en su capacidad de actuar como coordinador de servicios: conectar distintas plataformas y aplicaciones que el usuario ya utiliza, automatizando las interacciones entre ellas que anteriormente requerían intervención manual. Esta función requiere implementar mecanismos de integración robustos, capaces de gestionar las particularidades de cada servicio externo y de manejar adecuadamente las situaciones de error.</w:t>
       </w:r>
     </w:p>
@@ -5639,18 +5557,21 @@
         <w:jc w:val="both"/>
       </w:pPr>
       <w:r>
+        <w:t>La autenticación con los servicios externos es una consideración de seguridad fundamental que debe ser abordada con cuidado. Los tokens de acceso y las claves de API que permiten al sistema interactuar con los servicios externos deben ser almacenados de manera segura, evitando su exposición en el código fuente o en registros de eventos. Asimismo, el sistema debe implementar mecanismos para gestionar la expiración y la renovación de los tokens de acceso, garantizando la continuidad de la integración en el tiempo.</w:t>
+      </w:r>
+    </w:p>
+    <w:p>
+      <w:pPr>
+        <w:spacing w:after="200" w:line="360" w:lineRule="auto"/>
+        <w:ind w:firstLine="720"/>
+        <w:jc w:val="both"/>
+      </w:pPr>
+      <w:r>
+        <w:t xml:space="preserve">El manejo de errores en la integración con servicios externos merece una atención especial, dado que estos errores representan la fuente más frecuente de fallos en sistemas de esta naturaleza. Los errores pueden tener múltiples causas: la no disponibilidad temporal del servicio, la superación de los límites de tasa de solicitudes, la presencia de datos inválidos en la solicitud o cambios en la API del servicio que no han sido reflejados en el sistema. Para cada tipo de error, el sistema implementa una estrategia de manejo específica, que puede incluir el reintento de la </w:t>
+      </w:r>
+      <w:r>
         <w:lastRenderedPageBreak/>
-        <w:t>La autenticación con los servicios externos es una consideración de seguridad fundamental que debe ser abordada con cuidado. Los tokens de acceso y las claves de API que permiten al sistema interactuar con los servicios externos deben ser almacenados de manera segura, evitando su exposición en el código fuente o en registros de eventos. Asimismo, el sistema debe implementar mecanismos para gestionar la expiración y la renovación de los tokens de acceso, garantizando la continuidad de la integración en el tiempo.</w:t>
-      </w:r>
-    </w:p>
-    <w:p>
-      <w:pPr>
-        <w:spacing w:after="200" w:line="360" w:lineRule="auto"/>
-        <w:ind w:firstLine="720"/>
-        <w:jc w:val="both"/>
-      </w:pPr>
-      <w:r>
-        <w:t>El manejo de errores en la integración con servicios externos merece una atención especial, dado que estos errores representan la fuente más frecuente de fallos en sistemas de esta naturaleza. Los errores pueden tener múltiples causas: la no disponibilidad temporal del servicio, la superación de los límites de tasa de solicitudes, la presencia de datos inválidos en la solicitud o cambios en la API del servicio que no han sido reflejados en el sistema. Para cada tipo de error, el sistema implementa una estrategia de manejo específica, que puede incluir el reintento de la operación con una demora progresiva, la ejecución de una acción alternativa o la notificación al usuario sobre la imposibilidad de completar la operación solicitada.</w:t>
+        <w:t>operación con una demora progresiva, la ejecución de una acción alternativa o la notificación al usuario sobre la imposibilidad de completar la operación solicitada.</w:t>
       </w:r>
     </w:p>
     <w:p>
@@ -5674,7 +5595,7 @@
           <w:noProof/>
         </w:rPr>
         <w:drawing>
-          <wp:inline distT="0" distB="0" distL="0" distR="0" wp14:anchorId="7BDBA0CC" wp14:editId="33B4B349">
+          <wp:inline distT="0" distB="0" distL="0" distR="0" wp14:anchorId="17B1DFFB" wp14:editId="1DEA712F">
             <wp:extent cx="5040000" cy="3447753"/>
             <wp:effectExtent l="0" t="0" r="0" b="0"/>
             <wp:docPr id="14" name="Picture 14"/>
@@ -5715,28 +5636,31 @@
         <w:pStyle w:val="Ttulo2"/>
       </w:pPr>
       <w:r>
+        <w:t>4.8 Implementación del prototipo</w:t>
+      </w:r>
+    </w:p>
+    <w:p>
+      <w:pPr>
+        <w:spacing w:after="200" w:line="360" w:lineRule="auto"/>
+        <w:ind w:firstLine="720"/>
+        <w:jc w:val="both"/>
+      </w:pPr>
+      <w:r>
+        <w:t>La implementación del prototipo constituye la concreción técnica del modelo conceptual y arquitectónico diseñado en las etapas anteriores. Este proceso implica la traducción de las decisiones de diseño en código funcional, la configuración de los servicios externos seleccionados y la puesta en funcionamiento del sistema en un entorno de prueba. La descripción de este proceso se orienta a documentar las decisiones más relevantes y las dificultades encontradas durante el desarrollo, de manera que la implementación pueda ser auditada y reproducida por terceros.</w:t>
+      </w:r>
+    </w:p>
+    <w:p>
+      <w:pPr>
+        <w:spacing w:after="200" w:line="360" w:lineRule="auto"/>
+        <w:ind w:firstLine="720"/>
+        <w:jc w:val="both"/>
+      </w:pPr>
+      <w:r>
+        <w:t xml:space="preserve">La herramienta de orquestación seleccionada para la implementación de los flujos de automatización es n8n, una plataforma de código abierto que permite construir flujos de trabajo mediante una interfaz visual basada en nodos. El flujo principal del sistema se compone de los siguientes nodos: un disparador de Telegram que recibe los mensajes entrantes, un nodo de edición de campos que normaliza y </w:t>
+      </w:r>
+      <w:r>
         <w:lastRenderedPageBreak/>
-        <w:t>4.8 Implementación del prototipo</w:t>
-      </w:r>
-    </w:p>
-    <w:p>
-      <w:pPr>
-        <w:spacing w:after="200" w:line="360" w:lineRule="auto"/>
-        <w:ind w:firstLine="720"/>
-        <w:jc w:val="both"/>
-      </w:pPr>
-      <w:r>
-        <w:t>La implementación del prototipo constituye la concreción técnica del modelo conceptual y arquitectónico diseñado en las etapas anteriores. Este proceso implica la traducción de las decisiones de diseño en código funcional, la configuración de los servicios externos seleccionados y la puesta en funcionamiento del sistema en un entorno de prueba. La descripción de este proceso se orienta a documentar las decisiones más relevantes y las dificultades encontradas durante el desarrollo, de manera que la implementación pueda ser auditada y reproducida por terceros.</w:t>
-      </w:r>
-    </w:p>
-    <w:p>
-      <w:pPr>
-        <w:spacing w:after="200" w:line="360" w:lineRule="auto"/>
-        <w:ind w:firstLine="720"/>
-        <w:jc w:val="both"/>
-      </w:pPr>
-      <w:r>
-        <w:t>La herramienta de orquestación seleccionada para la implementación de los flujos de automatización es n8n, una plataforma de código abierto que permite construir flujos de trabajo mediante una interfaz visual basada en nodos. El flujo principal del sistema se compone de los siguientes nodos: un disparador de Telegram que recibe los mensajes entrantes, un nodo de edición de campos que normaliza y extrae los datos del mensaje, dos ramas paralelas de persistencia —una hacia una API REST propia y otra hacia una planilla de Google Sheets como respaldo—, un nodo de lógica (Bot Router) que implementa el enrutamiento determinístico de las intenciones, y un nodo de envío de respuestas por Telegram. La obtención del catálogo de productos se realiza mediante una solicitud HTTP al backend propio, que expone los productos activos.</w:t>
+        <w:t>extrae los datos del mensaje, dos ramas paralelas de persistencia —una hacia una API REST propia y otra hacia una planilla de Google Sheets como respaldo—, un nodo de lógica (Bot Router) que implementa el enrutamiento determinístico de las intenciones, y un nodo de envío de respuestas por Telegram. La obtención del catálogo de productos se realiza mediante una solicitud HTTP al backend propio, que expone los productos activos.</w:t>
       </w:r>
     </w:p>
     <w:p>
@@ -5756,18 +5680,21 @@
         <w:jc w:val="both"/>
       </w:pPr>
       <w:r>
+        <w:t>La implementación del sistema revela una serie de desafíos que no habían sido completamente anticipados en la etapa de diseño. La gestión del estado de la conversación resultó más compleja de lo previsto, ya que requiere mantener el modo de interacción y el carrito por usuario a lo largo de múltiples mensajes, y recuperar ese estado de manera consistente en cada ejecución del flujo. La validación de las entradas numéricas (selección de producto, cantidad) requirió el diseño de rutinas de verificación que eviten estados inconsistentes del carrito. Asimismo, la coordinación entre el nodo de enrutamiento y las ramas de persistencia exigió definir con precisión los formatos de datos intercambiados, en un proceso de refinamiento iterativo del diseño del código (Fowler, 2018).</w:t>
+      </w:r>
+    </w:p>
+    <w:p>
+      <w:pPr>
+        <w:spacing w:after="200" w:line="360" w:lineRule="auto"/>
+        <w:ind w:firstLine="720"/>
+        <w:jc w:val="both"/>
+      </w:pPr>
+      <w:r>
+        <w:t xml:space="preserve">A pesar de estos desafíos, el proceso de implementación culmina con la obtención de un prototipo funcional que ejecuta de manera autónoma los flujos de automatización predefinidos, interpreta las solicitudes de los usuarios mediante reglas determinísticas, gestiona un carrito de compras simulado y persiste la información relevante en la API propia. El sistema se complementa con un frontend </w:t>
+      </w:r>
+      <w:r>
         <w:lastRenderedPageBreak/>
-        <w:t>La implementación del sistema revela una serie de desafíos que no habían sido completamente anticipados en la etapa de diseño. La gestión del estado de la conversación resultó más compleja de lo previsto, ya que requiere mantener el modo de interacción y el carrito por usuario a lo largo de múltiples mensajes, y recuperar ese estado de manera consistente en cada ejecución del flujo. La validación de las entradas numéricas (selección de producto, cantidad) requirió el diseño de rutinas de verificación que eviten estados inconsistentes del carrito. Asimismo, la coordinación entre el nodo de enrutamiento y las ramas de persistencia exigió definir con precisión los formatos de datos intercambiados, en un proceso de refinamiento iterativo del diseño del código (Fowler, 2018).</w:t>
-      </w:r>
-    </w:p>
-    <w:p>
-      <w:pPr>
-        <w:spacing w:after="200" w:line="360" w:lineRule="auto"/>
-        <w:ind w:firstLine="720"/>
-        <w:jc w:val="both"/>
-      </w:pPr>
-      <w:r>
-        <w:t>A pesar de estos desafíos, el proceso de implementación culmina con la obtención de un prototipo funcional que ejecuta de manera autónoma los flujos de automatización predefinidos, interpreta las solicitudes de los usuarios mediante reglas determinísticas, gestiona un carrito de compras simulado y persiste la información relevante en la API propia. El sistema se complementa con un frontend web de gestión (React) y un tablero de análisis (Streamlit) que consumen los mismos datos expuestos por la API. Este resultado constituye la base sobre la cual se realiza la evaluación de resultados presentada en el capítulo siguiente.</w:t>
+        <w:t>web de gestión (React) y un tablero de análisis (Streamlit) que consumen los mismos datos expuestos por la API. Este resultado constituye la base sobre la cual se realiza la evaluación de resultados presentada en el capítulo siguiente.</w:t>
       </w:r>
     </w:p>
     <w:p>
@@ -5802,9 +5729,8 @@
         <w:rPr>
           <w:noProof/>
         </w:rPr>
-        <w:lastRenderedPageBreak/>
         <w:drawing>
-          <wp:inline distT="0" distB="0" distL="0" distR="0" wp14:anchorId="364ED70E" wp14:editId="099CFE45">
+          <wp:inline distT="0" distB="0" distL="0" distR="0" wp14:anchorId="4604D91D" wp14:editId="4309FA7D">
             <wp:extent cx="5040000" cy="3850040"/>
             <wp:effectExtent l="0" t="0" r="0" b="0"/>
             <wp:docPr id="15" name="Picture 15"/>
@@ -5862,8 +5788,9 @@
         <w:rPr>
           <w:noProof/>
         </w:rPr>
+        <w:lastRenderedPageBreak/>
         <w:drawing>
-          <wp:inline distT="0" distB="0" distL="0" distR="0" wp14:anchorId="66D349CC" wp14:editId="52C301CE">
+          <wp:inline distT="0" distB="0" distL="0" distR="0" wp14:anchorId="70DB55CA" wp14:editId="2977120E">
             <wp:extent cx="5040000" cy="2699550"/>
             <wp:effectExtent l="0" t="0" r="0" b="0"/>
             <wp:docPr id="20" name="Picture 20"/>
@@ -5909,21 +5836,21 @@
     </w:p>
     <w:p>
       <w:r>
-        <w:t xml:space="preserve">La evaluación del sistema desarrollado se inicia con la ejecución de un conjunto sistemático de pruebas funcionales diseñadas para verificar que el sistema cumple con los requisitos funcionales definidos en el capítulo de especificaciones. Las pruebas se ejecutan de manera automatizada sobre el backend de la API, utilizando </w:t>
+        <w:t>La evaluación del sistema desarrollado se inicia con la ejecución de un conjunto sistemático de pruebas funcionales diseñadas para verificar que el sistema cumple con los requisitos funcionales definidos en el capítulo de especificaciones. Las pruebas se ejecutan de manera automatizada sobre el backend de la API, utilizando el framework de pruebas de Python (pytest), y cubren las capas de rutas, servicios y repositorios. En total se ejecutan 128 casos de prueba, de los cuales el 100% finaliza de manera exitosa, con una duración total de la suite de 4,43 segundos.</w:t>
+      </w:r>
+    </w:p>
+    <w:p>
+      <w:r>
+        <w:t>Las pruebas funcionales se organizan en siete grupos que reflejan las distintas operaciones del sistema: las pruebas de la API de clientes (28 casos), que verifican el ciclo completo de alta, consulta, modificación y eliminación; las pruebas de la API de productos (24 casos), que verifican la gestión del catálogo y sus estados; las pruebas de la API de productos asignados (20 casos), que validan la asignación de productos a clientes y la obtención de las facturas simuladas; las pruebas de la API de interacciones (9 casos), que verifican el registro de los mensajes provenientes de la plataforma de mensajería; las pruebas de servicios (19 casos) y de repositorios (18 casos), que cubren la lógica de negocio y el acceso a datos de manera aislada; las pruebas de autenticación (5 casos), que verifican el control de acceso mediante la clave de API; y las pruebas de métricas (4 casos), que validan los indicadores expuestos en el tablero. A este conjunto se suma una prueba de integración de extremo a extremo (1 caso), que verifica la comunicación entre capas mediante una solicitud completa. La Tabla 4 presenta el resumen de los escenarios de prueba y sus resultados.</w:t>
+      </w:r>
+    </w:p>
+    <w:p>
+      <w:r>
+        <w:t xml:space="preserve">En el plano de la interacción conversacional, las pruebas funcionales del bot abarcan los escenarios correspondientes al menú principal, que ofrece siete opciones: comprar, ver catálogo, consultar precios, contactar a un asesor, realizar otra consulta, ver el carrito y finalizar la compra. Cada opción responde a comandos exactos y a variantes en lenguaje natural definidas en el catálogo de intenciones. Las pruebas verifican que la selección de un producto del catálogo abre el flujo de </w:t>
       </w:r>
       <w:r>
         <w:lastRenderedPageBreak/>
-        <w:t>el framework de pruebas de Python (pytest), y cubren las capas de rutas, servicios y repositorios. En total se ejecutan 128 casos de prueba, de los cuales el 100% finaliza de manera exitosa, con una duración total de la suite de 4,43 segundos.</w:t>
-      </w:r>
-    </w:p>
-    <w:p>
-      <w:r>
-        <w:t>Las pruebas funcionales se organizan en siete grupos que reflejan las distintas operaciones del sistema: las pruebas de la API de clientes (28 casos), que verifican el ciclo completo de alta, consulta, modificación y eliminación; las pruebas de la API de productos (24 casos), que verifican la gestión del catálogo y sus estados; las pruebas de la API de productos asignados (20 casos), que validan la asignación de productos a clientes y la obtención de las facturas simuladas; las pruebas de la API de interacciones (9 casos), que verifican el registro de los mensajes provenientes de la plataforma de mensajería; las pruebas de servicios (19 casos) y de repositorios (18 casos), que cubren la lógica de negocio y el acceso a datos de manera aislada; las pruebas de autenticación (5 casos), que verifican el control de acceso mediante la clave de API; y las pruebas de métricas (4 casos), que validan los indicadores expuestos en el tablero. A este conjunto se suma una prueba de integración de extremo a extremo (1 caso), que verifica la comunicación entre capas mediante una solicitud completa. La Tabla 4 presenta el resumen de los escenarios de prueba y sus resultados.</w:t>
-      </w:r>
-    </w:p>
-    <w:p>
-      <w:r>
-        <w:t>En el plano de la interacción conversacional, las pruebas funcionales del bot abarcan los escenarios correspondientes al menú principal, que ofrece siete opciones: comprar, ver catálogo, consultar precios, contactar a un asesor, realizar otra consulta, ver el carrito y finalizar la compra. Cada opción responde a comandos exactos y a variantes en lenguaje natural definidas en el catálogo de intenciones. Las pruebas verifican que la selección de un producto del catálogo abre el flujo de solicitud de cantidad, que la validación de stock rechaza los productos sin disponibilidad, que las cantidades inválidas generan un mensaje de orientación y que la finalización de la compra vacía correctamente el carrito simulado. Todos estos escenarios finalizan con la respuesta esperada.</w:t>
+        <w:t>solicitud de cantidad, que la validación de stock rechaza los productos sin disponibilidad, que las cantidades inválidas generan un mensaje de orientación y que la finalización de la compra vacía correctamente el carrito simulado. Todos estos escenarios finalizan con la respuesta esperada.</w:t>
       </w:r>
     </w:p>
     <w:p>
@@ -6245,7 +6172,6 @@
               <w:rPr>
                 <w:sz w:val="18"/>
               </w:rPr>
-              <w:lastRenderedPageBreak/>
               <w:t>Servicios (lógica de negocio)</w:t>
             </w:r>
           </w:p>
@@ -6580,7 +6506,11 @@
     </w:p>
     <w:p>
       <w:r>
-        <w:t>Los resultados de las mediciones de tiempo de respuesta revelan un comportamiento consistente y de baja latencia en todos los endpoints evaluados. La operación de consulta del detalle de un cliente presenta un tiempo de respuesta promedio de 2,76 ms, mientras que la obtención del catálogo de productos promedia 4,72 ms y el listado de clientes 5,34 ms. Las operaciones de escritura y de cómputo agregado presentan tiempos mayores pero igualmente reducidos: el registro de una interacción promedia 13,94 ms y la consulta de métricas del tablero 13,87 ms. La Tabla 5 presenta el detalle completo de las mediciones.</w:t>
+        <w:t xml:space="preserve">Los resultados de las mediciones de tiempo de respuesta revelan un comportamiento consistente y de baja latencia en todos los endpoints evaluados. La operación de consulta del detalle de un cliente presenta un tiempo de respuesta </w:t>
+      </w:r>
+      <w:r>
+        <w:lastRenderedPageBreak/>
+        <w:t>promedio de 2,76 ms, mientras que la obtención del catálogo de productos promedia 4,72 ms y el listado de clientes 5,34 ms. Las operaciones de escritura y de cómputo agregado presentan tiempos mayores pero igualmente reducidos: el registro de una interacción promedia 13,94 ms y la consulta de métricas del tablero 13,87 ms. La Tabla 5 presenta el detalle completo de las mediciones.</w:t>
       </w:r>
     </w:p>
     <w:p>
@@ -6600,7 +6530,7 @@
     </w:p>
     <w:p>
       <w:r>
-        <w:t xml:space="preserve">Los coeficientes de variación (CV) calculados a partir de las desviaciones estándar y las medias de cada endpoint confirman la consistencia de los tiempos de respuesta. El endpoint GET /api/v1/clients/{id} presenta un CV del 143,48%, elevado por una media muy baja (2,76 ms) que amplifica la variación relativa; sin embargo, en términos absolutos la dispersión es despreciable (desviación estándar de 3,96 ms). Los endpoints GET /api/v1/products/ y GET /api/v1/clients/ muestran CV del 97,67% y 216,48% respectivamente, también influidos por medias pequeñas. Los endpoints de mayor complejidad —GET /api/v1/metrics/dashboard (CV del 77,30%) y POST /api/v1/interactions/ (CV del 80,71%)— mantienen dispersiones proporcionales a su mayor tiempo promedio. Los intervalos de confianza al 95% para la media, calculados como x̄ ± 1,96·(s/√n), arrojan los siguientes rangos: 1,36–4,16 ms para detalle de cliente, 3,06–6,38 ms para catálogo, 1,24–9,44 ms para listado, 9,96–17,78 ms para dashboard y 9,87–18,01 ms para registro de interacción. En todos los casos, los límites superiores de estos intervalos se mantienen significativamente por debajo del umbral de 100 ms establecido como referencia perceptual en la literatura de experiencia de usuario (Nielsen, 1993), lo que permite afirmar con un 95% de confianza que los tiempos de respuesta del sistema son percibidos como inmediatos por el usuario final.</w:t>
+        <w:t>Los coeficientes de variación (CV) calculados a partir de las desviaciones estándar y las medias de cada endpoint confirman la consistencia de los tiempos de respuesta. El endpoint GET /api/v1/clients/{id} presenta un CV del 143,48%, elevado por una media muy baja (2,76 ms) que amplifica la variación relativa; sin embargo, en términos absolutos la dispersión es despreciable (desviación estándar de 3,96 ms). Los endpoints GET /api/v1/products/ y GET /api/v1/clients/ muestran CV del 97,67% y 216,48% respectivamente, también influidos por medias pequeñas. Los endpoints de mayor complejidad —GET /api/v1/metrics/dashboard (CV del 77,30%) y POST /api/v1/interactions/ (CV del 80,71%)— mantienen dispersiones proporcionales a su mayor tiempo promedio. Los intervalos de confianza al 95% para la media, calculados como x̄ ± 1,96·(s/√n), arrojan los siguientes rangos: 1,36–4,16 ms para detalle de cliente, 3,06–6,38 ms para catálogo, 1,24–9,44 ms para listado, 9,96–17,78 ms para dashboard y 9,87–18,01 ms para registro de interacción. En todos los casos, los límites superiores de estos intervalos se mantienen significativamente por debajo del umbral de 100 ms establecido como referencia perceptual en la literatura de experiencia de usuario (Nielsen, 1993), lo que permite afirmar con un 95% de confianza que los tiempos de respuesta del sistema son percibidos como inmediatos por el usuario final.</w:t>
       </w:r>
     </w:p>
     <w:p>
@@ -6643,7 +6573,6 @@
                 <w:b/>
                 <w:sz w:val="18"/>
               </w:rPr>
-              <w:lastRenderedPageBreak/>
               <w:t>Operación</w:t>
             </w:r>
           </w:p>
@@ -6894,6 +6823,7 @@
               <w:rPr>
                 <w:sz w:val="18"/>
               </w:rPr>
+              <w:lastRenderedPageBreak/>
               <w:t>GET /api/v1/clients/ (listado)</w:t>
             </w:r>
           </w:p>
@@ -7241,7 +7171,6 @@
               <w:rPr>
                 <w:sz w:val="18"/>
               </w:rPr>
-              <w:lastRenderedPageBreak/>
               <w:t>Menú principal</w:t>
             </w:r>
           </w:p>
@@ -7404,6 +7333,7 @@
               <w:rPr>
                 <w:sz w:val="18"/>
               </w:rPr>
+              <w:lastRenderedPageBreak/>
               <w:t>Precios</w:t>
             </w:r>
           </w:p>
@@ -7752,12 +7682,12 @@
     </w:p>
     <w:p>
       <w:r>
+        <w:t>La evaluación del componente de persistencia de datos se centra en la verificación de la correcta ejecución de las operaciones de almacenamiento y recuperación de la información gestionada por el sistema: clientes, productos, productos asignados e interacciones. Las pruebas correspondientes cubren la totalidad de las operaciones CRUD expuestas por la API, tanto a nivel de rutas como de servicios y repositorios, verificando además las reglas de negocio asociadas.</w:t>
+      </w:r>
+    </w:p>
+    <w:p>
+      <w:r>
         <w:lastRenderedPageBreak/>
-        <w:t>La evaluación del componente de persistencia de datos se centra en la verificación de la correcta ejecución de las operaciones de almacenamiento y recuperación de la información gestionada por el sistema: clientes, productos, productos asignados e interacciones. Las pruebas correspondientes cubren la totalidad de las operaciones CRUD expuestas por la API, tanto a nivel de rutas como de servicios y repositorios, verificando además las reglas de negocio asociadas.</w:t>
-      </w:r>
-    </w:p>
-    <w:p>
-      <w:r>
         <w:t>Los resultados de esta evaluación muestran que el sistema es capaz de almacenar y recuperar información de manera consistente en las condiciones evaluadas. La creación de un cliente persiste el registro con un identificador único, su consulta devuelve los datos esperados, y las operaciones de actualización y eliminación modifican el estado de manera coherente con el diseño del modelo de datos. La asignación de productos a clientes se registra correctamente y la consulta de las facturas simuladas agrega los importes de manera exacta.</w:t>
       </w:r>
     </w:p>
@@ -7786,12 +7716,16 @@
     </w:p>
     <w:p>
       <w:r>
-        <w:t xml:space="preserve">La comparación de los resultados obtenidos con los reportados en la literatura especializada permite contextualizar el alcance de los hallazgos. En el ámbito de las APIs REST para sistemas de gestión de clientes, los benchmarks publicados reportan tiempos de respuesta típicos entre 50 y 200 ms para operaciones CRUD similares (Richardson, 2018; Newman, 2015), mientras que los valores medidos en el sistema desarrollado oscilan entre 2,76 y 13,94 ms, representando una reducción de una a dos órdenes de magnitud. Esta diferencia se atribuye a dos factores arquitectónicos fundamentales: la ausencia de capas de procesamiento intermedias (middleware, validación compleja, caché distribuida) y el uso de SQLite como motor de almacenamiento embebido, que elimina la latencia de comunicación cliente-servidor propia de bases de datos como PostgreSQL o MySQL desplegadas en servidores remotos. En lo que respecta a la precisión de interpretación, el sistema alcanza un 100% de acierto sobre el catálogo predefinido de intenciones, valor que supera el rango reportado por sistemas de clasificación de intenciones basados en NLP de 85–95% (Jurafsky y Martin, 2024; Devlin et al., 2019). Cabe señalar que esta comparación debe interpretarse con cautela, dado que el sistema evaluado opera sobre un dominio acotado de siete intenciones con pattern matching determinístico, mientras que los modelos de NLP evalúan dominios abiertos con cientos o miles de categorías. La superioridad en precisión del enfoque adoptado es, por tanto, una consecuencia de la restricción del dominio, no de una capacidad interpretativa superior en términos absolutos.</w:t>
-      </w:r>
-    </w:p>
-    <w:p>
-      <w:r>
-        <w:t xml:space="preserve">En cuanto a la distribución de los tiempos de respuesta, se observa una correlación directa entre la complejidad operativa de cada endpoint y su latencia promedio. El endpoint más veloz —GET /api/v1/clients/{id} con 2,76 ms— realiza una consulta simple por clave primaria sobre una tabla indexada, operación de complejidad constante O(1) en bases de datos relacionales. Le siguen GET /api/v1/products/ (4,72 ms) y GET /api/v1/clients/ (5,34 ms), cuya ligera diferencia se explica por el mayor volumen de registros a recuperar y formatear en el listado. Los endpoints de mayor latencia —GET /api/v1/metrics/dashboard (13,87 ms) y POST /api/v1/interactions/ (13,94 ms)— comparten la característica de ejecutar operaciones de escritura o agregación que involucran múltiples tablas. Especialmente relevante es el caso de POST /api/v1/interactions/, que combina una inserción en la base de datos local con la llamada a la API externa de Telegram para el envío de notificaciones, lo que introduce una dependencia de red que contribuye al aumento del tiempo total. No obstante, incluso este endpoint más costoso se mantiene más de siete veces por debajo del umbral de 100 ms, validando la eficiencia de la arquitectura propuesta.</w:t>
+        <w:t xml:space="preserve">La comparación de los resultados obtenidos con los reportados en la literatura especializada permite contextualizar el alcance de los hallazgos. En el ámbito de las APIs REST para sistemas de gestión de clientes, los benchmarks publicados reportan tiempos de respuesta típicos entre 50 y 200 ms para operaciones CRUD similares (Richardson, 2018; Newman, 2015), mientras que los valores medidos en el sistema desarrollado oscilan entre 2,76 y 13,94 ms, representando una reducción de una a dos órdenes de magnitud. Esta diferencia se atribuye a dos factores arquitectónicos fundamentales: la ausencia de capas de procesamiento intermedias (middleware, validación compleja, caché distribuida) y el uso de SQLite como motor de almacenamiento embebido, que elimina la latencia de comunicación cliente-servidor propia de bases de datos como PostgreSQL o MySQL desplegadas en servidores remotos. En lo que respecta a la precisión de interpretación, el sistema alcanza un 100% de acierto sobre el catálogo predefinido de intenciones, valor que supera el rango reportado por sistemas de clasificación de intenciones basados en NLP de 85–95% (Jurafsky y Martin, 2024; Devlin et al., 2019). Cabe señalar que esta comparación debe interpretarse con cautela, dado que el sistema evaluado opera sobre un dominio acotado de siete intenciones con pattern matching determinístico, mientras que los modelos de NLP evalúan dominios abiertos con </w:t>
+      </w:r>
+      <w:r>
+        <w:lastRenderedPageBreak/>
+        <w:t>cientos o miles de categorías. La superioridad en precisión del enfoque adoptado es, por tanto, una consecuencia de la restricción del dominio, no de una capacidad interpretativa superior en términos absolutos.</w:t>
+      </w:r>
+    </w:p>
+    <w:p>
+      <w:r>
+        <w:t>En cuanto a la distribución de los tiempos de respuesta, se observa una correlación directa entre la complejidad operativa de cada endpoint y su latencia promedio. El endpoint más veloz —GET /api/v1/clients/{id} con 2,76 ms— realiza una consulta simple por clave primaria sobre una tabla indexada, operación de complejidad constante O(1) en bases de datos relacionales. Le siguen GET /api/v1/products/ (4,72 ms) y GET /api/v1/clients/ (5,34 ms), cuya ligera diferencia se explica por el mayor volumen de registros a recuperar y formatear en el listado. Los endpoints de mayor latencia —GET /api/v1/metrics/dashboard (13,87 ms) y POST /api/v1/interactions/ (13,94 ms)— comparten la característica de ejecutar operaciones de escritura o agregación que involucran múltiples tablas. Especialmente relevante es el caso de POST /api/v1/interactions/, que combina una inserción en la base de datos local con la llamada a la API externa de Telegram para el envío de notificaciones, lo que introduce una dependencia de red que contribuye al aumento del tiempo total. No obstante, incluso este endpoint más costoso se mantiene más de siete veces por debajo del umbral de 100 ms, validando la eficiencia de la arquitectura propuesta.</w:t>
       </w:r>
     </w:p>
     <w:p>
@@ -7804,32 +7738,25 @@
         <w:pStyle w:val="Ttulo2"/>
       </w:pPr>
       <w:r>
-        <w:t xml:space="preserve">5.7 Análisis de casos límite</w:t>
+        <w:t>5.7 Análisis de casos límite</w:t>
       </w:r>
     </w:p>
     <w:p/>
     <w:p>
-      <w:pPr>
-        <w:pStyle w:val="Normal"/>
-      </w:pPr>
-      <w:r>
-        <w:t xml:space="preserve">Aunque la evaluación reportada en las secciones precedentes demuestra una precisión del 100 % sobre el catálogo predefinido de intenciones, es necesario examinar el comportamiento del sistema ante entradas que exceden los casos cubiertos por las reglas de interpretación. Los siguientes casos límite ilustran situaciones en las que el mecanismo de pattern matching del Bot Router no alcanza a clasificar la intención del usuario de manera adecuada. Estos escenarios no fueron incluidos en la suite principal de pruebas porque corresponden a patrones de uso no contemplados en el catálogo de intenciones, pero su análisis permite delimitar con precisión el alcance real del modelo de interpretación implementado.</w:t>
+      <w:r>
+        <w:t>Aunque la evaluación reportada en las secciones precedentes demuestra una precisión del 100 % sobre el catálogo predefinido de intenciones, es necesario examinar el comportamiento del sistema ante entradas que exceden los casos cubiertos por las reglas de interpretación. Los siguientes casos límite ilustran situaciones en las que el mecanismo de pattern matching del Bot Router no alcanza a clasificar la intención del usuario de manera adecuada. Estos escenarios no fueron incluidos en la suite principal de pruebas porque corresponden a patrones de uso no contemplados en el catálogo de intenciones, pero su análisis permite delimitar con precisión el alcance real del modelo de interpretación implementado.</w:t>
       </w:r>
     </w:p>
     <w:p/>
     <w:p>
-      <w:pPr>
-        <w:pStyle w:val="Normal"/>
-      </w:pPr>
-      <w:r>
-        <w:t xml:space="preserve">Tabla 7. Análisis de casos límite del Bot Router: entradas que revelan limitaciones del enfoque determinístico.</w:t>
+      <w:r>
+        <w:t>Tabla 7. Análisis de casos límite del Bot Router: entradas que revelan limitaciones del enfoque determinístico.</w:t>
       </w:r>
     </w:p>
     <w:p/>
     <w:tbl>
       <w:tblPr>
         <w:tblStyle w:val="TableNormal"/>
-        <w:tblpPr/>
         <w:tblOverlap w:val="never"/>
         <w:tblW w:w="0" w:type="auto"/>
         <w:tblInd w:w="0" w:type="dxa"/>
@@ -7841,15 +7768,15 @@
           <w:insideH w:val="single" w:sz="4" w:space="0" w:color="auto"/>
           <w:insideV w:val="single" w:sz="4" w:space="0" w:color="auto"/>
         </w:tblBorders>
-        <w:tblLook w:val="04a0" w:firstRow="1" w:lastRow="0" w:firstColumn="1" w:lastColumn="0" w:noHBand="0" w:noVBand="1"/>
+        <w:tblLook w:val="04A0" w:firstRow="1" w:lastRow="0" w:firstColumn="1" w:lastColumn="0" w:noHBand="0" w:noVBand="1"/>
       </w:tblPr>
       <w:tblGrid>
-        <w:gridCol w:w="600"/>
-        <w:gridCol w:w="1500"/>
-        <w:gridCol w:w="1300"/>
-        <w:gridCol w:w="1500"/>
-        <w:gridCol w:w="800"/>
-        <w:gridCol w:w="3300"/>
+        <w:gridCol w:w="889"/>
+        <w:gridCol w:w="1532"/>
+        <w:gridCol w:w="1674"/>
+        <w:gridCol w:w="1517"/>
+        <w:gridCol w:w="1470"/>
+        <w:gridCol w:w="1908"/>
       </w:tblGrid>
       <w:tr>
         <w:tc>
@@ -7858,16 +7785,14 @@
             <w:vAlign w:val="center"/>
           </w:tcPr>
           <w:p>
-            <w:pPr>
-              <w:spacing w:before="0" w:after="0" w:line="240" w:lineRule="auto"/>
-            </w:pPr>
             <w:r>
               <w:rPr>
                 <w:b/>
                 <w:sz w:val="180"/>
                 <w:szCs w:val="180"/>
               </w:rPr>
-              <w:t xml:space="preserve">Caso</w:t>
+              <w:lastRenderedPageBreak/>
+              <w:t>Caso</w:t>
             </w:r>
           </w:p>
         </w:tc>
@@ -7877,54 +7802,31 @@
             <w:vAlign w:val="center"/>
           </w:tcPr>
           <w:p>
-            <w:pPr>
-              <w:spacing w:before="0" w:after="0" w:line="240" w:lineRule="auto"/>
-            </w:pPr>
             <w:r>
               <w:rPr>
                 <w:b/>
                 <w:sz w:val="180"/>
                 <w:szCs w:val="180"/>
               </w:rPr>
-              <w:t xml:space="preserve">Input del usuario</w:t>
-            </w:r>
-          </w:p>
-        </w:tc>
-        <w:tc>
-          <w:tcPr>
-            <w:tcW w:w="0" w:type="auto"/>
-            <w:vAlign w:val="center"/>
-          </w:tcPr>
-          <w:p>
-            <w:pPr>
-              <w:spacing w:before="0" w:after="0" w:line="240" w:lineRule="auto"/>
-            </w:pPr>
+              <w:t>Input d</w:t>
+            </w:r>
             <w:r>
               <w:rPr>
                 <w:b/>
                 <w:sz w:val="180"/>
                 <w:szCs w:val="180"/>
               </w:rPr>
-              <w:t xml:space="preserve">Intención esperada</w:t>
-            </w:r>
-          </w:p>
-        </w:tc>
-        <w:tc>
-          <w:tcPr>
-            <w:tcW w:w="0" w:type="auto"/>
-            <w:vAlign w:val="center"/>
-          </w:tcPr>
-          <w:p>
-            <w:pPr>
-              <w:spacing w:before="0" w:after="0" w:line="240" w:lineRule="auto"/>
-            </w:pPr>
+              <w:lastRenderedPageBreak/>
+              <w:t>el usua</w:t>
+            </w:r>
             <w:r>
               <w:rPr>
                 <w:b/>
                 <w:sz w:val="180"/>
                 <w:szCs w:val="180"/>
               </w:rPr>
-              <w:t xml:space="preserve">Intención detectada</w:t>
+              <w:lastRenderedPageBreak/>
+              <w:t>rio</w:t>
             </w:r>
           </w:p>
         </w:tc>
@@ -7934,35 +7836,119 @@
             <w:vAlign w:val="center"/>
           </w:tcPr>
           <w:p>
-            <w:pPr>
-              <w:spacing w:before="0" w:after="0" w:line="240" w:lineRule="auto"/>
-            </w:pPr>
             <w:r>
               <w:rPr>
                 <w:b/>
                 <w:sz w:val="180"/>
                 <w:szCs w:val="180"/>
               </w:rPr>
-              <w:t xml:space="preserve">Precisión</w:t>
-            </w:r>
-          </w:p>
-        </w:tc>
-        <w:tc>
-          <w:tcPr>
-            <w:tcW w:w="0" w:type="auto"/>
-            <w:vAlign w:val="center"/>
-          </w:tcPr>
-          <w:p>
-            <w:pPr>
-              <w:spacing w:before="0" w:after="0" w:line="240" w:lineRule="auto"/>
-            </w:pPr>
+              <w:lastRenderedPageBreak/>
+              <w:t>Intenc</w:t>
+            </w:r>
             <w:r>
               <w:rPr>
                 <w:b/>
                 <w:sz w:val="180"/>
                 <w:szCs w:val="180"/>
               </w:rPr>
-              <w:t xml:space="preserve">Observación</w:t>
+              <w:lastRenderedPageBreak/>
+              <w:t>ión esp</w:t>
+            </w:r>
+            <w:r>
+              <w:rPr>
+                <w:b/>
+                <w:sz w:val="180"/>
+                <w:szCs w:val="180"/>
+              </w:rPr>
+              <w:lastRenderedPageBreak/>
+              <w:t>erada</w:t>
+            </w:r>
+          </w:p>
+        </w:tc>
+        <w:tc>
+          <w:tcPr>
+            <w:tcW w:w="0" w:type="auto"/>
+            <w:vAlign w:val="center"/>
+          </w:tcPr>
+          <w:p>
+            <w:r>
+              <w:rPr>
+                <w:b/>
+                <w:sz w:val="180"/>
+                <w:szCs w:val="180"/>
+              </w:rPr>
+              <w:lastRenderedPageBreak/>
+              <w:t>Intenc</w:t>
+            </w:r>
+            <w:r>
+              <w:rPr>
+                <w:b/>
+                <w:sz w:val="180"/>
+                <w:szCs w:val="180"/>
+              </w:rPr>
+              <w:lastRenderedPageBreak/>
+              <w:t>ión det</w:t>
+            </w:r>
+            <w:r>
+              <w:rPr>
+                <w:b/>
+                <w:sz w:val="180"/>
+                <w:szCs w:val="180"/>
+              </w:rPr>
+              <w:lastRenderedPageBreak/>
+              <w:t>ectada</w:t>
+            </w:r>
+          </w:p>
+        </w:tc>
+        <w:tc>
+          <w:tcPr>
+            <w:tcW w:w="0" w:type="auto"/>
+            <w:vAlign w:val="center"/>
+          </w:tcPr>
+          <w:p>
+            <w:r>
+              <w:rPr>
+                <w:b/>
+                <w:sz w:val="180"/>
+                <w:szCs w:val="180"/>
+              </w:rPr>
+              <w:lastRenderedPageBreak/>
+              <w:t>Precis</w:t>
+            </w:r>
+            <w:r>
+              <w:rPr>
+                <w:b/>
+                <w:sz w:val="180"/>
+                <w:szCs w:val="180"/>
+              </w:rPr>
+              <w:lastRenderedPageBreak/>
+              <w:t>ión</w:t>
+            </w:r>
+          </w:p>
+        </w:tc>
+        <w:tc>
+          <w:tcPr>
+            <w:tcW w:w="0" w:type="auto"/>
+            <w:vAlign w:val="center"/>
+          </w:tcPr>
+          <w:p>
+            <w:r>
+              <w:rPr>
+                <w:b/>
+                <w:sz w:val="180"/>
+                <w:szCs w:val="180"/>
+              </w:rPr>
+              <w:lastRenderedPageBreak/>
+              <w:t>Observa</w:t>
+            </w:r>
+            <w:r>
+              <w:rPr>
+                <w:b/>
+                <w:sz w:val="180"/>
+                <w:szCs w:val="180"/>
+              </w:rPr>
+              <w:lastRenderedPageBreak/>
+              <w:t>ción</w:t>
             </w:r>
           </w:p>
         </w:tc>
@@ -7974,15 +7960,13 @@
             <w:vAlign w:val="center"/>
           </w:tcPr>
           <w:p>
-            <w:pPr>
-              <w:spacing w:before="0" w:after="0" w:line="240" w:lineRule="auto"/>
-            </w:pPr>
             <w:r>
               <w:rPr>
                 <w:sz w:val="180"/>
                 <w:szCs w:val="180"/>
               </w:rPr>
-              <w:t xml:space="preserve">1</w:t>
+              <w:lastRenderedPageBreak/>
+              <w:t>1</w:t>
             </w:r>
           </w:p>
         </w:tc>
@@ -7992,15 +7976,36 @@
             <w:vAlign w:val="center"/>
           </w:tcPr>
           <w:p>
-            <w:pPr>
-              <w:spacing w:before="0" w:after="0" w:line="240" w:lineRule="auto"/>
-            </w:pPr>
             <w:r>
               <w:rPr>
                 <w:sz w:val="180"/>
                 <w:szCs w:val="180"/>
               </w:rPr>
-              <w:t xml:space="preserve">“Quiero comprar jabón”</w:t>
+              <w:t>“Quier</w:t>
+            </w:r>
+            <w:r>
+              <w:rPr>
+                <w:sz w:val="180"/>
+                <w:szCs w:val="180"/>
+              </w:rPr>
+              <w:lastRenderedPageBreak/>
+              <w:t>o compr</w:t>
+            </w:r>
+            <w:r>
+              <w:rPr>
+                <w:sz w:val="180"/>
+                <w:szCs w:val="180"/>
+              </w:rPr>
+              <w:lastRenderedPageBreak/>
+              <w:t>ar jabó</w:t>
+            </w:r>
+            <w:r>
+              <w:rPr>
+                <w:sz w:val="180"/>
+                <w:szCs w:val="180"/>
+              </w:rPr>
+              <w:lastRenderedPageBreak/>
+              <w:t>n”</w:t>
             </w:r>
           </w:p>
         </w:tc>
@@ -8010,15 +8015,13 @@
             <w:vAlign w:val="center"/>
           </w:tcPr>
           <w:p>
-            <w:pPr>
-              <w:spacing w:before="0" w:after="0" w:line="240" w:lineRule="auto"/>
-            </w:pPr>
             <w:r>
               <w:rPr>
                 <w:sz w:val="180"/>
                 <w:szCs w:val="180"/>
               </w:rPr>
-              <w:t xml:space="preserve">Compra</w:t>
+              <w:lastRenderedPageBreak/>
+              <w:t>Compra</w:t>
             </w:r>
           </w:p>
         </w:tc>
@@ -8028,15 +8031,20 @@
             <w:vAlign w:val="center"/>
           </w:tcPr>
           <w:p>
-            <w:pPr>
-              <w:spacing w:before="0" w:after="0" w:line="240" w:lineRule="auto"/>
-            </w:pPr>
             <w:r>
               <w:rPr>
                 <w:sz w:val="180"/>
                 <w:szCs w:val="180"/>
               </w:rPr>
-              <w:t xml:space="preserve">Menú (fallback)</w:t>
+              <w:t>Menú (fa</w:t>
+            </w:r>
+            <w:r>
+              <w:rPr>
+                <w:sz w:val="180"/>
+                <w:szCs w:val="180"/>
+              </w:rPr>
+              <w:lastRenderedPageBreak/>
+              <w:t>llback)</w:t>
             </w:r>
           </w:p>
         </w:tc>
@@ -8046,15 +8054,13 @@
             <w:vAlign w:val="center"/>
           </w:tcPr>
           <w:p>
-            <w:pPr>
-              <w:spacing w:before="0" w:after="0" w:line="240" w:lineRule="auto"/>
-            </w:pPr>
             <w:r>
               <w:rPr>
                 <w:sz w:val="180"/>
                 <w:szCs w:val="180"/>
               </w:rPr>
-              <w:t xml:space="preserve">0 %</w:t>
+              <w:lastRenderedPageBreak/>
+              <w:t>0 %</w:t>
             </w:r>
           </w:p>
         </w:tc>
@@ -8064,15 +8070,52 @@
             <w:vAlign w:val="center"/>
           </w:tcPr>
           <w:p>
-            <w:pPr>
-              <w:spacing w:before="0" w:after="0" w:line="240" w:lineRule="auto"/>
-            </w:pPr>
             <w:r>
               <w:rPr>
                 <w:sz w:val="180"/>
                 <w:szCs w:val="180"/>
               </w:rPr>
-              <w:t xml:space="preserve">Lenguaje natural no matchea patrones predefinidos</w:t>
+              <w:t>Lenguaj</w:t>
+            </w:r>
+            <w:r>
+              <w:rPr>
+                <w:sz w:val="180"/>
+                <w:szCs w:val="180"/>
+              </w:rPr>
+              <w:lastRenderedPageBreak/>
+              <w:t>e natural n</w:t>
+            </w:r>
+            <w:r>
+              <w:rPr>
+                <w:sz w:val="180"/>
+                <w:szCs w:val="180"/>
+              </w:rPr>
+              <w:lastRenderedPageBreak/>
+              <w:t>o matche</w:t>
+            </w:r>
+            <w:r>
+              <w:rPr>
+                <w:sz w:val="180"/>
+                <w:szCs w:val="180"/>
+              </w:rPr>
+              <w:lastRenderedPageBreak/>
+              <w:t>a patrone</w:t>
+            </w:r>
+            <w:r>
+              <w:rPr>
+                <w:sz w:val="180"/>
+                <w:szCs w:val="180"/>
+              </w:rPr>
+              <w:lastRenderedPageBreak/>
+              <w:t>s predefin</w:t>
+            </w:r>
+            <w:r>
+              <w:rPr>
+                <w:sz w:val="180"/>
+                <w:szCs w:val="180"/>
+              </w:rPr>
+              <w:lastRenderedPageBreak/>
+              <w:t>idos</w:t>
             </w:r>
           </w:p>
         </w:tc>
@@ -8084,15 +8127,13 @@
             <w:vAlign w:val="center"/>
           </w:tcPr>
           <w:p>
-            <w:pPr>
-              <w:spacing w:before="0" w:after="0" w:line="240" w:lineRule="auto"/>
-            </w:pPr>
             <w:r>
               <w:rPr>
                 <w:sz w:val="180"/>
                 <w:szCs w:val="180"/>
               </w:rPr>
-              <w:t xml:space="preserve">2</w:t>
+              <w:lastRenderedPageBreak/>
+              <w:t>2</w:t>
             </w:r>
           </w:p>
         </w:tc>
@@ -8102,15 +8143,20 @@
             <w:vAlign w:val="center"/>
           </w:tcPr>
           <w:p>
-            <w:pPr>
-              <w:spacing w:before="0" w:after="0" w:line="240" w:lineRule="auto"/>
-            </w:pPr>
             <w:r>
               <w:rPr>
                 <w:sz w:val="180"/>
                 <w:szCs w:val="180"/>
               </w:rPr>
-              <w:t xml:space="preserve">“HOLA!”</w:t>
+              <w:t>“HO</w:t>
+            </w:r>
+            <w:r>
+              <w:rPr>
+                <w:sz w:val="180"/>
+                <w:szCs w:val="180"/>
+              </w:rPr>
+              <w:lastRenderedPageBreak/>
+              <w:t>LA!”</w:t>
             </w:r>
           </w:p>
         </w:tc>
@@ -8120,15 +8166,21 @@
             <w:vAlign w:val="center"/>
           </w:tcPr>
           <w:p>
-            <w:pPr>
-              <w:spacing w:before="0" w:after="0" w:line="240" w:lineRule="auto"/>
-            </w:pPr>
             <w:r>
               <w:rPr>
                 <w:sz w:val="180"/>
                 <w:szCs w:val="180"/>
               </w:rPr>
-              <w:t xml:space="preserve">Menú</w:t>
+              <w:lastRenderedPageBreak/>
+              <w:t>Me</w:t>
+            </w:r>
+            <w:r>
+              <w:rPr>
+                <w:sz w:val="180"/>
+                <w:szCs w:val="180"/>
+              </w:rPr>
+              <w:lastRenderedPageBreak/>
+              <w:t>nú</w:t>
             </w:r>
           </w:p>
         </w:tc>
@@ -8138,15 +8190,29 @@
             <w:vAlign w:val="center"/>
           </w:tcPr>
           <w:p>
-            <w:pPr>
-              <w:spacing w:before="0" w:after="0" w:line="240" w:lineRule="auto"/>
-            </w:pPr>
             <w:r>
               <w:rPr>
                 <w:sz w:val="180"/>
                 <w:szCs w:val="180"/>
               </w:rPr>
-              <w:t xml:space="preserve">Menú (fallback)</w:t>
+              <w:lastRenderedPageBreak/>
+              <w:t>Men</w:t>
+            </w:r>
+            <w:r>
+              <w:rPr>
+                <w:sz w:val="180"/>
+                <w:szCs w:val="180"/>
+              </w:rPr>
+              <w:lastRenderedPageBreak/>
+              <w:t>ú (fallba</w:t>
+            </w:r>
+            <w:r>
+              <w:rPr>
+                <w:sz w:val="180"/>
+                <w:szCs w:val="180"/>
+              </w:rPr>
+              <w:lastRenderedPageBreak/>
+              <w:t>ck)</w:t>
             </w:r>
           </w:p>
         </w:tc>
@@ -8156,15 +8222,21 @@
             <w:vAlign w:val="center"/>
           </w:tcPr>
           <w:p>
-            <w:pPr>
-              <w:spacing w:before="0" w:after="0" w:line="240" w:lineRule="auto"/>
-            </w:pPr>
             <w:r>
               <w:rPr>
                 <w:sz w:val="180"/>
                 <w:szCs w:val="180"/>
               </w:rPr>
-              <w:t xml:space="preserve">100 %*</w:t>
+              <w:lastRenderedPageBreak/>
+              <w:t xml:space="preserve">100 </w:t>
+            </w:r>
+            <w:r>
+              <w:rPr>
+                <w:sz w:val="180"/>
+                <w:szCs w:val="180"/>
+              </w:rPr>
+              <w:lastRenderedPageBreak/>
+              <w:t>%*</w:t>
             </w:r>
           </w:p>
         </w:tc>
@@ -8174,15 +8246,69 @@
             <w:vAlign w:val="center"/>
           </w:tcPr>
           <w:p>
-            <w:pPr>
-              <w:spacing w:before="0" w:after="0" w:line="240" w:lineRule="auto"/>
-            </w:pPr>
             <w:r>
               <w:rPr>
                 <w:sz w:val="180"/>
                 <w:szCs w:val="180"/>
               </w:rPr>
-              <w:t xml:space="preserve">Puntuación impide match exacto; resuelto por caso por defecto</w:t>
+              <w:lastRenderedPageBreak/>
+              <w:t>Punt</w:t>
+            </w:r>
+            <w:r>
+              <w:rPr>
+                <w:sz w:val="180"/>
+                <w:szCs w:val="180"/>
+              </w:rPr>
+              <w:lastRenderedPageBreak/>
+              <w:t>uación i</w:t>
+            </w:r>
+            <w:r>
+              <w:rPr>
+                <w:sz w:val="180"/>
+                <w:szCs w:val="180"/>
+              </w:rPr>
+              <w:lastRenderedPageBreak/>
+              <w:t>mpide mat</w:t>
+            </w:r>
+            <w:r>
+              <w:rPr>
+                <w:sz w:val="180"/>
+                <w:szCs w:val="180"/>
+              </w:rPr>
+              <w:lastRenderedPageBreak/>
+              <w:t>ch exact</w:t>
+            </w:r>
+            <w:r>
+              <w:rPr>
+                <w:sz w:val="180"/>
+                <w:szCs w:val="180"/>
+              </w:rPr>
+              <w:lastRenderedPageBreak/>
+              <w:t xml:space="preserve">o; resuelto </w:t>
+            </w:r>
+            <w:r>
+              <w:rPr>
+                <w:sz w:val="180"/>
+                <w:szCs w:val="180"/>
+              </w:rPr>
+              <w:lastRenderedPageBreak/>
+              <w:t xml:space="preserve">por caso </w:t>
+            </w:r>
+            <w:r>
+              <w:rPr>
+                <w:sz w:val="180"/>
+                <w:szCs w:val="180"/>
+              </w:rPr>
+              <w:lastRenderedPageBreak/>
+              <w:t>por defe</w:t>
+            </w:r>
+            <w:r>
+              <w:rPr>
+                <w:sz w:val="180"/>
+                <w:szCs w:val="180"/>
+              </w:rPr>
+              <w:lastRenderedPageBreak/>
+              <w:t>cto</w:t>
             </w:r>
           </w:p>
         </w:tc>
@@ -8194,15 +8320,13 @@
             <w:vAlign w:val="center"/>
           </w:tcPr>
           <w:p>
-            <w:pPr>
-              <w:spacing w:before="0" w:after="0" w:line="240" w:lineRule="auto"/>
-            </w:pPr>
             <w:r>
               <w:rPr>
                 <w:sz w:val="180"/>
                 <w:szCs w:val="180"/>
               </w:rPr>
-              <w:t xml:space="preserve">3</w:t>
+              <w:lastRenderedPageBreak/>
+              <w:t>3</w:t>
             </w:r>
           </w:p>
         </w:tc>
@@ -8212,15 +8336,44 @@
             <w:vAlign w:val="center"/>
           </w:tcPr>
           <w:p>
-            <w:pPr>
-              <w:spacing w:before="0" w:after="0" w:line="240" w:lineRule="auto"/>
-            </w:pPr>
             <w:r>
               <w:rPr>
                 <w:sz w:val="180"/>
                 <w:szCs w:val="180"/>
               </w:rPr>
-              <w:t xml:space="preserve">“5” (catálogo con 3 productos)</w:t>
+              <w:t>“5” (</w:t>
+            </w:r>
+            <w:r>
+              <w:rPr>
+                <w:sz w:val="180"/>
+                <w:szCs w:val="180"/>
+              </w:rPr>
+              <w:lastRenderedPageBreak/>
+              <w:t>catálo</w:t>
+            </w:r>
+            <w:r>
+              <w:rPr>
+                <w:sz w:val="180"/>
+                <w:szCs w:val="180"/>
+              </w:rPr>
+              <w:lastRenderedPageBreak/>
+              <w:t xml:space="preserve">go con 3 </w:t>
+            </w:r>
+            <w:r>
+              <w:rPr>
+                <w:sz w:val="180"/>
+                <w:szCs w:val="180"/>
+              </w:rPr>
+              <w:lastRenderedPageBreak/>
+              <w:t>produc</w:t>
+            </w:r>
+            <w:r>
+              <w:rPr>
+                <w:sz w:val="180"/>
+                <w:szCs w:val="180"/>
+              </w:rPr>
+              <w:lastRenderedPageBreak/>
+              <w:t>tos)</w:t>
             </w:r>
           </w:p>
         </w:tc>
@@ -8230,15 +8383,29 @@
             <w:vAlign w:val="center"/>
           </w:tcPr>
           <w:p>
-            <w:pPr>
-              <w:spacing w:before="0" w:after="0" w:line="240" w:lineRule="auto"/>
-            </w:pPr>
             <w:r>
               <w:rPr>
                 <w:sz w:val="180"/>
                 <w:szCs w:val="180"/>
               </w:rPr>
-              <w:t xml:space="preserve">Seleccionar producto</w:t>
+              <w:lastRenderedPageBreak/>
+              <w:t>Selec</w:t>
+            </w:r>
+            <w:r>
+              <w:rPr>
+                <w:sz w:val="180"/>
+                <w:szCs w:val="180"/>
+              </w:rPr>
+              <w:lastRenderedPageBreak/>
+              <w:t>cionar p</w:t>
+            </w:r>
+            <w:r>
+              <w:rPr>
+                <w:sz w:val="180"/>
+                <w:szCs w:val="180"/>
+              </w:rPr>
+              <w:lastRenderedPageBreak/>
+              <w:t>roducto</w:t>
             </w:r>
           </w:p>
         </w:tc>
@@ -8248,15 +8415,29 @@
             <w:vAlign w:val="center"/>
           </w:tcPr>
           <w:p>
-            <w:pPr>
-              <w:spacing w:before="0" w:after="0" w:line="240" w:lineRule="auto"/>
-            </w:pPr>
             <w:r>
               <w:rPr>
                 <w:sz w:val="180"/>
                 <w:szCs w:val="180"/>
               </w:rPr>
-              <w:t xml:space="preserve">Menú (fallback)</w:t>
+              <w:lastRenderedPageBreak/>
+              <w:t xml:space="preserve">Menú </w:t>
+            </w:r>
+            <w:r>
+              <w:rPr>
+                <w:sz w:val="180"/>
+                <w:szCs w:val="180"/>
+              </w:rPr>
+              <w:lastRenderedPageBreak/>
+              <w:t>(fallbac</w:t>
+            </w:r>
+            <w:r>
+              <w:rPr>
+                <w:sz w:val="180"/>
+                <w:szCs w:val="180"/>
+              </w:rPr>
+              <w:lastRenderedPageBreak/>
+              <w:t>k)</w:t>
             </w:r>
           </w:p>
         </w:tc>
@@ -8266,15 +8447,13 @@
             <w:vAlign w:val="center"/>
           </w:tcPr>
           <w:p>
-            <w:pPr>
-              <w:spacing w:before="0" w:after="0" w:line="240" w:lineRule="auto"/>
-            </w:pPr>
             <w:r>
               <w:rPr>
                 <w:sz w:val="180"/>
                 <w:szCs w:val="180"/>
               </w:rPr>
-              <w:t xml:space="preserve">0 %</w:t>
+              <w:lastRenderedPageBreak/>
+              <w:t>0 %</w:t>
             </w:r>
           </w:p>
         </w:tc>
@@ -8284,49 +8463,74 @@
             <w:vAlign w:val="center"/>
           </w:tcPr>
           <w:p>
-            <w:pPr>
-              <w:spacing w:before="0" w:after="0" w:line="240" w:lineRule="auto"/>
-            </w:pPr>
             <w:r>
               <w:rPr>
                 <w:sz w:val="180"/>
                 <w:szCs w:val="180"/>
               </w:rPr>
-              <w:t xml:space="preserve">Fuera de rango del catálogo disponible</w:t>
+              <w:t xml:space="preserve">Fuera </w:t>
+            </w:r>
+            <w:r>
+              <w:rPr>
+                <w:sz w:val="180"/>
+                <w:szCs w:val="180"/>
+              </w:rPr>
+              <w:lastRenderedPageBreak/>
+              <w:t xml:space="preserve">de rango </w:t>
+            </w:r>
+            <w:r>
+              <w:rPr>
+                <w:sz w:val="180"/>
+                <w:szCs w:val="180"/>
+              </w:rPr>
+              <w:lastRenderedPageBreak/>
+              <w:t>del catálo</w:t>
+            </w:r>
+            <w:r>
+              <w:rPr>
+                <w:sz w:val="180"/>
+                <w:szCs w:val="180"/>
+              </w:rPr>
+              <w:lastRenderedPageBreak/>
+              <w:t>go dispo</w:t>
+            </w:r>
+            <w:r>
+              <w:rPr>
+                <w:sz w:val="180"/>
+                <w:szCs w:val="180"/>
+              </w:rPr>
+              <w:lastRenderedPageBreak/>
+              <w:t>nible</w:t>
             </w:r>
           </w:p>
         </w:tc>
       </w:tr>
     </w:tbl>
     <w:p>
-      <w:pPr>
-        <w:pStyle w:val="Normal"/>
-      </w:pPr>
       <w:r>
         <w:rPr>
           <w:i/>
           <w:sz w:val="16"/>
           <w:szCs w:val="16"/>
         </w:rPr>
-        <w:t xml:space="preserve">* Precisión correcta por coincidencia, no por detección adecuada. El sistema resuelve la intención por el caso por defecto, no por un match exitoso del patrón.</w:t>
+        <w:lastRenderedPageBreak/>
+        <w:t>* Precisión correcta por coincidencia, no por detección adecuada. El sistema resuelve la intención por el caso por defecto, no por un match exitoso del patrón.</w:t>
       </w:r>
     </w:p>
     <w:p/>
     <w:p>
-      <w:pPr>
-        <w:pStyle w:val="Normal"/>
-      </w:pPr>
-      <w:r>
-        <w:t xml:space="preserve">Estas limitaciones son inherentes al diseño del sistema: al tratarse de un intérprete determinístico basado en reglas de pattern matching, el Bot Router no posee capacidad de generalización semántica. Cada entrada debe ajustarse a un patrón predefinido para ser clasificada correctamente. El caso 2 evidencia una coincidencia fortuita: aunque la clasificación es correcta, el mecanismo de detección no funciona como se espera, ya que la puntuación impide el match exacto y la intención se resuelve por el caso por defecto. Este tipo de comportamiento, aunque funcional en el corto plazo, representa un riesgo en escenarios donde la intención por defecto pudiera diferir de la intención del usuario.</w:t>
+      <w:r>
+        <w:t>Estas limitaciones son inherentes al diseño del sistema: al tratarse de un intérprete determinístico basado en reglas de pattern matching, el Bot Router no posee capacidad de generalización semántica. Cada entrada debe ajustarse a un patrón predefinido para ser clasificada correctamente. El caso 2 evidencia una coincidencia fortuita: aunque la clasificación es correcta, el mecanismo de detección no funciona como se espera, ya que la puntuación impide el match exacto y la intención se resuelve por el caso por defecto. Este tipo de comportamiento, aunque funcional en el corto plazo, representa un riesgo en escenarios donde la intención por defecto pudiera diferir de la intención del usuario.</w:t>
       </w:r>
     </w:p>
     <w:p/>
     <w:p>
-      <w:pPr>
-        <w:pStyle w:val="Normal"/>
-      </w:pPr>
-      <w:r>
-        <w:t xml:space="preserve">Estas limitaciones del enfoque determinístico refuerzan la pertinencia de las líneas de mejora propuestas en el Capítulo 8, particularmente la integración de modelos de lenguaje natural (NLP/LLM) como capa de interpretación semántica. La incorporación de un modelo de clasificación de intenciones basado en aprendizaje automático permitiría superar las restricciones del matcheo por patrones exactos, habilitando la comprensión de solicitudes en lenguaje natural y la validación contextual de selecciones fuera de rango.</w:t>
+      <w:r>
+        <w:t xml:space="preserve">Estas limitaciones del enfoque determinístico refuerzan la pertinencia de las líneas de mejora propuestas en el Capítulo 8, particularmente la integración de modelos de lenguaje natural (NLP/LLM) como capa de interpretación semántica. La </w:t>
+      </w:r>
+      <w:r>
+        <w:lastRenderedPageBreak/>
+        <w:t>incorporación de un modelo de clasificación de intenciones basado en aprendizaje automático permitiría superar las restricciones del matcheo por patrones exactos, habilitando la comprensión de solicitudes en lenguaje natural y la validación contextual de selecciones fuera de rango.</w:t>
       </w:r>
     </w:p>
     <w:p>
@@ -8346,52 +8550,110 @@
         <w:pStyle w:val="Ttulo2"/>
       </w:pPr>
       <w:r>
+        <w:t>6.1 Interpretación de los resultados en el marco teórico</w:t>
+      </w:r>
+    </w:p>
+    <w:p>
+      <w:pPr>
+        <w:spacing w:after="200" w:line="360" w:lineRule="auto"/>
+        <w:ind w:firstLine="720"/>
+        <w:jc w:val="both"/>
+      </w:pPr>
+      <w:r>
+        <w:t>El análisis de los resultados obtenidos en la evaluación del sistema no puede limitarse a la constatación de los valores numéricos registrados para cada indicador, sino que requiere una interpretación contextualizada que los vincule con los principios teóricos establecidos en el marco conceptual y con las decisiones de diseño adoptadas durante el desarrollo. Esta interpretación permite comprender el significado de los resultados más allá de su dimensión técnica inmediata y extraer enseñanzas generalizables que trasciendan la implementación específica desarrollada.</w:t>
+      </w:r>
+    </w:p>
+    <w:p>
+      <w:pPr>
+        <w:spacing w:after="200" w:line="360" w:lineRule="auto"/>
+        <w:ind w:firstLine="720"/>
+        <w:jc w:val="both"/>
+      </w:pPr>
+      <w:r>
+        <w:t>La capacidad del sistema para coordinar la interacción entre múltiples componentes heterogéneos —la plataforma de orquestación, el componente de interpretación de solicitudes, los servicios externos y el sistema de almacenamiento— sin que los errores en uno de ellos comprometan el funcionamiento de los demás valida empíricamente los principios teóricos que fundamentan este enfoque arquitectónico.</w:t>
+      </w:r>
+    </w:p>
+    <w:p>
+      <w:pPr>
+        <w:spacing w:after="200" w:line="360" w:lineRule="auto"/>
+        <w:ind w:firstLine="720"/>
+        <w:jc w:val="both"/>
+      </w:pPr>
+      <w:r>
+        <w:t>Este hallazgo es coherente con los postulados de Newman (2015) sobre las arquitecturas de microservicios y con los principios de integración de sistemas formulados por Hohpe y Woolf (2003). La modularidad del sistema facilita su comprensión, su mantenimiento y su evolución, al tiempo que reduce la complejidad de las decisiones de diseño al permitir que cada componente sea considerado de manera relativamente independiente. Sin embargo, la implementación también revela que el desacoplamiento tiene un costo en términos de complejidad operativa: la coordinación entre componentes independientes requiere mecanismos de manejo de errores más sofisticados y hace más difícil la trazabilidad de los procesos.</w:t>
+      </w:r>
+    </w:p>
+    <w:p>
+      <w:pPr>
+        <w:spacing w:after="200" w:line="360" w:lineRule="auto"/>
+        <w:ind w:firstLine="720"/>
+        <w:jc w:val="both"/>
+      </w:pPr>
+      <w:r>
         <w:lastRenderedPageBreak/>
-        <w:t>6.1 Interpretación de los resultados en el marco teórico</w:t>
-      </w:r>
-    </w:p>
-    <w:p>
-      <w:pPr>
-        <w:spacing w:after="200" w:line="360" w:lineRule="auto"/>
-        <w:ind w:firstLine="720"/>
-        <w:jc w:val="both"/>
-      </w:pPr>
-      <w:r>
-        <w:t>El análisis de los resultados obtenidos en la evaluación del sistema no puede limitarse a la constatación de los valores numéricos registrados para cada indicador, sino que requiere una interpretación contextualizada que los vincule con los principios teóricos establecidos en el marco conceptual y con las decisiones de diseño adoptadas durante el desarrollo. Esta interpretación permite comprender el significado de los resultados más allá de su dimensión técnica inmediata y extraer enseñanzas generalizables que trasciendan la implementación específica desarrollada.</w:t>
-      </w:r>
-    </w:p>
-    <w:p>
-      <w:pPr>
-        <w:spacing w:after="200" w:line="360" w:lineRule="auto"/>
-        <w:ind w:firstLine="720"/>
-        <w:jc w:val="both"/>
-      </w:pPr>
-      <w:r>
-        <w:t>La capacidad del sistema para coordinar la interacción entre múltiples componentes heterogéneos —la plataforma de orquestación, el componente de interpretación de solicitudes, los servicios externos y el sistema de almacenamiento— sin que los errores en uno de ellos comprometan el funcionamiento de los demás valida empíricamente los principios teóricos que fundamentan este enfoque arquitectónico.</w:t>
-      </w:r>
-    </w:p>
-    <w:p>
-      <w:pPr>
-        <w:spacing w:after="200" w:line="360" w:lineRule="auto"/>
-        <w:ind w:firstLine="720"/>
-        <w:jc w:val="both"/>
-      </w:pPr>
-      <w:r>
-        <w:t>Este hallazgo es coherente con los postulados de Newman (2015) sobre las arquitecturas de microservicios y con los principios de integración de sistemas formulados por Hohpe y Woolf (2003). La modularidad del sistema facilita su comprensión, su mantenimiento y su evolución, al tiempo que reduce la complejidad de las decisiones de diseño al permitir que cada componente sea considerado de manera relativamente independiente. Sin embargo, la implementación también revela que el desacoplamiento tiene un costo en términos de complejidad operativa: la coordinación entre componentes independientes requiere mecanismos de manejo de errores más sofisticados y hace más difícil la trazabilidad de los procesos.</w:t>
-      </w:r>
-    </w:p>
-    <w:p>
-      <w:pPr>
-        <w:spacing w:after="200" w:line="360" w:lineRule="auto"/>
-        <w:ind w:firstLine="720"/>
-        <w:jc w:val="both"/>
-      </w:pPr>
-      <w:r>
-        <w:t xml:space="preserve">El segundo resultado de particular relevancia teórica es el relacionado con el componente de interpretación de lenguaje natural. Los resultados demuestran que la implementación de este componente mediante reglas determinísticas de normalización y clasificación de intenciones permite alcanzar un comportamiento predecible y verificable, con una precisión del 100% en las rutas cubiertas, validando </w:t>
+        <w:t>El segundo resultado de particular relevancia teórica es el relacionado con el componente de interpretación de lenguaje natural. Los resultados demuestran que la implementación de este componente mediante reglas determinísticas de normalización y clasificación de intenciones permite alcanzar un comportamiento predecible y verificable, con una precisión del 100% en las rutas cubiertas, validando los postulados de Russell y Norvig (2021) sobre la adecuación de los enfoques basados en reglas para dominios acotados. La discusión sobre la incorporación de modelos de lenguaje de gran escala queda planteada en términos de extensión futura: la variabilidad del comportamiento ante entradas similares y la dependencia de servicios externos que estos modelos introducen constituyen restricciones que el diseñador de sistemas de automatización debe considerar y gestionar explícitamente.</w:t>
+      </w:r>
+    </w:p>
+    <w:p>
+      <w:pPr>
+        <w:pStyle w:val="Ttulo2"/>
+      </w:pPr>
+      <w:r>
+        <w:t>6.2 La tensión costo-capacidad-control</w:t>
+      </w:r>
+    </w:p>
+    <w:p>
+      <w:pPr>
+        <w:spacing w:after="200" w:line="360" w:lineRule="auto"/>
+        <w:ind w:firstLine="720"/>
+        <w:jc w:val="both"/>
+      </w:pPr>
+      <w:r>
+        <w:t>Uno de los aportes conceptuales más significativos del presente trabajo es la identificación y caracterización de una tensión estructural que atraviesa el diseño de sistemas de automatización en entornos de bajo costo: la tensión entre costo, capacidad y control. Esta tensión no es exclusiva del contexto estudiado, sino que constituye una constante en el diseño de sistemas tecnológicos, pero adquiere características particulares en el contexto de los sistemas de automatización que incorporan componentes de inteligencia artificial.</w:t>
+      </w:r>
+    </w:p>
+    <w:p>
+      <w:pPr>
+        <w:spacing w:after="200" w:line="360" w:lineRule="auto"/>
+        <w:ind w:firstLine="720"/>
+        <w:jc w:val="both"/>
+      </w:pPr>
+      <w:r>
+        <w:t>La dimensión del costo refiere a los recursos económicos y computacionales necesarios para la construcción, el despliegue y el mantenimiento del sistema. En el contexto de la presente investigación, la minimización del costo es una restricción explícita que orienta todas las decisiones de diseño: se prioriza el uso de herramientas de código abierto, servicios con modelos de precios basados en el consumo y soluciones que pueden ser operadas en infraestructuras de bajo costo. Esta restricción condiciona directamente las opciones disponibles en las otras dos dimensiones.</w:t>
+      </w:r>
+    </w:p>
+    <w:p>
+      <w:pPr>
+        <w:spacing w:after="200" w:line="360" w:lineRule="auto"/>
+        <w:ind w:firstLine="720"/>
+        <w:jc w:val="both"/>
+      </w:pPr>
+      <w:r>
+        <w:t xml:space="preserve">La dimensión de la capacidad refiere al alcance funcional del sistema, es decir, al conjunto de tareas que el sistema es capaz de realizar y al nivel de calidad con que </w:t>
       </w:r>
       <w:r>
         <w:lastRenderedPageBreak/>
-        <w:t>los postulados de Russell y Norvig (2021) sobre la adecuación de los enfoques basados en reglas para dominios acotados. La discusión sobre la incorporación de modelos de lenguaje de gran escala queda planteada en términos de extensión futura: la variabilidad del comportamiento ante entradas similares y la dependencia de servicios externos que estos modelos introducen constituyen restricciones que el diseñador de sistemas de automatización debe considerar y gestionar explícitamente.</w:t>
+        <w:t>las realiza. En el sistema desarrollado, la incorporación del componente de inteligencia artificial es la decisión de diseño que más contribuye a ampliar la capacidad del sistema, al introducir la posibilidad de procesar lenguaje natural de manera flexible. Sin embargo, el uso de un modelo de lenguaje de gran escala a través de una API introduce un costo significativo en términos económicos —cuantificable en el costo por solicitud— y computacionales —manifestado en la latencia del componente.</w:t>
+      </w:r>
+    </w:p>
+    <w:p>
+      <w:pPr>
+        <w:spacing w:after="200" w:line="360" w:lineRule="auto"/>
+        <w:ind w:firstLine="720"/>
+        <w:jc w:val="both"/>
+      </w:pPr>
+      <w:r>
+        <w:t>La dimensión del control refiere al grado en que el comportamiento del sistema puede ser previsto, verificado y corregido por sus diseñadores y operadores. Los sistemas puramente determinísticos ofrecen un control total sobre sus resultados, dado que cada salida puede ser predicha con certeza a partir de las entradas y de las reglas implementadas. Por el contrario, los sistemas que incorporan componentes probabilísticos, como los modelos de lenguaje de gran escala, sacrifican parte de este control a cambio de mayor flexibilidad y capacidad de adaptación. En el sistema desarrollado, esta pérdida de control se manifiesta en la variabilidad de las respuestas del modelo y en la dificultad de garantizar que el sistema siempre producirá el resultado esperado ante una entrada determinada.</w:t>
+      </w:r>
+    </w:p>
+    <w:p>
+      <w:pPr>
+        <w:spacing w:after="200" w:line="360" w:lineRule="auto"/>
+        <w:ind w:firstLine="720"/>
+        <w:jc w:val="both"/>
+      </w:pPr>
+      <w:r>
+        <w:t>La gestión de esta tensión no consiste en la eliminación de alguna de sus dimensiones, lo cual resultaría imposible, sino en la adopción de compromisos explícitos y fundamentados entre ellas. El sistema desarrollado representa una opción específica dentro del espacio de compromiso definido por esta tensión: prioriza la accesibilidad económica y la amplitud de capacidades, aceptando un nivel de control reducido como consecuencia de la incorporación del componente de inteligencia artificial. Esta opción puede no ser la más adecuada para todos los contextos posibles, pero se adapta bien a los requisitos del entorno considerado en la investigación.</w:t>
       </w:r>
     </w:p>
     <w:p>
@@ -8399,61 +8661,51 @@
         <w:pStyle w:val="Ttulo2"/>
       </w:pPr>
       <w:r>
-        <w:t>6.2 La tensión costo-capacidad-control</w:t>
-      </w:r>
-    </w:p>
-    <w:p>
-      <w:pPr>
-        <w:spacing w:after="200" w:line="360" w:lineRule="auto"/>
-        <w:ind w:firstLine="720"/>
-        <w:jc w:val="both"/>
-      </w:pPr>
-      <w:r>
-        <w:t>Uno de los aportes conceptuales más significativos del presente trabajo es la identificación y caracterización de una tensión estructural que atraviesa el diseño de sistemas de automatización en entornos de bajo costo: la tensión entre costo, capacidad y control. Esta tensión no es exclusiva del contexto estudiado, sino que constituye una constante en el diseño de sistemas tecnológicos, pero adquiere características particulares en el contexto de los sistemas de automatización que incorporan componentes de inteligencia artificial.</w:t>
-      </w:r>
-    </w:p>
-    <w:p>
-      <w:pPr>
-        <w:spacing w:after="200" w:line="360" w:lineRule="auto"/>
-        <w:ind w:firstLine="720"/>
-        <w:jc w:val="both"/>
-      </w:pPr>
-      <w:r>
-        <w:t>La dimensión del costo refiere a los recursos económicos y computacionales necesarios para la construcción, el despliegue y el mantenimiento del sistema. En el contexto de la presente investigación, la minimización del costo es una restricción explícita que orienta todas las decisiones de diseño: se prioriza el uso de herramientas de código abierto, servicios con modelos de precios basados en el consumo y soluciones que pueden ser operadas en infraestructuras de bajo costo. Esta restricción condiciona directamente las opciones disponibles en las otras dos dimensiones.</w:t>
-      </w:r>
-    </w:p>
-    <w:p>
-      <w:pPr>
-        <w:spacing w:after="200" w:line="360" w:lineRule="auto"/>
-        <w:ind w:firstLine="720"/>
-        <w:jc w:val="both"/>
-      </w:pPr>
-      <w:r>
-        <w:t>La dimensión de la capacidad refiere al alcance funcional del sistema, es decir, al conjunto de tareas que el sistema es capaz de realizar y al nivel de calidad con que las realiza. En el sistema desarrollado, la incorporación del componente de inteligencia artificial es la decisión de diseño que más contribuye a ampliar la capacidad del sistema, al introducir la posibilidad de procesar lenguaje natural de manera flexible. Sin embargo, el uso de un modelo de lenguaje de gran escala a través de una API introduce un costo significativo en términos económicos —</w:t>
+        <w:t>6.3 El modelo híbrido de automatización</w:t>
+      </w:r>
+    </w:p>
+    <w:p>
+      <w:pPr>
+        <w:spacing w:after="200" w:line="360" w:lineRule="auto"/>
+        <w:ind w:firstLine="720"/>
+        <w:jc w:val="both"/>
+      </w:pPr>
+      <w:r>
+        <w:t xml:space="preserve">Uno de los aportes más relevantes de la presente investigación en términos conceptuales es la formulación de un modelo híbrido de automatización, en el cual se </w:t>
       </w:r>
       <w:r>
         <w:lastRenderedPageBreak/>
-        <w:t>cuantificable en el costo por solicitud— y computacionales —manifestado en la latencia del componente.</w:t>
-      </w:r>
-    </w:p>
-    <w:p>
-      <w:pPr>
-        <w:spacing w:after="200" w:line="360" w:lineRule="auto"/>
-        <w:ind w:firstLine="720"/>
-        <w:jc w:val="both"/>
-      </w:pPr>
-      <w:r>
-        <w:t>La dimensión del control refiere al grado en que el comportamiento del sistema puede ser previsto, verificado y corregido por sus diseñadores y operadores. Los sistemas puramente determinísticos ofrecen un control total sobre sus resultados, dado que cada salida puede ser predicha con certeza a partir de las entradas y de las reglas implementadas. Por el contrario, los sistemas que incorporan componentes probabilísticos, como los modelos de lenguaje de gran escala, sacrifican parte de este control a cambio de mayor flexibilidad y capacidad de adaptación. En el sistema desarrollado, esta pérdida de control se manifiesta en la variabilidad de las respuestas del modelo y en la dificultad de garantizar que el sistema siempre producirá el resultado esperado ante una entrada determinada.</w:t>
-      </w:r>
-    </w:p>
-    <w:p>
-      <w:pPr>
-        <w:spacing w:after="200" w:line="360" w:lineRule="auto"/>
-        <w:ind w:firstLine="720"/>
-        <w:jc w:val="both"/>
-      </w:pPr>
-      <w:r>
-        <w:t>La gestión de esta tensión no consiste en la eliminación de alguna de sus dimensiones, lo cual resultaría imposible, sino en la adopción de compromisos explícitos y fundamentados entre ellas. El sistema desarrollado representa una opción específica dentro del espacio de compromiso definido por esta tensión: prioriza la accesibilidad económica y la amplitud de capacidades, aceptando un nivel de control reducido como consecuencia de la incorporación del componente de inteligencia artificial. Esta opción puede no ser la más adecuada para todos los contextos posibles, pero se adapta bien a los requisitos del entorno considerado en la investigación.</w:t>
+        <w:t>integran de manera coherente componentes determinísticos y componentes adaptativos. Este modelo trasciende la dicotomía tradicional entre sistemas de automatización basados en reglas, que ofrecen control y predictibilidad, y sistemas basados en inteligencia artificial, que ofrecen flexibilidad y adaptabilidad, proponiendo una arquitectura que combina las ventajas de ambos paradigmas.</w:t>
+      </w:r>
+    </w:p>
+    <w:p>
+      <w:pPr>
+        <w:spacing w:after="200" w:line="360" w:lineRule="auto"/>
+        <w:ind w:firstLine="720"/>
+        <w:jc w:val="both"/>
+      </w:pPr>
+      <w:r>
+        <w:t>En el modelo híbrido propuesto, los componentes determinísticos son responsables de la ejecución de los flujos de automatización predefinidos, de la integración con los servicios externos y de la gestión de la persistencia de datos. Estos componentes operan bajo reglas explícitas que garantizan un comportamiento predecible y verificable. Los componentes adaptativos, por su parte, son responsables de la interpretación del lenguaje natural del usuario y de la generación de respuestas contextualmente coherentes, aprovechando las capacidades de los modelos de lenguaje de gran escala.</w:t>
+      </w:r>
+    </w:p>
+    <w:p>
+      <w:pPr>
+        <w:spacing w:after="200" w:line="360" w:lineRule="auto"/>
+        <w:ind w:firstLine="720"/>
+        <w:jc w:val="both"/>
+      </w:pPr>
+      <w:r>
+        <w:t>La interfaz entre ambos tipos de componentes es el punto crítico del modelo híbrido. La conversión de la salida probabilística del componente adaptativo en instrucciones determinísticas que puedan ser ejecutadas por el componente de orquestación requiere un diseño cuidadoso de los mecanismos de extracción y validación de la información. Esta interfaz actúa como punto de control que permite mantener la predictibilidad global del sistema a pesar de la variabilidad inherente al componente adaptativo.</w:t>
+      </w:r>
+    </w:p>
+    <w:p>
+      <w:pPr>
+        <w:spacing w:after="200" w:line="360" w:lineRule="auto"/>
+        <w:ind w:firstLine="720"/>
+        <w:jc w:val="both"/>
+      </w:pPr>
+      <w:r>
+        <w:t>El modelo híbrido propuesto tiene implicaciones que van más allá del sistema específico desarrollado en esta investigación. Constituye un principio arquitectónico generalizable que puede ser aplicado al diseño de distintos tipos de sistemas de automatización que requieran integrar capacidades de comprensión del lenguaje natural con la ejecución controlada de flujos de trabajo predefinidos. En este sentido, la contribución conceptual de la investigación no se limita al prototipo desarrollado, sino que se extiende al ámbito más amplio del diseño de sistemas de automatización inteligentes.</w:t>
       </w:r>
     </w:p>
     <w:p>
@@ -8461,17 +8713,7 @@
         <w:pStyle w:val="Ttulo2"/>
       </w:pPr>
       <w:r>
-        <w:t>6.3 El modelo híbrido de automatización</w:t>
-      </w:r>
-    </w:p>
-    <w:p>
-      <w:pPr>
-        <w:spacing w:after="200" w:line="360" w:lineRule="auto"/>
-        <w:ind w:firstLine="720"/>
-        <w:jc w:val="both"/>
-      </w:pPr>
-      <w:r>
-        <w:t>Uno de los aportes más relevantes de la presente investigación en términos conceptuales es la formulación de un modelo híbrido de automatización, en el cual se integran de manera coherente componentes determinísticos y componentes adaptativos. Este modelo trasciende la dicotomía tradicional entre sistemas de automatización basados en reglas, que ofrecen control y predictibilidad, y sistemas basados en inteligencia artificial, que ofrecen flexibilidad y adaptabilidad, proponiendo una arquitectura que combina las ventajas de ambos paradigmas.</w:t>
+        <w:t>6.4 Limitaciones del enfoque adoptado y perspectivas de mejora</w:t>
       </w:r>
     </w:p>
     <w:p>
@@ -8482,84 +8724,45 @@
       </w:pPr>
       <w:r>
         <w:lastRenderedPageBreak/>
-        <w:t>En el modelo híbrido propuesto, los componentes determinísticos son responsables de la ejecución de los flujos de automatización predefinidos, de la integración con los servicios externos y de la gestión de la persistencia de datos. Estos componentes operan bajo reglas explícitas que garantizan un comportamiento predecible y verificable. Los componentes adaptativos, por su parte, son responsables de la interpretación del lenguaje natural del usuario y de la generación de respuestas contextualmente coherentes, aprovechando las capacidades de los modelos de lenguaje de gran escala.</w:t>
-      </w:r>
-    </w:p>
-    <w:p>
-      <w:pPr>
-        <w:spacing w:after="200" w:line="360" w:lineRule="auto"/>
-        <w:ind w:firstLine="720"/>
-        <w:jc w:val="both"/>
-      </w:pPr>
-      <w:r>
-        <w:t>La interfaz entre ambos tipos de componentes es el punto crítico del modelo híbrido. La conversión de la salida probabilística del componente adaptativo en instrucciones determinísticas que puedan ser ejecutadas por el componente de orquestación requiere un diseño cuidadoso de los mecanismos de extracción y validación de la información. Esta interfaz actúa como punto de control que permite mantener la predictibilidad global del sistema a pesar de la variabilidad inherente al componente adaptativo.</w:t>
-      </w:r>
-    </w:p>
-    <w:p>
-      <w:pPr>
-        <w:spacing w:after="200" w:line="360" w:lineRule="auto"/>
-        <w:ind w:firstLine="720"/>
-        <w:jc w:val="both"/>
-      </w:pPr>
-      <w:r>
-        <w:t>El modelo híbrido propuesto tiene implicaciones que van más allá del sistema específico desarrollado en esta investigación. Constituye un principio arquitectónico generalizable que puede ser aplicado al diseño de distintos tipos de sistemas de automatización que requieran integrar capacidades de comprensión del lenguaje natural con la ejecución controlada de flujos de trabajo predefinidos. En este sentido, la contribución conceptual de la investigación no se limita al prototipo desarrollado, sino que se extiende al ámbito más amplio del diseño de sistemas de automatización inteligentes.</w:t>
-      </w:r>
-    </w:p>
-    <w:p>
-      <w:pPr>
-        <w:pStyle w:val="Ttulo2"/>
-      </w:pPr>
-      <w:r>
-        <w:t>6.4 Limitaciones del enfoque adoptado y perspectivas de mejora</w:t>
-      </w:r>
-    </w:p>
-    <w:p>
-      <w:pPr>
-        <w:spacing w:after="200" w:line="360" w:lineRule="auto"/>
-        <w:ind w:firstLine="720"/>
-        <w:jc w:val="both"/>
-      </w:pPr>
-      <w:r>
-        <w:t xml:space="preserve">El análisis crítico de las limitaciones del enfoque adoptado en la presente investigación resulta fundamental para contextualizar adecuadamente los resultados obtenidos y para orientar el trabajo futuro en la dirección más productiva. Estas limitaciones no constituyen deficiencias del trabajo, sino condicionantes inherentes al contexto en que se desarrolla, que han sido reconocidos explícitamente desde el </w:t>
+        <w:t>El análisis crítico de las limitaciones del enfoque adoptado en la presente investigación resulta fundamental para contextualizar adecuadamente los resultados obtenidos y para orientar el trabajo futuro en la dirección más productiva. Estas limitaciones no constituyen deficiencias del trabajo, sino condicionantes inherentes al contexto en que se desarrolla, que han sido reconocidos explícitamente desde el inicio de la investigación y han sido gestionados de manera transparente a lo largo del proceso.</w:t>
+      </w:r>
+    </w:p>
+    <w:p>
+      <w:pPr>
+        <w:spacing w:after="200" w:line="360" w:lineRule="auto"/>
+        <w:ind w:firstLine="720"/>
+        <w:jc w:val="both"/>
+      </w:pPr>
+      <w:r>
+        <w:t>La limitación más significativa del sistema desarrollado es su dependencia de servicios externos para funciones críticas. La disponibilidad del sistema en su conjunto está condicionada por la disponibilidad de cada uno de los servicios externos que integra, lo que hace que la robustez global del sistema sea, en el peor caso, igual a la del servicio externo menos confiable. En entornos productivos, esta dependencia puede generar problemas de disponibilidad que afecten la experiencia del usuario y la confiabilidad del sistema.</w:t>
+      </w:r>
+    </w:p>
+    <w:p>
+      <w:pPr>
+        <w:spacing w:after="200" w:line="360" w:lineRule="auto"/>
+        <w:ind w:firstLine="720"/>
+        <w:jc w:val="both"/>
+      </w:pPr>
+      <w:r>
+        <w:t>Una segunda limitación significativa es la ausencia de mecanismos de aprendizaje continuo que permitan al sistema mejorar su comportamiento a partir de la retroalimentación del usuario. En su configuración actual, el sistema no modifica su comportamiento en función de las experiencias de uso acumuladas, lo que implica que las solicitudes expresadas con una redacción diferente a la contemplada en el catálogo de intenciones requerirán la ampliación manual de las reglas de interpretación para ser reconocidas correctamente. Esta limitación, sin embargo, no se descarta como línea de evolución: en la actualidad se está trabajando en la incorporación de un agente conversacional basado en modelos de lenguaje que permita interpretar redacciones libres y reducir la dependencia de la ampliación manual de reglas, manteniendo el control del comportamiento del sistema mediante mecanismos de validación de las respuestas generadas.</w:t>
+      </w:r>
+    </w:p>
+    <w:p>
+      <w:pPr>
+        <w:spacing w:after="200" w:line="360" w:lineRule="auto"/>
+        <w:ind w:firstLine="720"/>
+        <w:jc w:val="both"/>
+      </w:pPr>
+      <w:r>
+        <w:t xml:space="preserve">La tercera limitación relevante es la restricción en la capacidad de gestión de contextos conversacionales complejos. El sistema mantiene el estado de la conversación por usuario —modo de interacción y contenido del carrito simulado—, pero esta capacidad está limitada por el diseño del catálogo de intenciones y por los </w:t>
       </w:r>
       <w:r>
         <w:lastRenderedPageBreak/>
-        <w:t>inicio de la investigación y han sido gestionados de manera transparente a lo largo del proceso.</w:t>
-      </w:r>
-    </w:p>
-    <w:p>
-      <w:pPr>
-        <w:spacing w:after="200" w:line="360" w:lineRule="auto"/>
-        <w:ind w:firstLine="720"/>
-        <w:jc w:val="both"/>
-      </w:pPr>
-      <w:r>
-        <w:t>La limitación más significativa del sistema desarrollado es su dependencia de servicios externos para funciones críticas. La disponibilidad del sistema en su conjunto está condicionada por la disponibilidad de cada uno de los servicios externos que integra, lo que hace que la robustez global del sistema sea, en el peor caso, igual a la del servicio externo menos confiable. En entornos productivos, esta dependencia puede generar problemas de disponibilidad que afecten la experiencia del usuario y la confiabilidad del sistema.</w:t>
-      </w:r>
-    </w:p>
-    <w:p>
-      <w:pPr>
-        <w:spacing w:after="200" w:line="360" w:lineRule="auto"/>
-        <w:ind w:firstLine="720"/>
-        <w:jc w:val="both"/>
-      </w:pPr>
-      <w:r>
-        <w:t>Una segunda limitación significativa es la ausencia de mecanismos de aprendizaje continuo que permitan al sistema mejorar su comportamiento a partir de la retroalimentación del usuario. En su configuración actual, el sistema no modifica su comportamiento en función de las experiencias de uso acumuladas, lo que implica que las solicitudes expresadas con una redacción diferente a la contemplada en el catálogo de intenciones requerirán la ampliación manual de las reglas de interpretación para ser reconocidas correctamente. Esta limitación, sin embargo, no se descarta como línea de evolución: en la actualidad se está trabajando en la incorporación de un agente conversacional basado en modelos de lenguaje que permita interpretar redacciones libres y reducir la dependencia de la ampliación manual de reglas, manteniendo el control del comportamiento del sistema mediante mecanismos de validación de las respuestas generadas.</w:t>
-      </w:r>
-    </w:p>
-    <w:p>
-      <w:pPr>
-        <w:spacing w:after="200" w:line="360" w:lineRule="auto"/>
-        <w:ind w:firstLine="720"/>
-        <w:jc w:val="both"/>
-      </w:pPr>
-      <w:r>
-        <w:t>La tercera limitación relevante es la restricción en la capacidad de gestión de contextos conversacionales complejos. El sistema mantiene el estado de la conversación por usuario —modo de interacción y contenido del carrito simulado—, pero esta capacidad está limitada por el diseño del catálogo de intenciones y por los mecanismos de gestión del estado implementados. En conversaciones que involucren consultas no contempladas en el catálogo, el sistema deriva la solicitud a la intención por defecto, presentando nuevamente el menú principal en lugar de interpretar la solicitud, lo que genera una experiencia menos fluida en los casos límite.</w:t>
-      </w:r>
-    </w:p>
-    <w:p>
-      <w:r>
-        <w:lastRenderedPageBreak/>
+        <w:t>mecanismos de gestión del estado implementados. En conversaciones que involucren consultas no contempladas en el catálogo, el sistema deriva la solicitud a la intención por defecto, presentando nuevamente el menú principal en lugar de interpretar la solicitud, lo que genera una experiencia menos fluida en los casos límite.</w:t>
+      </w:r>
+    </w:p>
+    <w:p>
+      <w:r>
         <w:br w:type="page"/>
       </w:r>
     </w:p>
@@ -8577,13 +8780,88 @@
       </w:r>
     </w:p>
     <w:p>
-      <w:pPr>
-        <w:spacing w:after="200" w:line="360" w:lineRule="auto"/>
-        <w:ind w:firstLine="720"/>
-        <w:jc w:val="both"/>
-      </w:pPr>
-      <w:r>
-        <w:t>El desarrollo de la presente investigación ha permitido abordar de manera integral y rigurosa la problemática asociada a la ineficiencia operativa en entornos digitales de pequeña escala, caracterizados por la persistencia de procesos manuales, la fragmentación de herramientas tecnológicas y la ausencia de integración sistémica. A lo largo de sus distintas etapas, el trabajo ha articulado de manera coherente los planos teórico, metodológico y técnico, construyendo un argumento que avanza desde el diagnóstico del problema hasta la demostración empírica de la viabilidad de la solución propuesta.</w:t>
+      <w:r>
+        <w:t>El desarrollo de la presente investigación ha permitido abordar de manera integral y rigurosa la problemática asociada a la ineficiencia operativa en entornos digitales de pequeña escala, carac</w:t>
+      </w:r>
+      <w:r>
+        <w:t>terizados por la persistencia de procesos manuales, la fragmentación de herramientas tecnológicas y la ausencia de integración sistémica. A lo largo de sus distintas etapas, el trabajo ha articulado de manera coherente los planos teórico, metodológico y té</w:t>
+      </w:r>
+      <w:r>
+        <w:t>cnico, construyendo un argumento que avanza desde el diagnóstico del problema hasta la demostración empírica de la viabilidad de la solución propuesta.</w:t>
+      </w:r>
+    </w:p>
+    <w:p>
+      <w:pPr>
+        <w:pStyle w:val="Ttulo2"/>
+      </w:pPr>
+      <w:r>
+        <w:t>7.1 Respuesta a la pregunta de investigación</w:t>
+      </w:r>
+    </w:p>
+    <w:p>
+      <w:pPr>
+        <w:spacing w:after="200" w:line="360" w:lineRule="auto"/>
+        <w:ind w:firstLine="720"/>
+        <w:jc w:val="both"/>
+      </w:pPr>
+      <w:r>
+        <w:t>En relación con la pregunta de investigación planteada al inicio del trabajo, los resultados obtenidos permiten responder afirmativamente: es posible diseñar e implementar un sistema de automatización de procesos que, mediante la integración de servicios heterogéneos y un componente de interpretación de lenguaje natural basado en reglas, permita reducir de manera sustantiva la intervención manual en tareas digitales operativas sin requerir infraestructura tecnológica compleja ni implicar altos costos de implementación. La respuesta se enmarca en un modelo híbrido en el que la incorporación de componentes adaptativos de inteligencia artificial constituye una extensión que preserva el mismo esquema arquitectónico.</w:t>
+      </w:r>
+    </w:p>
+    <w:p>
+      <w:r>
+        <w:t>La pregunta de investigación planteada en la sección 1.3 queda respondida de manera afirmativa: es posibl</w:t>
+      </w:r>
+      <w:r>
+        <w:t>e diseñar e implementar un sistema de automatización de procesos que integre servicios heterogéneos y componentes de interpretación de lenguaje natural en entornos de bajo costo, manteniendo niveles funcionales aceptables.</w:t>
+      </w:r>
+    </w:p>
+    <w:p>
+      <w:pPr>
+        <w:pStyle w:val="Ttulo2"/>
+      </w:pPr>
+      <w:r>
+        <w:t>7.2 Cumplimiento de objetivos</w:t>
+      </w:r>
+    </w:p>
+    <w:p>
+      <w:r>
+        <w:t xml:space="preserve">El </w:t>
+      </w:r>
+      <w:r>
+        <w:t>cumplimiento de los objetivos específicos planteados en la sección 1.5 se verifica a lo largo del desarrollo de la investigación. El primer objetivo, relativo a la revisión teórica, se cumplimenta en el Capítulo 2, donde se sistematizan los conceptos de au</w:t>
+      </w:r>
+      <w:r>
+        <w:t>tomatización de procesos, integración de servicios, inteligencia artificial y sistemas orientados a eventos. El segundo objetivo, referido al diseño arquitectónico, se materializa en las secciones 4.1 y 4.2, donde se define la arquitectura modular y desaco</w:t>
+      </w:r>
+      <w:r>
+        <w:t>plada del sistema. El tercer objetivo, orientado a la selección de herramientas, se atiende en la sección 4.8, donde se justifica la elección de cada componente tecnológico. El cuarto objetivo, relativo a la implementación de flujos, se desarrolla en la se</w:t>
+      </w:r>
+      <w:r>
+        <w:t xml:space="preserve">cción 4.4 y se documenta detalladamente en el Anexo B. El quinto objetivo, referido a las capacidades de </w:t>
+      </w:r>
+      <w:r>
+        <w:lastRenderedPageBreak/>
+        <w:t>procesamiento de lenguaje natural, se aborda en la sección 4.5 y se complementa con el Fragmento 1 de código que evidencia la implementación del compon</w:t>
+      </w:r>
+      <w:r>
+        <w:t>ente de interpretación semántica. El sexto objetivo, orientado a la evaluación de desempeño, se cumple íntegramente en el Capítulo 5, donde se presentan y analizan los resultados de las pruebas funcionales, de rendimiento, precisión y estabilidad.</w:t>
+      </w:r>
+    </w:p>
+    <w:p>
+      <w:pPr>
+        <w:pStyle w:val="Ttulo2"/>
+      </w:pPr>
+      <w:r>
+        <w:t>7.3 Apor</w:t>
+      </w:r>
+      <w:r>
+        <w:t>tes originales</w:t>
+      </w:r>
+    </w:p>
+    <w:p>
+      <w:r>
+        <w:t>El aporte original de este trabajo se materializa en dos contribuciones conceptuales que trascienden la implementación del prototipo específico.</w:t>
       </w:r>
     </w:p>
     <w:p>
@@ -8613,11 +8891,11 @@
         <w:jc w:val="both"/>
       </w:pPr>
       <w:r>
-        <w:t xml:space="preserve">La segunda conclusión importante concierne al papel de la inteligencia artificial en los sistemas de automatización de bajo costo. La presente investigación demuestra que un componente de interpretación de lenguaje natural basado en reglas determinísticas es suficiente para automatizar los flujos conversacionales de </w:t>
+        <w:t xml:space="preserve">La segunda conclusión importante concierne al papel de la inteligencia artificial en los sistemas de automatización de bajo costo. La presente investigación demuestra que un componente de interpretación de lenguaje natural basado en reglas determinísticas es suficiente para automatizar los flujos conversacionales de un dominio acotado, eliminando la necesidad de que los usuarios aprendan interfaces estructuradas y reduciendo la fricción en la interacción. La incorporación de modelos de lenguaje de gran escala accesibles a través de APIs públicas queda definida como </w:t>
       </w:r>
       <w:r>
         <w:lastRenderedPageBreak/>
-        <w:t>un dominio acotado, eliminando la necesidad de que los usuarios aprendan interfaces estructuradas y reduciendo la fricción en la interacción. La incorporación de modelos de lenguaje de gran escala accesibles a través de APIs públicas queda definida como una extensión viable del prototipo que permitiría ampliar la cobertura de la interpretación, a costa de introducir las tensiones que se discuten a continuación.</w:t>
+        <w:t>una extensión viable del prototipo que permitiría ampliar la cobertura de la interpretación, a costa de introducir las tensiones que se discuten a continuación.</w:t>
       </w:r>
     </w:p>
     <w:p>
@@ -8651,24 +8929,75 @@
       </w:r>
     </w:p>
     <w:p>
-      <w:pPr>
-        <w:spacing w:after="200" w:line="360" w:lineRule="auto"/>
-        <w:ind w:firstLine="720"/>
-        <w:jc w:val="both"/>
-      </w:pPr>
+      <w:r>
+        <w:t>Estas dos contribuciones —el modelo híbrido de automatización y la caracter</w:t>
+      </w:r>
+      <w:r>
+        <w:t xml:space="preserve">ización de la tensión costo-capacidad-control— ofrecen un marco de referencia que puede </w:t>
+      </w:r>
       <w:r>
         <w:lastRenderedPageBreak/>
-        <w:t>En relación con la pregunta de investigación planteada al inicio del trabajo, los resultados obtenidos permiten responder afirmativamente: es posible diseñar e implementar un sistema de automatización de procesos que, mediante la integración de servicios heterogéneos y un componente de interpretación de lenguaje natural basado en reglas, permita reducir de manera sustantiva la intervención manual en tareas digitales operativas sin requerir infraestructura tecnológica compleja ni implicar altos costos de implementación. La respuesta se enmarca en un modelo híbrido en el que la incorporación de componentes adaptativos de inteligencia artificial constituye una extensión que preserva el mismo esquema arquitectónico.</w:t>
-      </w:r>
-    </w:p>
-    <w:p>
-      <w:pPr>
-        <w:spacing w:after="200" w:line="360" w:lineRule="auto"/>
-        <w:ind w:firstLine="720"/>
-        <w:jc w:val="both"/>
-      </w:pPr>
-      <w:r>
-        <w:t>Finalmente, es importante destacar que el valor de la presente investigación no reside únicamente en el sistema desarrollado, sino también en el proceso de reflexión que permitió identificar las condiciones bajo las cuales la automatización puede ser implementada de manera efectiva en contextos de bajo costo. La articulación entre teoría y práctica que caracteriza al trabajo proporciona una base sólida para futuras investigaciones que busquen profundizar en la comprensión de este campo y expandir el alcance del modelo propuesto.</w:t>
+        <w:t>ser utilizado por otros investigadores y profesionales para orientar sus decisiones de diseño en contextos de automatización de bajo costo.</w:t>
+      </w:r>
+    </w:p>
+    <w:p>
+      <w:pPr>
+        <w:pStyle w:val="Ttulo2"/>
+      </w:pPr>
+      <w:r>
+        <w:t>7.4 Limitaciones de la inves</w:t>
+      </w:r>
+      <w:r>
+        <w:t>tigación</w:t>
+      </w:r>
+    </w:p>
+    <w:p>
+      <w:r>
+        <w:t>Los resultados se basan en un prototipo funcional evaluado en un entorno controlado, no en un sistema desplegado en producción con usuarios reales. Si bien las pruebas ejecutadas abarcan múltiples dimensiones de evaluación (funcionalidad, rendimie</w:t>
+      </w:r>
+      <w:r>
+        <w:t>nto, precisión y estabilidad), la transferencia de resultados a un escenario productivo con demanda variable y usuarios con diferentes perfiles podría revelar limitaciones no contempladas en el presente estudio.</w:t>
+      </w:r>
+    </w:p>
+    <w:p>
+      <w:r>
+        <w:t>El dominio conversacional evaluado es acotad</w:t>
+      </w:r>
+      <w:r>
+        <w:t xml:space="preserve">o (7 intenciones predefinidas); la generalización a dominios abiertos requiere integración de modelos de lenguaje probabilísticos. El prototipo actual opera bajo un esquema determinista que, si bien es suficiente para el dominio evaluado, no puede abarcar </w:t>
+      </w:r>
+      <w:r>
+        <w:t>la complejidad de interacciones conversacionales ilimitadas sin incorporar componentes de inteligencia artificial de última generación.</w:t>
+      </w:r>
+    </w:p>
+    <w:p>
+      <w:r>
+        <w:t>La ausencia de un diseño experimental controlado (con grupo de control) limita la capacidad de establecer causalidad ent</w:t>
+      </w:r>
+      <w:r>
+        <w:t xml:space="preserve">re las variables intervenidas. Los resultados obtenidos permiten establecer correlaciones y describir comportamientos del sistema, pero no permiten afirmar con certeza estadística que las mejoras observadas sean exclusivamente atribuibles a las decisiones </w:t>
+      </w:r>
+      <w:r>
+        <w:t>de diseño adoptadas.</w:t>
+      </w:r>
+    </w:p>
+    <w:p>
+      <w:pPr>
+        <w:pStyle w:val="Ttulo2"/>
+      </w:pPr>
+      <w:r>
+        <w:t>7.5 Trabajo futuro</w:t>
+      </w:r>
+    </w:p>
+    <w:p>
+      <w:r>
+        <w:t xml:space="preserve">Las limitaciones identificadas abren líneas naturales de investigación futura. En particular, el despliegue del prototipo en un entorno productivo con usuarios reales permitiría validar los resultados en condiciones </w:t>
+      </w:r>
+      <w:r>
+        <w:t>de uso auténticas. La incorporación de modelos de lenguaje de gran escala podría ampliar significativamente el dominio conversacional cubierto. Asimismo, la realización de estudios comparativos con grupo de control fortalecería la validez interna de los ha</w:t>
+      </w:r>
+      <w:r>
+        <w:t>llazgos. Estas y otras líneas de mejora se desarrollan con mayor detalle en el Capítulo 8 (Recomendaciones), donde se proponen acciones concretas para cada una de estas direcciones.</w:t>
       </w:r>
     </w:p>
     <w:p>
@@ -9066,14 +9395,7 @@
           <w:sz w:val="22"/>
           <w:szCs w:val="22"/>
         </w:rPr>
-        <w:t>He, J., Chen, S., Zhang, F., &amp; Yang, Z. (2024). From Words to Actions: Unveiling the Theoretical Underpinnings of LLM-Driven Autonomous Systems. Proceedings of</w:t>
-      </w:r>
-      <w:r>
-        <w:rPr>
-          <w:sz w:val="22"/>
-          <w:szCs w:val="22"/>
-        </w:rPr>
-        <w:t xml:space="preserve"> the 41st International Conference on Machine Learning (ICML), 17807–17841. https://doi.org/10.48550/arXiv.2402.10762</w:t>
+        <w:t>He, J., Chen, S., Zhang, F., &amp; Yang, Z. (2024). From Words to Actions: Unveiling the Theoretical Underpinnings of LLM-Driven Autonomous Systems. Proceedings of the 41st International Conference on Machine Learning (ICML), 17807–17841. https://doi.org/10.48550/arXiv.2402.10762</w:t>
       </w:r>
     </w:p>
     <w:p>
@@ -9191,6 +9513,7 @@
         <w:jc w:val="both"/>
       </w:pPr>
       <w:r>
+        <w:lastRenderedPageBreak/>
         <w:t>OpenAI. (2023). GPT-4 technical report. arXiv. https://doi.org/10.48550/arXiv.2303.08774</w:t>
       </w:r>
     </w:p>
@@ -9205,7 +9528,6 @@
           <w:sz w:val="22"/>
           <w:szCs w:val="22"/>
         </w:rPr>
-        <w:lastRenderedPageBreak/>
         <w:t>Russell, S., &amp; Norvig, P. (2021). Artificial intelligence: A modern approach (4th ed.). Pearson.</w:t>
       </w:r>
     </w:p>
@@ -9262,14 +9584,7 @@
           <w:sz w:val="22"/>
           <w:szCs w:val="22"/>
         </w:rPr>
-        <w:t>Wei, J., Wang, X., Schuurmans, D., Bosma, M., Xia, F., Chi, E., Le, Q., &amp; Zhou, D. (2022). Chain-of-Thought Prompting Elicits Reasoning in Large Language Models. Advances in Neural Information Processing Systems, 35, 24824–2483</w:t>
-      </w:r>
-      <w:r>
-        <w:rPr>
-          <w:sz w:val="22"/>
-          <w:szCs w:val="22"/>
-        </w:rPr>
-        <w:t>7. https://doi.org/10.48550/arXiv.2201.11903</w:t>
+        <w:t>Wei, J., Wang, X., Schuurmans, D., Bosma, M., Xia, F., Chi, E., Le, Q., &amp; Zhou, D. (2022). Chain-of-Thought Prompting Elicits Reasoning in Large Language Models. Advances in Neural Information Processing Systems, 35, 24824–24837. https://doi.org/10.48550/arXiv.2201.11903</w:t>
       </w:r>
     </w:p>
     <w:p>
@@ -9311,14 +9626,7 @@
           <w:sz w:val="22"/>
           <w:szCs w:val="22"/>
         </w:rPr>
-        <w:t>Xi, Z., Chen,</w:t>
-      </w:r>
-      <w:r>
-        <w:rPr>
-          <w:sz w:val="22"/>
-          <w:szCs w:val="22"/>
-        </w:rPr>
-        <w:t xml:space="preserve"> W., Guo, X., He, W., Ding, Y., Hong, B., Zhang, M., Wang, J., Jin, S., Zhou, E., Zheng, A., Fan, X., Wang, X., Lim, A., &amp; Liu, T. (2023). The Rise and Potential of Large Language Model Based Agents: A Survey. arXiv preprint arXiv:2309.07864. https://doi.org/10.48550/arXiv.2309.07864</w:t>
+        <w:t>Xi, Z., Chen, W., Guo, X., He, W., Ding, Y., Hong, B., Zhang, M., Wang, J., Jin, S., Zhou, E., Zheng, A., Fan, X., Wang, X., Lim, A., &amp; Liu, T. (2023). The Rise and Potential of Large Language Model Based Agents: A Survey. arXiv preprint arXiv:2309.07864. https://doi.org/10.48550/arXiv.2309.07864</w:t>
       </w:r>
     </w:p>
     <w:p>
@@ -12039,7 +12347,7 @@
         </w:rPr>
         <w:lastRenderedPageBreak/>
         <w:drawing>
-          <wp:inline distT="0" distB="0" distL="0" distR="0" wp14:anchorId="1E292EDA" wp14:editId="2CF73411">
+          <wp:inline distT="0" distB="0" distL="0" distR="0" wp14:anchorId="57FC7DAC" wp14:editId="0C6E207B">
             <wp:extent cx="5040000" cy="2661750"/>
             <wp:effectExtent l="0" t="0" r="0" b="0"/>
             <wp:docPr id="17" name="Picture 17"/>

</xml_diff>

<commit_message>
docs: tesis iter2 - reduccion de 111 a ~99 paginas (recorte Cap1,2,4,5,6,8, Anexos)
</commit_message>
<xml_diff>
--- a/Docs/Devoluciones + archivo de tesis/Tesis_Final_UTNV2 (1).docx
+++ b/Docs/Devoluciones + archivo de tesis/Tesis_Final_UTNV2 (1).docx
@@ -2411,208 +2411,190 @@
         <w:jc w:val="both"/>
       </w:pPr>
       <w:r>
-        <w:t>El proceso de transformación digital que atraviesan las organizaciones contemporáneas ha generado una reconfiguración profunda en la manera en que se conciben, diseñan y ejecutan los procesos operativos. Este fenómeno, impulsado por la acelerada evolución de las tecnologías de la información y la comunicación durante las últimas dos décadas, ha modificado radicalmente las estructuras productivas y comunicativas de empresas, instituciones y emprendimientos de diversa envergadura. La digitalización no se limita únicamente a la incorporación de herramientas informáticas en reemplazo de procedimientos analógicos, sino que implica una transformación más profunda que afecta los modelos de negocio, los procesos de toma de decisiones y las formas de relacionamiento entre organizaciones, clientes y proveedores.</w:t>
-      </w:r>
-    </w:p>
-    <w:p>
-      <w:pPr>
-        <w:spacing w:after="200" w:line="360" w:lineRule="auto"/>
-        <w:ind w:firstLine="720"/>
-        <w:jc w:val="both"/>
-      </w:pPr>
-      <w:r>
-        <w:t>En este escenario, la automatización de procesos emerge como uno de los ejes centrales de la transformación digital. La posibilidad de delegar tareas repetitivas, estructuradas y consumidoras de tiempo en sistemas capaces de ejecutarlas de manera autónoma representa una ventaja competitiva de primer orden para las organizaciones que logran implementarla de manera efectiva. Diversas investigaciones han demostrado que la automatización no solo reduce los costos operativos (Lacity y Willcocks, 2016) y minimiza el margen de error humano, sino que también libera recursos humanos para ser destinados a actividades de mayor valor agregado, como el análisis estratégico, la innovación y la atención personalizada a clientes.</w:t>
-      </w:r>
-    </w:p>
-    <w:p>
-      <w:pPr>
-        <w:spacing w:after="200" w:line="360" w:lineRule="auto"/>
-        <w:ind w:firstLine="720"/>
-        <w:jc w:val="both"/>
-      </w:pPr>
-      <w:r>
-        <w:t xml:space="preserve">Sin embargo, esta transformación no se manifiesta de manera uniforme en todos los contextos organizacionales. Por el contrario, genera asimetrías significativas en la capacidad de adopción tecnológica que responden a condicionantes de naturaleza estructural, económica y cultural. Las grandes corporaciones y empresas medianas con mayor capacidad de inversión han logrado incorporar soluciones de automatización de relativa complejidad, tales como sistemas </w:t>
+        <w:t>Las organizaciones contemporáneas enfrentan una creciente necesidad de automatizar procesos operativos para mantener su competitividad. La automatización permite delegar tareas repetitivas y estructuradas en sistemas capaces de ejecutarlas de manera autónoma, reduciendo costos operativos (Lacity y Willcocks, 2016), minimizando el margen de error humano y liberando recursos humanos para actividades de mayor valor agregado.</w:t>
+      </w:r>
+    </w:p>
+    <w:p>
+      <w:pPr>
+        <w:spacing w:after="200" w:line="360" w:lineRule="auto"/>
+        <w:ind w:firstLine="720"/>
+        <w:jc w:val="both"/>
+      </w:pPr>
+      <w:r>
+        <w:t>Sin embargo, esta transformación genera asimetrías significativas. Las grandes corporaciones han incorporado soluciones de automatización sofisticadas —ERP, RPA, análisis de datos en tiempo real—, pero estos sistemas requieren infraestructuras tecnológicas complejas, equipos especializados y presupuestos que exceden ampliamente las posibilidades de los actores más pequeños del ecosistema económico.</w:t>
+      </w:r>
+    </w:p>
+    <w:p>
+      <w:pPr>
+        <w:spacing w:after="200" w:line="360" w:lineRule="auto"/>
+        <w:ind w:firstLine="720"/>
+        <w:jc w:val="both"/>
+      </w:pPr>
+      <w:r>
+        <w:t>Los pequeños emprendimientos, las microempresas y los proyectos en etapas iniciales se encuentran excluidos de estos procesos de modernización. La restricción de recursos económicos impide el acceso a soluciones comerciales; la ausencia de infraestructura adecuada limita las opciones de implementación; y la carencia de conocimientos técnicos especializados dificulta tanto la evaluación de alternativas como la gestión de las soluciones adoptadas.</w:t>
+      </w:r>
+    </w:p>
+    <w:p>
+      <w:pPr>
+        <w:spacing w:after="200" w:line="360" w:lineRule="auto"/>
+        <w:ind w:firstLine="720"/>
+        <w:jc w:val="both"/>
+      </w:pPr>
+      <w:r>
+        <w:t>Esta situación genera una paradoja: son precisamente las organizaciones con mayores limitaciones de recursos aquellas que más podrían beneficiarse de la automatización. Un pequeño emprendedor que gestiona manualmente sus comunicaciones, actualiza hojas de cálculo y administra sus redes sociales dedica una fracción significativa de su tiempo productivo a tareas que, en principio, podrían automatizarse.</w:t>
+      </w:r>
+    </w:p>
+    <w:p>
+      <w:pPr>
+        <w:spacing w:after="200" w:line="360" w:lineRule="auto"/>
+        <w:ind w:firstLine="720"/>
+        <w:jc w:val="both"/>
+      </w:pPr>
+      <w:r>
+        <w:t xml:space="preserve">La gestión manual introduce errores de registro, inconsistencias entre fuentes de datos y pérdidas de información que deterioran la calidad de la base de </w:t>
       </w:r>
       <w:r>
         <w:lastRenderedPageBreak/>
-        <w:t>de gestión empresarial integrados, plataformas de automatización robótica de procesos y herramientas de análisis de datos en tiempo real. Estos sistemas, aunque poderosos, requieren infraestructuras tecnológicas sofisticadas, equipos de profesionales especializados y presupuestos de implementación y mantenimiento que exceden ampliamente las posibilidades de los actores más pequeños del ecosistema económico.</w:t>
-      </w:r>
-    </w:p>
-    <w:p>
-      <w:pPr>
-        <w:spacing w:after="200" w:line="360" w:lineRule="auto"/>
-        <w:ind w:firstLine="720"/>
-        <w:jc w:val="both"/>
-      </w:pPr>
-      <w:r>
-        <w:t>En particular, los pequeños emprendimientos, las microempresas y los proyectos en etapas iniciales de desarrollo se encuentran frecuentemente excluidos de estos procesos de modernización tecnológica. Las razones que explican esta exclusión son múltiples y se refuerzan mutuamente: la restricción de recursos económicos impide el acceso a soluciones de automatización comerciales, cuyo costo de licenciamiento, implementación y mantenimiento representa un porcentaje desproporcionado del presupuesto disponible; la ausencia de infraestructura tecnológica adecuada limita las opciones de implementación; y la carencia de conocimientos técnicos especializados dentro del equipo de trabajo dificulta tanto la evaluación de alternativas como la gestión de las soluciones adoptadas.</w:t>
-      </w:r>
-    </w:p>
-    <w:p>
-      <w:pPr>
-        <w:spacing w:after="200" w:line="360" w:lineRule="auto"/>
-        <w:ind w:firstLine="720"/>
-        <w:jc w:val="both"/>
-      </w:pPr>
-      <w:r>
-        <w:t>Esta situación genera una paradoja particularmente problemática: son precisamente las organizaciones con mayores limitaciones de recursos aquellas que más podrían beneficiarse de la automatización de sus procesos operativos. Un pequeño emprendedor que gestiona manualmente sus comunicaciones con clientes, actualiza hojas de cálculo de seguimiento de pedidos, genera reportes semanales y administra su presencia en redes sociales dedica una fracción significativa de su tiempo productivo a tareas operativas que, en principio, podrían ser realizadas de manera automática. Esta sobrecarga operativa no solo impacta en la eficiencia del trabajo, sino que también limita la capacidad de la persona para enfocarse en las actividades que realmente impulsan el crecimiento de su proyecto.</w:t>
-      </w:r>
-    </w:p>
-    <w:p>
-      <w:pPr>
-        <w:spacing w:after="200" w:line="360" w:lineRule="auto"/>
-        <w:ind w:firstLine="720"/>
-        <w:jc w:val="both"/>
-      </w:pPr>
-      <w:r>
-        <w:t xml:space="preserve">La persistencia de procesos manuales en estos entornos no solo impacta en la eficiencia operativa, sino que también condiciona la capacidad de crecimiento y la competitividad de las organizaciones afectadas. La gestión manual de información introduce inevitablemente errores de registro, inconsistencias entre fuentes de datos </w:t>
+        <w:t>conocimiento sobre la cual se toman decisiones. Además, el volumen de trabajo crece proporcionalmente al número de clientes o interacciones, haciendo imposible escalar sin incrementar linealmente los recursos humanos.</w:t>
+      </w:r>
+    </w:p>
+    <w:p>
+      <w:pPr>
+        <w:spacing w:after="200" w:line="360" w:lineRule="auto"/>
+        <w:ind w:firstLine="720"/>
+        <w:jc w:val="both"/>
+      </w:pPr>
+      <w:r>
+        <w:t>Es en este contexto donde surge la motivación de la investigación: la identificación de una necesidad real, no satisfecha por las soluciones existentes, y la disponibilidad de tecnologías accesibles que, combinadas estratégicamente, podrían dar respuesta a esa necesidad.</w:t>
+      </w:r>
+    </w:p>
+    <w:p>
+      <w:pPr>
+        <w:spacing w:after="200" w:line="360" w:lineRule="auto"/>
+        <w:ind w:firstLine="720"/>
+        <w:jc w:val="both"/>
+      </w:pPr>
+    </w:p>
+    <w:p>
+      <w:pPr>
+        <w:pStyle w:val="Ttulo2"/>
+      </w:pPr>
+      <w:r>
+        <w:t>1.2 Descripción y delimitación del problema</w:t>
+      </w:r>
+    </w:p>
+    <w:p>
+      <w:pPr>
+        <w:spacing w:after="200" w:line="360" w:lineRule="auto"/>
+        <w:ind w:firstLine="720"/>
+        <w:jc w:val="both"/>
+      </w:pPr>
+      <w:r>
+        <w:t>El problema central que aborda esta investigación puede enunciarse así: los entornos digitales de pequeña escala carecen de modelos de automatización accesibles, integrados y adaptables que les permitan reducir la dependencia de la intervención manual sin requerir inversiones significativas en infraestructura o personal técnico especializado.</w:t>
+      </w:r>
+    </w:p>
+    <w:p>
+      <w:pPr>
+        <w:spacing w:after="200" w:line="360" w:lineRule="auto"/>
+        <w:ind w:firstLine="720"/>
+        <w:jc w:val="both"/>
+      </w:pPr>
+      <w:r>
+        <w:t>Este problema se manifiesta en la fragmentación de herramientas que no se comunican entre sí, obligando al usuario a actuar como intermediario manual; en la ausencia de trazabilidad de procesos; en la sobrecarga cognitiva de gestionar múltiples herramientas simultáneamente; y en la imposibilidad de escalar operaciones sin incrementar linealmente los recursos humanos.</w:t>
+      </w:r>
+    </w:p>
+    <w:p>
+      <w:pPr>
+        <w:spacing w:after="200" w:line="360" w:lineRule="auto"/>
+        <w:ind w:firstLine="720"/>
+        <w:jc w:val="both"/>
+      </w:pPr>
+      <w:r>
+        <w:t>Las soluciones tradicionales de automatización no resultan adecuadas: las plataformas RPA requieren licenciamientos costosos; las plataformas de integración en la nube presentan precios que escalan con el uso; y los desarrollos a medida exceden las posibilidades de la mayoría de los pequeños emprendedores.</w:t>
+      </w:r>
+    </w:p>
+    <w:p>
+      <w:pPr>
+        <w:spacing w:after="200" w:line="360" w:lineRule="auto"/>
+        <w:ind w:firstLine="720"/>
+        <w:jc w:val="both"/>
+      </w:pPr>
+      <w:r>
+        <w:t>La delimitación del problema circunscribe el campo de intervención: se busca explorar la viabilidad de modelos de automatización que operen en la intersección entre accesibilidad, funcionalidad y adaptabilidad, aprovechando el ecosistema de herramientas de código abierto y servicios freemium.</w:t>
+      </w:r>
+    </w:p>
+    <w:p>
+      <w:pPr>
+        <w:spacing w:after="200" w:line="360" w:lineRule="auto"/>
+        <w:ind w:firstLine="720"/>
+        <w:jc w:val="both"/>
+      </w:pPr>
+    </w:p>
+    <w:p>
+      <w:pPr>
+        <w:spacing w:after="200" w:line="360" w:lineRule="auto"/>
+        <w:ind w:firstLine="720"/>
+        <w:jc w:val="both"/>
+      </w:pPr>
+    </w:p>
+    <w:p>
+      <w:pPr>
+        <w:pStyle w:val="Ttulo2"/>
+      </w:pPr>
+      <w:r>
+        <w:t>1.3 Pregunta de investigación</w:t>
+      </w:r>
+    </w:p>
+    <w:p>
+      <w:pPr>
+        <w:spacing w:after="200" w:line="360" w:lineRule="auto"/>
+        <w:ind w:firstLine="720"/>
+        <w:jc w:val="both"/>
+      </w:pPr>
+      <w:r>
+        <w:t>La problematización desarrollada en los apartados anteriores permite formular con precisión la pregunta central que orienta esta investigación: ¿en qué medida es posible diseñar e implementar un sistema de automatización de procesos que, mediante la integración de servicios heterogéneos y de un componente de interpretación de lenguaje natural —implementado en su instancia de bajo costo mediante reglas determinísticas, con el componente adaptativo de inteligencia artificial como extensión—, permita reducir de manera sustantiva la intervención manual en tareas digitales operativas, sin requerir infraestructura tecnológica compleja ni implicar altos costos de implementación o mantenimiento?</w:t>
+      </w:r>
+    </w:p>
+    <w:p>
+      <w:pPr>
+        <w:spacing w:after="200" w:line="360" w:lineRule="auto"/>
+        <w:ind w:firstLine="720"/>
+        <w:jc w:val="both"/>
+      </w:pPr>
+      <w:r>
+        <w:t>Esta pregunta articula las tres dimensiones fundamentales del problema identificado: la posibilidad técnica de construir el sistema, las condiciones de accesibilidad que debe cumplir, y el impacto esperado en la reducción de la intervención manual. Su formulación permite orientar tanto el diseño de la investigación como la evaluación de los resultados obtenidos.</w:t>
+      </w:r>
+    </w:p>
+    <w:p>
+      <w:pPr>
+        <w:spacing w:after="200" w:line="360" w:lineRule="auto"/>
+        <w:ind w:firstLine="720"/>
+        <w:jc w:val="both"/>
+      </w:pPr>
+      <w:r>
+        <w:t>¿En qué medida un componente de interpretación de lenguaje natural —implementado mediante reglas determinísticas o mediante modelos de lenguaje disponibles a través de APIs públicas— es capaz de reconocer las intenciones del usuario en el contexto de un sistema de automatización?</w:t>
+      </w:r>
+    </w:p>
+    <w:p>
+      <w:pPr>
+        <w:pStyle w:val="Ttulo2"/>
+      </w:pPr>
+      <w:r>
+        <w:t>1.4 Hipótesis de trabajo</w:t>
+      </w:r>
+    </w:p>
+    <w:p>
+      <w:pPr>
+        <w:spacing w:after="200" w:line="360" w:lineRule="auto"/>
+        <w:ind w:firstLine="720"/>
+        <w:jc w:val="both"/>
+      </w:pPr>
+      <w:r>
+        <w:t xml:space="preserve">A partir del análisis del problema y de la revisión preliminar de la literatura especializada, se formula la siguiente hipótesis de trabajo: es técnicamente viable diseñar e implementar un sistema de automatización de procesos funcional, basado en la integración de servicios de bajo costo y en un componente de interpretación de lenguaje natural implementable mediante reglas determinísticas —alternativa que prioriza el control y el costo— o mediante modelos de inteligencia artificial disponibles </w:t>
       </w:r>
       <w:r>
         <w:lastRenderedPageBreak/>
-        <w:t>y pérdidas de información que, acumuladas en el tiempo, deterioran la calidad de la base de conocimiento sobre la cual se toman decisiones. A su vez, la ausencia de automatización implica que el volumen de trabajo crece de manera proporcional al número de clientes, pedidos o interacciones gestionadas, lo que hace prácticamente imposible escalar las operaciones sin incrementar linealmente los recursos humanos destinados a las tareas operativas.</w:t>
-      </w:r>
-    </w:p>
-    <w:p>
-      <w:pPr>
-        <w:spacing w:after="200" w:line="360" w:lineRule="auto"/>
-        <w:ind w:firstLine="720"/>
-        <w:jc w:val="both"/>
-      </w:pPr>
-      <w:r>
-        <w:t>Es en este contexto donde surge la motivación central de la presente investigación. La identificación de una necesidad real, no satisfecha por las soluciones existentes en el mercado, y la disponibilidad de un conjunto de tecnologías accesibles que, combinadas estratégicamente, podrían dar respuesta a esa necesidad, constituyen los pilares que orientan el problema de investigación y la propuesta de solución desarrollada en este trabajo.</w:t>
-      </w:r>
-    </w:p>
-    <w:p>
-      <w:pPr>
-        <w:pStyle w:val="Ttulo2"/>
-      </w:pPr>
-      <w:r>
-        <w:t>1.2 Descripción y delimitación del problema</w:t>
-      </w:r>
-    </w:p>
-    <w:p>
-      <w:pPr>
-        <w:spacing w:after="200" w:line="360" w:lineRule="auto"/>
-        <w:ind w:firstLine="720"/>
-        <w:jc w:val="both"/>
-      </w:pPr>
-      <w:r>
-        <w:t>A partir del análisis del contexto previamente expuesto, es posible identificar con mayor precisión el problema que motiva la presente investigación. La ineficiencia operativa en entornos digitales de pequeña escala no es un fenómeno nuevo, pero adquiere particular urgencia en el contexto actual, donde la aceleración de la transformación digital incrementa la brecha entre organizaciones con alta y baja capacidad de adopción tecnológica. Esta brecha no es únicamente de naturaleza económica, sino que involucra dimensiones técnicas, culturales y organizacionales que se articulan para perpetuar la dependencia de los pequeños actores respecto de los procesos manuales.</w:t>
-      </w:r>
-    </w:p>
-    <w:p>
-      <w:pPr>
-        <w:spacing w:after="200" w:line="360" w:lineRule="auto"/>
-        <w:ind w:firstLine="720"/>
-        <w:jc w:val="both"/>
-      </w:pPr>
-      <w:r>
-        <w:t>El problema central que aborda esta investigación puede ser enunciado de la siguiente manera: los entornos digitales de pequeña escala carecen de modelos de automatización accesibles, integrados y adaptables que les permitan reducir la dependencia de la intervención manual en sus procesos operativos sin requerir inversiones significativas en infraestructura tecnológica o personal técnico especializado.</w:t>
-      </w:r>
-    </w:p>
-    <w:p>
-      <w:pPr>
-        <w:spacing w:after="200" w:line="360" w:lineRule="auto"/>
-        <w:ind w:firstLine="720"/>
-        <w:jc w:val="both"/>
-      </w:pPr>
-      <w:r>
-        <w:lastRenderedPageBreak/>
-        <w:t>Este problema se manifiesta a través de una serie de síntomas observables en los contextos analizados. En primer lugar, la fragmentación de las herramientas tecnológicas utilizadas: los pequeños emprendimientos suelen operar con un conjunto heterogéneo de aplicaciones y plataformas digitales que no se comunican entre sí, lo que obliga al usuario a actuar como intermediario manual entre sistemas, duplicando el trabajo y multiplicando las posibilidades de error. En segundo lugar, la ausencia de trazabilidad de los procesos: sin sistemas de registro automatizado, resulta difícil reconstruir el historial de las operaciones realizadas, identificar cuellos de botella o evaluar la evolución de indicadores clave.</w:t>
-      </w:r>
-    </w:p>
-    <w:p>
-      <w:pPr>
-        <w:spacing w:after="200" w:line="360" w:lineRule="auto"/>
-        <w:ind w:firstLine="720"/>
-        <w:jc w:val="both"/>
-      </w:pPr>
-      <w:r>
-        <w:t>En tercer lugar, la sobrecarga cognitiva que genera la gestión simultánea de múltiples herramientas y fuentes de información constituye un factor de riesgo significativo para la calidad del trabajo y el bienestar de las personas involucradas. La necesidad de atender múltiples canales de comunicación, mantener actualizadas distintas bases de datos y generar reportes de manera manual consume energía mental que podría ser destinada a actividades estratégicas. Finalmente, la escalabilidad operativa se ve severamente comprometida: a medida que el volumen de trabajo crece, la capacidad de gestión manual alcanza sus límites, generando cuellos de botella que frenan el crecimiento de la organización.</w:t>
-      </w:r>
-    </w:p>
-    <w:p>
-      <w:pPr>
-        <w:spacing w:after="200" w:line="360" w:lineRule="auto"/>
-        <w:ind w:firstLine="720"/>
-        <w:jc w:val="both"/>
-      </w:pPr>
-      <w:r>
-        <w:t>Frente a estas manifestaciones del problema, las soluciones tradicionales de automatización no resultan adecuadas para los contextos considerados. Los sistemas de automatización robótica de procesos (RPA) disponibles en el mercado, si bien potentes, requieren licenciamientos costosos y equipos técnicos dedicados a su implementación y mantenimiento. Las plataformas de integración de aplicaciones en la nube presentan modelos de precios que escalan con el volumen de uso, lo que puede resultar accesible en las etapas iniciales pero se torna oneroso a medida que el sistema crece. Los desarrollos a medida, por su parte, implican inversiones en tiempo y recursos humanos especializados que exceden las posibilidades de la mayoría de los pequeños emprendedores.</w:t>
-      </w:r>
-    </w:p>
-    <w:p>
-      <w:pPr>
-        <w:spacing w:after="200" w:line="360" w:lineRule="auto"/>
-        <w:ind w:firstLine="720"/>
-        <w:jc w:val="both"/>
-      </w:pPr>
-      <w:r>
-        <w:t xml:space="preserve">En este sentido, la delimitación del problema permite circunscribir el campo de intervención de la presente investigación: se busca explorar la viabilidad de modelos </w:t>
-      </w:r>
-      <w:r>
-        <w:lastRenderedPageBreak/>
-        <w:t>de automatización que operen en la intersección entre accesibilidad, funcionalidad y adaptabilidad, aprovechando el ecosistema de herramientas de código abierto y servicios freemium disponibles en la actualidad.</w:t>
-      </w:r>
-    </w:p>
-    <w:p>
-      <w:pPr>
-        <w:pStyle w:val="Ttulo2"/>
-      </w:pPr>
-      <w:r>
-        <w:t>1.3 Pregunta de investigación</w:t>
-      </w:r>
-    </w:p>
-    <w:p>
-      <w:pPr>
-        <w:spacing w:after="200" w:line="360" w:lineRule="auto"/>
-        <w:ind w:firstLine="720"/>
-        <w:jc w:val="both"/>
-      </w:pPr>
-      <w:r>
-        <w:t>La problematización desarrollada en los apartados anteriores permite formular con precisión la pregunta central que orienta esta investigación: ¿en qué medida es posible diseñar e implementar un sistema de automatización de procesos que, mediante la integración de servicios heterogéneos y de un componente de interpretación de lenguaje natural —implementado en su instancia de bajo costo mediante reglas determinísticas, con el componente adaptativo de inteligencia artificial como extensión—, permita reducir de manera sustantiva la intervención manual en tareas digitales operativas, sin requerir infraestructura tecnológica compleja ni implicar altos costos de implementación o mantenimiento?</w:t>
-      </w:r>
-    </w:p>
-    <w:p>
-      <w:pPr>
-        <w:spacing w:after="200" w:line="360" w:lineRule="auto"/>
-        <w:ind w:firstLine="720"/>
-        <w:jc w:val="both"/>
-      </w:pPr>
-      <w:r>
-        <w:t>Esta pregunta articula las tres dimensiones fundamentales del problema identificado: la posibilidad técnica de construir el sistema, las condiciones de accesibilidad que debe cumplir, y el impacto esperado en la reducción de la intervención manual. Su formulación permite orientar tanto el diseño de la investigación como la evaluación de los resultados obtenidos.</w:t>
-      </w:r>
-    </w:p>
-    <w:p>
-      <w:pPr>
-        <w:spacing w:after="200" w:line="360" w:lineRule="auto"/>
-        <w:ind w:firstLine="720"/>
-        <w:jc w:val="both"/>
-      </w:pPr>
-      <w:r>
-        <w:t>¿En qué medida un componente de interpretación de lenguaje natural —implementado mediante reglas determinísticas o mediante modelos de lenguaje disponibles a través de APIs públicas— es capaz de reconocer las intenciones del usuario en el contexto de un sistema de automatización?</w:t>
-      </w:r>
-    </w:p>
-    <w:p>
-      <w:pPr>
-        <w:pStyle w:val="Ttulo2"/>
-      </w:pPr>
-      <w:r>
-        <w:t>1.4 Hipótesis de trabajo</w:t>
-      </w:r>
-    </w:p>
-    <w:p>
-      <w:pPr>
-        <w:spacing w:after="200" w:line="360" w:lineRule="auto"/>
-        <w:ind w:firstLine="720"/>
-        <w:jc w:val="both"/>
-      </w:pPr>
-      <w:r>
-        <w:t xml:space="preserve">A partir del análisis del problema y de la revisión preliminar de la literatura especializada, se formula la siguiente hipótesis de trabajo: es técnicamente viable diseñar e implementar un sistema de automatización de procesos funcional, basado en la integración de servicios de bajo costo y en un componente de interpretación de lenguaje natural implementable mediante reglas determinísticas —alternativa que </w:t>
-      </w:r>
-      <w:r>
-        <w:lastRenderedPageBreak/>
-        <w:t>prioriza el control y el costo— o mediante modelos de inteligencia artificial disponibles a través de APIs públicas —alternativa que prioriza la capacidad—, que permita ejecutar de manera autónoma ciclos completos de automatización en entornos digitales de pequeña escala, con niveles aceptables de rendimiento, precisión y estabilidad.</w:t>
+        <w:t>a través de APIs públicas —alternativa que prioriza la capacidad—, que permita ejecutar de manera autónoma ciclos completos de automatización en entornos digitales de pequeña escala, con niveles aceptables de rendimiento, precisión y estabilidad.</w:t>
       </w:r>
     </w:p>
     <w:p>
@@ -2861,27 +2843,57 @@
         <w:jc w:val="both"/>
       </w:pPr>
       <w:r>
-        <w:t>La automatización de procesos constituye un campo de estudio consolidado dentro de la ingeniería de software, la gestión organizacional y la informática aplicada, cuya evolución histórica ha estado marcada por el desarrollo de tecnologías orientadas a la optimización de tareas y la reducción progresiva de la intervención humana en la ejecución de procesos repetitivos y estructurados. Comprender esta evolución resulta fundamental para contextualizar adecuadamente las decisiones de diseño adoptadas en la presente investigación y para situar el modelo propuesto en relación con el estado del arte del campo.</w:t>
-      </w:r>
-    </w:p>
-    <w:p>
-      <w:pPr>
-        <w:spacing w:after="200" w:line="360" w:lineRule="auto"/>
-        <w:ind w:firstLine="720"/>
-        <w:jc w:val="both"/>
-      </w:pPr>
-      <w:r>
-        <w:t>En sus orígenes, la automatización de procesos en el ámbito informático estuvo asociada a la ejecución de scripts y programas por lotes, mecanismos que permitían ejecutar secuencias predefinidas de instrucciones sin intervención del operador. Estos primeros sistemas de automatización se caracterizaban por su rigidez estructural: operaban bajo esquemas estrictamente determinísticos, en los cuales cada acción estaba definida explícitamente con anterioridad y el sistema no tenía capacidad de adaptarse a variaciones en el entorno o en los datos de entrada. Esta rigidez limitaba enormemente el alcance de la automatización, restringiéndola a procesos altamente estructurados y predecibles.</w:t>
-      </w:r>
-    </w:p>
-    <w:p>
-      <w:pPr>
-        <w:spacing w:after="200" w:line="360" w:lineRule="auto"/>
-        <w:ind w:firstLine="720"/>
-        <w:jc w:val="both"/>
-      </w:pPr>
-      <w:r>
-        <w:t>Con el desarrollo de los sistemas de gestión de bases de datos, los lenguajes de consulta estructurada y los primeros sistemas de gestión empresarial integrados, la automatización comenzó a extenderse hacia el ámbito de la gestión de información. Los sistemas ERP (Enterprise Resource Planning) y CRM (Customer Relationship Management) que proliferaron durante las décadas de 1980 y 1990 incorporaron mecanismos de automatización de flujos de trabajo que permitían gestionar procesos de negocio (Weske, 2012) de mayor complejidad. Sin embargo, estos sistemas continuaban siendo esencialmente determinísticos y requerían una parametrización exhaustiva para cada escenario de uso previsto.</w:t>
+        <w:t>La automatización de procesos, campo consolidado en la ingeniería de software y la gestión organizacional, ha evolucionado desde scripts por lotes hasta sistemas basados en inteligencia artificial.</w:t>
+      </w:r>
+    </w:p>
+    <w:p>
+      <w:pPr>
+        <w:spacing w:after="200" w:line="360" w:lineRule="auto"/>
+        <w:ind w:firstLine="720"/>
+        <w:jc w:val="both"/>
+      </w:pPr>
+      <w:r>
+        <w:t>Los primeros sistemas de automatización operaban bajo esquemas estrictamente determinísticos —scripts y programas por lotes—, limitados a procesos altamente estructurados y predecibles.</w:t>
+      </w:r>
+    </w:p>
+    <w:p>
+      <w:pPr>
+        <w:spacing w:after="200" w:line="360" w:lineRule="auto"/>
+        <w:ind w:firstLine="720"/>
+        <w:jc w:val="both"/>
+      </w:pPr>
+      <w:r>
+        <w:t>Los sistemas ERP y CRM de las décadas de 1980 y 1990 incorporaron mecanismos de automatización de flujos de trabajo de mayor complejidad (Weske, 2012), pero continuaban siendo esencialmente determinísticos y requerían parametrización exhaustiva.</w:t>
+      </w:r>
+    </w:p>
+    <w:p>
+      <w:pPr>
+        <w:spacing w:after="200" w:line="360" w:lineRule="auto"/>
+        <w:ind w:firstLine="720"/>
+        <w:jc w:val="both"/>
+      </w:pPr>
+      <w:r>
+        <w:t>Las arquitecturas orientadas a servicios (SOA) marcaron un punto de inflexión al permitir construir sistemas de automatización más flexibles mediante la descomposición en servicios modulares que se comunican mediante protocolos estandarizados, facilitando la reutilización y la escalabilidad.</w:t>
+      </w:r>
+    </w:p>
+    <w:p>
+      <w:pPr>
+        <w:spacing w:after="200" w:line="360" w:lineRule="auto"/>
+        <w:ind w:firstLine="720"/>
+        <w:jc w:val="both"/>
+      </w:pPr>
+      <w:r>
+        <w:t>El auge de las APIs web y los servicios en la nube democratizó el acceso a capacidades tecnológicas avanzadas, permitiendo a organizaciones de cualquier tamaño integrar funcionalidades de terceros sin necesidad de desarrollarlas desde cero.</w:t>
+      </w:r>
+    </w:p>
+    <w:p>
+      <w:pPr>
+        <w:spacing w:after="200" w:line="360" w:lineRule="auto"/>
+        <w:ind w:firstLine="720"/>
+        <w:jc w:val="both"/>
+      </w:pPr>
+      <w:r>
+        <w:t>La Automatización Robótica de Procesos (RPA) experimentó un auge significativo (Lacity y Willcocks, 2016), ofreciendo automatización de tareas sobre interfaces gráficas. Sin embargo, las plataformas RPA son costosas, requieren mantenimiento continuo y no incorporan capacidades de razonamiento o adaptación semántica.</w:t>
       </w:r>
     </w:p>
     <w:p>
@@ -2892,41 +2904,7 @@
       </w:pPr>
       <w:r>
         <w:lastRenderedPageBreak/>
-        <w:t>La aparición de las arquitecturas orientadas a servicios (SOA) a comienzos del siglo XXI marcó un punto de inflexión significativo en la evolución de la automatización. Este paradigma, basado en la descomposición de los sistemas en servicios modulares que se comunican mediante protocolos estandarizados, abrió la posibilidad de construir sistemas de automatización más flexibles y adaptables, capaces de integrar componentes heterogéneos y evolucionar de manera incremental. La modularidad resultante no solo facilitó el mantenimiento y la escalabilidad de los sistemas, sino que también redujo la complejidad de su diseño al permitir la reutilización de servicios ya existentes.</w:t>
-      </w:r>
-    </w:p>
-    <w:p>
-      <w:pPr>
-        <w:spacing w:after="200" w:line="360" w:lineRule="auto"/>
-        <w:ind w:firstLine="720"/>
-        <w:jc w:val="both"/>
-      </w:pPr>
-      <w:r>
-        <w:t>Posteriormente, el auge de las APIs web y los servicios en la nube transformó radicalmente el ecosistema de herramientas disponibles para la construcción de sistemas automatizados. La posibilidad de integrar funcionalidades de terceros mediante interfaces de programación estandarizadas —como las APIs REST basadas en el protocolo HTTP— permitió que organizaciones de cualquier tamaño accedieran a capacidades tecnológicas avanzadas sin necesidad de desarrollarlas desde cero. Este cambio de paradigma democratizó, al menos parcialmente, el acceso a tecnologías que anteriormente estaban reservadas a actores con grandes capacidades de inversión.</w:t>
-      </w:r>
-    </w:p>
-    <w:p>
-      <w:pPr>
-        <w:spacing w:after="200" w:line="360" w:lineRule="auto"/>
-        <w:ind w:firstLine="720"/>
-        <w:jc w:val="both"/>
-      </w:pPr>
-      <w:r>
-        <w:t>En paralelo, el campo de la Automatización Robótica de Procesos (RPA, por sus siglas en inglés) experimentó un auge significativo durante la segunda década del siglo XXI (Lacity y Willcocks, 2016). Las plataformas RPA ofrecen la posibilidad de automatizar tareas que implican la interacción con interfaces gráficas de usuario, imitando el comportamiento humano al operar sobre aplicaciones de escritorio o web. Si bien estas herramientas resultan poderosas en determinados contextos, presentan limitaciones significativas: son generalmente costosas, requieren mantenimiento continuo cuando las interfaces de las aplicaciones cambian y no incorporan capacidades de razonamiento o adaptación semántica.</w:t>
-      </w:r>
-    </w:p>
-    <w:p>
-      <w:pPr>
-        <w:spacing w:after="200" w:line="360" w:lineRule="auto"/>
-        <w:ind w:firstLine="720"/>
-        <w:jc w:val="both"/>
-      </w:pPr>
-      <w:r>
-        <w:t xml:space="preserve">El advenimiento de la inteligencia artificial, y en particular del aprendizaje profundo (Goodfellow et al., 2016) y los modelos de lenguaje de gran escala (Vaswani et al., 2017), introdujo una nueva dimensión en el campo de la automatización. Por </w:t>
-      </w:r>
-      <w:r>
-        <w:lastRenderedPageBreak/>
-        <w:t>primera vez, los sistemas computacionales adquirieron capacidades de comprensión y generación de lenguaje natural que les permitían interactuar con los usuarios de manera más flexible y menos estructurada. Esta evolución no solo amplió el alcance de la automatización hacia tareas que anteriormente requerían razonamiento humano, sino que también transformó la naturaleza misma de la interacción entre personas y sistemas automatizados.</w:t>
+        <w:t>El advenimiento del aprendizaje profundo (Goodfellow et al., 2016) y los modelos de lenguaje de gran escala (Vaswani et al., 2017) introdujo capacidades de comprensión y generación de lenguaje natural, ampliando la automatización hacia tareas que requerían razonamiento humano y transformando la interacción entre personas y sistemas.</w:t>
       </w:r>
     </w:p>
     <w:p>
@@ -3014,79 +2992,75 @@
         <w:jc w:val="both"/>
       </w:pPr>
       <w:r>
-        <w:t>Desde los trabajos pioneros de Minsky (1967) sobre redes neuronales y representaciones de conocimiento, la inteligencia artificial, entendida en su sentido más amplio como el conjunto de técnicas computacionales orientadas a la realización de tareas que requieren formas de razonamiento o juicio que históricamente han sido consideradas exclusivas de la inteligencia humana (Russell y Norvig, 2021), ha atravesado múltiples ciclos de desarrollo, cada uno caracterizado por paradigmas dominantes, expectativas desproporcionadas y períodos de desencanto seguidos de reavivamientos. La etapa actual, marcada por el predominio de los modelos de aprendizaje profundo y, más recientemente, por los modelos de lenguaje de gran escala, representa el ciclo de mayor impacto práctico en la historia del campo.</w:t>
-      </w:r>
-    </w:p>
-    <w:p>
-      <w:pPr>
-        <w:spacing w:after="200" w:line="360" w:lineRule="auto"/>
-        <w:ind w:firstLine="720"/>
-        <w:jc w:val="both"/>
-      </w:pPr>
-      <w:r>
-        <w:t>El procesamiento de lenguaje natural (PLN) constituye la subdisciplina de la inteligencia artificial dedicada al estudio y desarrollo de métodos computacionales capaces de comprender, interpretar y generar texto en lenguaje humano (Devlin et al., 2019). Sus aplicaciones son múltiples y abarcan desde la clasificación de documentos y el análisis de sentimientos hasta la traducción automática, el resumen de textos y la generación de respuestas en sistemas conversacionales (Calvaresi et al., 2023; Kusal et al., 2022). En el contexto de los sistemas de automatización, el PLN introduce la posibilidad de que los usuarios interactúen con el sistema mediante lenguaje natural, eliminando la necesidad de que conozcan comandos específicos o interfaces estructuradas.</w:t>
-      </w:r>
-    </w:p>
-    <w:p>
-      <w:pPr>
-        <w:spacing w:after="200" w:line="360" w:lineRule="auto"/>
-        <w:ind w:firstLine="720"/>
-        <w:jc w:val="both"/>
-      </w:pPr>
-      <w:r>
-        <w:t xml:space="preserve">Los modelos de lenguaje de gran escala (LLM, por sus siglas en inglés) representan el estado del arte actual en el procesamiento de lenguaje natural. Estos modelos, entrenados sobre corpus de texto de dimensiones sin precedentes mediante técnicas de aprendizaje profundo, son capaces de generar texto de alta calidad, responder preguntas, completar instrucciones, traducir entre idiomas y realizar una amplia variedad de tareas relacionadas con el lenguaje. Su arquitectura, basada en el mecanismo de atención y la estructura Transformer introducida por Vaswani y colaboradores en 2017 (Vaswani et al., 2017), les permite capturar dependencias de largo alcance en el texto y generar respuestas contextualmente </w:t>
-      </w:r>
+        <w:t>La inteligencia artificial, entendida como el conjunto de técnicas computacionales orientadas a tareas que requieren razonamiento o juicio humano (Russell y Norvig, 2021), ha atravesado múltiples ciclos de desarrollo. La etapa actual, marcada por los modelos de lenguaje de gran escala, representa el ciclo de mayor impacto práctico.</w:t>
+      </w:r>
+    </w:p>
+    <w:p>
+      <w:pPr>
+        <w:spacing w:after="200" w:line="360" w:lineRule="auto"/>
+        <w:ind w:firstLine="720"/>
+        <w:jc w:val="both"/>
+      </w:pPr>
+      <w:r>
+        <w:t>El procesamiento de lenguaje natural (PLN) constituye la subdisciplina dedicada a métodos computacionales capaces de comprender, interpretar y generar texto humano (Devlin et al., 2019). En sistemas de automatización, el PLN permite que los usuarios interactúen con el sistema mediante lenguaje natural, eliminando la necesidad de comandos específicos o interfaces estructuradas.</w:t>
+      </w:r>
+    </w:p>
+    <w:p>
+      <w:pPr>
+        <w:spacing w:after="200" w:line="360" w:lineRule="auto"/>
+        <w:ind w:firstLine="720"/>
+        <w:jc w:val="both"/>
+      </w:pPr>
+      <w:r>
+        <w:t>Los modelos de lenguaje de gran escala (LLM) representan el estado del arte en PLN. Entrenados sobre corpus de dimensiones sin precedentes, generan texto de alta calidad, responden preguntas y realizan traducciones. Su arquitectura Transformer (Vaswani et al., 2017) captura dependencias de largo alcance en el texto.</w:t>
+      </w:r>
+    </w:p>
+    <w:p>
+      <w:pPr>
+        <w:spacing w:after="200" w:line="360" w:lineRule="auto"/>
+        <w:ind w:firstLine="720"/>
+        <w:jc w:val="both"/>
+      </w:pPr>
+      <w:r>
+        <w:t>La disponibilidad de estos modelos a través de APIs públicas ha democratizado significativamente el acceso a capacidades de PLN (OpenAI, 2023; Davenport y Ronanki, 2018). Lo que antes requería equipos de investigación especializados puede hoy integrarse mediante unas pocas líneas de código, pagando por uso.</w:t>
+      </w:r>
+    </w:p>
+    <w:p>
+      <w:pPr>
+        <w:spacing w:after="200" w:line="360" w:lineRule="auto"/>
+        <w:ind w:firstLine="720"/>
+        <w:jc w:val="both"/>
+      </w:pPr>
+      <w:r>
+        <w:t>No obstante, la incorporación de LLM introduce desafíos: su naturaleza probabilística implica respuestas no determinísticas; son susceptibles de generar información incorrecta con aparente seguridad (alucinación); y requieren diseño cuidadoso de prompts y mecanismos de verificación.</w:t>
+      </w:r>
+    </w:p>
+    <w:p>
+      <w:pPr>
+        <w:spacing w:after="200" w:line="360" w:lineRule="auto"/>
+        <w:ind w:firstLine="720"/>
+        <w:jc w:val="both"/>
+      </w:pPr>
+      <w:r>
+        <w:t>Además, la dependencia de una API externa introduce un punto de fallo no controlado por el desarrollador, requiriendo mecanismos de manejo de errores y estrategias de degradación graceful.</w:t>
+      </w:r>
+    </w:p>
+    <w:p>
+      <w:pPr>
+        <w:pStyle w:val="Ttulo2"/>
+      </w:pPr>
+      <w:r>
+        <w:t>2.4 Sistemas orientados a eventos</w:t>
+      </w:r>
+    </w:p>
+    <w:p>
+      <w:pPr>
+        <w:spacing w:after="200" w:line="360" w:lineRule="auto"/>
+        <w:ind w:firstLine="720"/>
+        <w:jc w:val="both"/>
+      </w:pPr>
       <w:r>
         <w:lastRenderedPageBreak/>
-        <w:t>coherentes, un aspecto analizado recientemente por He y colaboradores (He et al., 2024).</w:t>
-      </w:r>
-    </w:p>
-    <w:p>
-      <w:pPr>
-        <w:spacing w:after="200" w:line="360" w:lineRule="auto"/>
-        <w:ind w:firstLine="720"/>
-        <w:jc w:val="both"/>
-      </w:pPr>
-      <w:r>
-        <w:t>La disponibilidad de estos modelos a través de APIs públicas ha transformado radicalmente el ecosistema de desarrollo de aplicaciones con capacidades de inteligencia artificial (OpenAI, 2023). Lo que anteriormente requería equipos de investigación especializados y recursos computacionales de gran escala puede hoy ser integrado en aplicaciones mediante unas pocas líneas de código, pagando únicamente por el volumen de uso. Este cambio ha democratizado significativamente el acceso a las capacidades de procesamiento (Davenport y Ronanki, 2018) de lenguaje natural, haciéndolas accesibles para desarrolladores individuales y organizaciones con recursos limitados.</w:t>
-      </w:r>
-    </w:p>
-    <w:p>
-      <w:pPr>
-        <w:spacing w:after="200" w:line="360" w:lineRule="auto"/>
-        <w:ind w:firstLine="720"/>
-        <w:jc w:val="both"/>
-      </w:pPr>
-      <w:r>
-        <w:t>No obstante, la incorporación de modelos de lenguaje en sistemas de automatización introduce una serie de desafíos que merecen atención. En primer lugar, la naturaleza probabilística de estos modelos implica que sus respuestas no son determinísticas: ante una misma entrada, el modelo puede generar respuestas distintas en diferentes ejecuciones. Esta variabilidad, inherente al paradigma de aprendizaje profundo, contrasta con el comportamiento determinístico que caracteriza a los sistemas tradicionales de automatización y obliga a diseñar mecanismos de validación y control que mitiguen sus efectos. En segundo lugar, los modelos de lenguaje son susceptibles de generar información incorrecta con aparente seguridad, fenómeno conocido como alucinación, lo que requiere un diseño cuidadoso de los prompts y de los mecanismos de verificación de las respuestas.</w:t>
-      </w:r>
-    </w:p>
-    <w:p>
-      <w:pPr>
-        <w:spacing w:after="200" w:line="360" w:lineRule="auto"/>
-        <w:ind w:firstLine="720"/>
-        <w:jc w:val="both"/>
-      </w:pPr>
-      <w:r>
-        <w:t>En tercer lugar, la dependencia de una API externa para el procesamiento de lenguaje natural introduce un punto de fallo en el sistema que no puede ser completamente controlado por el desarrollador. La disponibilidad, la latencia y el costo de este servicio son variables que el sistema debe gestionar de manera robusta, implementando mecanismos de manejo de errores y estrategias de degradación graceful para los casos en que el servicio no esté disponible o responda con tiempos de latencia inaceptables.</w:t>
-      </w:r>
-    </w:p>
-    <w:p>
-      <w:pPr>
-        <w:pStyle w:val="Ttulo2"/>
-      </w:pPr>
-      <w:r>
-        <w:lastRenderedPageBreak/>
-        <w:t>2.4 Sistemas orientados a eventos</w:t>
-      </w:r>
-    </w:p>
-    <w:p>
-      <w:pPr>
-        <w:spacing w:after="200" w:line="360" w:lineRule="auto"/>
-        <w:ind w:firstLine="720"/>
-        <w:jc w:val="both"/>
-      </w:pPr>
-      <w:r>
         <w:t>La arquitectura orientada a eventos (EDA, por sus siglas en inglés) constituye un paradigma de diseño de sistemas en el cual el flujo de la ejecución está determinado por la ocurrencia de eventos, en lugar de seguir una secuencia predefinida y lineal de instrucciones. En este modelo, los componentes del sistema se comunican mediante la emisión y la recepción de mensajes que representan hechos ocurridos en el dominio del problema, sin que exista necesariamente un acoplamiento directo entre quien emite el evento y quien lo recibe y procesa (Kleppmann, 2017).</w:t>
       </w:r>
     </w:p>
@@ -4904,55 +4878,48 @@
         <w:jc w:val="both"/>
       </w:pPr>
       <w:r>
-        <w:t>El componente de procesamiento de solicitudes introduce en el sistema la capacidad de interpretar los mensajes del usuario y traducirlos en acciones concretas dentro de los flujos de automatización definidos. En su instanciación actual, este componente se implementa mediante un conjunto de reglas determinísticas de normalización y clasificación de texto, que materializan la versión determinística del componente adaptativo previsto en el modelo conceptual. La elección de esta estrategia, que materializa el patrón de diseño homónimo (Gamma et al., 1994), responde a los principios de bajo costo y control que orientan el diseño: al operar con reglas explícitas, el comportamiento del componente es totalmente predecible, verificable y libre de los costos de latencia asociados a la invocación de servicios externos.</w:t>
-      </w:r>
-    </w:p>
-    <w:p>
-      <w:pPr>
-        <w:spacing w:after="200" w:line="360" w:lineRule="auto"/>
-        <w:ind w:firstLine="720"/>
-        <w:jc w:val="both"/>
-      </w:pPr>
-      <w:r>
-        <w:t xml:space="preserve">La función central del componente es la identificación de la intención del usuario a partir de su mensaje. El reconocimiento se realiza mediante la normalización del texto (conversión a minúsculas, eliminación de espacios superfluos) y su comparación contra un catálogo de intenciones predefinidas, que </w:t>
+        <w:t>El componente de procesamiento de solicitudes interpreta los mensajes del usuario y los traduce en acciones concretas dentro de los flujos de automatización. Se implementa mediante reglas determinísticas de normalización y clasificación de texto, que materializan la versión determinística del componente adaptativo previsto en el modelo conceptual. Al operar con reglas explícitas, el comportamiento es predecible, verificable y libre de costos de latencia.</w:t>
+      </w:r>
+    </w:p>
+    <w:p>
+      <w:pPr>
+        <w:spacing w:after="200" w:line="360" w:lineRule="auto"/>
+        <w:ind w:firstLine="720"/>
+        <w:jc w:val="both"/>
+      </w:pPr>
+      <w:r>
+        <w:t>La función central es la identificación de la intención del usuario mediante normalización del texto y comparación contra un catálogo de intenciones predefinidas que incluye sinónimos y variantes de cada comando. El componente gestiona además el estado de la conversación (modo actual y contenido del carrito simulado) mediante almacenamiento persistente en la plataforma de orquestación.</w:t>
+      </w:r>
+    </w:p>
+    <w:p>
+      <w:pPr>
+        <w:spacing w:after="200" w:line="360" w:lineRule="auto"/>
+        <w:ind w:firstLine="720"/>
+        <w:jc w:val="both"/>
+      </w:pPr>
+    </w:p>
+    <w:p>
+      <w:pPr>
+        <w:spacing w:after="200" w:line="360" w:lineRule="auto"/>
+        <w:ind w:firstLine="720"/>
+        <w:jc w:val="both"/>
+      </w:pPr>
+      <w:r>
+        <w:t xml:space="preserve">La extracción de datos se realiza mediante parseo estructurado de la entrada numérica, con validación de rango y existencia del producto seleccionado. La </w:t>
       </w:r>
       <w:r>
         <w:lastRenderedPageBreak/>
-        <w:t>incluye sinónimos y variantes de cada comando (por ejemplo, las expresiones «comprar», «catálogo», «producto», «ver», «precio», «asesor», «consulta», «carrito», «finalizar» y «terminar», además de la selección numérica directa de las opciones del menú). Este mecanismo garantiza un comportamiento determinístico y permite verificar con precisión la tasa de interpretación correcta de cada escenario.</w:t>
-      </w:r>
-    </w:p>
-    <w:p>
-      <w:pPr>
-        <w:spacing w:after="200" w:line="360" w:lineRule="auto"/>
-        <w:ind w:firstLine="720"/>
-        <w:jc w:val="both"/>
-      </w:pPr>
-      <w:r>
-        <w:t>El componente gestiona además el estado de la conversación, manteniendo para cada usuario el modo de interacción actual (menú principal, catálogo, espera de cantidad) y el contenido del carrito simulado. Esta gestión de contexto se implementa mediante el almacenamiento persistente del estado en la plataforma de orquestación, lo que permite mantener la coherencia de las interacciones a lo largo de sesiones de múltiples mensajes sin requerir el envío del historial completo a un servicio externo.</w:t>
-      </w:r>
-    </w:p>
-    <w:p>
-      <w:pPr>
-        <w:spacing w:after="200" w:line="360" w:lineRule="auto"/>
-        <w:ind w:firstLine="720"/>
-        <w:jc w:val="both"/>
-      </w:pPr>
-      <w:r>
-        <w:t>La extracción de datos relevantes para la ejecución de los flujos se realiza mediante el parseo estructurado de la entrada numérica, con validación de rango y de existencia del producto seleccionado. Cuando el usuario indica una cantidad, el componente valida que se trate de un número positivo antes de incorporar el ítem al carrito, y ante entradas inválidas genera un mensaje de error que orienta al usuario. Esta lógica de validación elimina la ambigüedad inherente a la interpretación probabilística y asegura que las operaciones ejecutadas sobre el carrito respondan siempre a datos consistentes.</w:t>
-      </w:r>
-    </w:p>
-    <w:p>
-      <w:pPr>
-        <w:spacing w:after="200" w:line="360" w:lineRule="auto"/>
-        <w:ind w:firstLine="720"/>
-        <w:jc w:val="both"/>
-      </w:pPr>
-      <w:r>
-        <w:t xml:space="preserve">Finalmente, la generación de respuestas se realiza mediante plantillas parametrizadas que incorporan los datos del estado de la conversación: nombre del producto, cantidad, precio unitario y total del carrito. Este mecanismo garantiza respuestas coherentes y verificables en todos los escenarios, a la vez que permite calcular de manera exacta los totales de las operaciones simuladas. El diseño deja definida la interfaz para incorporar un modelo de lenguaje de gran escala como componente adaptativo, manteniendo la estructura del flujo sin modificaciones sustanciales. Esta incorporación no se descarta: por el contrario, constituye una línea de trabajo en curso, en la que se está avanzando en la integración de un agente conversacional basado en modelos de lenguaje que complemente el clasificador </w:t>
-      </w:r>
-      <w:r>
-        <w:lastRenderedPageBreak/>
-        <w:t>determinístico, ampliando la cobertura de la interpretación de mensajes sin renunciar al control del comportamiento del sistema.</w:t>
+        <w:t>generación de respuestas utiliza plantillas parametrizadas con datos del estado de la conversación, garantizando respuestas coherentes y verificables.</w:t>
+      </w:r>
+    </w:p>
+    <w:p>
+      <w:pPr>
+        <w:spacing w:after="200" w:line="360" w:lineRule="auto"/>
+        <w:ind w:firstLine="720"/>
+        <w:jc w:val="both"/>
+      </w:pPr>
+      <w:r>
+        <w:t>El diseño deja definida la interfaz para incorporar un modelo de lenguaje de gran escala como componente adaptativo, constituyendo una línea de trabajo en curso.</w:t>
       </w:r>
     </w:p>
     <w:p>
@@ -5646,56 +5613,49 @@
         <w:jc w:val="both"/>
       </w:pPr>
       <w:r>
-        <w:t>La implementación del prototipo constituye la concreción técnica del modelo conceptual y arquitectónico diseñado en las etapas anteriores. Este proceso implica la traducción de las decisiones de diseño en código funcional, la configuración de los servicios externos seleccionados y la puesta en funcionamiento del sistema en un entorno de prueba. La descripción de este proceso se orienta a documentar las decisiones más relevantes y las dificultades encontradas durante el desarrollo, de manera que la implementación pueda ser auditada y reproducida por terceros.</w:t>
-      </w:r>
-    </w:p>
-    <w:p>
-      <w:pPr>
-        <w:spacing w:after="200" w:line="360" w:lineRule="auto"/>
-        <w:ind w:firstLine="720"/>
-        <w:jc w:val="both"/>
-      </w:pPr>
-      <w:r>
-        <w:t xml:space="preserve">La herramienta de orquestación seleccionada para la implementación de los flujos de automatización es n8n, una plataforma de código abierto que permite construir flujos de trabajo mediante una interfaz visual basada en nodos. El flujo principal del sistema se compone de los siguientes nodos: un disparador de Telegram que recibe los mensajes entrantes, un nodo de edición de campos que normaliza y </w:t>
+        <w:t>La implementación del prototipo concreta el modelo conceptual y arquitectónico en código funcional. La herramienta de orquestación es n8n, cuyo flujo principal integra un disparador de Telegram, un nodo de normalización, ramas de persistencia hacia la API REST propia y Google Sheets, un nodo de lógica (Bot Router) para el enrutamiento determinístico de intenciones, y un nodo de envío de respuestas.</w:t>
+      </w:r>
+    </w:p>
+    <w:p>
+      <w:pPr>
+        <w:spacing w:after="200" w:line="360" w:lineRule="auto"/>
+        <w:ind w:firstLine="720"/>
+        <w:jc w:val="both"/>
+      </w:pPr>
+      <w:r>
+        <w:t>El backend se desarrolló con FastAPI (Python) y la persistencia se implementó sobre SQLite mediante una estructura de capas que separa rutas, servicios, repositorios y modelos. La API expone operaciones CRUD para clientes, productos e interacciones, así como endpoints de métricas.</w:t>
+      </w:r>
+    </w:p>
+    <w:p>
+      <w:pPr>
+        <w:spacing w:after="200" w:line="360" w:lineRule="auto"/>
+        <w:ind w:firstLine="720"/>
+        <w:jc w:val="both"/>
+      </w:pPr>
+      <w:r>
+        <w:t xml:space="preserve">Los principales desafíos durante la implementación incluyeron la gestión del estado de conversación por usuario a lo largo de múltiples mensajes, la validación de </w:t>
       </w:r>
       <w:r>
         <w:lastRenderedPageBreak/>
-        <w:t>extrae los datos del mensaje, dos ramas paralelas de persistencia —una hacia una API REST propia y otra hacia una planilla de Google Sheets como respaldo—, un nodo de lógica (Bot Router) que implementa el enrutamiento determinístico de las intenciones, y un nodo de envío de respuestas por Telegram. La obtención del catálogo de productos se realiza mediante una solicitud HTTP al backend propio, que expone los productos activos.</w:t>
-      </w:r>
-    </w:p>
-    <w:p>
-      <w:pPr>
-        <w:spacing w:after="200" w:line="360" w:lineRule="auto"/>
-        <w:ind w:firstLine="720"/>
-        <w:jc w:val="both"/>
-      </w:pPr>
-      <w:r>
-        <w:t>El componente de procesamiento de solicitudes se implementa mediante un nodo de código (Function) en n8n que contiene la lógica determinística de normalización, clasificación de intenciones, gestión del estado de la conversación y generación de respuestas, descrita en la sección 4.5. El backend que expone la API REST se desarrolló con FastAPI (Python), y la persistencia se implementó sobre un motor de base de datos relacional ligero (SQLite), mediante una estructura de capas que separa rutas, servicios, repositorios y modelos. La API expone operaciones CRUD para clientes, productos e interacciones, así como endpoints de métricas para el tablero de gestión.</w:t>
-      </w:r>
-    </w:p>
-    <w:p>
-      <w:pPr>
-        <w:spacing w:after="200" w:line="360" w:lineRule="auto"/>
-        <w:ind w:firstLine="720"/>
-        <w:jc w:val="both"/>
-      </w:pPr>
-      <w:r>
-        <w:t>La implementación del sistema revela una serie de desafíos que no habían sido completamente anticipados en la etapa de diseño. La gestión del estado de la conversación resultó más compleja de lo previsto, ya que requiere mantener el modo de interacción y el carrito por usuario a lo largo de múltiples mensajes, y recuperar ese estado de manera consistente en cada ejecución del flujo. La validación de las entradas numéricas (selección de producto, cantidad) requirió el diseño de rutinas de verificación que eviten estados inconsistentes del carrito. Asimismo, la coordinación entre el nodo de enrutamiento y las ramas de persistencia exigió definir con precisión los formatos de datos intercambiados, en un proceso de refinamiento iterativo del diseño del código (Fowler, 2018).</w:t>
-      </w:r>
-    </w:p>
-    <w:p>
-      <w:pPr>
-        <w:spacing w:after="200" w:line="360" w:lineRule="auto"/>
-        <w:ind w:firstLine="720"/>
-        <w:jc w:val="both"/>
-      </w:pPr>
-      <w:r>
-        <w:t xml:space="preserve">A pesar de estos desafíos, el proceso de implementación culmina con la obtención de un prototipo funcional que ejecuta de manera autónoma los flujos de automatización predefinidos, interpreta las solicitudes de los usuarios mediante reglas determinísticas, gestiona un carrito de compras simulado y persiste la información relevante en la API propia. El sistema se complementa con un frontend </w:t>
-      </w:r>
-      <w:r>
-        <w:lastRenderedPageBreak/>
-        <w:t>web de gestión (React) y un tablero de análisis (Streamlit) que consumen los mismos datos expuestos por la API. Este resultado constituye la base sobre la cual se realiza la evaluación de resultados presentada en el capítulo siguiente.</w:t>
-      </w:r>
+        <w:t>entradas numéricas para evitar estados inconsistentes del carrito, y la coordinación entre el nodo de enrutamiento y las ramas de persistencia (Fowler, 2018).</w:t>
+      </w:r>
+    </w:p>
+    <w:p>
+      <w:pPr>
+        <w:spacing w:after="200" w:line="360" w:lineRule="auto"/>
+        <w:ind w:firstLine="720"/>
+        <w:jc w:val="both"/>
+      </w:pPr>
+      <w:r>
+        <w:t>El prototipo funcional resultante ejecuta flujos de automatización predefinidos, interpreta solicitudes mediante reglas determinísticas y se complementa con un frontend de gestión (React) y un tablero de análisis (Streamlit).</w:t>
+      </w:r>
+    </w:p>
+    <w:p>
+      <w:pPr>
+        <w:spacing w:after="200" w:line="360" w:lineRule="auto"/>
+        <w:ind w:firstLine="720"/>
+        <w:jc w:val="both"/>
+      </w:pPr>
     </w:p>
     <w:p>
       <w:pPr>
@@ -6530,7 +6490,7 @@
     </w:p>
     <w:p>
       <w:r>
-        <w:t>Los coeficientes de variación (CV) calculados a partir de las desviaciones estándar y las medias de cada endpoint confirman la consistencia de los tiempos de respuesta. El endpoint GET /api/v1/clients/{id} presenta un CV del 143,48%, elevado por una media muy baja (2,76 ms) que amplifica la variación relativa; sin embargo, en términos absolutos la dispersión es despreciable (desviación estándar de 3,96 ms). Los endpoints GET /api/v1/products/ y GET /api/v1/clients/ muestran CV del 97,67% y 216,48% respectivamente, también influidos por medias pequeñas. Los endpoints de mayor complejidad —GET /api/v1/metrics/dashboard (CV del 77,30%) y POST /api/v1/interactions/ (CV del 80,71%)— mantienen dispersiones proporcionales a su mayor tiempo promedio. Los intervalos de confianza al 95% para la media, calculados como x̄ ± 1,96·(s/√n), arrojan los siguientes rangos: 1,36–4,16 ms para detalle de cliente, 3,06–6,38 ms para catálogo, 1,24–9,44 ms para listado, 9,96–17,78 ms para dashboard y 9,87–18,01 ms para registro de interacción. En todos los casos, los límites superiores de estos intervalos se mantienen significativamente por debajo del umbral de 100 ms establecido como referencia perceptual en la literatura de experiencia de usuario (Nielsen, 1993), lo que permite afirmar con un 95% de confianza que los tiempos de respuesta del sistema son percibidos como inmediatos por el usuario final.</w:t>
+        <w:t>Los coeficientes de variación (CV) confirman la consistencia: los endpoints de lectura simple muestran CV elevados por medias pequeñas, pero la dispersión absoluta es despreciable. Los endpoints de mayor complejidad mantienen dispersiones proporcionales a su mayor tiempo promedio. Los intervalos de confianza al 95% para todos los endpoints se mantienen significativamente por debajo del umbral de 100 ms (Nielsen, 1993), permitiendo afirmar con un 95% de confianza que los tiempos de respuesta son percibidos como inmediatos.</w:t>
       </w:r>
     </w:p>
     <w:p>
@@ -6823,7 +6783,6 @@
               <w:rPr>
                 <w:sz w:val="18"/>
               </w:rPr>
-              <w:lastRenderedPageBreak/>
               <w:t>GET /api/v1/clients/ (listado)</w:t>
             </w:r>
           </w:p>
@@ -7065,7 +7024,11 @@
     </w:p>
     <w:p>
       <w:r>
-        <w:t>La evaluación de la precisión en la interpretación de las intenciones del usuario constituye el aspecto más complejo y conceptualmente relevante del análisis de resultados, dado que determina la utilidad práctica del sistema como interfaz conversacional. En la presente implementación, la interpretación se realiza mediante reglas determinísticas de normalización y clasificación, por lo que la precisión puede verificarse de manera exhaustiva y no queda sujeta a la variabilidad de un modelo probabilístico.</w:t>
+        <w:t xml:space="preserve">La evaluación de la precisión en la interpretación de las intenciones del usuario constituye el aspecto más complejo y conceptualmente relevante del análisis de </w:t>
+      </w:r>
+      <w:r>
+        <w:lastRenderedPageBreak/>
+        <w:t>resultados, dado que determina la utilidad práctica del sistema como interfaz conversacional. En la presente implementación, la interpretación se realiza mediante reglas determinísticas de normalización y clasificación, por lo que la precisión puede verificarse de manera exhaustiva y no queda sujeta a la variabilidad de un modelo probabilístico.</w:t>
       </w:r>
     </w:p>
     <w:p>
@@ -7333,7 +7296,6 @@
               <w:rPr>
                 <w:sz w:val="18"/>
               </w:rPr>
-              <w:lastRenderedPageBreak/>
               <w:t>Precios</w:t>
             </w:r>
           </w:p>
@@ -7654,6 +7616,7 @@
         <w:pStyle w:val="Ttulo2"/>
       </w:pPr>
       <w:r>
+        <w:lastRenderedPageBreak/>
         <w:t>5.4 Estabilidad y robustez del sistema</w:t>
       </w:r>
     </w:p>
@@ -7687,52 +7650,32 @@
     </w:p>
     <w:p>
       <w:r>
+        <w:t>Los resultados de esta evaluación muestran que el sistema es capaz de almacenar y recuperar información de manera consistente en las condiciones evaluadas. La creación de un cliente persiste el registro con un identificador único, su consulta devuelve los datos esperados, y las operaciones de actualización y eliminación modifican el estado de manera coherente con el diseño del modelo de datos. La asignación de productos a clientes se registra correctamente y la consulta de las facturas simuladas agrega los importes de manera exacta.</w:t>
+      </w:r>
+    </w:p>
+    <w:p>
+      <w:r>
+        <w:t>La solución de almacenamiento adoptada (un motor de base de datos relacional ligero embebido) cumple con los requisitos funcionales y de rendimiento del prototipo, como lo evidencian los tiempos de respuesta presentados en la sección 5.2. Sus limitaciones en cuanto a concurrencia y escalabilidad son conocidas y aceptadas para el alcance de esta investigación, y son discutidas en el capítulo siguiente como parte de las líneas de trabajo futuro.</w:t>
+      </w:r>
+    </w:p>
+    <w:p>
+      <w:pPr>
+        <w:pStyle w:val="Ttulo2"/>
+      </w:pPr>
+      <w:r>
+        <w:t>5.6 Síntesis de resultados</w:t>
+      </w:r>
+    </w:p>
+    <w:p>
+      <w:r>
         <w:lastRenderedPageBreak/>
-        <w:t>Los resultados de esta evaluación muestran que el sistema es capaz de almacenar y recuperar información de manera consistente en las condiciones evaluadas. La creación de un cliente persiste el registro con un identificador único, su consulta devuelve los datos esperados, y las operaciones de actualización y eliminación modifican el estado de manera coherente con el diseño del modelo de datos. La asignación de productos a clientes se registra correctamente y la consulta de las facturas simuladas agrega los importes de manera exacta.</w:t>
-      </w:r>
-    </w:p>
-    <w:p>
-      <w:r>
-        <w:t>La solución de almacenamiento adoptada (un motor de base de datos relacional ligero embebido) cumple con los requisitos funcionales y de rendimiento del prototipo, como lo evidencian los tiempos de respuesta presentados en la sección 5.2. Sus limitaciones en cuanto a concurrencia y escalabilidad son conocidas y aceptadas para el alcance de esta investigación, y son discutidas en el capítulo siguiente como parte de las líneas de trabajo futuro.</w:t>
-      </w:r>
-    </w:p>
-    <w:p>
-      <w:pPr>
-        <w:pStyle w:val="Ttulo2"/>
-      </w:pPr>
-      <w:r>
-        <w:t>5.6 Síntesis de resultados</w:t>
-      </w:r>
-    </w:p>
-    <w:p>
-      <w:r>
-        <w:t>La síntesis de los resultados obtenidos en las distintas dimensiones de evaluación permite formular una valoración integral del sistema desarrollado. En el plano funcional, la suite de 128 pruebas automatizadas evidencia que la API cumple con la totalidad de los requisitos funcionales definidos, y los escenarios de interacción conversacional verifican la ejecución correcta de los flujos del bot en las rutas cubiertas por las reglas de interpretación.</w:t>
-      </w:r>
-    </w:p>
-    <w:p>
-      <w:r>
-        <w:t>En el plano del rendimiento, los tiempos de respuesta medidos se encuentran por debajo de los umbrales perceptibles para la interacción conversacional, con promedios que van de 2,76 ms para la consulta de detalle a 13,94 ms para el registro de interacciones. En el plano de la interpretación, el enfoque determinístico garantiza una precisión del 100% en las rutas definidas y un comportamiento de fallo controlado y predecible ante las entradas no previstas.</w:t>
-      </w:r>
-    </w:p>
-    <w:p>
-      <w:r>
-        <w:t xml:space="preserve">La comparación de los resultados obtenidos con los reportados en la literatura especializada permite contextualizar el alcance de los hallazgos. En el ámbito de las APIs REST para sistemas de gestión de clientes, los benchmarks publicados reportan tiempos de respuesta típicos entre 50 y 200 ms para operaciones CRUD similares (Richardson, 2018; Newman, 2015), mientras que los valores medidos en el sistema desarrollado oscilan entre 2,76 y 13,94 ms, representando una reducción de una a dos órdenes de magnitud. Esta diferencia se atribuye a dos factores arquitectónicos fundamentales: la ausencia de capas de procesamiento intermedias (middleware, validación compleja, caché distribuida) y el uso de SQLite como motor de almacenamiento embebido, que elimina la latencia de comunicación cliente-servidor propia de bases de datos como PostgreSQL o MySQL desplegadas en servidores remotos. En lo que respecta a la precisión de interpretación, el sistema alcanza un 100% de acierto sobre el catálogo predefinido de intenciones, valor que supera el rango reportado por sistemas de clasificación de intenciones basados en NLP de 85–95% (Jurafsky y Martin, 2024; Devlin et al., 2019). Cabe señalar que esta comparación debe interpretarse con cautela, dado que el sistema evaluado opera sobre un dominio acotado de siete intenciones con pattern matching determinístico, mientras que los modelos de NLP evalúan dominios abiertos con </w:t>
-      </w:r>
-      <w:r>
-        <w:lastRenderedPageBreak/>
-        <w:t>cientos o miles de categorías. La superioridad en precisión del enfoque adoptado es, por tanto, una consecuencia de la restricción del dominio, no de una capacidad interpretativa superior en términos absolutos.</w:t>
-      </w:r>
-    </w:p>
-    <w:p>
-      <w:r>
-        <w:t>En cuanto a la distribución de los tiempos de respuesta, se observa una correlación directa entre la complejidad operativa de cada endpoint y su latencia promedio. El endpoint más veloz —GET /api/v1/clients/{id} con 2,76 ms— realiza una consulta simple por clave primaria sobre una tabla indexada, operación de complejidad constante O(1) en bases de datos relacionales. Le siguen GET /api/v1/products/ (4,72 ms) y GET /api/v1/clients/ (5,34 ms), cuya ligera diferencia se explica por el mayor volumen de registros a recuperar y formatear en el listado. Los endpoints de mayor latencia —GET /api/v1/metrics/dashboard (13,87 ms) y POST /api/v1/interactions/ (13,94 ms)— comparten la característica de ejecutar operaciones de escritura o agregación que involucran múltiples tablas. Especialmente relevante es el caso de POST /api/v1/interactions/, que combina una inserción en la base de datos local con la llamada a la API externa de Telegram para el envío de notificaciones, lo que introduce una dependencia de red que contribuye al aumento del tiempo total. No obstante, incluso este endpoint más costoso se mantiene más de siete veces por debajo del umbral de 100 ms, validando la eficiencia de la arquitectura propuesta.</w:t>
-      </w:r>
-    </w:p>
-    <w:p>
-      <w:r>
-        <w:t>Al mismo tiempo, la evaluación permite identificar un conjunto de limitaciones que delimitan el alcance del modelo propuesto y orientan las líneas de trabajo futuro: la cobertura de la interpretación queda restringida al catálogo de intenciones predefinido, la solución de persistencia ligera presenta límites de concurrencia, y la disponibilidad del entorno de orquestación gratuito introduce incidencias menores documentadas. Estas limitaciones, junto con las implicancias generales del estudio, se discuten en el capítulo siguiente.</w:t>
-      </w:r>
-    </w:p>
+        <w:t>La síntesis integral de los resultados permite afirmar que el sistema desarrollado cumple con la totalidad de los requisitos funcionales evaluados, como lo evidencian las 128 pruebas automatizadas exitosas y la ejecución correcta de los flujos conversacionales en todas las rutas cubiertas por las reglas de interpretación. Los tiempos de respuesta, comprendidos entre 2,76 ms y 13,94 ms, se mantienen por debajo del umbral perceptual de 100 ms, y el enfoque determinístico garantiza una precisión del 100 % sobre el catálogo predefinido de intenciones, aunque con las limitaciones inherentes a la restricción del dominio y a la dependencia del entorno de orquestación gratuito.</w:t>
+      </w:r>
+    </w:p>
+    <w:p/>
+    <w:p/>
+    <w:p/>
+    <w:p/>
     <w:p>
       <w:pPr>
         <w:pStyle w:val="Ttulo2"/>
@@ -7791,25 +7734,25 @@
                 <w:sz w:val="180"/>
                 <w:szCs w:val="180"/>
               </w:rPr>
-              <w:lastRenderedPageBreak/>
-              <w:t>Caso</w:t>
-            </w:r>
-          </w:p>
-        </w:tc>
-        <w:tc>
-          <w:tcPr>
-            <w:tcW w:w="0" w:type="auto"/>
-            <w:vAlign w:val="center"/>
-          </w:tcPr>
-          <w:p>
+              <w:t>Ca</w:t>
+            </w:r>
             <w:r>
               <w:rPr>
                 <w:b/>
                 <w:sz w:val="180"/>
                 <w:szCs w:val="180"/>
               </w:rPr>
-              <w:t>Input d</w:t>
-            </w:r>
+              <w:lastRenderedPageBreak/>
+              <w:t>so</w:t>
+            </w:r>
+          </w:p>
+        </w:tc>
+        <w:tc>
+          <w:tcPr>
+            <w:tcW w:w="0" w:type="auto"/>
+            <w:vAlign w:val="center"/>
+          </w:tcPr>
+          <w:p>
             <w:r>
               <w:rPr>
                 <w:b/>
@@ -7817,7 +7760,7 @@
                 <w:szCs w:val="180"/>
               </w:rPr>
               <w:lastRenderedPageBreak/>
-              <w:t>el usua</w:t>
+              <w:t>In</w:t>
             </w:r>
             <w:r>
               <w:rPr>
@@ -7826,16 +7769,8 @@
                 <w:szCs w:val="180"/>
               </w:rPr>
               <w:lastRenderedPageBreak/>
-              <w:t>rio</w:t>
-            </w:r>
-          </w:p>
-        </w:tc>
-        <w:tc>
-          <w:tcPr>
-            <w:tcW w:w="0" w:type="auto"/>
-            <w:vAlign w:val="center"/>
-          </w:tcPr>
-          <w:p>
+              <w:t xml:space="preserve">put del </w:t>
+            </w:r>
             <w:r>
               <w:rPr>
                 <w:b/>
@@ -7843,8 +7778,16 @@
                 <w:szCs w:val="180"/>
               </w:rPr>
               <w:lastRenderedPageBreak/>
-              <w:t>Intenc</w:t>
-            </w:r>
+              <w:t>usuario</w:t>
+            </w:r>
+          </w:p>
+        </w:tc>
+        <w:tc>
+          <w:tcPr>
+            <w:tcW w:w="0" w:type="auto"/>
+            <w:vAlign w:val="center"/>
+          </w:tcPr>
+          <w:p>
             <w:r>
               <w:rPr>
                 <w:b/>
@@ -7852,7 +7795,7 @@
                 <w:szCs w:val="180"/>
               </w:rPr>
               <w:lastRenderedPageBreak/>
-              <w:t>ión esp</w:t>
+              <w:t>In</w:t>
             </w:r>
             <w:r>
               <w:rPr>
@@ -7861,16 +7804,8 @@
                 <w:szCs w:val="180"/>
               </w:rPr>
               <w:lastRenderedPageBreak/>
-              <w:t>erada</w:t>
-            </w:r>
-          </w:p>
-        </w:tc>
-        <w:tc>
-          <w:tcPr>
-            <w:tcW w:w="0" w:type="auto"/>
-            <w:vAlign w:val="center"/>
-          </w:tcPr>
-          <w:p>
+              <w:t>tenció</w:t>
+            </w:r>
             <w:r>
               <w:rPr>
                 <w:b/>
@@ -7878,7 +7813,7 @@
                 <w:szCs w:val="180"/>
               </w:rPr>
               <w:lastRenderedPageBreak/>
-              <w:t>Intenc</w:t>
+              <w:t>n esper</w:t>
             </w:r>
             <w:r>
               <w:rPr>
@@ -7887,8 +7822,16 @@
                 <w:szCs w:val="180"/>
               </w:rPr>
               <w:lastRenderedPageBreak/>
-              <w:t>ión det</w:t>
-            </w:r>
+              <w:t>ada</w:t>
+            </w:r>
+          </w:p>
+        </w:tc>
+        <w:tc>
+          <w:tcPr>
+            <w:tcW w:w="0" w:type="auto"/>
+            <w:vAlign w:val="center"/>
+          </w:tcPr>
+          <w:p>
             <w:r>
               <w:rPr>
                 <w:b/>
@@ -7896,16 +7839,8 @@
                 <w:szCs w:val="180"/>
               </w:rPr>
               <w:lastRenderedPageBreak/>
-              <w:t>ectada</w:t>
-            </w:r>
-          </w:p>
-        </w:tc>
-        <w:tc>
-          <w:tcPr>
-            <w:tcW w:w="0" w:type="auto"/>
-            <w:vAlign w:val="center"/>
-          </w:tcPr>
-          <w:p>
+              <w:t>In</w:t>
+            </w:r>
             <w:r>
               <w:rPr>
                 <w:b/>
@@ -7913,7 +7848,7 @@
                 <w:szCs w:val="180"/>
               </w:rPr>
               <w:lastRenderedPageBreak/>
-              <w:t>Precis</w:t>
+              <w:t>tenció</w:t>
             </w:r>
             <w:r>
               <w:rPr>
@@ -7922,16 +7857,8 @@
                 <w:szCs w:val="180"/>
               </w:rPr>
               <w:lastRenderedPageBreak/>
-              <w:t>ión</w:t>
-            </w:r>
-          </w:p>
-        </w:tc>
-        <w:tc>
-          <w:tcPr>
-            <w:tcW w:w="0" w:type="auto"/>
-            <w:vAlign w:val="center"/>
-          </w:tcPr>
-          <w:p>
+              <w:t>n detec</w:t>
+            </w:r>
             <w:r>
               <w:rPr>
                 <w:b/>
@@ -7939,8 +7866,16 @@
                 <w:szCs w:val="180"/>
               </w:rPr>
               <w:lastRenderedPageBreak/>
-              <w:t>Observa</w:t>
-            </w:r>
+              <w:t>tada</w:t>
+            </w:r>
+          </w:p>
+        </w:tc>
+        <w:tc>
+          <w:tcPr>
+            <w:tcW w:w="0" w:type="auto"/>
+            <w:vAlign w:val="center"/>
+          </w:tcPr>
+          <w:p>
             <w:r>
               <w:rPr>
                 <w:b/>
@@ -7948,7 +7883,60 @@
                 <w:szCs w:val="180"/>
               </w:rPr>
               <w:lastRenderedPageBreak/>
-              <w:t>ción</w:t>
+              <w:t>Pr</w:t>
+            </w:r>
+            <w:r>
+              <w:rPr>
+                <w:b/>
+                <w:sz w:val="180"/>
+                <w:szCs w:val="180"/>
+              </w:rPr>
+              <w:lastRenderedPageBreak/>
+              <w:t>ecisi</w:t>
+            </w:r>
+            <w:r>
+              <w:rPr>
+                <w:b/>
+                <w:sz w:val="180"/>
+                <w:szCs w:val="180"/>
+              </w:rPr>
+              <w:lastRenderedPageBreak/>
+              <w:t>ón</w:t>
+            </w:r>
+          </w:p>
+        </w:tc>
+        <w:tc>
+          <w:tcPr>
+            <w:tcW w:w="0" w:type="auto"/>
+            <w:vAlign w:val="center"/>
+          </w:tcPr>
+          <w:p>
+            <w:r>
+              <w:rPr>
+                <w:b/>
+                <w:sz w:val="180"/>
+                <w:szCs w:val="180"/>
+              </w:rPr>
+              <w:lastRenderedPageBreak/>
+              <w:t>Ob</w:t>
+            </w:r>
+            <w:r>
+              <w:rPr>
+                <w:b/>
+                <w:sz w:val="180"/>
+                <w:szCs w:val="180"/>
+              </w:rPr>
+              <w:lastRenderedPageBreak/>
+              <w:t>servaci</w:t>
+            </w:r>
+            <w:r>
+              <w:rPr>
+                <w:b/>
+                <w:sz w:val="180"/>
+                <w:szCs w:val="180"/>
+              </w:rPr>
+              <w:lastRenderedPageBreak/>
+              <w:t>ón</w:t>
             </w:r>
           </w:p>
         </w:tc>
@@ -7981,7 +7969,7 @@
                 <w:sz w:val="180"/>
                 <w:szCs w:val="180"/>
               </w:rPr>
-              <w:t>“Quier</w:t>
+              <w:t>“Q</w:t>
             </w:r>
             <w:r>
               <w:rPr>
@@ -7989,7 +7977,7 @@
                 <w:szCs w:val="180"/>
               </w:rPr>
               <w:lastRenderedPageBreak/>
-              <w:t>o compr</w:t>
+              <w:t>uiero c</w:t>
             </w:r>
             <w:r>
               <w:rPr>
@@ -7997,7 +7985,7 @@
                 <w:szCs w:val="180"/>
               </w:rPr>
               <w:lastRenderedPageBreak/>
-              <w:t>ar jabó</w:t>
+              <w:t xml:space="preserve">omprar </w:t>
             </w:r>
             <w:r>
               <w:rPr>
@@ -8005,7 +7993,7 @@
                 <w:szCs w:val="180"/>
               </w:rPr>
               <w:lastRenderedPageBreak/>
-              <w:t>n”</w:t>
+              <w:t>jabón”</w:t>
             </w:r>
           </w:p>
         </w:tc>
@@ -8021,7 +8009,15 @@
                 <w:szCs w:val="180"/>
               </w:rPr>
               <w:lastRenderedPageBreak/>
-              <w:t>Compra</w:t>
+              <w:t>Co</w:t>
+            </w:r>
+            <w:r>
+              <w:rPr>
+                <w:sz w:val="180"/>
+                <w:szCs w:val="180"/>
+              </w:rPr>
+              <w:lastRenderedPageBreak/>
+              <w:t>mpra</w:t>
             </w:r>
           </w:p>
         </w:tc>
@@ -8036,7 +8032,8 @@
                 <w:sz w:val="180"/>
                 <w:szCs w:val="180"/>
               </w:rPr>
-              <w:t>Menú (fa</w:t>
+              <w:lastRenderedPageBreak/>
+              <w:t>Me</w:t>
             </w:r>
             <w:r>
               <w:rPr>
@@ -8044,7 +8041,15 @@
                 <w:szCs w:val="180"/>
               </w:rPr>
               <w:lastRenderedPageBreak/>
-              <w:t>llback)</w:t>
+              <w:t>nú (fallb</w:t>
+            </w:r>
+            <w:r>
+              <w:rPr>
+                <w:sz w:val="180"/>
+                <w:szCs w:val="180"/>
+              </w:rPr>
+              <w:lastRenderedPageBreak/>
+              <w:t>ack)</w:t>
             </w:r>
           </w:p>
         </w:tc>
@@ -8075,7 +8080,7 @@
                 <w:sz w:val="180"/>
                 <w:szCs w:val="180"/>
               </w:rPr>
-              <w:t>Lenguaj</w:t>
+              <w:t>Le</w:t>
             </w:r>
             <w:r>
               <w:rPr>
@@ -8083,7 +8088,7 @@
                 <w:szCs w:val="180"/>
               </w:rPr>
               <w:lastRenderedPageBreak/>
-              <w:t>e natural n</w:t>
+              <w:t>nguaje n</w:t>
             </w:r>
             <w:r>
               <w:rPr>
@@ -8091,7 +8096,7 @@
                 <w:szCs w:val="180"/>
               </w:rPr>
               <w:lastRenderedPageBreak/>
-              <w:t>o matche</w:t>
+              <w:t>atural no m</w:t>
             </w:r>
             <w:r>
               <w:rPr>
@@ -8099,7 +8104,7 @@
                 <w:szCs w:val="180"/>
               </w:rPr>
               <w:lastRenderedPageBreak/>
-              <w:t>a patrone</w:t>
+              <w:t>atchea p</w:t>
             </w:r>
             <w:r>
               <w:rPr>
@@ -8107,7 +8112,7 @@
                 <w:szCs w:val="180"/>
               </w:rPr>
               <w:lastRenderedPageBreak/>
-              <w:t>s predefin</w:t>
+              <w:t>atrones pr</w:t>
             </w:r>
             <w:r>
               <w:rPr>
@@ -8115,7 +8120,15 @@
                 <w:szCs w:val="180"/>
               </w:rPr>
               <w:lastRenderedPageBreak/>
-              <w:t>idos</w:t>
+              <w:t>edefinid</w:t>
+            </w:r>
+            <w:r>
+              <w:rPr>
+                <w:sz w:val="180"/>
+                <w:szCs w:val="180"/>
+              </w:rPr>
+              <w:lastRenderedPageBreak/>
+              <w:t>os</w:t>
             </w:r>
           </w:p>
         </w:tc>
@@ -8148,7 +8161,7 @@
                 <w:sz w:val="180"/>
                 <w:szCs w:val="180"/>
               </w:rPr>
-              <w:t>“HO</w:t>
+              <w:t>“HOL</w:t>
             </w:r>
             <w:r>
               <w:rPr>
@@ -8156,7 +8169,7 @@
                 <w:szCs w:val="180"/>
               </w:rPr>
               <w:lastRenderedPageBreak/>
-              <w:t>LA!”</w:t>
+              <w:t>A!”</w:t>
             </w:r>
           </w:p>
         </w:tc>
@@ -8172,15 +8185,38 @@
                 <w:szCs w:val="180"/>
               </w:rPr>
               <w:lastRenderedPageBreak/>
-              <w:t>Me</w:t>
-            </w:r>
+              <w:t>Menú</w:t>
+            </w:r>
+          </w:p>
+        </w:tc>
+        <w:tc>
+          <w:tcPr>
+            <w:tcW w:w="0" w:type="auto"/>
+            <w:vAlign w:val="center"/>
+          </w:tcPr>
+          <w:p>
             <w:r>
               <w:rPr>
                 <w:sz w:val="180"/>
                 <w:szCs w:val="180"/>
               </w:rPr>
+              <w:t xml:space="preserve">Menú </w:t>
+            </w:r>
+            <w:r>
+              <w:rPr>
+                <w:sz w:val="180"/>
+                <w:szCs w:val="180"/>
+              </w:rPr>
               <w:lastRenderedPageBreak/>
-              <w:t>nú</w:t>
+              <w:t>(fallbac</w:t>
+            </w:r>
+            <w:r>
+              <w:rPr>
+                <w:sz w:val="180"/>
+                <w:szCs w:val="180"/>
+              </w:rPr>
+              <w:lastRenderedPageBreak/>
+              <w:t>k)</w:t>
             </w:r>
           </w:p>
         </w:tc>
@@ -8196,7 +8232,7 @@
                 <w:szCs w:val="180"/>
               </w:rPr>
               <w:lastRenderedPageBreak/>
-              <w:t>Men</w:t>
+              <w:t xml:space="preserve">100 </w:t>
             </w:r>
             <w:r>
               <w:rPr>
@@ -8204,18 +8240,76 @@
                 <w:szCs w:val="180"/>
               </w:rPr>
               <w:lastRenderedPageBreak/>
-              <w:t>ú (fallba</w:t>
-            </w:r>
+              <w:t>%*</w:t>
+            </w:r>
+          </w:p>
+        </w:tc>
+        <w:tc>
+          <w:tcPr>
+            <w:tcW w:w="0" w:type="auto"/>
+            <w:vAlign w:val="center"/>
+          </w:tcPr>
+          <w:p>
             <w:r>
               <w:rPr>
                 <w:sz w:val="180"/>
                 <w:szCs w:val="180"/>
               </w:rPr>
               <w:lastRenderedPageBreak/>
-              <w:t>ck)</w:t>
-            </w:r>
-          </w:p>
-        </w:tc>
+              <w:t>Puntu</w:t>
+            </w:r>
+            <w:r>
+              <w:rPr>
+                <w:sz w:val="180"/>
+                <w:szCs w:val="180"/>
+              </w:rPr>
+              <w:lastRenderedPageBreak/>
+              <w:t>ación im</w:t>
+            </w:r>
+            <w:r>
+              <w:rPr>
+                <w:sz w:val="180"/>
+                <w:szCs w:val="180"/>
+              </w:rPr>
+              <w:lastRenderedPageBreak/>
+              <w:t>pide matc</w:t>
+            </w:r>
+            <w:r>
+              <w:rPr>
+                <w:sz w:val="180"/>
+                <w:szCs w:val="180"/>
+              </w:rPr>
+              <w:lastRenderedPageBreak/>
+              <w:t xml:space="preserve">h exacto; </w:t>
+            </w:r>
+            <w:r>
+              <w:rPr>
+                <w:sz w:val="180"/>
+                <w:szCs w:val="180"/>
+              </w:rPr>
+              <w:lastRenderedPageBreak/>
+              <w:t>resuelto p</w:t>
+            </w:r>
+            <w:r>
+              <w:rPr>
+                <w:sz w:val="180"/>
+                <w:szCs w:val="180"/>
+              </w:rPr>
+              <w:lastRenderedPageBreak/>
+              <w:t>or caso p</w:t>
+            </w:r>
+            <w:r>
+              <w:rPr>
+                <w:sz w:val="180"/>
+                <w:szCs w:val="180"/>
+              </w:rPr>
+              <w:lastRenderedPageBreak/>
+              <w:t>or defecto</w:t>
+            </w:r>
+          </w:p>
+        </w:tc>
+      </w:tr>
+      <w:tr>
         <w:tc>
           <w:tcPr>
             <w:tcW w:w="0" w:type="auto"/>
@@ -8228,15 +8322,54 @@
                 <w:szCs w:val="180"/>
               </w:rPr>
               <w:lastRenderedPageBreak/>
-              <w:t xml:space="preserve">100 </w:t>
-            </w:r>
+              <w:t>3</w:t>
+            </w:r>
+          </w:p>
+        </w:tc>
+        <w:tc>
+          <w:tcPr>
+            <w:tcW w:w="0" w:type="auto"/>
+            <w:vAlign w:val="center"/>
+          </w:tcPr>
+          <w:p>
             <w:r>
               <w:rPr>
                 <w:sz w:val="180"/>
                 <w:szCs w:val="180"/>
               </w:rPr>
+              <w:t>“5” (ca</w:t>
+            </w:r>
+            <w:r>
+              <w:rPr>
+                <w:sz w:val="180"/>
+                <w:szCs w:val="180"/>
+              </w:rPr>
               <w:lastRenderedPageBreak/>
-              <w:t>%*</w:t>
+              <w:t xml:space="preserve">tálogo </w:t>
+            </w:r>
+            <w:r>
+              <w:rPr>
+                <w:sz w:val="180"/>
+                <w:szCs w:val="180"/>
+              </w:rPr>
+              <w:lastRenderedPageBreak/>
+              <w:t>con 3 pr</w:t>
+            </w:r>
+            <w:r>
+              <w:rPr>
+                <w:sz w:val="180"/>
+                <w:szCs w:val="180"/>
+              </w:rPr>
+              <w:lastRenderedPageBreak/>
+              <w:t>oducto</w:t>
+            </w:r>
+            <w:r>
+              <w:rPr>
+                <w:sz w:val="180"/>
+                <w:szCs w:val="180"/>
+              </w:rPr>
+              <w:lastRenderedPageBreak/>
+              <w:t>s)</w:t>
             </w:r>
           </w:p>
         </w:tc>
@@ -8252,7 +8385,7 @@
                 <w:szCs w:val="180"/>
               </w:rPr>
               <w:lastRenderedPageBreak/>
-              <w:t>Punt</w:t>
+              <w:t>Seleccio</w:t>
             </w:r>
             <w:r>
               <w:rPr>
@@ -8260,7 +8393,7 @@
                 <w:szCs w:val="180"/>
               </w:rPr>
               <w:lastRenderedPageBreak/>
-              <w:t>uación i</w:t>
+              <w:t>nar pro</w:t>
             </w:r>
             <w:r>
               <w:rPr>
@@ -8268,15 +8401,23 @@
                 <w:szCs w:val="180"/>
               </w:rPr>
               <w:lastRenderedPageBreak/>
-              <w:t>mpide mat</w:t>
-            </w:r>
+              <w:t>ducto</w:t>
+            </w:r>
+          </w:p>
+        </w:tc>
+        <w:tc>
+          <w:tcPr>
+            <w:tcW w:w="0" w:type="auto"/>
+            <w:vAlign w:val="center"/>
+          </w:tcPr>
+          <w:p>
             <w:r>
               <w:rPr>
                 <w:sz w:val="180"/>
                 <w:szCs w:val="180"/>
               </w:rPr>
               <w:lastRenderedPageBreak/>
-              <w:t>ch exact</w:t>
+              <w:t>Menú (fa</w:t>
             </w:r>
             <w:r>
               <w:rPr>
@@ -8284,23 +8425,38 @@
                 <w:szCs w:val="180"/>
               </w:rPr>
               <w:lastRenderedPageBreak/>
-              <w:t xml:space="preserve">o; resuelto </w:t>
-            </w:r>
+              <w:t>llback)</w:t>
+            </w:r>
+          </w:p>
+        </w:tc>
+        <w:tc>
+          <w:tcPr>
+            <w:tcW w:w="0" w:type="auto"/>
+            <w:vAlign w:val="center"/>
+          </w:tcPr>
+          <w:p>
             <w:r>
               <w:rPr>
                 <w:sz w:val="180"/>
                 <w:szCs w:val="180"/>
               </w:rPr>
               <w:lastRenderedPageBreak/>
-              <w:t xml:space="preserve">por caso </w:t>
-            </w:r>
+              <w:t>0 %</w:t>
+            </w:r>
+          </w:p>
+        </w:tc>
+        <w:tc>
+          <w:tcPr>
+            <w:tcW w:w="0" w:type="auto"/>
+            <w:vAlign w:val="center"/>
+          </w:tcPr>
+          <w:p>
             <w:r>
               <w:rPr>
                 <w:sz w:val="180"/>
                 <w:szCs w:val="180"/>
               </w:rPr>
-              <w:lastRenderedPageBreak/>
-              <w:t>por defe</w:t>
+              <w:t xml:space="preserve">Fuera de </w:t>
             </w:r>
             <w:r>
               <w:rPr>
@@ -8308,40 +8464,23 @@
                 <w:szCs w:val="180"/>
               </w:rPr>
               <w:lastRenderedPageBreak/>
-              <w:t>cto</w:t>
-            </w:r>
-          </w:p>
-        </w:tc>
-      </w:tr>
-      <w:tr>
-        <w:tc>
-          <w:tcPr>
-            <w:tcW w:w="0" w:type="auto"/>
-            <w:vAlign w:val="center"/>
-          </w:tcPr>
-          <w:p>
+              <w:t xml:space="preserve">rango del </w:t>
+            </w:r>
             <w:r>
               <w:rPr>
                 <w:sz w:val="180"/>
                 <w:szCs w:val="180"/>
               </w:rPr>
               <w:lastRenderedPageBreak/>
-              <w:t>3</w:t>
-            </w:r>
-          </w:p>
-        </w:tc>
-        <w:tc>
-          <w:tcPr>
-            <w:tcW w:w="0" w:type="auto"/>
-            <w:vAlign w:val="center"/>
-          </w:tcPr>
-          <w:p>
+              <w:t xml:space="preserve">catálogo </w:t>
+            </w:r>
             <w:r>
               <w:rPr>
                 <w:sz w:val="180"/>
                 <w:szCs w:val="180"/>
               </w:rPr>
-              <w:t>“5” (</w:t>
+              <w:lastRenderedPageBreak/>
+              <w:t>disponi</w:t>
             </w:r>
             <w:r>
               <w:rPr>
@@ -8349,158 +8488,7 @@
                 <w:szCs w:val="180"/>
               </w:rPr>
               <w:lastRenderedPageBreak/>
-              <w:t>catálo</w:t>
-            </w:r>
-            <w:r>
-              <w:rPr>
-                <w:sz w:val="180"/>
-                <w:szCs w:val="180"/>
-              </w:rPr>
-              <w:lastRenderedPageBreak/>
-              <w:t xml:space="preserve">go con 3 </w:t>
-            </w:r>
-            <w:r>
-              <w:rPr>
-                <w:sz w:val="180"/>
-                <w:szCs w:val="180"/>
-              </w:rPr>
-              <w:lastRenderedPageBreak/>
-              <w:t>produc</w:t>
-            </w:r>
-            <w:r>
-              <w:rPr>
-                <w:sz w:val="180"/>
-                <w:szCs w:val="180"/>
-              </w:rPr>
-              <w:lastRenderedPageBreak/>
-              <w:t>tos)</w:t>
-            </w:r>
-          </w:p>
-        </w:tc>
-        <w:tc>
-          <w:tcPr>
-            <w:tcW w:w="0" w:type="auto"/>
-            <w:vAlign w:val="center"/>
-          </w:tcPr>
-          <w:p>
-            <w:r>
-              <w:rPr>
-                <w:sz w:val="180"/>
-                <w:szCs w:val="180"/>
-              </w:rPr>
-              <w:lastRenderedPageBreak/>
-              <w:t>Selec</w:t>
-            </w:r>
-            <w:r>
-              <w:rPr>
-                <w:sz w:val="180"/>
-                <w:szCs w:val="180"/>
-              </w:rPr>
-              <w:lastRenderedPageBreak/>
-              <w:t>cionar p</w:t>
-            </w:r>
-            <w:r>
-              <w:rPr>
-                <w:sz w:val="180"/>
-                <w:szCs w:val="180"/>
-              </w:rPr>
-              <w:lastRenderedPageBreak/>
-              <w:t>roducto</w:t>
-            </w:r>
-          </w:p>
-        </w:tc>
-        <w:tc>
-          <w:tcPr>
-            <w:tcW w:w="0" w:type="auto"/>
-            <w:vAlign w:val="center"/>
-          </w:tcPr>
-          <w:p>
-            <w:r>
-              <w:rPr>
-                <w:sz w:val="180"/>
-                <w:szCs w:val="180"/>
-              </w:rPr>
-              <w:lastRenderedPageBreak/>
-              <w:t xml:space="preserve">Menú </w:t>
-            </w:r>
-            <w:r>
-              <w:rPr>
-                <w:sz w:val="180"/>
-                <w:szCs w:val="180"/>
-              </w:rPr>
-              <w:lastRenderedPageBreak/>
-              <w:t>(fallbac</w:t>
-            </w:r>
-            <w:r>
-              <w:rPr>
-                <w:sz w:val="180"/>
-                <w:szCs w:val="180"/>
-              </w:rPr>
-              <w:lastRenderedPageBreak/>
-              <w:t>k)</w:t>
-            </w:r>
-          </w:p>
-        </w:tc>
-        <w:tc>
-          <w:tcPr>
-            <w:tcW w:w="0" w:type="auto"/>
-            <w:vAlign w:val="center"/>
-          </w:tcPr>
-          <w:p>
-            <w:r>
-              <w:rPr>
-                <w:sz w:val="180"/>
-                <w:szCs w:val="180"/>
-              </w:rPr>
-              <w:lastRenderedPageBreak/>
-              <w:t>0 %</w:t>
-            </w:r>
-          </w:p>
-        </w:tc>
-        <w:tc>
-          <w:tcPr>
-            <w:tcW w:w="0" w:type="auto"/>
-            <w:vAlign w:val="center"/>
-          </w:tcPr>
-          <w:p>
-            <w:r>
-              <w:rPr>
-                <w:sz w:val="180"/>
-                <w:szCs w:val="180"/>
-              </w:rPr>
-              <w:t xml:space="preserve">Fuera </w:t>
-            </w:r>
-            <w:r>
-              <w:rPr>
-                <w:sz w:val="180"/>
-                <w:szCs w:val="180"/>
-              </w:rPr>
-              <w:lastRenderedPageBreak/>
-              <w:t xml:space="preserve">de rango </w:t>
-            </w:r>
-            <w:r>
-              <w:rPr>
-                <w:sz w:val="180"/>
-                <w:szCs w:val="180"/>
-              </w:rPr>
-              <w:lastRenderedPageBreak/>
-              <w:t>del catálo</w:t>
-            </w:r>
-            <w:r>
-              <w:rPr>
-                <w:sz w:val="180"/>
-                <w:szCs w:val="180"/>
-              </w:rPr>
-              <w:lastRenderedPageBreak/>
-              <w:t>go dispo</w:t>
-            </w:r>
-            <w:r>
-              <w:rPr>
-                <w:sz w:val="180"/>
-                <w:szCs w:val="180"/>
-              </w:rPr>
-              <w:lastRenderedPageBreak/>
-              <w:t>nible</w:t>
+              <w:t>ble</w:t>
             </w:r>
           </w:p>
         </w:tc>
@@ -8526,11 +8514,7 @@
     <w:p/>
     <w:p>
       <w:r>
-        <w:t xml:space="preserve">Estas limitaciones del enfoque determinístico refuerzan la pertinencia de las líneas de mejora propuestas en el Capítulo 8, particularmente la integración de modelos de lenguaje natural (NLP/LLM) como capa de interpretación semántica. La </w:t>
-      </w:r>
-      <w:r>
-        <w:lastRenderedPageBreak/>
-        <w:t>incorporación de un modelo de clasificación de intenciones basado en aprendizaje automático permitiría superar las restricciones del matcheo por patrones exactos, habilitando la comprensión de solicitudes en lenguaje natural y la validación contextual de selecciones fuera de rango.</w:t>
+        <w:t>Estas limitaciones del enfoque determinístico refuerzan la pertinencia de las líneas de mejora propuestas en el Capítulo 8, particularmente la integración de modelos de lenguaje natural (NLP/LLM) como capa de interpretación semántica. La incorporación de un modelo de clasificación de intenciones basado en aprendizaje automático permitiría superar las restricciones del matcheo por patrones exactos, habilitando la comprensión de solicitudes en lenguaje natural y la validación contextual de selecciones fuera de rango.</w:t>
       </w:r>
     </w:p>
     <w:p>
@@ -8560,7 +8544,11 @@
         <w:jc w:val="both"/>
       </w:pPr>
       <w:r>
-        <w:t>El análisis de los resultados obtenidos en la evaluación del sistema no puede limitarse a la constatación de los valores numéricos registrados para cada indicador, sino que requiere una interpretación contextualizada que los vincule con los principios teóricos establecidos en el marco conceptual y con las decisiones de diseño adoptadas durante el desarrollo. Esta interpretación permite comprender el significado de los resultados más allá de su dimensión técnica inmediata y extraer enseñanzas generalizables que trasciendan la implementación específica desarrollada.</w:t>
+        <w:t xml:space="preserve">El análisis de los resultados obtenidos en la evaluación del sistema no puede limitarse a la constatación de los valores numéricos registrados para cada indicador, sino que requiere una interpretación contextualizada que los vincule con los principios </w:t>
+      </w:r>
+      <w:r>
+        <w:lastRenderedPageBreak/>
+        <w:t>teóricos establecidos en el marco conceptual y con las decisiones de diseño adoptadas durante el desarrollo. Esta interpretación permite comprender el significado de los resultados más allá de su dimensión técnica inmediata y extraer enseñanzas generalizables que trasciendan la implementación específica desarrollada.</w:t>
       </w:r>
     </w:p>
     <w:p>
@@ -8590,8 +8578,11 @@
         <w:jc w:val="both"/>
       </w:pPr>
       <w:r>
+        <w:t xml:space="preserve">El segundo resultado de particular relevancia teórica es el relacionado con el componente de interpretación de lenguaje natural. Los resultados demuestran que la implementación de este componente mediante reglas determinísticas de normalización y clasificación de intenciones permite alcanzar un comportamiento predecible y verificable, con una precisión del 100% en las rutas cubiertas, validando los postulados de Russell y Norvig (2021) sobre la adecuación de los enfoques basados en reglas para dominios acotados. La discusión sobre la incorporación de modelos de lenguaje de gran escala queda planteada en términos de extensión futura: la variabilidad del comportamiento ante entradas similares y la dependencia </w:t>
+      </w:r>
+      <w:r>
         <w:lastRenderedPageBreak/>
-        <w:t>El segundo resultado de particular relevancia teórica es el relacionado con el componente de interpretación de lenguaje natural. Los resultados demuestran que la implementación de este componente mediante reglas determinísticas de normalización y clasificación de intenciones permite alcanzar un comportamiento predecible y verificable, con una precisión del 100% en las rutas cubiertas, validando los postulados de Russell y Norvig (2021) sobre la adecuación de los enfoques basados en reglas para dominios acotados. La discusión sobre la incorporación de modelos de lenguaje de gran escala queda planteada en términos de extensión futura: la variabilidad del comportamiento ante entradas similares y la dependencia de servicios externos que estos modelos introducen constituyen restricciones que el diseñador de sistemas de automatización debe considerar y gestionar explícitamente.</w:t>
+        <w:t>de servicios externos que estos modelos introducen constituyen restricciones que el diseñador de sistemas de automatización debe considerar y gestionar explícitamente.</w:t>
       </w:r>
     </w:p>
     <w:p>
@@ -8609,132 +8600,127 @@
         <w:jc w:val="both"/>
       </w:pPr>
       <w:r>
-        <w:t>Uno de los aportes conceptuales más significativos del presente trabajo es la identificación y caracterización de una tensión estructural que atraviesa el diseño de sistemas de automatización en entornos de bajo costo: la tensión entre costo, capacidad y control. Esta tensión no es exclusiva del contexto estudiado, sino que constituye una constante en el diseño de sistemas tecnológicos, pero adquiere características particulares en el contexto de los sistemas de automatización que incorporan componentes de inteligencia artificial.</w:t>
-      </w:r>
-    </w:p>
-    <w:p>
-      <w:pPr>
-        <w:spacing w:after="200" w:line="360" w:lineRule="auto"/>
-        <w:ind w:firstLine="720"/>
-        <w:jc w:val="both"/>
-      </w:pPr>
-      <w:r>
-        <w:t>La dimensión del costo refiere a los recursos económicos y computacionales necesarios para la construcción, el despliegue y el mantenimiento del sistema. En el contexto de la presente investigación, la minimización del costo es una restricción explícita que orienta todas las decisiones de diseño: se prioriza el uso de herramientas de código abierto, servicios con modelos de precios basados en el consumo y soluciones que pueden ser operadas en infraestructuras de bajo costo. Esta restricción condiciona directamente las opciones disponibles en las otras dos dimensiones.</w:t>
-      </w:r>
-    </w:p>
-    <w:p>
-      <w:pPr>
-        <w:spacing w:after="200" w:line="360" w:lineRule="auto"/>
-        <w:ind w:firstLine="720"/>
-        <w:jc w:val="both"/>
-      </w:pPr>
-      <w:r>
-        <w:t xml:space="preserve">La dimensión de la capacidad refiere al alcance funcional del sistema, es decir, al conjunto de tareas que el sistema es capaz de realizar y al nivel de calidad con que </w:t>
+        <w:t>Uno de los aportes conceptuales mas significativos del presente trabajo es la identificacion y caracterizacion de una tension estructural que atraviesa el diseno de sistemas de automatizacion en entornos de bajo costo: la tension entre costo, capacidad y control.</w:t>
+      </w:r>
+    </w:p>
+    <w:p>
+      <w:pPr>
+        <w:spacing w:after="200" w:line="360" w:lineRule="auto"/>
+        <w:ind w:firstLine="720"/>
+        <w:jc w:val="both"/>
+      </w:pPr>
+      <w:r>
+        <w:t>La dimension del costo refiere a los recursos economicos y computacionales necesarios para la construccion, el despliegue y el mantenimiento del sistema, donde la minimizacion del costo es una restriccion explicita que orienta todas las decisiones de diseno.</w:t>
+      </w:r>
+    </w:p>
+    <w:p>
+      <w:pPr>
+        <w:spacing w:after="200" w:line="360" w:lineRule="auto"/>
+        <w:ind w:firstLine="720"/>
+        <w:jc w:val="both"/>
+      </w:pPr>
+      <w:r>
+        <w:t>La dimension de la capacidad refiere al alcance funcional del sistema, donde la incorporacion del componente de inteligencia artificial es la decision que mas contribuye a ampliar la capacidad, aunque introduce un costo significativo en terminos economicos y computacionales.</w:t>
+      </w:r>
+    </w:p>
+    <w:p>
+      <w:pPr>
+        <w:spacing w:after="200" w:line="360" w:lineRule="auto"/>
+        <w:ind w:firstLine="720"/>
+        <w:jc w:val="both"/>
+      </w:pPr>
+      <w:r>
+        <w:t>La dimension del control refiere al grado en que el comportamiento del sistema puede ser previsto, verificado y corregido, siendo que los sistemas que incorporan componentes probabilisticos sacrifican parte de este control a cambio de mayor flexibilidad y capacidad de adaptacion.</w:t>
+      </w:r>
+    </w:p>
+    <w:p>
+      <w:pPr>
+        <w:spacing w:after="200" w:line="360" w:lineRule="auto"/>
+        <w:ind w:firstLine="720"/>
+        <w:jc w:val="both"/>
+      </w:pPr>
+      <w:r>
+        <w:t>La gestion de esta tension consiste en la adopcion de compromisos explicitos entre estas dimensiones, y el sistema desarrollado representa una opcion que prioriza la accesibilidad economica y la amplitud de capacidades, aceptando un nivel de control reducido como consecuencia de la incorporacion del componente de inteligencia artificial.</w:t>
+      </w:r>
+    </w:p>
+    <w:p>
+      <w:pPr>
+        <w:pStyle w:val="Ttulo2"/>
+      </w:pPr>
+      <w:r>
+        <w:t>6.3 El modelo híbrido de automatización</w:t>
+      </w:r>
+    </w:p>
+    <w:p>
+      <w:pPr>
+        <w:spacing w:after="200" w:line="360" w:lineRule="auto"/>
+        <w:ind w:firstLine="720"/>
+        <w:jc w:val="both"/>
+      </w:pPr>
+      <w:r>
+        <w:t>Uno de los aportes mas relevantes de la presente investigacion es la formulacion de un modelo hibrido de automatizacion, en el cual se integran componentes deterministicos y componentes adaptativos, trascendiendo la dicotomia tradicional entre sistemas basados en reglas y sistemas basados en inteligencia artificial.</w:t>
+      </w:r>
+    </w:p>
+    <w:p>
+      <w:pPr>
+        <w:spacing w:after="200" w:line="360" w:lineRule="auto"/>
+        <w:ind w:firstLine="720"/>
+        <w:jc w:val="both"/>
+      </w:pPr>
+      <w:r>
+        <w:t>En el modelo hibrido propuesto, los componentes deterministicos ejecutan flujos de automatizacion predefinidos, integran servicios externos y gestionan la persistencia de datos bajo reglas explicitas, mientras que los componentes adaptativos interpretan el lenguaje natural del usuario y generan respuestas contextualmente coherentes aprovechando las capacidades de los modelos de lenguaje de gran escala.</w:t>
+      </w:r>
+    </w:p>
+    <w:p>
+      <w:pPr>
+        <w:spacing w:after="200" w:line="360" w:lineRule="auto"/>
+        <w:ind w:firstLine="720"/>
+        <w:jc w:val="both"/>
+      </w:pPr>
+      <w:r>
+        <w:t>La interfaz entre ambos tipos de componentes es el punto critico del modelo hibrido, requiriendo un diseno cuidadoso de los mecanismos de extraccion y validacion de la informacion para convertir la salida probabilistica del componente adaptativo en instrucciones deterministicas que puedan ser ejecutadas por el componente de orquestacion.</w:t>
+      </w:r>
+    </w:p>
+    <w:p>
+      <w:pPr>
+        <w:spacing w:after="200" w:line="360" w:lineRule="auto"/>
+        <w:ind w:firstLine="720"/>
+        <w:jc w:val="both"/>
+      </w:pPr>
+      <w:r>
+        <w:t>El modelo hibrido propuesto tiene implicaciones que van mas alla del sistema especifico desarrollado, constituyendo un principio arquitectonico generalizable que puede ser aplicado al diseno de distintos tipos de sistemas de automatizacion que requieran integrar capacidades de comprension del lenguaje natural con la ejecucion controlada de flujos de trabajo predefinidos.</w:t>
+      </w:r>
+    </w:p>
+    <w:p>
+      <w:pPr>
+        <w:pStyle w:val="Ttulo2"/>
+      </w:pPr>
+      <w:r>
+        <w:t>6.4 Limitaciones del enfoque adoptado y perspectivas de mejora</w:t>
+      </w:r>
+    </w:p>
+    <w:p>
+      <w:pPr>
+        <w:spacing w:after="200" w:line="360" w:lineRule="auto"/>
+        <w:ind w:firstLine="720"/>
+        <w:jc w:val="both"/>
+      </w:pPr>
+      <w:r>
+        <w:t>El análisis crítico de las limitaciones del enfoque adoptado en la presente investigación resulta fundamental para contextualizar adecuadamente los resultados obtenidos y para orientar el trabajo futuro en la dirección más productiva. Estas limitaciones no constituyen deficiencias del trabajo, sino condicionantes inherentes al contexto en que se desarrolla, que han sido reconocidos explícitamente desde el inicio de la investigación y han sido gestionados de manera transparente a lo largo del proceso.</w:t>
+      </w:r>
+    </w:p>
+    <w:p>
+      <w:pPr>
+        <w:spacing w:after="200" w:line="360" w:lineRule="auto"/>
+        <w:ind w:firstLine="720"/>
+        <w:jc w:val="both"/>
+      </w:pPr>
+      <w:r>
+        <w:t xml:space="preserve">La limitación más significativa del sistema desarrollado es su dependencia de servicios externos para funciones críticas. La disponibilidad del sistema en su </w:t>
       </w:r>
       <w:r>
         <w:lastRenderedPageBreak/>
-        <w:t>las realiza. En el sistema desarrollado, la incorporación del componente de inteligencia artificial es la decisión de diseño que más contribuye a ampliar la capacidad del sistema, al introducir la posibilidad de procesar lenguaje natural de manera flexible. Sin embargo, el uso de un modelo de lenguaje de gran escala a través de una API introduce un costo significativo en términos económicos —cuantificable en el costo por solicitud— y computacionales —manifestado en la latencia del componente.</w:t>
-      </w:r>
-    </w:p>
-    <w:p>
-      <w:pPr>
-        <w:spacing w:after="200" w:line="360" w:lineRule="auto"/>
-        <w:ind w:firstLine="720"/>
-        <w:jc w:val="both"/>
-      </w:pPr>
-      <w:r>
-        <w:t>La dimensión del control refiere al grado en que el comportamiento del sistema puede ser previsto, verificado y corregido por sus diseñadores y operadores. Los sistemas puramente determinísticos ofrecen un control total sobre sus resultados, dado que cada salida puede ser predicha con certeza a partir de las entradas y de las reglas implementadas. Por el contrario, los sistemas que incorporan componentes probabilísticos, como los modelos de lenguaje de gran escala, sacrifican parte de este control a cambio de mayor flexibilidad y capacidad de adaptación. En el sistema desarrollado, esta pérdida de control se manifiesta en la variabilidad de las respuestas del modelo y en la dificultad de garantizar que el sistema siempre producirá el resultado esperado ante una entrada determinada.</w:t>
-      </w:r>
-    </w:p>
-    <w:p>
-      <w:pPr>
-        <w:spacing w:after="200" w:line="360" w:lineRule="auto"/>
-        <w:ind w:firstLine="720"/>
-        <w:jc w:val="both"/>
-      </w:pPr>
-      <w:r>
-        <w:t>La gestión de esta tensión no consiste en la eliminación de alguna de sus dimensiones, lo cual resultaría imposible, sino en la adopción de compromisos explícitos y fundamentados entre ellas. El sistema desarrollado representa una opción específica dentro del espacio de compromiso definido por esta tensión: prioriza la accesibilidad económica y la amplitud de capacidades, aceptando un nivel de control reducido como consecuencia de la incorporación del componente de inteligencia artificial. Esta opción puede no ser la más adecuada para todos los contextos posibles, pero se adapta bien a los requisitos del entorno considerado en la investigación.</w:t>
-      </w:r>
-    </w:p>
-    <w:p>
-      <w:pPr>
-        <w:pStyle w:val="Ttulo2"/>
-      </w:pPr>
-      <w:r>
-        <w:t>6.3 El modelo híbrido de automatización</w:t>
-      </w:r>
-    </w:p>
-    <w:p>
-      <w:pPr>
-        <w:spacing w:after="200" w:line="360" w:lineRule="auto"/>
-        <w:ind w:firstLine="720"/>
-        <w:jc w:val="both"/>
-      </w:pPr>
-      <w:r>
-        <w:t xml:space="preserve">Uno de los aportes más relevantes de la presente investigación en términos conceptuales es la formulación de un modelo híbrido de automatización, en el cual se </w:t>
-      </w:r>
-      <w:r>
-        <w:lastRenderedPageBreak/>
-        <w:t>integran de manera coherente componentes determinísticos y componentes adaptativos. Este modelo trasciende la dicotomía tradicional entre sistemas de automatización basados en reglas, que ofrecen control y predictibilidad, y sistemas basados en inteligencia artificial, que ofrecen flexibilidad y adaptabilidad, proponiendo una arquitectura que combina las ventajas de ambos paradigmas.</w:t>
-      </w:r>
-    </w:p>
-    <w:p>
-      <w:pPr>
-        <w:spacing w:after="200" w:line="360" w:lineRule="auto"/>
-        <w:ind w:firstLine="720"/>
-        <w:jc w:val="both"/>
-      </w:pPr>
-      <w:r>
-        <w:t>En el modelo híbrido propuesto, los componentes determinísticos son responsables de la ejecución de los flujos de automatización predefinidos, de la integración con los servicios externos y de la gestión de la persistencia de datos. Estos componentes operan bajo reglas explícitas que garantizan un comportamiento predecible y verificable. Los componentes adaptativos, por su parte, son responsables de la interpretación del lenguaje natural del usuario y de la generación de respuestas contextualmente coherentes, aprovechando las capacidades de los modelos de lenguaje de gran escala.</w:t>
-      </w:r>
-    </w:p>
-    <w:p>
-      <w:pPr>
-        <w:spacing w:after="200" w:line="360" w:lineRule="auto"/>
-        <w:ind w:firstLine="720"/>
-        <w:jc w:val="both"/>
-      </w:pPr>
-      <w:r>
-        <w:t>La interfaz entre ambos tipos de componentes es el punto crítico del modelo híbrido. La conversión de la salida probabilística del componente adaptativo en instrucciones determinísticas que puedan ser ejecutadas por el componente de orquestación requiere un diseño cuidadoso de los mecanismos de extracción y validación de la información. Esta interfaz actúa como punto de control que permite mantener la predictibilidad global del sistema a pesar de la variabilidad inherente al componente adaptativo.</w:t>
-      </w:r>
-    </w:p>
-    <w:p>
-      <w:pPr>
-        <w:spacing w:after="200" w:line="360" w:lineRule="auto"/>
-        <w:ind w:firstLine="720"/>
-        <w:jc w:val="both"/>
-      </w:pPr>
-      <w:r>
-        <w:t>El modelo híbrido propuesto tiene implicaciones que van más allá del sistema específico desarrollado en esta investigación. Constituye un principio arquitectónico generalizable que puede ser aplicado al diseño de distintos tipos de sistemas de automatización que requieran integrar capacidades de comprensión del lenguaje natural con la ejecución controlada de flujos de trabajo predefinidos. En este sentido, la contribución conceptual de la investigación no se limita al prototipo desarrollado, sino que se extiende al ámbito más amplio del diseño de sistemas de automatización inteligentes.</w:t>
-      </w:r>
-    </w:p>
-    <w:p>
-      <w:pPr>
-        <w:pStyle w:val="Ttulo2"/>
-      </w:pPr>
-      <w:r>
-        <w:t>6.4 Limitaciones del enfoque adoptado y perspectivas de mejora</w:t>
-      </w:r>
-    </w:p>
-    <w:p>
-      <w:pPr>
-        <w:spacing w:after="200" w:line="360" w:lineRule="auto"/>
-        <w:ind w:firstLine="720"/>
-        <w:jc w:val="both"/>
-      </w:pPr>
-      <w:r>
-        <w:lastRenderedPageBreak/>
-        <w:t>El análisis crítico de las limitaciones del enfoque adoptado en la presente investigación resulta fundamental para contextualizar adecuadamente los resultados obtenidos y para orientar el trabajo futuro en la dirección más productiva. Estas limitaciones no constituyen deficiencias del trabajo, sino condicionantes inherentes al contexto en que se desarrolla, que han sido reconocidos explícitamente desde el inicio de la investigación y han sido gestionados de manera transparente a lo largo del proceso.</w:t>
-      </w:r>
-    </w:p>
-    <w:p>
-      <w:pPr>
-        <w:spacing w:after="200" w:line="360" w:lineRule="auto"/>
-        <w:ind w:firstLine="720"/>
-        <w:jc w:val="both"/>
-      </w:pPr>
-      <w:r>
-        <w:t>La limitación más significativa del sistema desarrollado es su dependencia de servicios externos para funciones críticas. La disponibilidad del sistema en su conjunto está condicionada por la disponibilidad de cada uno de los servicios externos que integra, lo que hace que la robustez global del sistema sea, en el peor caso, igual a la del servicio externo menos confiable. En entornos productivos, esta dependencia puede generar problemas de disponibilidad que afecten la experiencia del usuario y la confiabilidad del sistema.</w:t>
+        <w:t>conjunto está condicionada por la disponibilidad de cada uno de los servicios externos que integra, lo que hace que la robustez global del sistema sea, en el peor caso, igual a la del servicio externo menos confiable. En entornos productivos, esta dependencia puede generar problemas de disponibilidad que afecten la experiencia del usuario y la confiabilidad del sistema.</w:t>
       </w:r>
     </w:p>
     <w:p>
@@ -8754,11 +8740,7 @@
         <w:jc w:val="both"/>
       </w:pPr>
       <w:r>
-        <w:t xml:space="preserve">La tercera limitación relevante es la restricción en la capacidad de gestión de contextos conversacionales complejos. El sistema mantiene el estado de la conversación por usuario —modo de interacción y contenido del carrito simulado—, pero esta capacidad está limitada por el diseño del catálogo de intenciones y por los </w:t>
-      </w:r>
-      <w:r>
-        <w:lastRenderedPageBreak/>
-        <w:t>mecanismos de gestión del estado implementados. En conversaciones que involucren consultas no contempladas en el catálogo, el sistema deriva la solicitud a la intención por defecto, presentando nuevamente el menú principal en lugar de interpretar la solicitud, lo que genera una experiencia menos fluida en los casos límite.</w:t>
+        <w:t>La tercera limitación relevante es la restricción en la capacidad de gestión de contextos conversacionales complejos. El sistema mantiene el estado de la conversación por usuario —modo de interacción y contenido del carrito simulado—, pero esta capacidad está limitada por el diseño del catálogo de intenciones y por los mecanismos de gestión del estado implementados. En conversaciones que involucren consultas no contempladas en el catálogo, el sistema deriva la solicitud a la intención por defecto, presentando nuevamente el menú principal en lugar de interpretar la solicitud, lo que genera una experiencia menos fluida en los casos límite.</w:t>
       </w:r>
     </w:p>
     <w:p>
@@ -8781,13 +8763,7 @@
     </w:p>
     <w:p>
       <w:r>
-        <w:t>El desarrollo de la presente investigación ha permitido abordar de manera integral y rigurosa la problemática asociada a la ineficiencia operativa en entornos digitales de pequeña escala, carac</w:t>
-      </w:r>
-      <w:r>
-        <w:t>terizados por la persistencia de procesos manuales, la fragmentación de herramientas tecnológicas y la ausencia de integración sistémica. A lo largo de sus distintas etapas, el trabajo ha articulado de manera coherente los planos teórico, metodológico y té</w:t>
-      </w:r>
-      <w:r>
-        <w:t>cnico, construyendo un argumento que avanza desde el diagnóstico del problema hasta la demostración empírica de la viabilidad de la solución propuesta.</w:t>
+        <w:t>El desarrollo de la presente investigación ha permitido abordar de manera integral y rigurosa la problemática asociada a la ineficiencia operativa en entornos digitales de pequeña escala, caracterizados por la persistencia de procesos manuales, la fragmentación de herramientas tecnológicas y la ausencia de integración sistémica. A lo largo de sus distintas etapas, el trabajo ha articulado de manera coherente los planos teórico, metodológico y técnico, construyendo un argumento que avanza desde el diagnóstico del problema hasta la demostración empírica de la viabilidad de la solución propuesta.</w:t>
       </w:r>
     </w:p>
     <w:p>
@@ -8805,17 +8781,10 @@
         <w:jc w:val="both"/>
       </w:pPr>
       <w:r>
-        <w:t>En relación con la pregunta de investigación planteada al inicio del trabajo, los resultados obtenidos permiten responder afirmativamente: es posible diseñar e implementar un sistema de automatización de procesos que, mediante la integración de servicios heterogéneos y un componente de interpretación de lenguaje natural basado en reglas, permita reducir de manera sustantiva la intervención manual en tareas digitales operativas sin requerir infraestructura tecnológica compleja ni implicar altos costos de implementación. La respuesta se enmarca en un modelo híbrido en el que la incorporación de componentes adaptativos de inteligencia artificial constituye una extensión que preserva el mismo esquema arquitectónico.</w:t>
-      </w:r>
-    </w:p>
-    <w:p>
-      <w:r>
-        <w:t>La pregunta de investigación planteada en la sección 1.3 queda respondida de manera afirmativa: es posibl</w:t>
-      </w:r>
-      <w:r>
-        <w:t>e diseñar e implementar un sistema de automatización de procesos que integre servicios heterogéneos y componentes de interpretación de lenguaje natural en entornos de bajo costo, manteniendo niveles funcionales aceptables.</w:t>
-      </w:r>
-    </w:p>
+        <w:t>Los resultados obtenidos permiten responder afirmativamente a la pregunta de investigación: es posible diseñar e implementar un sistema de automatización de procesos que, mediante la integración de servicios heterogéneos y un componente de interpretación de lenguaje natural basado en reglas, reduzca de manera sustantiva la intervención manual en tareas digitales operativas sin requerir infraestructura tecnológica compleja ni altos costos de implementación.</w:t>
+      </w:r>
+    </w:p>
+    <w:p/>
     <w:p>
       <w:pPr>
         <w:pStyle w:val="Ttulo2"/>
@@ -8826,118 +8795,94 @@
     </w:p>
     <w:p>
       <w:r>
-        <w:t xml:space="preserve">El </w:t>
-      </w:r>
-      <w:r>
-        <w:t>cumplimiento de los objetivos específicos planteados en la sección 1.5 se verifica a lo largo del desarrollo de la investigación. El primer objetivo, relativo a la revisión teórica, se cumplimenta en el Capítulo 2, donde se sistematizan los conceptos de au</w:t>
-      </w:r>
-      <w:r>
-        <w:t>tomatización de procesos, integración de servicios, inteligencia artificial y sistemas orientados a eventos. El segundo objetivo, referido al diseño arquitectónico, se materializa en las secciones 4.1 y 4.2, donde se define la arquitectura modular y desaco</w:t>
-      </w:r>
-      <w:r>
-        <w:t>plada del sistema. El tercer objetivo, orientado a la selección de herramientas, se atiende en la sección 4.8, donde se justifica la elección de cada componente tecnológico. El cuarto objetivo, relativo a la implementación de flujos, se desarrolla en la se</w:t>
-      </w:r>
-      <w:r>
-        <w:t xml:space="preserve">cción 4.4 y se documenta detalladamente en el Anexo B. El quinto objetivo, referido a las capacidades de </w:t>
-      </w:r>
+        <w:t>El cumplimiento de los objetivos específicos planteados en la sección 1.5 se verifica a lo largo del desarrollo de la investigación. El primer objetivo, relativo a la revisión teórica, se cumplimenta en el Capítulo 2, donde se sistematizan los conceptos de automatización de procesos, integración de servicios, inteligencia artificial y sistemas orientados a eventos. El segundo objetivo, referido al diseño arquitectónico, se materializa en las secciones 4.1 y 4.2, donde se define la arquitectura modular y desacoplada del sistema. El tercer objetivo, orientado a la selección de herramientas, se atiende en la sección 4.8, donde se justifica la elección de cada componente tecnológico. El cuarto objetivo, relativo a la implementación de flujos, se desarrolla en la sección 4.4 y se documenta detalladamente en el Anexo B. El quinto objetivo, referido a las capacidades de procesamiento de lenguaje natural, se aborda en la sección 4.5 y se complementa con el Fragmento 1 de código que evidencia la implementación del componente de interpretación semántica. El sexto objetivo, orientado a la evaluación de desempeño, se cumple íntegramente en el Capítulo 5, donde se presentan y analizan los resultados de las pruebas funcionales, de rendimiento, precisión y estabilidad.</w:t>
+      </w:r>
+    </w:p>
+    <w:p>
+      <w:pPr>
+        <w:pStyle w:val="Ttulo2"/>
+      </w:pPr>
+      <w:r>
+        <w:t>7.3 Aportes originales</w:t>
+      </w:r>
+    </w:p>
+    <w:p>
       <w:r>
         <w:lastRenderedPageBreak/>
-        <w:t>procesamiento de lenguaje natural, se aborda en la sección 4.5 y se complementa con el Fragmento 1 de código que evidencia la implementación del compon</w:t>
-      </w:r>
-      <w:r>
-        <w:t>ente de interpretación semántica. El sexto objetivo, orientado a la evaluación de desempeño, se cumple íntegramente en el Capítulo 5, donde se presentan y analizan los resultados de las pruebas funcionales, de rendimiento, precisión y estabilidad.</w:t>
-      </w:r>
-    </w:p>
+        <w:t>El primer aporte original consiste en la demostración empírica de que la automatización de procesos en entornos de bajo costo es técnicamente viable mediante la combinación estratégica de herramientas accesibles —n8n, FastAPI, SQLite, Telegram—, y que esta viabilidad depende de decisiones de diseño adecuadas, particularmente de una arquitectura desacoplada y orientada a eventos que gestione la complejidad de integrar múltiples componentes heterogéneos en un entorno de recursos limitados.</w:t>
+      </w:r>
+    </w:p>
+    <w:p>
+      <w:pPr>
+        <w:spacing w:after="200" w:line="360" w:lineRule="auto"/>
+        <w:ind w:firstLine="720"/>
+        <w:jc w:val="both"/>
+      </w:pPr>
+      <w:r>
+        <w:t>El segundo aporte es la formulación del modelo híbrido de automatización, que integra componentes determinísticos y adaptativos en una arquitectura coherente. Este modelo no es solo una estrategia de implementación del prototipo, sino un principio de diseño generalizable: la separación entre lógica determinística que gobierna los flujos y lógica adaptativa que gestiona la comprensión del lenguaje natural constituye un patrón aplicable a una amplia variedad de contextos de automatización.</w:t>
+      </w:r>
+    </w:p>
+    <w:p>
+      <w:pPr>
+        <w:spacing w:after="200" w:line="360" w:lineRule="auto"/>
+        <w:ind w:firstLine="720"/>
+        <w:jc w:val="both"/>
+      </w:pPr>
+      <w:r>
+        <w:t>El tercer aporte se refiere a la caracterización de las tensiones estructurales entre costo, capacidad y control. El trabajo demuestra que estas tensiones no pueden eliminarse, sino gestionarse mediante compromisos explícitos, ofreciendo un marco de referencia para orientar decisiones de diseño en contextos de automatización de bajo costo.</w:t>
+      </w:r>
+    </w:p>
+    <w:p>
+      <w:pPr>
+        <w:spacing w:after="200" w:line="360" w:lineRule="auto"/>
+        <w:ind w:firstLine="720"/>
+        <w:jc w:val="both"/>
+      </w:pPr>
+    </w:p>
+    <w:p>
+      <w:pPr>
+        <w:spacing w:after="200" w:line="360" w:lineRule="auto"/>
+        <w:ind w:firstLine="720"/>
+        <w:jc w:val="both"/>
+      </w:pPr>
+    </w:p>
+    <w:p>
+      <w:pPr>
+        <w:spacing w:after="200" w:line="360" w:lineRule="auto"/>
+        <w:ind w:firstLine="720"/>
+        <w:jc w:val="both"/>
+      </w:pPr>
+    </w:p>
+    <w:p>
+      <w:pPr>
+        <w:spacing w:after="200" w:line="360" w:lineRule="auto"/>
+        <w:ind w:firstLine="720"/>
+        <w:jc w:val="both"/>
+      </w:pPr>
+    </w:p>
+    <w:p/>
     <w:p>
       <w:pPr>
         <w:pStyle w:val="Ttulo2"/>
       </w:pPr>
       <w:r>
-        <w:t>7.3 Apor</w:t>
-      </w:r>
-      <w:r>
-        <w:t>tes originales</w:t>
-      </w:r>
-    </w:p>
-    <w:p>
-      <w:r>
-        <w:t>El aporte original de este trabajo se materializa en dos contribuciones conceptuales que trascienden la implementación del prototipo específico.</w:t>
-      </w:r>
-    </w:p>
-    <w:p>
-      <w:pPr>
-        <w:spacing w:after="200" w:line="360" w:lineRule="auto"/>
-        <w:ind w:firstLine="720"/>
-        <w:jc w:val="both"/>
-      </w:pPr>
-      <w:r>
-        <w:t>La primera conclusión fundamental que se deriva del trabajo realizado es que la automatización de procesos en entornos de bajo costo es técnicamente viable mediante la combinación estratégica de herramientas accesibles, y que el costo no constituye una barrera insalvable para la implementación de sistemas de automatización funcionales. Esta conclusión desafía la percepción frecuente de que la automatización es un lujo reservado a organizaciones con grandes capacidades de inversión, y abre perspectivas relevantes para la democratización del acceso a estas tecnologías.</w:t>
-      </w:r>
-    </w:p>
-    <w:p>
-      <w:pPr>
-        <w:spacing w:after="200" w:line="360" w:lineRule="auto"/>
-        <w:ind w:firstLine="720"/>
-        <w:jc w:val="both"/>
-      </w:pPr>
-      <w:r>
-        <w:t>Esta viabilidad, sin embargo, no es incondicional: depende de la adopción de decisiones de diseño adecuadas que permitan maximizar la funcionalidad del sistema dentro de las restricciones impuestas por el contexto. En particular, la arquitectura desacoplada y orientada a eventos adoptada en el sistema desarrollado demuestra ser especialmente adecuada para gestionar la complejidad de la integración de múltiples componentes heterogéneos en un entorno de recursos limitados. Este hallazgo constituye una contribución metodológica relevante para el diseño de futuros sistemas de automatización en contextos similares.</w:t>
-      </w:r>
-    </w:p>
-    <w:p>
-      <w:pPr>
-        <w:spacing w:after="200" w:line="360" w:lineRule="auto"/>
-        <w:ind w:firstLine="720"/>
-        <w:jc w:val="both"/>
-      </w:pPr>
-      <w:r>
-        <w:t xml:space="preserve">La segunda conclusión importante concierne al papel de la inteligencia artificial en los sistemas de automatización de bajo costo. La presente investigación demuestra que un componente de interpretación de lenguaje natural basado en reglas determinísticas es suficiente para automatizar los flujos conversacionales de un dominio acotado, eliminando la necesidad de que los usuarios aprendan interfaces estructuradas y reduciendo la fricción en la interacción. La incorporación de modelos de lenguaje de gran escala accesibles a través de APIs públicas queda definida como </w:t>
-      </w:r>
+        <w:t>7.4 Limitaciones de la investigación</w:t>
+      </w:r>
+    </w:p>
+    <w:p>
+      <w:r>
+        <w:t>Los resultados se basan en un prototipo funcional evaluado en un entorno controlado, no en un sistema desplegado en producción con usuarios reales. Si bien las pruebas ejecutadas abarcan múltiples dimensiones de evaluación (funcionalidad, rendimiento, precisión y estabilidad), la transferencia de resultados a un escenario productivo con demanda variable y usuarios con diferentes perfiles podría revelar limitaciones no contempladas en el presente estudio.</w:t>
+      </w:r>
+    </w:p>
+    <w:p>
       <w:r>
         <w:lastRenderedPageBreak/>
-        <w:t>una extensión viable del prototipo que permitiría ampliar la cobertura de la interpretación, a costa de introducir las tensiones que se discuten a continuación.</w:t>
-      </w:r>
-    </w:p>
-    <w:p>
-      <w:pPr>
-        <w:spacing w:after="200" w:line="360" w:lineRule="auto"/>
-        <w:ind w:firstLine="720"/>
-        <w:jc w:val="both"/>
-      </w:pPr>
-      <w:r>
-        <w:t>Al mismo tiempo, la investigación pone en evidencia que la incorporación de componentes de inteligencia artificial, en caso de ser adoptada en una versión extendida del sistema, introduciría tensiones y compromisos que deben ser gestionados explícitamente. La variabilidad inherente a los modelos probabilísticos, la dependencia de servicios externos y el impacto sobre el tiempo de respuesta del sistema son características que el diseñador debe anticipar y para las cuales debe implementar mecanismos de mitigación adecuados. El prototipo desarrollado, al optar por la variante determinística, evita estas tensiones en su estado actual y las difiere al momento de incorporar el componente adaptativo.</w:t>
-      </w:r>
-    </w:p>
-    <w:p>
-      <w:pPr>
-        <w:spacing w:after="200" w:line="360" w:lineRule="auto"/>
-        <w:ind w:firstLine="720"/>
-        <w:jc w:val="both"/>
-      </w:pPr>
-      <w:r>
-        <w:t>La tercera conclusión relevante es la formulación del modelo híbrido de automatización como contribución conceptual de la investigación. Este modelo, que integra componentes determinísticos y adaptativos en una arquitectura coherente, proporciona un marco conceptual generalizable que puede orientar el diseño de sistemas de automatización más allá del prototipo específico desarrollado en este trabajo. La distinción entre la lógica determinística que gobierna los flujos de automatización y la lógica adaptativa que gestiona la comprensión del lenguaje natural constituye un principio de diseño que puede ser aplicado en una amplia variedad de contextos.</w:t>
-      </w:r>
-    </w:p>
-    <w:p>
-      <w:pPr>
-        <w:spacing w:after="200" w:line="360" w:lineRule="auto"/>
-        <w:ind w:firstLine="720"/>
-        <w:jc w:val="both"/>
-      </w:pPr>
-      <w:r>
-        <w:t>La cuarta conclusión se vincula con las tensiones estructurales identificadas entre costo, capacidad y control. El trabajo demuestra que estas tensiones no pueden ser eliminadas, sino únicamente gestionadas mediante compromisos explícitos que reflejan las prioridades del contexto de aplicación. La contribución de la investigación en este sentido no consiste en proporcionar una receta universal para la gestión de estas tensiones, sino en caracterizarlas con precisión y en ofrecer un ejemplo concreto de cómo pueden ser abordadas en un contexto específico.</w:t>
-      </w:r>
-    </w:p>
-    <w:p>
-      <w:r>
-        <w:t>Estas dos contribuciones —el modelo híbrido de automatización y la caracter</w:t>
-      </w:r>
-      <w:r>
-        <w:t xml:space="preserve">ización de la tensión costo-capacidad-control— ofrecen un marco de referencia que puede </w:t>
-      </w:r>
-      <w:r>
-        <w:lastRenderedPageBreak/>
-        <w:t>ser utilizado por otros investigadores y profesionales para orientar sus decisiones de diseño en contextos de automatización de bajo costo.</w:t>
+        <w:t>El dominio conversacional evaluado es acotado (7 intenciones predefinidas); la generalización a dominios abiertos requiere integración de modelos de lenguaje probabilísticos. El prototipo actual opera bajo un esquema determinista que, si bien es suficiente para el dominio evaluado, no puede abarcar la complejidad de interacciones conversacionales ilimitadas sin incorporar componentes de inteligencia artificial de última generación.</w:t>
+      </w:r>
+    </w:p>
+    <w:p>
+      <w:r>
+        <w:t>La ausencia de un diseño experimental controlado (con grupo de control) limita la capacidad de establecer causalidad entre las variables intervenidas. Los resultados obtenidos permiten establecer correlaciones y describir comportamientos del sistema, pero no permiten afirmar con certeza estadística que las mejoras observadas sean exclusivamente atribuibles a las decisiones de diseño adoptadas.</w:t>
       </w:r>
     </w:p>
     <w:p>
@@ -8945,59 +8890,12 @@
         <w:pStyle w:val="Ttulo2"/>
       </w:pPr>
       <w:r>
-        <w:t>7.4 Limitaciones de la inves</w:t>
-      </w:r>
-      <w:r>
-        <w:t>tigación</w:t>
-      </w:r>
-    </w:p>
-    <w:p>
-      <w:r>
-        <w:t>Los resultados se basan en un prototipo funcional evaluado en un entorno controlado, no en un sistema desplegado en producción con usuarios reales. Si bien las pruebas ejecutadas abarcan múltiples dimensiones de evaluación (funcionalidad, rendimie</w:t>
-      </w:r>
-      <w:r>
-        <w:t>nto, precisión y estabilidad), la transferencia de resultados a un escenario productivo con demanda variable y usuarios con diferentes perfiles podría revelar limitaciones no contempladas en el presente estudio.</w:t>
-      </w:r>
-    </w:p>
-    <w:p>
-      <w:r>
-        <w:t>El dominio conversacional evaluado es acotad</w:t>
-      </w:r>
-      <w:r>
-        <w:t xml:space="preserve">o (7 intenciones predefinidas); la generalización a dominios abiertos requiere integración de modelos de lenguaje probabilísticos. El prototipo actual opera bajo un esquema determinista que, si bien es suficiente para el dominio evaluado, no puede abarcar </w:t>
-      </w:r>
-      <w:r>
-        <w:t>la complejidad de interacciones conversacionales ilimitadas sin incorporar componentes de inteligencia artificial de última generación.</w:t>
-      </w:r>
-    </w:p>
-    <w:p>
-      <w:r>
-        <w:t>La ausencia de un diseño experimental controlado (con grupo de control) limita la capacidad de establecer causalidad ent</w:t>
-      </w:r>
-      <w:r>
-        <w:t xml:space="preserve">re las variables intervenidas. Los resultados obtenidos permiten establecer correlaciones y describir comportamientos del sistema, pero no permiten afirmar con certeza estadística que las mejoras observadas sean exclusivamente atribuibles a las decisiones </w:t>
-      </w:r>
-      <w:r>
-        <w:t>de diseño adoptadas.</w:t>
-      </w:r>
-    </w:p>
-    <w:p>
-      <w:pPr>
-        <w:pStyle w:val="Ttulo2"/>
-      </w:pPr>
-      <w:r>
         <w:t>7.5 Trabajo futuro</w:t>
       </w:r>
     </w:p>
     <w:p>
       <w:r>
-        <w:t xml:space="preserve">Las limitaciones identificadas abren líneas naturales de investigación futura. En particular, el despliegue del prototipo en un entorno productivo con usuarios reales permitiría validar los resultados en condiciones </w:t>
-      </w:r>
-      <w:r>
-        <w:t>de uso auténticas. La incorporación de modelos de lenguaje de gran escala podría ampliar significativamente el dominio conversacional cubierto. Asimismo, la realización de estudios comparativos con grupo de control fortalecería la validez interna de los ha</w:t>
-      </w:r>
-      <w:r>
-        <w:t>llazgos. Estas y otras líneas de mejora se desarrollan con mayor detalle en el Capítulo 8 (Recomendaciones), donde se proponen acciones concretas para cada una de estas direcciones.</w:t>
+        <w:t>Las limitaciones identificadas abren líneas naturales de investigación futura. En particular, el despliegue del prototipo en un entorno productivo con usuarios reales permitiría validar los resultados en condiciones de uso auténticas. La incorporación de modelos de lenguaje de gran escala podría ampliar significativamente el dominio conversacional cubierto. Asimismo, la realización de estudios comparativos con grupo de control fortalecería la validez interna de los hallazgos. Estas y otras líneas de mejora se desarrollan con mayor detalle en el Capítulo 8 (Recomendaciones), donde se proponen acciones concretas para cada una de estas direcciones.</w:t>
       </w:r>
     </w:p>
     <w:p>
@@ -9043,17 +8941,7 @@
         <w:jc w:val="both"/>
       </w:pPr>
       <w:r>
-        <w:t>La primera y más urgente recomendación para la evolución del sistema concierne a la mejora de la arquitectura de persistencia de datos. La solución adoptada en el prototipo, que prioriza la simplicidad y el bajo costo, presenta limitaciones en términos de escalabilidad, integridad transaccional y capacidad de gestión de grandes volúmenes de datos que resultan críticas en contextos de uso real. Se recomienda explorar la incorporación de soluciones de almacenamiento más robustas, como bases de datos relacionales ligeras que ofrezcan garantías transaccionales básicas, o soluciones NoSQL optimizadas para los patrones de acceso específicos del sistema.</w:t>
-      </w:r>
-    </w:p>
-    <w:p>
-      <w:pPr>
-        <w:spacing w:after="200" w:line="360" w:lineRule="auto"/>
-        <w:ind w:firstLine="720"/>
-        <w:jc w:val="both"/>
-      </w:pPr>
-      <w:r>
-        <w:t>Esta mejora no implica necesariamente el abandono del principio de bajo costo que orienta el diseño del sistema. Existen soluciones de bases de datos de código abierto que ofrecen características avanzadas sin implicar costos de licenciamiento, y cuya implementación en infraestructuras en la nube con modelos de precios de pago por uso puede mantenerse dentro de rangos accesibles para pequeñas organizaciones.</w:t>
+        <w:t>La primera y mas urgente recomendacion para la evolucion del sistema concierne a la mejora de la arquitectura de persistencia de datos. La solucion adoptada en el prototipo presenta limitaciones en terminos de escalabilidad, integridad transaccional y capacidad de gestion de grandes volumenes de datos. Se recomienda explorar la incorporacion de soluciones de almacenamiento mas robustas, como bases de datos relacionales ligeras o soluciones NoSQL, manteniendo el principio de bajo costo mediante soluciones de codigo abierto e infraestructuras en la nube con modelos de precios de pago por uso.</w:t>
       </w:r>
     </w:p>
     <w:p>
@@ -9071,21 +8959,7 @@
         <w:jc w:val="both"/>
       </w:pPr>
       <w:r>
-        <w:t xml:space="preserve">La segunda recomendación apunta a abordar la escalabilidad del sistema como un aspecto central en futuras implementaciones. Si bien la arquitectura </w:t>
-      </w:r>
-      <w:r>
-        <w:lastRenderedPageBreak/>
-        <w:t>desacoplada adoptada proporciona una base adecuada para la expansión del sistema, su implementación actual no contempla mecanismos específicos para la gestión de cargas elevadas o para la distribución de procesos en múltiples entornos. Se recomienda explorar soluciones basadas en contenedores y orquestación de contenedores, que permitan escalar los componentes del sistema de manera independiente en función de la demanda y gestionar de manera más robusta las situaciones de falla.</w:t>
-      </w:r>
-    </w:p>
-    <w:p>
-      <w:pPr>
-        <w:spacing w:after="200" w:line="360" w:lineRule="auto"/>
-        <w:ind w:firstLine="720"/>
-        <w:jc w:val="both"/>
-      </w:pPr>
-      <w:r>
-        <w:t>Asimismo, se recomienda implementar estrategias de resiliencia que reduzcan el impacto de la no disponibilidad de los servicios externos. La implementación de caché para las respuestas de servicios externos frecuentemente consultados, el uso de múltiples proveedores para funciones críticas y el diseño de mecanismos de degradación graceful que permitan al sistema continuar operando de manera parcial cuando algún servicio externo no está disponible son estrategias que mejorarían significativamente la robustez del sistema.</w:t>
+        <w:t>La segunda recomendacion apunta a abordar la escalabilidad del sistema como un aspecto central en futuras implementaciones. Si bien la arquitectura desacoplada proporciona una base adecuada para la expansion, se recomienda explorar soluciones basadas en contenedores y orquestacion, implementar estrategias de resiliencia como cache para servicios externos frecuentes, uso de multiples proveedores y mecanismos de degradacion graceful que permitan al sistema continuar operando de manera parcial cuando algun servicio externo no este disponible.</w:t>
       </w:r>
     </w:p>
     <w:p>
@@ -9103,17 +8977,7 @@
         <w:jc w:val="both"/>
       </w:pPr>
       <w:r>
-        <w:t>La tercera recomendación se vincula con la gestión de la dependencia del componente de inteligencia artificial y con la mejora de la precisión semántica del sistema. En el mediano plazo, se recomienda explorar la posibilidad de implementar mecanismos de validación de las respuestas del modelo de lenguaje que permitan detectar automáticamente las situaciones en que la respuesta generada no cumple con los requisitos del flujo de automatización, solicitando una nueva respuesta o recurriendo a estrategias alternativas de interpretación.</w:t>
-      </w:r>
-    </w:p>
-    <w:p>
-      <w:pPr>
-        <w:spacing w:after="200" w:line="360" w:lineRule="auto"/>
-        <w:ind w:firstLine="720"/>
-        <w:jc w:val="both"/>
-      </w:pPr>
-      <w:r>
-        <w:t>En el largo plazo, sería valioso explorar la incorporación de modelos de lenguaje más pequeños que puedan ser ejecutados localmente, eliminando la dependencia de servicios externos para las funciones de procesamiento de lenguaje natural más críticas. Aunque actualmente los modelos de lenguaje de menor tamaño presentan limitaciones en su capacidad de comprensión en comparación con los grandes modelos en la nube, la evolución acelerada del campo sugiere que esta brecha se reducirá en el futuro próximo.</w:t>
+        <w:t>La tercera recomendacion se vincula con la gestion de la dependencia del componente de inteligencia artificial y con la mejora de la precision semantica del sistema. En el mediano plazo, se recomienda implementar mecanismos de validacion de las respuestas del modelo de lenguaje, y en el largo plazo, explorar la incorporacion de modelos de lenguaje mas pequenos que puedan ser ejecutados localmente, eliminando la dependencia de servicios externos para las funciones de procesamiento de lenguaje natural mas criticas.</w:t>
       </w:r>
     </w:p>
     <w:p>
@@ -9132,17 +8996,7 @@
         <w:jc w:val="both"/>
       </w:pPr>
       <w:r>
-        <w:t>La cuarta recomendación concierne a la implementación de mecanismos de monitoreo y observabilidad que permitan analizar el comportamiento del sistema en tiempo real e identificar proactivamente situaciones que requieran atención. En su versión actual, el sistema genera registros de eventos básicos que proporcionan información sobre su funcionamiento, pero carece de herramientas de análisis que faciliten la interpretación de estos registros y la identificación de patrones.</w:t>
-      </w:r>
-    </w:p>
-    <w:p>
-      <w:pPr>
-        <w:spacing w:after="200" w:line="360" w:lineRule="auto"/>
-        <w:ind w:firstLine="720"/>
-        <w:jc w:val="both"/>
-      </w:pPr>
-      <w:r>
-        <w:t>Se recomienda la implementación de un sistema de monitoreo que permita visualizar en tiempo real indicadores clave del comportamiento del sistema, como el tiempo de respuesta promedio, la tasa de éxito en la interpretación de intenciones y la frecuencia de errores por tipo. La implementación de alertas automáticas que notifiquen a los administradores del sistema cuando alguno de estos indicadores supera umbrales predefinidos permitiría responder de manera proactiva a situaciones de degradación del servicio.</w:t>
+        <w:t>La cuarta recomendacion concierne a la implementacion de mecanismos de monitoreo y observabilidad que permitan analizar el comportamiento del sistema en tiempo real. Se recomienda implementar un sistema que permita visualizar indicadores clave como el tiempo de respuesta promedio, la tasa de exito en la interpretacion de intenciones y la frecuencia de errores por tipo, con alertas automaticas que notifiquen a los administradores cuando estos indicadores superen umbrales predefinidos.</w:t>
       </w:r>
     </w:p>
     <w:p>
@@ -9160,21 +9014,7 @@
         <w:jc w:val="both"/>
       </w:pPr>
       <w:r>
-        <w:t>La quinta recomendación aborda aspectos vinculados a la seguridad y la privacidad del sistema, que no constituyen objetivos centrales del prototipo desarrollado pero resultan críticos para cualquier implementación en un entorno productivo real. Se recomienda la implementación de mecanismos robustos de autenticación y autorización que garanticen que solo los usuarios autorizados puedan acceder al sistema y ejecutar las acciones correspondientes a sus permisos. El cifrado de la comunicación entre los componentes del sistema y el cifrado de los datos almacenados en el sistema de persistencia son medidas adicionales que deben ser implementadas.</w:t>
-      </w:r>
-    </w:p>
-    <w:p>
-      <w:pPr>
-        <w:spacing w:after="200" w:line="360" w:lineRule="auto"/>
-        <w:ind w:firstLine="720"/>
-        <w:jc w:val="both"/>
-      </w:pPr>
-      <w:r>
-        <w:t xml:space="preserve">En lo que respecta a la privacidad, se recomienda realizar un análisis detallado de los datos que son transmitidos a los servicios externos, con el objetivo de identificar posibles exposiciones de información sensible y de implementar mecanismos de anonimización o seudonimización que minimicen el riesgo. En contextos donde se </w:t>
-      </w:r>
-      <w:r>
-        <w:lastRenderedPageBreak/>
-        <w:t>gestione información personal de usuarios, será necesario garantizar el cumplimiento de la normativa aplicable en materia de protección de datos personales.</w:t>
+        <w:t>La quinta recomendacion aborda aspectos vinculados a la seguridad y la privacidad del sistema. Se recomienda implementar mecanismos robustos de autenticacion y autorizacion, cifrado de la comunicacion entre componentes y de los datos almacenados, y realizar un analisis detallado de los datos transmitidos a servicios externos para identificar posibles exposiciones de informacion sensible, implementando mecanismos de anonimizacion o seudonimizacion que minimicen el riesgo.</w:t>
       </w:r>
     </w:p>
     <w:p>
@@ -9192,17 +9032,7 @@
         <w:jc w:val="both"/>
       </w:pPr>
       <w:r>
-        <w:t>Desde una perspectiva más amplia, la investigación abre una serie de líneas de trabajo futuro que merecen ser exploradas. En primer lugar, la validación del modelo propuesto en contextos reales de uso, con usuarios efectivos y condiciones de operación no controladas, permitiría obtener evidencia más sólida sobre su viabilidad y sus limitaciones en entornos distintos del laboratorio. En segundo lugar, la comparación sistemática entre distintas herramientas de orquestación de flujos de trabajo y distintos modelos de lenguaje permitiría identificar las combinaciones más efectivas para distintos tipos de casos de uso.</w:t>
-      </w:r>
-    </w:p>
-    <w:p>
-      <w:pPr>
-        <w:spacing w:after="200" w:line="360" w:lineRule="auto"/>
-        <w:ind w:firstLine="720"/>
-        <w:jc w:val="both"/>
-      </w:pPr>
-      <w:r>
-        <w:t>En tercer lugar, la exploración de enfoques de ajuste fino de modelos de lenguaje de menor tamaño para tareas específicas de automatización podría permitir reducir significativamente la dependencia de servicios externos sin sacrificar la precisión semántica del sistema. Finalmente, el diseño de metodologías de evaluación más rigurosas para sistemas de automatización que incorporan componentes de inteligencia artificial constituye una contribución metodológica valiosa que trascendería los límites del sistema específico desarrollado en esta investigación.</w:t>
+        <w:t>Desde una perspectiva mas amplia, la investigacion abre una serie de lineas de trabajo futuro que merecen ser exploradas: la validacion del modelo propuesto en contextos reales de uso, la comparacion sistematica entre distintas herramientas de orquestacion y modelos de lenguaje, la exploracion de enfoques de ajuste fino de modelos de lenguaje de menor tamano para tareas especificas de automatizacion, y el diseno de metodologias de evaluacion mas rigurosas para sistemas de automatizacion que incorporan componentes de inteligencia artificial.</w:t>
       </w:r>
     </w:p>
     <w:p>
@@ -12916,31 +12746,17 @@
         <w:jc w:val="both"/>
       </w:pPr>
       <w:r>
-        <w:t xml:space="preserve">El modelo de datos del sistema define las entidades que son almacenadas en el sistema de persistencia, sus atributos relevantes y las relaciones entre ellas. Este modelo ha sido diseñado priorizando la simplicidad y la adecuación a los patrones de </w:t>
-      </w:r>
-      <w:r>
-        <w:lastRenderedPageBreak/>
-        <w:t>acceso del sistema, con el objetivo de minimizar la complejidad de las operaciones de lectura y escritura y maximizar la eficiencia del sistema de almacenamiento.</w:t>
-      </w:r>
-    </w:p>
-    <w:p>
-      <w:pPr>
-        <w:spacing w:after="200" w:line="360" w:lineRule="auto"/>
-        <w:ind w:firstLine="720"/>
-        <w:jc w:val="both"/>
-      </w:pPr>
-      <w:r>
-        <w:t>La entidad principal del modelo es la sesión de conversación, que representa el contexto de interacción entre un usuario y el sistema en un momento determinado. Esta entidad almacena el identificador del usuario, la marca de tiempo de inicio y fin de la sesión, y una referencia al historial de mensajes intercambiados durante la sesión. El historial de mensajes se almacena como una colección ordenada de objetos que representan cada mensaje individual, incluyendo el contenido del mensaje, el rol del emisor —usuario o sistema— y la marca de tiempo de creación.</w:t>
-      </w:r>
-    </w:p>
-    <w:p>
-      <w:pPr>
-        <w:spacing w:after="200" w:line="360" w:lineRule="auto"/>
-        <w:ind w:firstLine="720"/>
-        <w:jc w:val="both"/>
-      </w:pPr>
-      <w:r>
-        <w:t>La entidad de registro de ejecución de flujos almacena información sobre cada invocación de un flujo de automatización, incluyendo el identificador del flujo ejecutado, los parámetros con que fue invocado, el resultado de la ejecución y la marca de tiempo de inicio y fin de la ejecución. Este registro constituye la base para el análisis del comportamiento del sistema y para la identificación de patrones de uso.</w:t>
+        <w:t>El modelo de datos del sistema define las entidades almacenadas en el sistema de persistencia, sus atributos relevantes y las relaciones entre ellas, priorizando la simplicidad y la adecuacion a los patrones de acceso del sistema.</w:t>
+      </w:r>
+    </w:p>
+    <w:p>
+      <w:pPr>
+        <w:spacing w:after="200" w:line="360" w:lineRule="auto"/>
+        <w:ind w:firstLine="720"/>
+        <w:jc w:val="both"/>
+      </w:pPr>
+      <w:r>
+        <w:t>Las entidades principales son la sesion de conversacion (contexto de interaccion entre usuario y sistema), el registro de ejecucion de flujos (informacion sobre cada invocacion de un flujo de automatizacion), y las entidades de clientes, productos e interacciones que soportan las funcionalidades del sistema.</w:t>
       </w:r>
     </w:p>
     <w:p>
@@ -12948,10 +12764,7 @@
         <w:spacing w:after="120"/>
       </w:pPr>
       <w:r>
-        <w:rPr>
-          <w:sz w:val="22"/>
-        </w:rPr>
-        <w:t>La Tabla D.1 resume las entidades persistidas en la base de datos SQLite y sus atributos principales, tal como están implementadas en los modelos del backend (src/models). A continuación se reproduce el esquema DDL equivalente.</w:t>
+        <w:t>La Tabla D.1 resume las entidades persistidas en la base de datos SQLite. A continuacion se reproduce el esquema DDL equivalente de forma condensada.</w:t>
       </w:r>
     </w:p>
     <w:p>
@@ -13200,406 +13013,36 @@
         <w:shd w:val="clear" w:color="auto" w:fill="F2F2F2"/>
       </w:pPr>
       <w:r>
-        <w:rPr>
-          <w:rFonts w:ascii="Courier New" w:hAnsi="Courier New"/>
-          <w:sz w:val="18"/>
-        </w:rPr>
         <w:t>CREATE TABLE clients (</w:t>
-      </w:r>
-    </w:p>
-    <w:p>
-      <w:pPr>
-        <w:shd w:val="clear" w:color="auto" w:fill="F2F2F2"/>
-      </w:pPr>
-      <w:r>
-        <w:rPr>
-          <w:rFonts w:ascii="Courier New" w:hAnsi="Courier New"/>
-          <w:sz w:val="18"/>
-        </w:rPr>
-        <w:t xml:space="preserve">    id INTEGER PRIMARY KEY,</w:t>
-      </w:r>
-    </w:p>
-    <w:p>
-      <w:pPr>
-        <w:shd w:val="clear" w:color="auto" w:fill="F2F2F2"/>
-      </w:pPr>
-      <w:r>
-        <w:rPr>
-          <w:rFonts w:ascii="Courier New" w:hAnsi="Courier New"/>
-          <w:sz w:val="18"/>
-        </w:rPr>
-        <w:t xml:space="preserve">    nombre VARCHAR(100) NOT NULL,</w:t>
-      </w:r>
-    </w:p>
-    <w:p>
-      <w:pPr>
-        <w:shd w:val="clear" w:color="auto" w:fill="F2F2F2"/>
-      </w:pPr>
-      <w:r>
-        <w:rPr>
-          <w:rFonts w:ascii="Courier New" w:hAnsi="Courier New"/>
-          <w:sz w:val="18"/>
-        </w:rPr>
-        <w:t xml:space="preserve">    apellido VARCHAR(100) NOT NULL,</w:t>
-      </w:r>
-    </w:p>
-    <w:p>
-      <w:pPr>
-        <w:shd w:val="clear" w:color="auto" w:fill="F2F2F2"/>
-      </w:pPr>
-      <w:r>
-        <w:rPr>
-          <w:rFonts w:ascii="Courier New" w:hAnsi="Courier New"/>
-          <w:sz w:val="18"/>
-        </w:rPr>
-        <w:t xml:space="preserve">    telefono VARCHAR(50),</w:t>
-      </w:r>
-    </w:p>
-    <w:p>
-      <w:pPr>
-        <w:shd w:val="clear" w:color="auto" w:fill="F2F2F2"/>
-      </w:pPr>
-      <w:r>
-        <w:rPr>
-          <w:rFonts w:ascii="Courier New" w:hAnsi="Courier New"/>
-          <w:sz w:val="18"/>
-        </w:rPr>
-        <w:t xml:space="preserve">    email VARCHAR(255) NOT NULL UNIQUE,</w:t>
-      </w:r>
-    </w:p>
-    <w:p>
-      <w:pPr>
-        <w:shd w:val="clear" w:color="auto" w:fill="F2F2F2"/>
-      </w:pPr>
-      <w:r>
-        <w:rPr>
-          <w:rFonts w:ascii="Courier New" w:hAnsi="Courier New"/>
-          <w:sz w:val="18"/>
-        </w:rPr>
-        <w:t xml:space="preserve">    fecha_registro DATETIME NOT NULL DEFAULT CURRENT_TIMESTAMP,</w:t>
-      </w:r>
-    </w:p>
-    <w:p>
-      <w:pPr>
-        <w:shd w:val="clear" w:color="auto" w:fill="F2F2F2"/>
-      </w:pPr>
-      <w:r>
-        <w:rPr>
-          <w:rFonts w:ascii="Courier New" w:hAnsi="Courier New"/>
-          <w:sz w:val="18"/>
-        </w:rPr>
-        <w:t xml:space="preserve">    activo BOOLEAN NOT NULL DEFAULT 1,</w:t>
-      </w:r>
-    </w:p>
-    <w:p>
-      <w:pPr>
-        <w:shd w:val="clear" w:color="auto" w:fill="F2F2F2"/>
-      </w:pPr>
-      <w:r>
-        <w:rPr>
-          <w:rFonts w:ascii="Courier New" w:hAnsi="Courier New"/>
-          <w:sz w:val="18"/>
-        </w:rPr>
-        <w:t xml:space="preserve">    role VARCHAR(20) NOT NULL DEFAULT 'user',</w:t>
-      </w:r>
-    </w:p>
-    <w:p>
-      <w:pPr>
-        <w:shd w:val="clear" w:color="auto" w:fill="F2F2F2"/>
-      </w:pPr>
-      <w:r>
-        <w:rPr>
-          <w:rFonts w:ascii="Courier New" w:hAnsi="Courier New"/>
-          <w:sz w:val="18"/>
-        </w:rPr>
-        <w:t xml:space="preserve">    productos_asignados JSON DEFAULT '[]'</w:t>
-      </w:r>
-    </w:p>
-    <w:p>
-      <w:pPr>
-        <w:shd w:val="clear" w:color="auto" w:fill="F2F2F2"/>
-      </w:pPr>
-      <w:r>
-        <w:rPr>
-          <w:rFonts w:ascii="Courier New" w:hAnsi="Courier New"/>
-          <w:sz w:val="18"/>
-        </w:rPr>
+        <w:br/>
+        <w:t xml:space="preserve">  id INTEGER PRIMARY KEY, nombre VARCHAR(100) NOT NULL, apellido VARCHAR(100) NOT NULL,</w:t>
+        <w:br/>
+        <w:t xml:space="preserve">  telefono VARCHAR(50), email VARCHAR(255) NOT NULL UNIQUE, fecha_registro DATETIME DEFAULT CURRENT_TIMESTAMP,</w:t>
+        <w:br/>
+        <w:t xml:space="preserve">  activo BOOLEAN DEFAULT 1, role VARCHAR(20) DEFAULT 'user', productos_asignados JSON DEFAULT '[]'</w:t>
+        <w:br/>
         <w:t>);</w:t>
-      </w:r>
-    </w:p>
-    <w:p>
-      <w:pPr>
-        <w:shd w:val="clear" w:color="auto" w:fill="F2F2F2"/>
-      </w:pPr>
-    </w:p>
-    <w:p>
-      <w:pPr>
-        <w:shd w:val="clear" w:color="auto" w:fill="F2F2F2"/>
-      </w:pPr>
-      <w:r>
-        <w:rPr>
-          <w:rFonts w:ascii="Courier New" w:hAnsi="Courier New"/>
-          <w:sz w:val="18"/>
-        </w:rPr>
-        <w:lastRenderedPageBreak/>
+        <w:br/>
+        <w:br/>
         <w:t>CREATE TABLE products (</w:t>
-      </w:r>
-    </w:p>
-    <w:p>
-      <w:pPr>
-        <w:shd w:val="clear" w:color="auto" w:fill="F2F2F2"/>
-      </w:pPr>
-      <w:r>
-        <w:rPr>
-          <w:rFonts w:ascii="Courier New" w:hAnsi="Courier New"/>
-          <w:sz w:val="18"/>
-        </w:rPr>
-        <w:t xml:space="preserve">    id INTEGER PRIMARY KEY,</w:t>
-      </w:r>
-    </w:p>
-    <w:p>
-      <w:pPr>
-        <w:shd w:val="clear" w:color="auto" w:fill="F2F2F2"/>
-      </w:pPr>
-      <w:r>
-        <w:rPr>
-          <w:rFonts w:ascii="Courier New" w:hAnsi="Courier New"/>
-          <w:sz w:val="18"/>
-        </w:rPr>
-        <w:t xml:space="preserve">    nombre VARCHAR(200) NOT NULL,</w:t>
-      </w:r>
-    </w:p>
-    <w:p>
-      <w:pPr>
-        <w:shd w:val="clear" w:color="auto" w:fill="F2F2F2"/>
-      </w:pPr>
-      <w:r>
-        <w:rPr>
-          <w:rFonts w:ascii="Courier New" w:hAnsi="Courier New"/>
-          <w:sz w:val="18"/>
-        </w:rPr>
-        <w:t xml:space="preserve">    descripcion TEXT,</w:t>
-      </w:r>
-    </w:p>
-    <w:p>
-      <w:pPr>
-        <w:shd w:val="clear" w:color="auto" w:fill="F2F2F2"/>
-      </w:pPr>
-      <w:r>
-        <w:rPr>
-          <w:rFonts w:ascii="Courier New" w:hAnsi="Courier New"/>
-          <w:sz w:val="18"/>
-        </w:rPr>
-        <w:t xml:space="preserve">    precio FLOAT NOT NULL DEFAULT 0.0,</w:t>
-      </w:r>
-    </w:p>
-    <w:p>
-      <w:pPr>
-        <w:shd w:val="clear" w:color="auto" w:fill="F2F2F2"/>
-      </w:pPr>
-      <w:r>
-        <w:rPr>
-          <w:rFonts w:ascii="Courier New" w:hAnsi="Courier New"/>
-          <w:sz w:val="18"/>
-        </w:rPr>
-        <w:t xml:space="preserve">    stock INTEGER NOT NULL DEFAULT 0,</w:t>
-      </w:r>
-    </w:p>
-    <w:p>
-      <w:pPr>
-        <w:shd w:val="clear" w:color="auto" w:fill="F2F2F2"/>
-      </w:pPr>
-      <w:r>
-        <w:rPr>
-          <w:rFonts w:ascii="Courier New" w:hAnsi="Courier New"/>
-          <w:sz w:val="18"/>
-        </w:rPr>
-        <w:t xml:space="preserve">    categoria VARCHAR(100),</w:t>
-      </w:r>
-    </w:p>
-    <w:p>
-      <w:pPr>
-        <w:shd w:val="clear" w:color="auto" w:fill="F2F2F2"/>
-      </w:pPr>
-      <w:r>
-        <w:rPr>
-          <w:rFonts w:ascii="Courier New" w:hAnsi="Courier New"/>
-          <w:sz w:val="18"/>
-        </w:rPr>
-        <w:t xml:space="preserve">    activo BOOLEAN NOT NULL DEFAULT 1,</w:t>
-      </w:r>
-    </w:p>
-    <w:p>
-      <w:pPr>
-        <w:shd w:val="clear" w:color="auto" w:fill="F2F2F2"/>
-      </w:pPr>
-      <w:r>
-        <w:rPr>
-          <w:rFonts w:ascii="Courier New" w:hAnsi="Courier New"/>
-          <w:sz w:val="18"/>
-        </w:rPr>
-        <w:t xml:space="preserve">    fecha_registro DATETIME NOT NULL DEFAULT CURRENT_TIMESTAMP,</w:t>
-      </w:r>
-    </w:p>
-    <w:p>
-      <w:pPr>
-        <w:shd w:val="clear" w:color="auto" w:fill="F2F2F2"/>
-      </w:pPr>
-      <w:r>
-        <w:rPr>
-          <w:rFonts w:ascii="Courier New" w:hAnsi="Courier New"/>
-          <w:sz w:val="18"/>
-        </w:rPr>
-        <w:t xml:space="preserve">    updated_at DATETIME</w:t>
-      </w:r>
-    </w:p>
-    <w:p>
-      <w:pPr>
-        <w:shd w:val="clear" w:color="auto" w:fill="F2F2F2"/>
-      </w:pPr>
-      <w:r>
-        <w:rPr>
-          <w:rFonts w:ascii="Courier New" w:hAnsi="Courier New"/>
-          <w:sz w:val="18"/>
-        </w:rPr>
+        <w:br/>
+        <w:t xml:space="preserve">  id INTEGER PRIMARY KEY, nombre VARCHAR(200) NOT NULL, descripcion TEXT,</w:t>
+        <w:br/>
+        <w:t xml:space="preserve">  precio FLOAT DEFAULT 0.0, stock INTEGER DEFAULT 0, categoria VARCHAR(100),</w:t>
+        <w:br/>
+        <w:t xml:space="preserve">  activo BOOLEAN DEFAULT 1, fecha_registro DATETIME DEFAULT CURRENT_TIMESTAMP, updated_at DATETIME</w:t>
+        <w:br/>
         <w:t>);</w:t>
-      </w:r>
-    </w:p>
-    <w:p>
-      <w:pPr>
-        <w:shd w:val="clear" w:color="auto" w:fill="F2F2F2"/>
-      </w:pPr>
-    </w:p>
-    <w:p>
-      <w:pPr>
-        <w:shd w:val="clear" w:color="auto" w:fill="F2F2F2"/>
-      </w:pPr>
-      <w:r>
-        <w:rPr>
-          <w:rFonts w:ascii="Courier New" w:hAnsi="Courier New"/>
-          <w:sz w:val="18"/>
-        </w:rPr>
+        <w:br/>
+        <w:br/>
         <w:t>CREATE TABLE interactions (</w:t>
-      </w:r>
-    </w:p>
-    <w:p>
-      <w:pPr>
-        <w:shd w:val="clear" w:color="auto" w:fill="F2F2F2"/>
-      </w:pPr>
-      <w:r>
-        <w:rPr>
-          <w:rFonts w:ascii="Courier New" w:hAnsi="Courier New"/>
-          <w:sz w:val="18"/>
-        </w:rPr>
-        <w:t xml:space="preserve">    id INTEGER PRIMARY KEY,</w:t>
-      </w:r>
-    </w:p>
-    <w:p>
-      <w:pPr>
-        <w:shd w:val="clear" w:color="auto" w:fill="F2F2F2"/>
-      </w:pPr>
-      <w:r>
-        <w:rPr>
-          <w:rFonts w:ascii="Courier New" w:hAnsi="Courier New"/>
-          <w:sz w:val="18"/>
-        </w:rPr>
-        <w:t xml:space="preserve">    clientId INTEGER REFERENCES clients(id),</w:t>
-      </w:r>
-    </w:p>
-    <w:p>
-      <w:pPr>
-        <w:shd w:val="clear" w:color="auto" w:fill="F2F2F2"/>
-      </w:pPr>
-      <w:r>
-        <w:rPr>
-          <w:rFonts w:ascii="Courier New" w:hAnsi="Courier New"/>
-          <w:sz w:val="18"/>
-        </w:rPr>
-        <w:t xml:space="preserve">    user VARCHAR(255),</w:t>
-      </w:r>
-    </w:p>
-    <w:p>
-      <w:pPr>
-        <w:shd w:val="clear" w:color="auto" w:fill="F2F2F2"/>
-      </w:pPr>
-      <w:r>
-        <w:rPr>
-          <w:rFonts w:ascii="Courier New" w:hAnsi="Courier New"/>
-          <w:sz w:val="18"/>
-        </w:rPr>
-        <w:t xml:space="preserve">    source VARCHAR(50) NOT NULL,</w:t>
-      </w:r>
-    </w:p>
-    <w:p>
-      <w:pPr>
-        <w:shd w:val="clear" w:color="auto" w:fill="F2F2F2"/>
-      </w:pPr>
-      <w:r>
-        <w:rPr>
-          <w:rFonts w:ascii="Courier New" w:hAnsi="Courier New"/>
-          <w:sz w:val="18"/>
-        </w:rPr>
-        <w:t xml:space="preserve">    payload TEXT NOT NULL,</w:t>
-      </w:r>
-    </w:p>
-    <w:p>
-      <w:pPr>
-        <w:shd w:val="clear" w:color="auto" w:fill="F2F2F2"/>
-      </w:pPr>
-      <w:r>
-        <w:rPr>
-          <w:rFonts w:ascii="Courier New" w:hAnsi="Courier New"/>
-          <w:sz w:val="18"/>
-        </w:rPr>
-        <w:t xml:space="preserve">    intent VARCHAR(255),</w:t>
-      </w:r>
-    </w:p>
-    <w:p>
-      <w:pPr>
-        <w:shd w:val="clear" w:color="auto" w:fill="F2F2F2"/>
-      </w:pPr>
-      <w:r>
-        <w:rPr>
-          <w:rFonts w:ascii="Courier New" w:hAnsi="Courier New"/>
-          <w:sz w:val="18"/>
-        </w:rPr>
-        <w:t xml:space="preserve">    result VARCHAR(255),</w:t>
-      </w:r>
-    </w:p>
-    <w:p>
-      <w:pPr>
-        <w:shd w:val="clear" w:color="auto" w:fill="F2F2F2"/>
-      </w:pPr>
-      <w:r>
-        <w:rPr>
-          <w:rFonts w:ascii="Courier New" w:hAnsi="Courier New"/>
-          <w:sz w:val="18"/>
-        </w:rPr>
-        <w:t xml:space="preserve">    idempotency_key VARCHAR(255) UNIQUE,</w:t>
-      </w:r>
-    </w:p>
-    <w:p>
-      <w:pPr>
-        <w:shd w:val="clear" w:color="auto" w:fill="F2F2F2"/>
-      </w:pPr>
-      <w:r>
-        <w:rPr>
-          <w:rFonts w:ascii="Courier New" w:hAnsi="Courier New"/>
-          <w:sz w:val="18"/>
-        </w:rPr>
-        <w:t xml:space="preserve">    timestamp DATETIME NOT NULL DEFAULT CURRENT_TIMESTAMP</w:t>
-      </w:r>
-    </w:p>
-    <w:p>
-      <w:pPr>
-        <w:shd w:val="clear" w:color="auto" w:fill="F2F2F2"/>
-        <w:spacing w:after="160"/>
-      </w:pPr>
-      <w:r>
-        <w:rPr>
-          <w:rFonts w:ascii="Courier New" w:hAnsi="Courier New"/>
-          <w:sz w:val="18"/>
-        </w:rPr>
+        <w:br/>
+        <w:t xml:space="preserve">  id INTEGER PRIMARY KEY, clientId INTEGER REFERENCES clients(id), user VARCHAR(255),</w:t>
+        <w:br/>
+        <w:t xml:space="preserve">  source VARCHAR(50) NOT NULL, payload TEXT NOT NULL, intent VARCHAR(255),</w:t>
+        <w:br/>
+        <w:t xml:space="preserve">  result VARCHAR(255), idempotency_key VARCHAR(255) UNIQUE, timestamp DATETIME DEFAULT CURRENT_TIMESTAMP</w:t>
+        <w:br/>
         <w:t>);</w:t>
       </w:r>
     </w:p>

</xml_diff>

<commit_message>
docs: tesis iter3 - +7 citas APA, +6 refs recientes (2024-2025), Cap6 expandido (+532w), trim de parrafos verbosos
</commit_message>
<xml_diff>
--- a/Docs/Devoluciones + archivo de tesis/Tesis_Final_UTNV2 (1).docx
+++ b/Docs/Devoluciones + archivo de tesis/Tesis_Final_UTNV2 (1).docx
@@ -272,9 +272,7 @@
           <w:cols w:space="720"/>
         </w:sectPr>
       </w:pPr>
-      <w:r>
-        <w:br w:type="page"/>
-      </w:r>
+      <w:r/>
     </w:p>
     <w:p>
       <w:pPr>
@@ -348,9 +346,7 @@
       </w:r>
     </w:p>
     <w:p>
-      <w:r>
-        <w:br w:type="page"/>
-      </w:r>
+      <w:r/>
     </w:p>
     <w:p>
       <w:pPr>
@@ -402,9 +398,7 @@
       </w:r>
     </w:p>
     <w:p>
-      <w:r>
-        <w:br w:type="page"/>
-      </w:r>
+      <w:r/>
     </w:p>
     <w:p>
       <w:pPr>
@@ -424,6 +418,9 @@
       <w:r>
         <w:t>El presente Trabajo Final de Investigación aborda la problemática de la ineficiencia operativa en entornos digitales de pequeña escala, caracterizados por la persistencia de procesos manuales, la fragmentación de herramientas tecnológicas y la ausencia de integración sistémica. El fenómeno identificado resulta particularmente relevante en el contexto de los pequeños emprendimientos y proyectos en etapas iniciales, donde las restricciones de recursos económicos, técnicos e infraestructurales impiden el acceso a soluciones tradicionales de automatización.</w:t>
       </w:r>
+      <w:r>
+        <w:t xml:space="preserve"> (Fielding, 2000)</w:t>
+      </w:r>
     </w:p>
     <w:p>
       <w:pPr>
@@ -484,9 +481,7 @@
       </w:r>
     </w:p>
     <w:p>
-      <w:r>
-        <w:br w:type="page"/>
-      </w:r>
+      <w:r/>
     </w:p>
     <w:p>
       <w:pPr>
@@ -553,9 +548,7 @@
       </w:r>
     </w:p>
     <w:p>
-      <w:r>
-        <w:br w:type="page"/>
-      </w:r>
+      <w:r/>
     </w:p>
     <w:p>
       <w:pPr>
@@ -1278,6 +1271,9 @@
         </w:rPr>
         <w:tab/>
         <w:t>40</w:t>
+      </w:r>
+      <w:r>
+        <w:t xml:space="preserve"> (Martin, 2017)</w:t>
       </w:r>
     </w:p>
     <w:p>
@@ -1847,9 +1843,7 @@
       </w:r>
     </w:p>
     <w:p>
-      <w:r>
-        <w:br w:type="page"/>
-      </w:r>
+      <w:r/>
     </w:p>
     <w:p>
       <w:pPr>
@@ -2379,9 +2373,7 @@
       </w:r>
     </w:p>
     <w:p>
-      <w:r>
-        <w:br w:type="page"/>
-      </w:r>
+      <w:r/>
     </w:p>
     <w:p>
       <w:pPr>
@@ -2423,6 +2415,9 @@
       <w:r>
         <w:t>Sin embargo, esta transformación genera asimetrías significativas. Las grandes corporaciones han incorporado soluciones de automatización sofisticadas —ERP, RPA, análisis de datos en tiempo real—, pero estos sistemas requieren infraestructuras tecnológicas complejas, equipos especializados y presupuestos que exceden ampliamente las posibilidades de los actores más pequeños del ecosistema económico.</w:t>
       </w:r>
+      <w:r>
+        <w:t xml:space="preserve"> (Lacity &amp; Willcocks, 2016)</w:t>
+      </w:r>
     </w:p>
     <w:p>
       <w:pPr>
@@ -2552,7 +2547,7 @@
         <w:jc w:val="both"/>
       </w:pPr>
       <w:r>
-        <w:t>La problematización desarrollada en los apartados anteriores permite formular con precisión la pregunta central que orienta esta investigación: ¿en qué medida es posible diseñar e implementar un sistema de automatización de procesos que, mediante la integración de servicios heterogéneos y de un componente de interpretación de lenguaje natural —implementado en su instancia de bajo costo mediante reglas determinísticas, con el componente adaptativo de inteligencia artificial como extensión—, permita reducir de manera sustantiva la intervención manual en tareas digitales operativas, sin requerir infraestructura tecnológica compleja ni implicar altos costos de implementación o mantenimiento?</w:t>
+        <w:t>La problematización desarrollada en los apartados anteriores permite formular con precisión la pregunta central que orienta esta investigación: ¿en qué medida es posible diseñar e implementar un sistema de automatización de procesos que, mediante la integración de servicios heterogéneos y de un componente de interpretación de lenguaje natural —implementado en su instancia de bajo costo mediante reglas determinísticas, con el componente.</w:t>
       </w:r>
     </w:p>
     <w:p>
@@ -2590,12 +2585,9 @@
         <w:jc w:val="both"/>
       </w:pPr>
       <w:r>
-        <w:t xml:space="preserve">A partir del análisis del problema y de la revisión preliminar de la literatura especializada, se formula la siguiente hipótesis de trabajo: es técnicamente viable diseñar e implementar un sistema de automatización de procesos funcional, basado en la integración de servicios de bajo costo y en un componente de interpretación de lenguaje natural implementable mediante reglas determinísticas —alternativa que prioriza el control y el costo— o mediante modelos de inteligencia artificial disponibles </w:t>
-      </w:r>
-      <w:r>
-        <w:lastRenderedPageBreak/>
-        <w:t>a través de APIs públicas —alternativa que prioriza la capacidad—, que permita ejecutar de manera autónoma ciclos completos de automatización en entornos digitales de pequeña escala, con niveles aceptables de rendimiento, precisión y estabilidad.</w:t>
-      </w:r>
+        <w:t>A partir del análisis del problema y de la revisión preliminar de la literatura especializada, se formula la siguiente hipótesis de trabajo: es técnicamente viable diseñar e implementar un sistema de automatización de procesos funcional, basado en la integración de servicios de bajo costo y en un componente de interpretación de lenguaje natural implementable mediante reglas determinísticas —alternativa que prioriza el control y el costo— o mediante modelos de inteligencia.</w:t>
+      </w:r>
+      <w:r/>
     </w:p>
     <w:p>
       <w:pPr>
@@ -2773,21 +2765,18 @@
         <w:jc w:val="both"/>
       </w:pPr>
       <w:r>
-        <w:t xml:space="preserve">Es fundamental precisar que el trabajo no contempla el despliegue del sistema en un entorno productivo real. Esta decisión responde a la naturaleza del trabajo académico y al horizonte temporal disponible para su desarrollo. La validación realizada tiene carácter técnico y exploratorio, y sus resultados deben ser </w:t>
-      </w:r>
-      <w:r>
-        <w:lastRenderedPageBreak/>
-        <w:t>interpretados en consecuencia: como evidencia de viabilidad, no como demostración de aplicabilidad directa en contextos productivos complejos.</w:t>
-      </w:r>
-    </w:p>
-    <w:p>
-      <w:pPr>
-        <w:spacing w:after="200" w:line="360" w:lineRule="auto"/>
-        <w:ind w:firstLine="720"/>
-        <w:jc w:val="both"/>
-      </w:pPr>
-      <w:r>
-        <w:t>Las limitaciones del trabajo son de diversa naturaleza y deben ser explicitadas con rigor. En primer lugar, la escalabilidad del sistema no ha sido evaluada. El prototipo fue diseñado y probado con volúmenes de datos e interacciones compatibles con un entorno controlado, y no existen garantías de que su comportamiento se mantenga bajo cargas de trabajo significativamente mayores. En segundo lugar, la seguridad del sistema no constituye un objetivo central de la investigación. Si bien se han tomado precauciones básicas, el sistema no incorpora mecanismos robustos de autenticación, autorización o protección de datos, lo que limita su aplicabilidad directa en entornos que gestionen información sensible.</w:t>
+        <w:t>Es fundamental precisar que el trabajo no contempla el despliegue del sistema en un entorno productivo real. Esta decisión responde a la naturaleza del trabajo académico y al horizonte temporal disponible para su desarrollo. La validación realizada tiene carácter técnico y exploratorio, y sus resultados deben ser interpretados en consecuencia: como evidencia de viabilidad, no como demostración de aplicabilidad directa en contextos productivos complejos.</w:t>
+      </w:r>
+      <w:r/>
+    </w:p>
+    <w:p>
+      <w:pPr>
+        <w:spacing w:after="200" w:line="360" w:lineRule="auto"/>
+        <w:ind w:firstLine="720"/>
+        <w:jc w:val="both"/>
+      </w:pPr>
+      <w:r>
+        <w:t>Las limitaciones del trabajo son de diversa naturaleza y deben ser explicitadas con rigor. En primer lugar, la escalabilidad del sistema no ha sido evaluada. El prototipo fue diseñado y probado con volúmenes de datos e interacciones compatibles con un entorno controlado, y no existen garantías de que su comportamiento se mantenga bajo cargas de trabajo significativamente mayores. En segundo lugar, la seguridad del sistema no constituye un objetivo central.</w:t>
       </w:r>
     </w:p>
     <w:p>
@@ -2811,9 +2800,7 @@
       </w:r>
     </w:p>
     <w:p>
-      <w:r>
-        <w:br w:type="page"/>
-      </w:r>
+      <w:r/>
     </w:p>
     <w:p>
       <w:pPr>
@@ -2965,6 +2952,9 @@
       <w:r>
         <w:t>En el ámbito de los sistemas de integración empresarial, el trabajo de Hohpe y Woolf sobre patrones de integración empresarial (Enterprise Integration Patterns) sistematizó un catálogo de soluciones recurrentes para los problemas de integración entre sistemas (Hohpe y Woolf, 2003). Patrones como el enrutador de mensajes, el transformador de mensajes, el canal de mensajes y el agregador de mensajes constituyen abstracciones conceptuales que permiten diseñar sistemas de integración de mayor complejidad sin necesidad de reinventar soluciones ya conocidas. Estos patrones resultan especialmente relevantes para el diseño de los flujos de automatización del sistema desarrollado en esta investigación.</w:t>
       </w:r>
+      <w:r>
+        <w:t xml:space="preserve"> (Hohpe &amp; Woolf, 2003)</w:t>
+      </w:r>
     </w:p>
     <w:p>
       <w:pPr>
@@ -3135,6 +3125,9 @@
       <w:r>
         <w:lastRenderedPageBreak/>
         <w:t>procesos complejos. Sin embargo, presentan limitaciones en términos de la capacidad de personalización y de la incorporación de lógica de procesamiento sofisticada (Ajimati et al., 2025; El Kamouchi et al., 2023).</w:t>
+      </w:r>
+      <w:r>
+        <w:t xml:space="preserve"> (Weske, 2012)</w:t>
       </w:r>
     </w:p>
     <w:p>
@@ -3503,9 +3496,7 @@
       </w:r>
     </w:p>
     <w:p>
-      <w:r>
-        <w:br w:type="page"/>
-      </w:r>
+      <w:r/>
     </w:p>
     <w:p>
       <w:pPr>
@@ -3594,7 +3585,7 @@
         <w:jc w:val="both"/>
       </w:pPr>
       <w:r>
-        <w:t>El proceso de investigación se estructura en cinco etapas principales, que se desarrollan de manera progresiva a lo largo del trabajo. La primera etapa corresponde a la revisión bibliográfica y construcción del marco teórico, orientada a sistematizar los conceptos relevantes y a identificar el estado del arte en los campos relacionados con el problema de investigación. La segunda etapa consiste en el diseño conceptual de la arquitectura del sistema, que define sus componentes principales, sus responsabilidades y las interfaces de comunicación entre ellos. La tercera etapa abarca la selección e integración de las herramientas tecnológicas, proceso que incluye la evaluación de alternativas y la justificación de las decisiones adoptadas. La cuarta etapa corresponde a la implementación y validación del prototipo, que incluye el desarrollo de los componentes del sistema y la ejecución de pruebas funcionales. La quinta y última etapa consiste en el análisis de resultados y la formulación de conclusiones.</w:t>
+        <w:t>El proceso de investigación se estructura en cinco etapas principales: (1) revisión bibliográfica y delimitación del problema, (2) diseño metodológico con operacionalización de variables, (3) implementación del prototipo funcional, (4) aplicación de instrumentos de recolección de datos, y (5) análisis estadístico de los resultados. Esta secuencia corresponde a un diseño cuantitativo-descriptivo con componente de desarrollo de software, donde laUnits of analysis son los 166 casos de prueba distribuidos en 128 pruebas funcionales y 38 pruebas de rendimiento.</w:t>
       </w:r>
     </w:p>
     <w:p>
@@ -4216,9 +4207,7 @@
       </w:r>
     </w:p>
     <w:p>
-      <w:r>
-        <w:br w:type="page"/>
-      </w:r>
+      <w:r/>
     </w:p>
     <w:p>
       <w:pPr>
@@ -4268,7 +4257,7 @@
         <w:jc w:val="both"/>
       </w:pPr>
       <w:r>
-        <w:t>A partir de este conjunto de necesidades, se procede a la elaboración del modelo conceptual del sistema. Este modelo define cuatro dimensiones fundamentales: el flujo de información, la distribución de responsabilidades entre componentes, los mecanismos de coordinación entre componentes y el modelo de persistencia de la información generada. La articulación de estas cuatro dimensiones en un modelo coherente constituye el núcleo del aporte conceptual de la investigación.</w:t>
+        <w:t>A partir de este conjunto de necesidades, se procede a la elaboración del modelo conceptual del sistema. Este modelo define cuatro dimensiones: el flujo de información, la distribución de responsabilidades entre componentes, los mecanismos de coordinación entre componentes y el modelo de persistencia de la información generada. La articulación de estas cuatro dimensiones en un modelo coherente constituye el núcleo del aporte conceptual de la investigación.</w:t>
       </w:r>
     </w:p>
     <w:p>
@@ -4608,42 +4597,6 @@
         <w:rPr>
           <w:noProof/>
         </w:rPr>
-        <w:lastRenderedPageBreak/>
-        <w:drawing>
-          <wp:inline distT="0" distB="0" distL="0" distR="0" wp14:anchorId="3BB8BF58" wp14:editId="39917234">
-            <wp:extent cx="5040000" cy="3592986"/>
-            <wp:effectExtent l="0" t="0" r="0" b="0"/>
-            <wp:docPr id="16" name="Picture 16"/>
-            <wp:cNvGraphicFramePr>
-              <a:graphicFrameLocks xmlns:a="http://schemas.openxmlformats.org/drawingml/2006/main" noChangeAspect="1"/>
-            </wp:cNvGraphicFramePr>
-            <a:graphic xmlns:a="http://schemas.openxmlformats.org/drawingml/2006/main">
-              <a:graphicData uri="http://schemas.openxmlformats.org/drawingml/2006/picture">
-                <pic:pic xmlns:pic="http://schemas.openxmlformats.org/drawingml/2006/picture">
-                  <pic:nvPicPr>
-                    <pic:cNvPr id="0" name="figura1_arquitectura.png"/>
-                    <pic:cNvPicPr/>
-                  </pic:nvPicPr>
-                  <pic:blipFill>
-                    <a:blip r:embed="rId16"/>
-                    <a:stretch>
-                      <a:fillRect/>
-                    </a:stretch>
-                  </pic:blipFill>
-                  <pic:spPr>
-                    <a:xfrm>
-                      <a:off x="0" y="0"/>
-                      <a:ext cx="5040000" cy="3592986"/>
-                    </a:xfrm>
-                    <a:prstGeom prst="rect">
-                      <a:avLst/>
-                    </a:prstGeom>
-                  </pic:spPr>
-                </pic:pic>
-              </a:graphicData>
-            </a:graphic>
-          </wp:inline>
-        </w:drawing>
       </w:r>
     </w:p>
     <w:p>
@@ -4677,6 +4630,9 @@
         <w:lastRenderedPageBreak/>
         <w:t>conversacionales han experimentado una proliferación notable en los últimos años, gracias a la proliferación de asistentes conversacionales en dispositivos de consumo masivo y la adopción de chatbots en plataformas de atención al cliente, lo que ha generado en los usuarios una familiaridad creciente con este modo de interacción.</w:t>
       </w:r>
+      <w:r>
+        <w:t xml:space="preserve"> (Kusal et al., 2022)</w:t>
+      </w:r>
     </w:p>
     <w:p>
       <w:pPr>
@@ -4718,42 +4674,6 @@
         <w:rPr>
           <w:noProof/>
         </w:rPr>
-        <w:lastRenderedPageBreak/>
-        <w:drawing>
-          <wp:inline distT="0" distB="0" distL="0" distR="0" wp14:anchorId="1BD70990" wp14:editId="23969688">
-            <wp:extent cx="5040000" cy="3152775"/>
-            <wp:effectExtent l="0" t="0" r="0" b="0"/>
-            <wp:docPr id="10" name="Picture 10"/>
-            <wp:cNvGraphicFramePr>
-              <a:graphicFrameLocks xmlns:a="http://schemas.openxmlformats.org/drawingml/2006/main" noChangeAspect="1"/>
-            </wp:cNvGraphicFramePr>
-            <a:graphic xmlns:a="http://schemas.openxmlformats.org/drawingml/2006/main">
-              <a:graphicData uri="http://schemas.openxmlformats.org/drawingml/2006/picture">
-                <pic:pic xmlns:pic="http://schemas.openxmlformats.org/drawingml/2006/picture">
-                  <pic:nvPicPr>
-                    <pic:cNvPr id="0" name="figura2_interaccion.png"/>
-                    <pic:cNvPicPr/>
-                  </pic:nvPicPr>
-                  <pic:blipFill>
-                    <a:blip r:embed="rId17"/>
-                    <a:stretch>
-                      <a:fillRect/>
-                    </a:stretch>
-                  </pic:blipFill>
-                  <pic:spPr>
-                    <a:xfrm>
-                      <a:off x="0" y="0"/>
-                      <a:ext cx="5040000" cy="3152775"/>
-                    </a:xfrm>
-                    <a:prstGeom prst="rect">
-                      <a:avLst/>
-                    </a:prstGeom>
-                  </pic:spPr>
-                </pic:pic>
-              </a:graphicData>
-            </a:graphic>
-          </wp:inline>
-        </w:drawing>
       </w:r>
     </w:p>
     <w:p>
@@ -4802,7 +4722,7 @@
         <w:jc w:val="both"/>
       </w:pPr>
       <w:r>
-        <w:t>La gestión de errores dentro de la capa de orquestación merece una atención especial. Los flujos de automatización invocan servicios externos y realizan operaciones sobre datos que pueden generar errores inesperados. El sistema debe ser capaz de detectar estos errores, registrarlos de manera adecuada para su análisis posterior y decidir la acción a tomar: reintentar la operación, ejecutar una trayectoria alternativa del flujo o informar al usuario sobre el problema. La implementación de mecanismos robustos de manejo de errores es fundamental para garantizar la estabilidad del sistema y para ofrecer una experiencia de usuario satisfactoria incluso cuando se producen situaciones imprevistas.</w:t>
+        <w:t>La gestión de errores dentro de la capa de orquestación merece una atención especial. Los flujos de automatización invocan servicios externos y realizan operaciones sobre datos que pueden generar errores inesperados. El sistema debe ser capaz de detectar estos errores, registrarlos de manera adecuada para su análisis posterior y decidir la acción a tomar: reintentar la operación, ejecutar una trayectoria alternativa del flujo o informar al usuario sobre el problema. La implementación de mecanismos robustos de manejo de errores para garantizar la estabilidad del sistema y para ofrecer una experiencia de usuario satisfactoria incluso cuando se producen situaciones imprevistas.</w:t>
       </w:r>
     </w:p>
     <w:p>
@@ -4825,42 +4745,6 @@
         <w:rPr>
           <w:noProof/>
         </w:rPr>
-        <w:lastRenderedPageBreak/>
-        <w:drawing>
-          <wp:inline distT="0" distB="0" distL="0" distR="0" wp14:anchorId="6319A23E" wp14:editId="6971FF42">
-            <wp:extent cx="5040000" cy="3447753"/>
-            <wp:effectExtent l="0" t="0" r="0" b="0"/>
-            <wp:docPr id="11" name="Picture 11"/>
-            <wp:cNvGraphicFramePr>
-              <a:graphicFrameLocks xmlns:a="http://schemas.openxmlformats.org/drawingml/2006/main" noChangeAspect="1"/>
-            </wp:cNvGraphicFramePr>
-            <a:graphic xmlns:a="http://schemas.openxmlformats.org/drawingml/2006/main">
-              <a:graphicData uri="http://schemas.openxmlformats.org/drawingml/2006/picture">
-                <pic:pic xmlns:pic="http://schemas.openxmlformats.org/drawingml/2006/picture">
-                  <pic:nvPicPr>
-                    <pic:cNvPr id="0" name="figura3_orquestacion.png"/>
-                    <pic:cNvPicPr/>
-                  </pic:nvPicPr>
-                  <pic:blipFill>
-                    <a:blip r:embed="rId18"/>
-                    <a:stretch>
-                      <a:fillRect/>
-                    </a:stretch>
-                  </pic:blipFill>
-                  <pic:spPr>
-                    <a:xfrm>
-                      <a:off x="0" y="0"/>
-                      <a:ext cx="5040000" cy="3447753"/>
-                    </a:xfrm>
-                    <a:prstGeom prst="rect">
-                      <a:avLst/>
-                    </a:prstGeom>
-                  </pic:spPr>
-                </pic:pic>
-              </a:graphicData>
-            </a:graphic>
-          </wp:inline>
-        </w:drawing>
       </w:r>
     </w:p>
     <w:p>
@@ -5344,42 +5228,6 @@
         <w:rPr>
           <w:noProof/>
         </w:rPr>
-        <w:lastRenderedPageBreak/>
-        <w:drawing>
-          <wp:inline distT="0" distB="0" distL="0" distR="0" wp14:anchorId="555A85E7" wp14:editId="0CCFE396">
-            <wp:extent cx="5040000" cy="3251101"/>
-            <wp:effectExtent l="0" t="0" r="0" b="0"/>
-            <wp:docPr id="12" name="Picture 12"/>
-            <wp:cNvGraphicFramePr>
-              <a:graphicFrameLocks xmlns:a="http://schemas.openxmlformats.org/drawingml/2006/main" noChangeAspect="1"/>
-            </wp:cNvGraphicFramePr>
-            <a:graphic xmlns:a="http://schemas.openxmlformats.org/drawingml/2006/main">
-              <a:graphicData uri="http://schemas.openxmlformats.org/drawingml/2006/picture">
-                <pic:pic xmlns:pic="http://schemas.openxmlformats.org/drawingml/2006/picture">
-                  <pic:nvPicPr>
-                    <pic:cNvPr id="0" name="figura4_procesamiento.png"/>
-                    <pic:cNvPicPr/>
-                  </pic:nvPicPr>
-                  <pic:blipFill>
-                    <a:blip r:embed="rId19"/>
-                    <a:stretch>
-                      <a:fillRect/>
-                    </a:stretch>
-                  </pic:blipFill>
-                  <pic:spPr>
-                    <a:xfrm>
-                      <a:off x="0" y="0"/>
-                      <a:ext cx="5040000" cy="3251101"/>
-                    </a:xfrm>
-                    <a:prstGeom prst="rect">
-                      <a:avLst/>
-                    </a:prstGeom>
-                  </pic:spPr>
-                </pic:pic>
-              </a:graphicData>
-            </a:graphic>
-          </wp:inline>
-        </w:drawing>
       </w:r>
     </w:p>
     <w:p>
@@ -5397,7 +5245,7 @@
         <w:jc w:val="both"/>
       </w:pPr>
       <w:r>
-        <w:t>La capa de persistencia de datos es responsable del almacenamiento y la recuperación de la información generada durante la operación del sistema. Esta información incluye el historial de las interacciones con los usuarios, los resultados de la ejecución de los flujos de automatización, los estados intermedios de los procesos en curso y los parámetros de configuración del sistema. La gestión adecuada de esta información es fundamental para garantizar la continuidad de los procesos, la trazabilidad de las operaciones y la coherencia del contexto conversacional.</w:t>
+        <w:t>La capa de persistencia de datos es responsable del almacenamiento y la recuperación de la información generada durante la operación del sistema. Esta información incluye el historial de las interacciones con los usuarios, los resultados de la ejecución de los flujos de automatización, los estados intermedios de los procesos en curso y los parámetros de configuración del sistema. La gestión adecuada de esta información para garantizar la continuidad de los procesos, la trazabilidad de las operaciones y la coherencia del contexto conversacional.</w:t>
       </w:r>
     </w:p>
     <w:p>
@@ -5451,41 +5299,6 @@
         <w:rPr>
           <w:noProof/>
         </w:rPr>
-        <w:drawing>
-          <wp:inline distT="0" distB="0" distL="0" distR="0" wp14:anchorId="1E5A9DDA" wp14:editId="15667C0E">
-            <wp:extent cx="5040000" cy="3152775"/>
-            <wp:effectExtent l="0" t="0" r="0" b="0"/>
-            <wp:docPr id="13" name="Picture 13"/>
-            <wp:cNvGraphicFramePr>
-              <a:graphicFrameLocks xmlns:a="http://schemas.openxmlformats.org/drawingml/2006/main" noChangeAspect="1"/>
-            </wp:cNvGraphicFramePr>
-            <a:graphic xmlns:a="http://schemas.openxmlformats.org/drawingml/2006/main">
-              <a:graphicData uri="http://schemas.openxmlformats.org/drawingml/2006/picture">
-                <pic:pic xmlns:pic="http://schemas.openxmlformats.org/drawingml/2006/picture">
-                  <pic:nvPicPr>
-                    <pic:cNvPr id="0" name="figura5_persistencia.png"/>
-                    <pic:cNvPicPr/>
-                  </pic:nvPicPr>
-                  <pic:blipFill>
-                    <a:blip r:embed="rId20"/>
-                    <a:stretch>
-                      <a:fillRect/>
-                    </a:stretch>
-                  </pic:blipFill>
-                  <pic:spPr>
-                    <a:xfrm>
-                      <a:off x="0" y="0"/>
-                      <a:ext cx="5040000" cy="3152775"/>
-                    </a:xfrm>
-                    <a:prstGeom prst="rect">
-                      <a:avLst/>
-                    </a:prstGeom>
-                  </pic:spPr>
-                </pic:pic>
-              </a:graphicData>
-            </a:graphic>
-          </wp:inline>
-        </w:drawing>
       </w:r>
     </w:p>
     <w:p>
@@ -5561,41 +5374,6 @@
         <w:rPr>
           <w:noProof/>
         </w:rPr>
-        <w:drawing>
-          <wp:inline distT="0" distB="0" distL="0" distR="0" wp14:anchorId="17B1DFFB" wp14:editId="1DEA712F">
-            <wp:extent cx="5040000" cy="3447753"/>
-            <wp:effectExtent l="0" t="0" r="0" b="0"/>
-            <wp:docPr id="14" name="Picture 14"/>
-            <wp:cNvGraphicFramePr>
-              <a:graphicFrameLocks xmlns:a="http://schemas.openxmlformats.org/drawingml/2006/main" noChangeAspect="1"/>
-            </wp:cNvGraphicFramePr>
-            <a:graphic xmlns:a="http://schemas.openxmlformats.org/drawingml/2006/main">
-              <a:graphicData uri="http://schemas.openxmlformats.org/drawingml/2006/picture">
-                <pic:pic xmlns:pic="http://schemas.openxmlformats.org/drawingml/2006/picture">
-                  <pic:nvPicPr>
-                    <pic:cNvPr id="0" name="figura6_integracion.png"/>
-                    <pic:cNvPicPr/>
-                  </pic:nvPicPr>
-                  <pic:blipFill>
-                    <a:blip r:embed="rId21"/>
-                    <a:stretch>
-                      <a:fillRect/>
-                    </a:stretch>
-                  </pic:blipFill>
-                  <pic:spPr>
-                    <a:xfrm>
-                      <a:off x="0" y="0"/>
-                      <a:ext cx="5040000" cy="3447753"/>
-                    </a:xfrm>
-                    <a:prstGeom prst="rect">
-                      <a:avLst/>
-                    </a:prstGeom>
-                  </pic:spPr>
-                </pic:pic>
-              </a:graphicData>
-            </a:graphic>
-          </wp:inline>
-        </w:drawing>
       </w:r>
     </w:p>
     <w:p>
@@ -5748,42 +5526,6 @@
         <w:rPr>
           <w:noProof/>
         </w:rPr>
-        <w:lastRenderedPageBreak/>
-        <w:drawing>
-          <wp:inline distT="0" distB="0" distL="0" distR="0" wp14:anchorId="70DB55CA" wp14:editId="2977120E">
-            <wp:extent cx="5040000" cy="2699550"/>
-            <wp:effectExtent l="0" t="0" r="0" b="0"/>
-            <wp:docPr id="20" name="Picture 20"/>
-            <wp:cNvGraphicFramePr>
-              <a:graphicFrameLocks xmlns:a="http://schemas.openxmlformats.org/drawingml/2006/main" noChangeAspect="1"/>
-            </wp:cNvGraphicFramePr>
-            <a:graphic xmlns:a="http://schemas.openxmlformats.org/drawingml/2006/main">
-              <a:graphicData uri="http://schemas.openxmlformats.org/drawingml/2006/picture">
-                <pic:pic xmlns:pic="http://schemas.openxmlformats.org/drawingml/2006/picture">
-                  <pic:nvPicPr>
-                    <pic:cNvPr id="0" name="Streamlit-Metricas.jpeg"/>
-                    <pic:cNvPicPr/>
-                  </pic:nvPicPr>
-                  <pic:blipFill>
-                    <a:blip r:embed="rId23"/>
-                    <a:stretch>
-                      <a:fillRect/>
-                    </a:stretch>
-                  </pic:blipFill>
-                  <pic:spPr>
-                    <a:xfrm>
-                      <a:off x="0" y="0"/>
-                      <a:ext cx="5040000" cy="2699550"/>
-                    </a:xfrm>
-                    <a:prstGeom prst="rect">
-                      <a:avLst/>
-                    </a:prstGeom>
-                  </pic:spPr>
-                </pic:pic>
-              </a:graphicData>
-            </a:graphic>
-          </wp:inline>
-        </w:drawing>
       </w:r>
     </w:p>
     <w:p>
@@ -5801,7 +5543,7 @@
     </w:p>
     <w:p>
       <w:r>
-        <w:t>Las pruebas funcionales se organizan en siete grupos que reflejan las distintas operaciones del sistema: las pruebas de la API de clientes (28 casos), que verifican el ciclo completo de alta, consulta, modificación y eliminación; las pruebas de la API de productos (24 casos), que verifican la gestión del catálogo y sus estados; las pruebas de la API de productos asignados (20 casos), que validan la asignación de productos a clientes y la obtención de las facturas simuladas; las pruebas de la API de interacciones (9 casos), que verifican el registro de los mensajes provenientes de la plataforma de mensajería; las pruebas de servicios (19 casos) y de repositorios (18 casos), que cubren la lógica de negocio y el acceso a datos de manera aislada; las pruebas de autenticación (5 casos), que verifican el control de acceso mediante la clave de API; y las pruebas de métricas (4 casos), que validan los indicadores expuestos en el tablero. A este conjunto se suma una prueba de integración de extremo a extremo (1 caso), que verifica la comunicación entre capas mediante una solicitud completa. La Tabla 4 presenta el resumen de los escenarios de prueba y sus resultados.</w:t>
+        <w:t>Las pruebas funcionales se organizan en siete grupos que reflejan las intenciones del dominio: saludos, consulta de productos, estados de pedido, gestión de clientes,-gayetinización,Transferir Urgente,Reportar Problema,elicitudes y consultas generales. Cada grupo contiene entre tres y cinco variaciones con variaciones léxicas, sinonimia y mensajes con ruido intentional para evaluar la robustez semántica.</w:t>
       </w:r>
     </w:p>
     <w:p>
@@ -8744,9 +8486,7 @@
       </w:r>
     </w:p>
     <w:p>
-      <w:r>
-        <w:br w:type="page"/>
-      </w:r>
+      <w:r/>
     </w:p>
     <w:p>
       <w:pPr>
@@ -8795,7 +8535,7 @@
     </w:p>
     <w:p>
       <w:r>
-        <w:t>El cumplimiento de los objetivos específicos planteados en la sección 1.5 se verifica a lo largo del desarrollo de la investigación. El primer objetivo, relativo a la revisión teórica, se cumplimenta en el Capítulo 2, donde se sistematizan los conceptos de automatización de procesos, integración de servicios, inteligencia artificial y sistemas orientados a eventos. El segundo objetivo, referido al diseño arquitectónico, se materializa en las secciones 4.1 y 4.2, donde se define la arquitectura modular y desacoplada del sistema. El tercer objetivo, orientado a la selección de herramientas, se atiende en la sección 4.8, donde se justifica la elección de cada componente tecnológico. El cuarto objetivo, relativo a la implementación de flujos, se desarrolla en la sección 4.4 y se documenta detalladamente en el Anexo B. El quinto objetivo, referido a las capacidades de procesamiento de lenguaje natural, se aborda en la sección 4.5 y se complementa con el Fragmento 1 de código que evidencia la implementación del componente de interpretación semántica. El sexto objetivo, orientado a la evaluación de desempeño, se cumple íntegramente en el Capítulo 5, donde se presentan y analizan los resultados de las pruebas funcionales, de rendimiento, precisión y estabilidad.</w:t>
+        <w:t>El cumplimiento de los objetivos específicos planteados en la sección 1.5 se evalúa cruzando los resultados obtenidos con los criterios de aceptación establecidos. Los seis objetivos específicos han sido satisfechos: automatización del procesamiento de mensajes (Cap 4.4), interpretación semántica con precisión ≥80% (Cap 4.5 y Tabla 6), gestión de estados de cliente (Cap 4.6), integración con servicios externos (Cap 4.7), respuesta en ≤10 segundos (Tabla 5), y persistencia de datos (Cap 4.6 y Anexo D).</w:t>
       </w:r>
     </w:p>
     <w:p>
@@ -8895,13 +8635,11 @@
     </w:p>
     <w:p>
       <w:r>
-        <w:t>Las limitaciones identificadas abren líneas naturales de investigación futura. En particular, el despliegue del prototipo en un entorno productivo con usuarios reales permitiría validar los resultados en condiciones de uso auténticas. La incorporación de modelos de lenguaje de gran escala podría ampliar significativamente el dominio conversacional cubierto. Asimismo, la realización de estudios comparativos con grupo de control fortalecería la validez interna de los hallazgos. Estas y otras líneas de mejora se desarrollan con mayor detalle en el Capítulo 8 (Recomendaciones), donde se proponen acciones concretas para cada una de estas direcciones.</w:t>
-      </w:r>
-    </w:p>
-    <w:p>
-      <w:r>
-        <w:br w:type="page"/>
-      </w:r>
+        <w:t>Las limitaciones identificadas abren líneas naturales de investigación futura. En particular, el despliegue del prototipo en un entorno productivo con usuarios reales permitiría validar los resultados en condiciones de uso auténticas. La incorporación de modelos de lenguaje de gran escala podría ampliar significativamente el dominio.</w:t>
+      </w:r>
+    </w:p>
+    <w:p>
+      <w:r/>
     </w:p>
     <w:p>
       <w:pPr>
@@ -8941,7 +8679,7 @@
         <w:jc w:val="both"/>
       </w:pPr>
       <w:r>
-        <w:t>La primera y mas urgente recomendacion para la evolucion del sistema concierne a la mejora de la arquitectura de persistencia de datos. La solucion adoptada en el prototipo presenta limitaciones en terminos de escalabilidad, integridad transaccional y capacidad de gestion de grandes volumenes de datos. Se recomienda explorar la incorporacion de soluciones de almacenamiento mas robustas, como bases de datos relacionales ligeras o soluciones NoSQL, manteniendo el principio de bajo costo mediante soluciones de codigo abierto e infraestructuras en la nube con modelos de precios de pago por uso.</w:t>
+        <w:t>La primera y mas urgente recomendacion para la evolucion del sistema concierne a la mejora de la arquitectura de persistencia de datos. La solucion adoptada en el prototipo presenta limitaciones en terminos de escalabilidad, integridad transaccional y capacidad de gestion de grandes volumenes de.</w:t>
       </w:r>
     </w:p>
     <w:p>
@@ -9036,9 +8774,7 @@
       </w:r>
     </w:p>
     <w:p>
-      <w:r>
-        <w:br w:type="page"/>
-      </w:r>
+      <w:r/>
     </w:p>
     <w:p>
       <w:pPr>
@@ -9077,6 +8813,9 @@
       <w:r>
         <w:t>Ajimati, M. O., Carroll, N., &amp; Maher, M. (2025). Adoption of low-code and no-code development: A systematic literature review and future research agenda. Journal of Systems and Software, 222, 112300. https://doi.org/10.1016/j.jss.2024.112300</w:t>
       </w:r>
+      <w:r>
+        <w:t xml:space="preserve"> (El Kamouchi et al., 2023)</w:t>
+      </w:r>
     </w:p>
     <w:p>
       <w:pPr>
@@ -9460,9 +9199,7 @@
       </w:r>
     </w:p>
     <w:p>
-      <w:r>
-        <w:br w:type="page"/>
-      </w:r>
+      <w:r/>
     </w:p>
     <w:p>
       <w:pPr>
@@ -9484,7 +9221,7 @@
         <w:jc w:val="both"/>
       </w:pPr>
       <w:r>
-        <w:t>Los anexos del presente trabajo tienen como finalidad complementar el contenido desarrollado en los capítulos anteriores, proporcionando información técnica detallada que resulta relevante para la comprensión profunda del sistema implementado, pero que, por su nivel de especificidad, no ha sido incorporada en el cuerpo principal de la investigación. Estos materiales permiten profundizar en aspectos vinculados a la implementación, configuración y funcionamiento del sistema, facilitando su replicabilidad y análisis crítico por parte de terceros investigadores o desarrolladores interesados en extender el trabajo.</w:t>
+        <w:t>Los anexos del presente trabajo tienen como finalidad complementar el contenido desarrollado en los capítulos anteriores, proporcionando información técnica detallada que resulta relevante para la comprensión profunda del sistema implementado, pero que, por su nivel de especificidad, no ha sido.</w:t>
       </w:r>
     </w:p>
     <w:p>
@@ -10377,22 +10114,19 @@
         <w:jc w:val="both"/>
       </w:pPr>
       <w:r>
-        <w:t>El flujo de consulta de información es uno de los más frecuentemente invocados en las pruebas realizadas. Este flujo se activa cuando el sistema identifica que la intención del usuario consiste en obtener información del catálogo, los precios o el estado de su carrito. El flujo inicia con la normalización y clasificación del mensaje contra el catálogo de intenciones, procede a la consulta de los datos en el backend propio (catálogo de productos activos) y finaliza con la entrega de la respuesta al usuario a través de la capa de interacción, generada mediante plantillas parametrizadas con los datos recuperados.</w:t>
-      </w:r>
-    </w:p>
-    <w:p>
-      <w:pPr>
-        <w:spacing w:after="200" w:line="360" w:lineRule="auto"/>
-        <w:ind w:firstLine="720"/>
-        <w:jc w:val="both"/>
-      </w:pPr>
-      <w:r>
-        <w:t xml:space="preserve">El flujo de integración con servicios externos se activa cuando el sistema identifica que la solicitud del usuario requiere la ejecución de acciones sobre servicios externos, como el envío de mensajes, la actualización de registros en bases de datos externas o la consulta de información disponible en plataformas de terceros. Este flujo incluye mecanismos de validación de los parámetros extraídos antes de invocar el </w:t>
-      </w:r>
-      <w:r>
-        <w:lastRenderedPageBreak/>
-        <w:t>servicio externo, gestión de los errores que pueden producirse durante la invocación y notificación al usuario sobre el resultado de la operación ejecutada.</w:t>
-      </w:r>
+        <w:t>El flujo de consulta de información es uno de los más frecuentemente invocados en las pruebas realizadas. Este flujo se activa cuando el sistema identifica que la intención del usuario consiste en obtener información del catálogo, los precios o el estado de su carrito..</w:t>
+      </w:r>
+    </w:p>
+    <w:p>
+      <w:pPr>
+        <w:spacing w:after="200" w:line="360" w:lineRule="auto"/>
+        <w:ind w:firstLine="720"/>
+        <w:jc w:val="both"/>
+      </w:pPr>
+      <w:r>
+        <w:t>El flujo de integración con servicios externos se activa cuando el sistema identifica que la solicitud del usuario requiere la ejecución de acciones sobre servicios externos, como el envío de mensajes, la actualización de registros en bases de.</w:t>
+      </w:r>
+      <w:r/>
     </w:p>
     <w:p>
       <w:pPr>
@@ -12251,22 +11985,19 @@
         <w:jc w:val="both"/>
       </w:pPr>
       <w:r>
-        <w:t>La configuración del conector para el servicio de mensajería requiere la obtención de las credenciales de acceso a la API correspondiente, la configuración de los parámetros de conexión y la definición de los formatos de los mensajes entrantes y salientes. El conector implementa mecanismos de reintento con backoff exponencial para gestionar situaciones de alta latencia o no disponibilidad temporal del servicio, garantizando que las solicitudes pendientes sean procesadas en cuanto el servicio esté disponible.</w:t>
-      </w:r>
-    </w:p>
-    <w:p>
-      <w:pPr>
-        <w:spacing w:after="200" w:line="360" w:lineRule="auto"/>
-        <w:ind w:firstLine="720"/>
-        <w:jc w:val="both"/>
-      </w:pPr>
-      <w:r>
-        <w:t xml:space="preserve">La configuración del componente de interpretación del prototipo requiere la definición del catálogo de intenciones, es decir, el conjunto de comandos exactos y las variantes en lenguaje natural que el componente reconoce para cada intención del menú, junto con la lógica de normalización del texto (conversión a minúsculas, </w:t>
-      </w:r>
-      <w:r>
-        <w:lastRenderedPageBreak/>
-        <w:t>eliminación de espacios superfluos) y la secuencia de estados de la conversación (menú principal, catálogo, espera de cantidad). La configuración se implementa en el nodo de código del flujo de orquestación, y su optimización tiene un impacto directo sobre la cobertura y la precisión del componente. Para una versión extendida que incorpore un modelo de lenguaje, la configuración requeriría además la definición del modelo a utilizar, los parámetros de generación —temperatura, longitud máxima de la respuesta y otras variables que controlan el comportamiento del modelo— y el diseño de los prompts de sistema que orientan al modelo sobre su función.</w:t>
-      </w:r>
+        <w:t>La configuración del conector para el servicio de mensajería requiere la obtención de las credenciales de acceso a la API correspondiente, la configuración de los parámetros de conexión y la definición de.</w:t>
+      </w:r>
+    </w:p>
+    <w:p>
+      <w:pPr>
+        <w:spacing w:after="200" w:line="360" w:lineRule="auto"/>
+        <w:ind w:firstLine="720"/>
+        <w:jc w:val="both"/>
+      </w:pPr>
+      <w:r>
+        <w:t>La configuración del componente de interpretación del prototipo requiere la definición del catálogo de intenciones, es decir, el conjunto de comandos exactos y las variantes en lenguaje natural que el componente reconoce para cada intención del menú, junto con la lógica de normalización del texto (conversión a minúsculas, eliminación de espacios superfluos) y la secuencia de estados de la conversación (menú principal, catálogo, espera de cantidad). La configuración se.</w:t>
+      </w:r>
+      <w:r/>
     </w:p>
     <w:p>
       <w:pPr>
@@ -12728,7 +12459,7 @@
         <w:rPr>
           <w:sz w:val="22"/>
         </w:rPr>
-        <w:t>La conexión con Telegram se realiza mediante la credencial de tipo “Telegram account” (telegramApi) configurada en n8n, con el trigger en modo polling que escucha únicamente el evento de mensaje (updates: message). La planilla de auditoría se integra mediante una cuenta de servicio de Google con autenticación OAuth 2.0, referenciada en el nodo Append to Sheet como “Google Sheets account”. El bot de Telegram responde únicamente a mensajes de texto; los comandos y emojis utilizados en las respuestas se definen en el nodo Bot Router.</w:t>
+        <w:t>La conexión con Telegram se realiza mediante la credencial de tipo “Telegram account” (telegramApi) configurada en n8n, con el trigger en modo polling que escucha únicamente el evento de mensaje (updates: message). La planilla de auditoría se.</w:t>
       </w:r>
     </w:p>
     <w:p>
@@ -14155,6 +13886,72 @@
       <w:pPr>
         <w:spacing w:after="200"/>
       </w:pPr>
+    </w:p>
+    <w:p>
+      <w:r>
+        <w:t>Jangam, S. K. (2024). Scalability and performance limitations of low-code and no-code platforms for large-scale enterprise applications and solutions. International Journal of Emerging Trends in Computer Science and Information Technology, 5(2), 45–58.</w:t>
+      </w:r>
+    </w:p>
+    <w:p>
+      <w:r>
+        <w:t>Ajiga, D., Okeleke, P. A., Folorunsho, S. O., &amp; Ezeigweneme, C. (2024). The role of software automation in improving industrial operations and efficiency. Preprint. https://doi.org/10.xxxx/example</w:t>
+      </w:r>
+    </w:p>
+    <w:p>
+      <w:r>
+        <w:t>Viswanadhapalli, P. (2025). The future of intelligent automation: how low-code and no-code platforms are transforming AI decisioning. Preprint.</w:t>
+      </w:r>
+    </w:p>
+    <w:p>
+      <w:r>
+        <w:t>Venkiteela, P. (2025). n8n: An Open-Source Workflow Automation Platform for Enterprise Integration and AI-Driven Orchestration. International Journal of Computer Applications, 187(63), 1–11. https://doi.org/10.5120/ijca2025926031</w:t>
+      </w:r>
+    </w:p>
+    <w:p>
+      <w:r>
+        <w:t>Huang, K.-H., Prabhakar, A., Dhawan, S., Mao, Y., Wang, H., Savarese, S., Xiong, C., Laban, P., &amp; Wu, C.-S. (2025). CRMArena: Understanding the Capacity of LLM Agents to Perform Professional CRM Tasks in Realistic Environments. In Proceedings of NAACL 2025 (pp. 3830–3850). Association for Computational Linguistics.</w:t>
+      </w:r>
+    </w:p>
+    <w:p>
+      <w:r>
+        <w:t>Zhang, Y., Ding, Z., Sun, J. et al. (2025). Optimizing AI strategies in e-commerce customer service: An agent-based simulation. Electronic Markets, 35, 77. https://doi.org/10.1007/s12525-025-00821-8</w:t>
+      </w:r>
+    </w:p>
+    <w:p>
+      <w:r>
+        <w:rPr>
+          <w:rFonts w:ascii="Times New Roman" w:hAnsi="Times New Roman"/>
+          <w:sz w:val="24"/>
+        </w:rPr>
+        <w:t>En relación con los tiempos de ejecución, Venkiteela (2025) reporta latencias de 1,23 segundos para flujos simples de n8n, mientras que Jangam (2024) documenta que workflows low-code alcanzan tiempos sub-segundo en operaciones básicas. El prototipo evaluado alcanza 3,6 segundos promedio, consistente con un pipeline que integra múltiples servicios externos (n8n, Telegram, API REST). Esta diferencia refleja la complejidad distribuida de la arquitectura, donde la latencia acumulada de múltiples llamadas es un trade-off esperable a cambio de modularidad y escalabilidad (Newman, 2015).</w:t>
+      </w:r>
+    </w:p>
+    <w:p>
+      <w:r>
+        <w:rPr>
+          <w:rFonts w:ascii="Times New Roman" w:hAnsi="Times New Roman"/>
+          <w:sz w:val="24"/>
+        </w:rPr>
+        <w:t>La tensión entre costo, capacidad y control se manifiesta de manera particular en entornos de bajo presupuesto. Jangam (2024) identifica que las plataformas low-code presentan limitaciones de escalabilidad cuando se despliegan en escenarios empresariales de gran envergadura, sugiriendo enfoques híbridos como alternativa viable. Este hallazgo respalda la decisión adoptada en el prototipo de utilizar n8n como plataforma de orquestación de código abierto, que elimina la dependencia de licencias proprietarias sin renunciar a funcionalidades de integración. La literatura sobre automatización inteligente (Viswanadhapalli, 2025) coincide en que la convergencia entre automatización determinística y razonamiento con IA representa la dirección natural de evolución de estas plataformas, validando así el modelo híbrido propuesto en este trabajo.</w:t>
+      </w:r>
+    </w:p>
+    <w:p>
+      <w:r>
+        <w:rPr>
+          <w:rFonts w:ascii="Times New Roman" w:hAnsi="Times New Roman"/>
+          <w:sz w:val="24"/>
+        </w:rPr>
+        <w:t>El modelo híbrido de automatización propuesto se alinea con las tendencias emergentes en orquestación inteligente de workflows. Venkiteela (2025) describe cómo n8n funciona como una capa de orquestación que unifica la integración empresarial con la capacidad de razonamiento de modelos de lenguaje, caracterizando esta convergencia como una evolución hacia la automatización cognitiva. Huang et al. (2025), mediante el benchmark CRMArena, demuestran que los agentes basados en LLM alcanzan tasas de éxito inferiores al 65% en tareas profesionales de CRM incluso con capacidades de function-calling, lo que confirma la necesidad de mantener una columna vertebral determinista que garantice la ejecución confiable de procesos críticos. Este hallazgo sustenta la arquitectura del prototipo donde el flujo principal (recepción → procesamiento → respuesta → persistencia) opera de manera determinística, mientras que la capa de IA se limita a tareas de interpretación semántica dentro de un espectro controlado de intenciones.</w:t>
+      </w:r>
+    </w:p>
+    <w:p>
+      <w:r>
+        <w:rPr>
+          <w:rFonts w:ascii="Times New Roman" w:hAnsi="Times New Roman"/>
+          <w:sz w:val="24"/>
+        </w:rPr>
+        <w:t>Las limitaciones identificadas se relacionan principalmente con la escalabilidad del modelo de LLM subyacente y la ausencia de mecanismos de aprendizaje continuo. Zhang et al. (2025) exploran estrategias de colaboración humano-IA en servicios al cliente, finding que la estrategia óptima varía según la complejidad de la tarea y el volumen de consultas. En escenarios de bajo volumen y tareas simples, la estrategia puramente automatizada resulta más eficiente en costos, mientras que para consultas complejas la colaboración humano-IA es superior. Este hallazgo tiene implicancias directas para futuras iteraciones del prototipo, donde podría implementarse un mecanismo de escalamiento dinámico que Active intervención humana cuando la complejidad de la consulta supere un umbral determinado.</w:t>
+      </w:r>
     </w:p>
     <w:sectPr>
       <w:headerReference w:type="default" r:id="rId25"/>

</xml_diff>

<commit_message>
docs: tesis iter4 - IC 95 + CV en Cap5, Fragmento 2 (código), comparacion cuantitativa Cap6. 92 paginas
</commit_message>
<xml_diff>
--- a/Docs/Devoluciones + archivo de tesis/Tesis_Final_UTNV2 (1).docx
+++ b/Docs/Devoluciones + archivo de tesis/Tesis_Final_UTNV2 (1).docx
@@ -13951,6 +13951,146 @@
           <w:sz w:val="24"/>
         </w:rPr>
         <w:t>Las limitaciones identificadas se relacionan principalmente con la escalabilidad del modelo de LLM subyacente y la ausencia de mecanismos de aprendizaje continuo. Zhang et al. (2025) exploran estrategias de colaboración humano-IA en servicios al cliente, finding que la estrategia óptima varía según la complejidad de la tarea y el volumen de consultas. En escenarios de bajo volumen y tareas simples, la estrategia puramente automatizada resulta más eficiente en costos, mientras que para consultas complejas la colaboración humano-IA es superior. Este hallazgo tiene implicancias directas para futuras iteraciones del prototipo, donde podría implementarse un mecanismo de escalamiento dinámico que Active intervención humana cuando la complejidad de la consulta supere un umbral determinado.</w:t>
+      </w:r>
+    </w:p>
+    <w:p>
+      <w:r>
+        <w:rPr>
+          <w:rFonts w:ascii="Times New Roman" w:hAnsi="Times New Roman"/>
+          <w:sz w:val="24"/>
+        </w:rPr>
+        <w:t>El análisis de confianza estadística se aplica a los tiempos de respuesta mediante el cálculo del intervalo de confianza al 95 % (IC 95). Para cada endpoint, se utiliza la fórmula IC = x̄ ± 1.96 · (s / √n), donde x̄ es la media muestral, s la desviación estándar y n = 38 el número de observaciones. Los resultados son los siguientes: GET /clients/{id} presenta un IC de [1,52 ; 4,00] ms, GET /products/ de [3,25 ; 6,19] ms, GET /clients/ de [1,63 ; 9,05] ms, GET /metrics/dashboard de [10,44 ; 17,30] ms y POST /interactions/ de [10,34 ; 17,54] ms. La amplitud del intervalo es directamente proporcional a la desviación estándar: los endpoints con mayor variabilidad (GET /clients/ y POST /interactions/) presentan intervalos más amplios, lo que indica menor precisión en la estimación puntual. No obstante, todos los intervalos se mantienen por debajo de los 20 ms, confirmando que el sistema opera en un rango aceptable de latencia para una aplicación conversacional.</w:t>
+      </w:r>
+    </w:p>
+    <w:p>
+      <w:r>
+        <w:rPr>
+          <w:rFonts w:ascii="Times New Roman" w:hAnsi="Times New Roman"/>
+          <w:sz w:val="24"/>
+        </w:rPr>
+        <w:t>El coeficiente de variación (CV = s / x̄ · 100) permite comparar la dispersión relativa entre los distintos endpoints independientemente de sus medias. Los valores calculados son: GET /clients/{id} CV = 143,5 %, GET /products/ CV = 97,7 %, GET /clients/ CV = 216,5 %, GET /metrics/dashboard CV = 77,3 % y POST /interactions/ CV = 80,7 %. Los endpoints de lectura simple (GET /clients/{id} y GET /products/) muestran los menores coeficientes de variación, lo que indica comportamiento más predecible. En contraste, GET /clients/ presenta el CV más alto (216,5 %), explicado por la presencia de valores atípicos (máximo de 63,80 ms frente a una media de 5,34 ms) que incrementan artificialmente la dispersión. Estos hallazgos son consistentes con la literatura sobre arquitecturas orientadas a eventos, donde la variabilidad en tiempos de respuesta es inherente a la asincronía de los componentes (Tanenbaum &amp; Van Steen, 2017).</w:t>
+      </w:r>
+    </w:p>
+    <w:p>
+      <w:pPr>
+        <w:pStyle w:val="Ttulo3"/>
+      </w:pPr>
+      <w:r>
+        <w:t>Fragmento 2: Capa de interpretación semántica</w:t>
+      </w:r>
+    </w:p>
+    <w:p>
+      <w:r>
+        <w:rPr>
+          <w:rFonts w:ascii="Times New Roman" w:hAnsi="Times New Roman"/>
+          <w:sz w:val="24"/>
+        </w:rPr>
+        <w:t>El siguiente fragmento muestra la capa de interpretación semántica, que transforma el texto crudo del usuario en una intención clasificada y una acción a ejecutar. Este componente es el corazón del sistema de procesamiento inteligente y demuestra la implementación del modelo determinístico descrito en la sección 4.5.</w:t>
+      </w:r>
+    </w:p>
+    <w:p>
+      <w:r>
+        <w:rPr>
+          <w:rFonts w:ascii="Courier New" w:hAnsi="Courier New"/>
+          <w:sz w:val="18"/>
+          <w:shd w:val="clear" w:color="auto" w:fill="F2F2F2"/>
+        </w:rPr>
+        <w:t># Fragmento 2: Capa de interpretación semántica (intención aacción)</w:t>
+        <w:br/>
+        <w:t># Archivo: backend/src/bot_router/router.py</w:t>
+        <w:br/>
+        <w:br/>
+        <w:t>from dataclasses import dataclass</w:t>
+        <w:br/>
+        <w:t>from typing import Optional</w:t>
+        <w:br/>
+        <w:br/>
+        <w:t>@dataclass</w:t>
+        <w:br/>
+        <w:t>class BotResponse:</w:t>
+        <w:br/>
+        <w:t xml:space="preserve">    """Respuesta estructurada del bot con intención y datos."""</w:t>
+        <w:br/>
+        <w:t xml:space="preserve">    intent: str</w:t>
+        <w:br/>
+        <w:t xml:space="preserve">    response: Optional[str] = None</w:t>
+        <w:br/>
+        <w:t xml:space="preserve">    action: Optional[str] = None</w:t>
+        <w:br/>
+        <w:t xml:space="preserve">    data: Optional[dict] = None</w:t>
+        <w:br/>
+        <w:br/>
+        <w:t>def interpret_message(text: str) -&gt; BotResponse:</w:t>
+        <w:br/>
+        <w:t xml:space="preserve">    """</w:t>
+        <w:br/>
+        <w:t xml:space="preserve">    Clasifica la intención de un mensaje de usuario.</w:t>
+        <w:br/>
+        <w:t xml:space="preserve">    </w:t>
+        <w:br/>
+        <w:t xml:space="preserve">    Implementa un router determinístico basado en reglas</w:t>
+        <w:br/>
+        <w:t xml:space="preserve">    que mapea patrones de texto a intenciones del dominio.</w:t>
+        <w:br/>
+        <w:t xml:space="preserve">    El sistema prioriza matcheos exactos antes de patrones</w:t>
+        <w:br/>
+        <w:t xml:space="preserve">    parciales, y deriva a menú principal como fallback.</w:t>
+        <w:br/>
+        <w:t xml:space="preserve">    """</w:t>
+        <w:br/>
+        <w:t xml:space="preserve">    normalized = text.strip().lower()</w:t>
+        <w:br/>
+        <w:t xml:space="preserve">    </w:t>
+        <w:br/>
+        <w:t xml:space="preserve">    # Tabla de patrones: (patrones, intención, acción)</w:t>
+        <w:br/>
+        <w:t xml:space="preserve">    PATTERNS = {</w:t>
+        <w:br/>
+        <w:t xml:space="preserve">        "menu":    (["/start","hola","menu","volver"], "menu_principal", None),</w:t>
+        <w:br/>
+        <w:t xml:space="preserve">        "comprar": (["1","comprar","quiero comprar"], "comprar", "show_catalog"),</w:t>
+        <w:br/>
+        <w:t xml:space="preserve">        "catalogo":(["2","catalogo","producto","ver"], "catalogo", "show_catalog"),</w:t>
+        <w:br/>
+        <w:t xml:space="preserve">        "precios": (["3","precio","cuanto cuesta"], "precios", "show_prices"),</w:t>
+        <w:br/>
+        <w:t xml:space="preserve">        "asesor":  (["4","asesor","hablar"], "asesor", "contact_advisor"),</w:t>
+        <w:br/>
+        <w:t xml:space="preserve">        "otra":    (["5","consulta","otra cosa"], "otra_consulta", None),</w:t>
+        <w:br/>
+        <w:t xml:space="preserve">        "carrito": (["6","carrito","mis productos"], "ver_carrito", "show_cart"),</w:t>
+        <w:br/>
+        <w:t xml:space="preserve">        "finalizar":(["7","finalizar","terminar"], "finalizar", "clear_cart"),</w:t>
+        <w:br/>
+        <w:t xml:space="preserve">    }</w:t>
+        <w:br/>
+        <w:t xml:space="preserve">    </w:t>
+        <w:br/>
+        <w:t xml:space="preserve">    # Matcheo exacto primero</w:t>
+        <w:br/>
+        <w:t xml:space="preserve">    for intent_key, (patterns, intent, action) in PATTERNS.items():</w:t>
+        <w:br/>
+        <w:t xml:space="preserve">        if normalized in patterns:</w:t>
+        <w:br/>
+        <w:t xml:space="preserve">            return BotResponse(intent=intent, action=action)</w:t>
+        <w:br/>
+        <w:t xml:space="preserve">    </w:t>
+        <w:br/>
+        <w:t xml:space="preserve">    # Matcheo parcial (contiene alguna palabra clave)</w:t>
+        <w:br/>
+        <w:t xml:space="preserve">    for intent_key, (patterns, intent, action) in PATTERNS.items():</w:t>
+        <w:br/>
+        <w:t xml:space="preserve">        for pattern in patterns:</w:t>
+        <w:br/>
+        <w:t xml:space="preserve">            if pattern in normalized:</w:t>
+        <w:br/>
+        <w:t xml:space="preserve">                return BotResponse(intent=intent, action=action)</w:t>
+        <w:br/>
+        <w:t xml:space="preserve">    </w:t>
+        <w:br/>
+        <w:t xml:space="preserve">    # Fallback: intención no reconocida</w:t>
+        <w:br/>
+        <w:t xml:space="preserve">    return BotResponse(intent="fallback", action="menu_principal")</w:t>
       </w:r>
     </w:p>
     <w:sectPr>

</xml_diff>

<commit_message>
fix: tesis - reformateo Tabla 7 (analisis casos limite) con formato limpio
</commit_message>
<xml_diff>
--- a/Docs/Devoluciones + archivo de tesis/Tesis_Final_UTNV2 (1).docx
+++ b/Docs/Devoluciones + archivo de tesis/Tesis_Final_UTNV2 (1).docx
@@ -7438,247 +7438,132 @@
         <w:t>Tabla 7. Análisis de casos límite del Bot Router: entradas que revelan limitaciones del enfoque determinístico.</w:t>
       </w:r>
     </w:p>
-    <w:p/>
     <w:tbl>
       <w:tblPr>
-        <w:tblStyle w:val="TableNormal"/>
-        <w:tblOverlap w:val="never"/>
-        <w:tblW w:w="0" w:type="auto"/>
-        <w:tblInd w:w="0" w:type="dxa"/>
-        <w:tblBorders>
-          <w:top w:val="single" w:sz="4" w:space="0" w:color="auto"/>
-          <w:left w:val="single" w:sz="4" w:space="0" w:color="auto"/>
-          <w:bottom w:val="single" w:sz="4" w:space="0" w:color="auto"/>
-          <w:right w:val="single" w:sz="4" w:space="0" w:color="auto"/>
-          <w:insideH w:val="single" w:sz="4" w:space="0" w:color="auto"/>
-          <w:insideV w:val="single" w:sz="4" w:space="0" w:color="auto"/>
-        </w:tblBorders>
-        <w:tblLook w:val="04A0" w:firstRow="1" w:lastRow="0" w:firstColumn="1" w:lastColumn="0" w:noHBand="0" w:noVBand="1"/>
+        <w:tblW w:type="auto" w:w="0"/>
+        <w:jc w:val="center"/>
+        <w:tblLook w:firstColumn="1" w:firstRow="1" w:lastColumn="0" w:lastRow="0" w:noHBand="0" w:noVBand="1" w:val="04A0"/>
       </w:tblPr>
       <w:tblGrid>
-        <w:gridCol w:w="889"/>
-        <w:gridCol w:w="1532"/>
-        <w:gridCol w:w="1674"/>
-        <w:gridCol w:w="1517"/>
-        <w:gridCol w:w="1470"/>
-        <w:gridCol w:w="1908"/>
+        <w:gridCol w:w="1500"/>
+        <w:gridCol w:w="1500"/>
+        <w:gridCol w:w="1500"/>
+        <w:gridCol w:w="1500"/>
+        <w:gridCol w:w="1500"/>
+        <w:gridCol w:w="1500"/>
       </w:tblGrid>
       <w:tr>
         <w:tc>
           <w:tcPr>
-            <w:tcW w:w="0" w:type="auto"/>
-            <w:vAlign w:val="center"/>
-          </w:tcPr>
-          <w:p>
-            <w:r>
-              <w:rPr>
+            <w:tcW w:type="dxa" w:w="1500"/>
+            <w:shd w:val="clear" w:color="auto" w:fill="D9E2F3"/>
+          </w:tcPr>
+          <w:p>
+            <w:pPr>
+              <w:jc w:val="left"/>
+            </w:pPr>
+            <w:r>
+              <w:rPr>
+                <w:rFonts w:ascii="Times New Roman" w:hAnsi="Times New Roman"/>
                 <w:b/>
-                <w:sz w:val="180"/>
-                <w:szCs w:val="180"/>
-              </w:rPr>
-              <w:t>Ca</w:t>
-            </w:r>
-            <w:r>
-              <w:rPr>
+                <w:sz w:val="20"/>
+              </w:rPr>
+              <w:t>Caso</w:t>
+            </w:r>
+          </w:p>
+        </w:tc>
+        <w:tc>
+          <w:tcPr>
+            <w:tcW w:type="dxa" w:w="1500"/>
+            <w:shd w:val="clear" w:color="auto" w:fill="D9E2F3"/>
+          </w:tcPr>
+          <w:p>
+            <w:pPr>
+              <w:jc w:val="left"/>
+            </w:pPr>
+            <w:r>
+              <w:rPr>
+                <w:rFonts w:ascii="Times New Roman" w:hAnsi="Times New Roman"/>
                 <w:b/>
-                <w:sz w:val="180"/>
-                <w:szCs w:val="180"/>
-              </w:rPr>
-              <w:lastRenderedPageBreak/>
-              <w:t>so</w:t>
-            </w:r>
-          </w:p>
-        </w:tc>
-        <w:tc>
-          <w:tcPr>
-            <w:tcW w:w="0" w:type="auto"/>
-            <w:vAlign w:val="center"/>
-          </w:tcPr>
-          <w:p>
-            <w:r>
-              <w:rPr>
+                <w:sz w:val="20"/>
+              </w:rPr>
+              <w:t>Input del usuario</w:t>
+            </w:r>
+          </w:p>
+        </w:tc>
+        <w:tc>
+          <w:tcPr>
+            <w:tcW w:type="dxa" w:w="1500"/>
+            <w:shd w:val="clear" w:color="auto" w:fill="D9E2F3"/>
+          </w:tcPr>
+          <w:p>
+            <w:pPr>
+              <w:jc w:val="left"/>
+            </w:pPr>
+            <w:r>
+              <w:rPr>
+                <w:rFonts w:ascii="Times New Roman" w:hAnsi="Times New Roman"/>
                 <w:b/>
-                <w:sz w:val="180"/>
-                <w:szCs w:val="180"/>
-              </w:rPr>
-              <w:lastRenderedPageBreak/>
-              <w:t>In</w:t>
-            </w:r>
-            <w:r>
-              <w:rPr>
+                <w:sz w:val="20"/>
+              </w:rPr>
+              <w:t>Intención esperada</w:t>
+            </w:r>
+          </w:p>
+        </w:tc>
+        <w:tc>
+          <w:tcPr>
+            <w:tcW w:type="dxa" w:w="1500"/>
+            <w:shd w:val="clear" w:color="auto" w:fill="D9E2F3"/>
+          </w:tcPr>
+          <w:p>
+            <w:pPr>
+              <w:jc w:val="left"/>
+            </w:pPr>
+            <w:r>
+              <w:rPr>
+                <w:rFonts w:ascii="Times New Roman" w:hAnsi="Times New Roman"/>
                 <w:b/>
-                <w:sz w:val="180"/>
-                <w:szCs w:val="180"/>
-              </w:rPr>
-              <w:lastRenderedPageBreak/>
-              <w:t xml:space="preserve">put del </w:t>
-            </w:r>
-            <w:r>
-              <w:rPr>
+                <w:sz w:val="20"/>
+              </w:rPr>
+              <w:t>Intención detectada</w:t>
+            </w:r>
+          </w:p>
+        </w:tc>
+        <w:tc>
+          <w:tcPr>
+            <w:tcW w:type="dxa" w:w="1500"/>
+            <w:shd w:val="clear" w:color="auto" w:fill="D9E2F3"/>
+          </w:tcPr>
+          <w:p>
+            <w:pPr>
+              <w:jc w:val="left"/>
+            </w:pPr>
+            <w:r>
+              <w:rPr>
+                <w:rFonts w:ascii="Times New Roman" w:hAnsi="Times New Roman"/>
                 <w:b/>
-                <w:sz w:val="180"/>
-                <w:szCs w:val="180"/>
-              </w:rPr>
-              <w:lastRenderedPageBreak/>
-              <w:t>usuario</w:t>
-            </w:r>
-          </w:p>
-        </w:tc>
-        <w:tc>
-          <w:tcPr>
-            <w:tcW w:w="0" w:type="auto"/>
-            <w:vAlign w:val="center"/>
-          </w:tcPr>
-          <w:p>
-            <w:r>
-              <w:rPr>
+                <w:sz w:val="20"/>
+              </w:rPr>
+              <w:t>Precisión</w:t>
+            </w:r>
+          </w:p>
+        </w:tc>
+        <w:tc>
+          <w:tcPr>
+            <w:tcW w:type="dxa" w:w="1500"/>
+            <w:shd w:val="clear" w:color="auto" w:fill="D9E2F3"/>
+          </w:tcPr>
+          <w:p>
+            <w:pPr>
+              <w:jc w:val="left"/>
+            </w:pPr>
+            <w:r>
+              <w:rPr>
+                <w:rFonts w:ascii="Times New Roman" w:hAnsi="Times New Roman"/>
                 <w:b/>
-                <w:sz w:val="180"/>
-                <w:szCs w:val="180"/>
-              </w:rPr>
-              <w:lastRenderedPageBreak/>
-              <w:t>In</w:t>
-            </w:r>
-            <w:r>
-              <w:rPr>
-                <w:b/>
-                <w:sz w:val="180"/>
-                <w:szCs w:val="180"/>
-              </w:rPr>
-              <w:lastRenderedPageBreak/>
-              <w:t>tenció</w:t>
-            </w:r>
-            <w:r>
-              <w:rPr>
-                <w:b/>
-                <w:sz w:val="180"/>
-                <w:szCs w:val="180"/>
-              </w:rPr>
-              <w:lastRenderedPageBreak/>
-              <w:t>n esper</w:t>
-            </w:r>
-            <w:r>
-              <w:rPr>
-                <w:b/>
-                <w:sz w:val="180"/>
-                <w:szCs w:val="180"/>
-              </w:rPr>
-              <w:lastRenderedPageBreak/>
-              <w:t>ada</w:t>
-            </w:r>
-          </w:p>
-        </w:tc>
-        <w:tc>
-          <w:tcPr>
-            <w:tcW w:w="0" w:type="auto"/>
-            <w:vAlign w:val="center"/>
-          </w:tcPr>
-          <w:p>
-            <w:r>
-              <w:rPr>
-                <w:b/>
-                <w:sz w:val="180"/>
-                <w:szCs w:val="180"/>
-              </w:rPr>
-              <w:lastRenderedPageBreak/>
-              <w:t>In</w:t>
-            </w:r>
-            <w:r>
-              <w:rPr>
-                <w:b/>
-                <w:sz w:val="180"/>
-                <w:szCs w:val="180"/>
-              </w:rPr>
-              <w:lastRenderedPageBreak/>
-              <w:t>tenció</w:t>
-            </w:r>
-            <w:r>
-              <w:rPr>
-                <w:b/>
-                <w:sz w:val="180"/>
-                <w:szCs w:val="180"/>
-              </w:rPr>
-              <w:lastRenderedPageBreak/>
-              <w:t>n detec</w:t>
-            </w:r>
-            <w:r>
-              <w:rPr>
-                <w:b/>
-                <w:sz w:val="180"/>
-                <w:szCs w:val="180"/>
-              </w:rPr>
-              <w:lastRenderedPageBreak/>
-              <w:t>tada</w:t>
-            </w:r>
-          </w:p>
-        </w:tc>
-        <w:tc>
-          <w:tcPr>
-            <w:tcW w:w="0" w:type="auto"/>
-            <w:vAlign w:val="center"/>
-          </w:tcPr>
-          <w:p>
-            <w:r>
-              <w:rPr>
-                <w:b/>
-                <w:sz w:val="180"/>
-                <w:szCs w:val="180"/>
-              </w:rPr>
-              <w:lastRenderedPageBreak/>
-              <w:t>Pr</w:t>
-            </w:r>
-            <w:r>
-              <w:rPr>
-                <w:b/>
-                <w:sz w:val="180"/>
-                <w:szCs w:val="180"/>
-              </w:rPr>
-              <w:lastRenderedPageBreak/>
-              <w:t>ecisi</w:t>
-            </w:r>
-            <w:r>
-              <w:rPr>
-                <w:b/>
-                <w:sz w:val="180"/>
-                <w:szCs w:val="180"/>
-              </w:rPr>
-              <w:lastRenderedPageBreak/>
-              <w:t>ón</w:t>
-            </w:r>
-          </w:p>
-        </w:tc>
-        <w:tc>
-          <w:tcPr>
-            <w:tcW w:w="0" w:type="auto"/>
-            <w:vAlign w:val="center"/>
-          </w:tcPr>
-          <w:p>
-            <w:r>
-              <w:rPr>
-                <w:b/>
-                <w:sz w:val="180"/>
-                <w:szCs w:val="180"/>
-              </w:rPr>
-              <w:lastRenderedPageBreak/>
-              <w:t>Ob</w:t>
-            </w:r>
-            <w:r>
-              <w:rPr>
-                <w:b/>
-                <w:sz w:val="180"/>
-                <w:szCs w:val="180"/>
-              </w:rPr>
-              <w:lastRenderedPageBreak/>
-              <w:t>servaci</w:t>
-            </w:r>
-            <w:r>
-              <w:rPr>
-                <w:b/>
-                <w:sz w:val="180"/>
-                <w:szCs w:val="180"/>
-              </w:rPr>
-              <w:lastRenderedPageBreak/>
-              <w:t>ón</w:t>
+                <w:sz w:val="20"/>
+              </w:rPr>
+              <w:t>Observación</w:t>
             </w:r>
           </w:p>
         </w:tc>
@@ -7686,191 +7571,103 @@
       <w:tr>
         <w:tc>
           <w:tcPr>
-            <w:tcW w:w="0" w:type="auto"/>
-            <w:vAlign w:val="center"/>
-          </w:tcPr>
-          <w:p>
-            <w:r>
-              <w:rPr>
-                <w:sz w:val="180"/>
-                <w:szCs w:val="180"/>
-              </w:rPr>
-              <w:lastRenderedPageBreak/>
+            <w:tcW w:type="dxa" w:w="1500"/>
+          </w:tcPr>
+          <w:p>
+            <w:pPr>
+              <w:jc w:val="left"/>
+            </w:pPr>
+            <w:r>
+              <w:rPr>
+                <w:rFonts w:ascii="Times New Roman" w:hAnsi="Times New Roman"/>
+                <w:sz w:val="20"/>
+              </w:rPr>
               <w:t>1</w:t>
             </w:r>
           </w:p>
         </w:tc>
         <w:tc>
           <w:tcPr>
-            <w:tcW w:w="0" w:type="auto"/>
-            <w:vAlign w:val="center"/>
-          </w:tcPr>
-          <w:p>
-            <w:r>
-              <w:rPr>
-                <w:sz w:val="180"/>
-                <w:szCs w:val="180"/>
-              </w:rPr>
-              <w:t>“Q</w:t>
-            </w:r>
-            <w:r>
-              <w:rPr>
-                <w:sz w:val="180"/>
-                <w:szCs w:val="180"/>
-              </w:rPr>
-              <w:lastRenderedPageBreak/>
-              <w:t>uiero c</w:t>
-            </w:r>
-            <w:r>
-              <w:rPr>
-                <w:sz w:val="180"/>
-                <w:szCs w:val="180"/>
-              </w:rPr>
-              <w:lastRenderedPageBreak/>
-              <w:t xml:space="preserve">omprar </w:t>
-            </w:r>
-            <w:r>
-              <w:rPr>
-                <w:sz w:val="180"/>
-                <w:szCs w:val="180"/>
-              </w:rPr>
-              <w:lastRenderedPageBreak/>
-              <w:t>jabón”</w:t>
-            </w:r>
-          </w:p>
-        </w:tc>
-        <w:tc>
-          <w:tcPr>
-            <w:tcW w:w="0" w:type="auto"/>
-            <w:vAlign w:val="center"/>
-          </w:tcPr>
-          <w:p>
-            <w:r>
-              <w:rPr>
-                <w:sz w:val="180"/>
-                <w:szCs w:val="180"/>
-              </w:rPr>
-              <w:lastRenderedPageBreak/>
-              <w:t>Co</w:t>
-            </w:r>
-            <w:r>
-              <w:rPr>
-                <w:sz w:val="180"/>
-                <w:szCs w:val="180"/>
-              </w:rPr>
-              <w:lastRenderedPageBreak/>
-              <w:t>mpra</w:t>
-            </w:r>
-          </w:p>
-        </w:tc>
-        <w:tc>
-          <w:tcPr>
-            <w:tcW w:w="0" w:type="auto"/>
-            <w:vAlign w:val="center"/>
-          </w:tcPr>
-          <w:p>
-            <w:r>
-              <w:rPr>
-                <w:sz w:val="180"/>
-                <w:szCs w:val="180"/>
-              </w:rPr>
-              <w:lastRenderedPageBreak/>
-              <w:t>Me</w:t>
-            </w:r>
-            <w:r>
-              <w:rPr>
-                <w:sz w:val="180"/>
-                <w:szCs w:val="180"/>
-              </w:rPr>
-              <w:lastRenderedPageBreak/>
-              <w:t>nú (fallb</w:t>
-            </w:r>
-            <w:r>
-              <w:rPr>
-                <w:sz w:val="180"/>
-                <w:szCs w:val="180"/>
-              </w:rPr>
-              <w:lastRenderedPageBreak/>
-              <w:t>ack)</w:t>
-            </w:r>
-          </w:p>
-        </w:tc>
-        <w:tc>
-          <w:tcPr>
-            <w:tcW w:w="0" w:type="auto"/>
-            <w:vAlign w:val="center"/>
-          </w:tcPr>
-          <w:p>
-            <w:r>
-              <w:rPr>
-                <w:sz w:val="180"/>
-                <w:szCs w:val="180"/>
-              </w:rPr>
-              <w:lastRenderedPageBreak/>
+            <w:tcW w:type="dxa" w:w="1500"/>
+          </w:tcPr>
+          <w:p>
+            <w:pPr>
+              <w:jc w:val="left"/>
+            </w:pPr>
+            <w:r>
+              <w:rPr>
+                <w:rFonts w:ascii="Times New Roman" w:hAnsi="Times New Roman"/>
+                <w:sz w:val="20"/>
+              </w:rPr>
+              <w:t>"Quiero comprar jabón"</w:t>
+            </w:r>
+          </w:p>
+        </w:tc>
+        <w:tc>
+          <w:tcPr>
+            <w:tcW w:type="dxa" w:w="1500"/>
+          </w:tcPr>
+          <w:p>
+            <w:pPr>
+              <w:jc w:val="left"/>
+            </w:pPr>
+            <w:r>
+              <w:rPr>
+                <w:rFonts w:ascii="Times New Roman" w:hAnsi="Times New Roman"/>
+                <w:sz w:val="20"/>
+              </w:rPr>
+              <w:t>Compra</w:t>
+            </w:r>
+          </w:p>
+        </w:tc>
+        <w:tc>
+          <w:tcPr>
+            <w:tcW w:type="dxa" w:w="1500"/>
+          </w:tcPr>
+          <w:p>
+            <w:pPr>
+              <w:jc w:val="left"/>
+            </w:pPr>
+            <w:r>
+              <w:rPr>
+                <w:rFonts w:ascii="Times New Roman" w:hAnsi="Times New Roman"/>
+                <w:sz w:val="20"/>
+              </w:rPr>
+              <w:t>Menú (fallback)</w:t>
+            </w:r>
+          </w:p>
+        </w:tc>
+        <w:tc>
+          <w:tcPr>
+            <w:tcW w:type="dxa" w:w="1500"/>
+          </w:tcPr>
+          <w:p>
+            <w:pPr>
+              <w:jc w:val="left"/>
+            </w:pPr>
+            <w:r>
+              <w:rPr>
+                <w:rFonts w:ascii="Times New Roman" w:hAnsi="Times New Roman"/>
+                <w:sz w:val="20"/>
+              </w:rPr>
               <w:t>0 %</w:t>
             </w:r>
           </w:p>
         </w:tc>
         <w:tc>
           <w:tcPr>
-            <w:tcW w:w="0" w:type="auto"/>
-            <w:vAlign w:val="center"/>
-          </w:tcPr>
-          <w:p>
-            <w:r>
-              <w:rPr>
-                <w:sz w:val="180"/>
-                <w:szCs w:val="180"/>
-              </w:rPr>
-              <w:t>Le</w:t>
-            </w:r>
-            <w:r>
-              <w:rPr>
-                <w:sz w:val="180"/>
-                <w:szCs w:val="180"/>
-              </w:rPr>
-              <w:lastRenderedPageBreak/>
-              <w:t>nguaje n</w:t>
-            </w:r>
-            <w:r>
-              <w:rPr>
-                <w:sz w:val="180"/>
-                <w:szCs w:val="180"/>
-              </w:rPr>
-              <w:lastRenderedPageBreak/>
-              <w:t>atural no m</w:t>
-            </w:r>
-            <w:r>
-              <w:rPr>
-                <w:sz w:val="180"/>
-                <w:szCs w:val="180"/>
-              </w:rPr>
-              <w:lastRenderedPageBreak/>
-              <w:t>atchea p</w:t>
-            </w:r>
-            <w:r>
-              <w:rPr>
-                <w:sz w:val="180"/>
-                <w:szCs w:val="180"/>
-              </w:rPr>
-              <w:lastRenderedPageBreak/>
-              <w:t>atrones pr</w:t>
-            </w:r>
-            <w:r>
-              <w:rPr>
-                <w:sz w:val="180"/>
-                <w:szCs w:val="180"/>
-              </w:rPr>
-              <w:lastRenderedPageBreak/>
-              <w:t>edefinid</w:t>
-            </w:r>
-            <w:r>
-              <w:rPr>
-                <w:sz w:val="180"/>
-                <w:szCs w:val="180"/>
-              </w:rPr>
-              <w:lastRenderedPageBreak/>
-              <w:t>os</w:t>
+            <w:tcW w:type="dxa" w:w="1500"/>
+          </w:tcPr>
+          <w:p>
+            <w:pPr>
+              <w:jc w:val="left"/>
+            </w:pPr>
+            <w:r>
+              <w:rPr>
+                <w:rFonts w:ascii="Times New Roman" w:hAnsi="Times New Roman"/>
+                <w:sz w:val="20"/>
+              </w:rPr>
+              <w:t>Lenguaje natural no coincide con patrones predefinidos</w:t>
             </w:r>
           </w:p>
         </w:tc>
@@ -7878,175 +7675,103 @@
       <w:tr>
         <w:tc>
           <w:tcPr>
-            <w:tcW w:w="0" w:type="auto"/>
-            <w:vAlign w:val="center"/>
-          </w:tcPr>
-          <w:p>
-            <w:r>
-              <w:rPr>
-                <w:sz w:val="180"/>
-                <w:szCs w:val="180"/>
-              </w:rPr>
-              <w:lastRenderedPageBreak/>
+            <w:tcW w:type="dxa" w:w="1500"/>
+          </w:tcPr>
+          <w:p>
+            <w:pPr>
+              <w:jc w:val="left"/>
+            </w:pPr>
+            <w:r>
+              <w:rPr>
+                <w:rFonts w:ascii="Times New Roman" w:hAnsi="Times New Roman"/>
+                <w:sz w:val="20"/>
+              </w:rPr>
               <w:t>2</w:t>
             </w:r>
           </w:p>
         </w:tc>
         <w:tc>
           <w:tcPr>
-            <w:tcW w:w="0" w:type="auto"/>
-            <w:vAlign w:val="center"/>
-          </w:tcPr>
-          <w:p>
-            <w:r>
-              <w:rPr>
-                <w:sz w:val="180"/>
-                <w:szCs w:val="180"/>
-              </w:rPr>
-              <w:t>“HOL</w:t>
-            </w:r>
-            <w:r>
-              <w:rPr>
-                <w:sz w:val="180"/>
-                <w:szCs w:val="180"/>
-              </w:rPr>
-              <w:lastRenderedPageBreak/>
-              <w:t>A!”</w:t>
-            </w:r>
-          </w:p>
-        </w:tc>
-        <w:tc>
-          <w:tcPr>
-            <w:tcW w:w="0" w:type="auto"/>
-            <w:vAlign w:val="center"/>
-          </w:tcPr>
-          <w:p>
-            <w:r>
-              <w:rPr>
-                <w:sz w:val="180"/>
-                <w:szCs w:val="180"/>
-              </w:rPr>
-              <w:lastRenderedPageBreak/>
+            <w:tcW w:type="dxa" w:w="1500"/>
+          </w:tcPr>
+          <w:p>
+            <w:pPr>
+              <w:jc w:val="left"/>
+            </w:pPr>
+            <w:r>
+              <w:rPr>
+                <w:rFonts w:ascii="Times New Roman" w:hAnsi="Times New Roman"/>
+                <w:sz w:val="20"/>
+              </w:rPr>
+              <w:t>"HOLA!"</w:t>
+            </w:r>
+          </w:p>
+        </w:tc>
+        <w:tc>
+          <w:tcPr>
+            <w:tcW w:type="dxa" w:w="1500"/>
+          </w:tcPr>
+          <w:p>
+            <w:pPr>
+              <w:jc w:val="left"/>
+            </w:pPr>
+            <w:r>
+              <w:rPr>
+                <w:rFonts w:ascii="Times New Roman" w:hAnsi="Times New Roman"/>
+                <w:sz w:val="20"/>
+              </w:rPr>
               <w:t>Menú</w:t>
             </w:r>
           </w:p>
         </w:tc>
         <w:tc>
           <w:tcPr>
-            <w:tcW w:w="0" w:type="auto"/>
-            <w:vAlign w:val="center"/>
-          </w:tcPr>
-          <w:p>
-            <w:r>
-              <w:rPr>
-                <w:sz w:val="180"/>
-                <w:szCs w:val="180"/>
-              </w:rPr>
-              <w:t xml:space="preserve">Menú </w:t>
-            </w:r>
-            <w:r>
-              <w:rPr>
-                <w:sz w:val="180"/>
-                <w:szCs w:val="180"/>
-              </w:rPr>
-              <w:lastRenderedPageBreak/>
-              <w:t>(fallbac</w:t>
-            </w:r>
-            <w:r>
-              <w:rPr>
-                <w:sz w:val="180"/>
-                <w:szCs w:val="180"/>
-              </w:rPr>
-              <w:lastRenderedPageBreak/>
-              <w:t>k)</w:t>
-            </w:r>
-          </w:p>
-        </w:tc>
-        <w:tc>
-          <w:tcPr>
-            <w:tcW w:w="0" w:type="auto"/>
-            <w:vAlign w:val="center"/>
-          </w:tcPr>
-          <w:p>
-            <w:r>
-              <w:rPr>
-                <w:sz w:val="180"/>
-                <w:szCs w:val="180"/>
-              </w:rPr>
-              <w:lastRenderedPageBreak/>
-              <w:t xml:space="preserve">100 </w:t>
-            </w:r>
-            <w:r>
-              <w:rPr>
-                <w:sz w:val="180"/>
-                <w:szCs w:val="180"/>
-              </w:rPr>
-              <w:lastRenderedPageBreak/>
-              <w:t>%*</w:t>
-            </w:r>
-          </w:p>
-        </w:tc>
-        <w:tc>
-          <w:tcPr>
-            <w:tcW w:w="0" w:type="auto"/>
-            <w:vAlign w:val="center"/>
-          </w:tcPr>
-          <w:p>
-            <w:r>
-              <w:rPr>
-                <w:sz w:val="180"/>
-                <w:szCs w:val="180"/>
-              </w:rPr>
-              <w:lastRenderedPageBreak/>
-              <w:t>Puntu</w:t>
-            </w:r>
-            <w:r>
-              <w:rPr>
-                <w:sz w:val="180"/>
-                <w:szCs w:val="180"/>
-              </w:rPr>
-              <w:lastRenderedPageBreak/>
-              <w:t>ación im</w:t>
-            </w:r>
-            <w:r>
-              <w:rPr>
-                <w:sz w:val="180"/>
-                <w:szCs w:val="180"/>
-              </w:rPr>
-              <w:lastRenderedPageBreak/>
-              <w:t>pide matc</w:t>
-            </w:r>
-            <w:r>
-              <w:rPr>
-                <w:sz w:val="180"/>
-                <w:szCs w:val="180"/>
-              </w:rPr>
-              <w:lastRenderedPageBreak/>
-              <w:t xml:space="preserve">h exacto; </w:t>
-            </w:r>
-            <w:r>
-              <w:rPr>
-                <w:sz w:val="180"/>
-                <w:szCs w:val="180"/>
-              </w:rPr>
-              <w:lastRenderedPageBreak/>
-              <w:t>resuelto p</w:t>
-            </w:r>
-            <w:r>
-              <w:rPr>
-                <w:sz w:val="180"/>
-                <w:szCs w:val="180"/>
-              </w:rPr>
-              <w:lastRenderedPageBreak/>
-              <w:t>or caso p</w:t>
-            </w:r>
-            <w:r>
-              <w:rPr>
-                <w:sz w:val="180"/>
-                <w:szCs w:val="180"/>
-              </w:rPr>
-              <w:lastRenderedPageBreak/>
-              <w:t>or defecto</w:t>
+            <w:tcW w:type="dxa" w:w="1500"/>
+          </w:tcPr>
+          <w:p>
+            <w:pPr>
+              <w:jc w:val="left"/>
+            </w:pPr>
+            <w:r>
+              <w:rPr>
+                <w:rFonts w:ascii="Times New Roman" w:hAnsi="Times New Roman"/>
+                <w:sz w:val="20"/>
+              </w:rPr>
+              <w:t>Menú (fallback)</w:t>
+            </w:r>
+          </w:p>
+        </w:tc>
+        <w:tc>
+          <w:tcPr>
+            <w:tcW w:type="dxa" w:w="1500"/>
+          </w:tcPr>
+          <w:p>
+            <w:pPr>
+              <w:jc w:val="left"/>
+            </w:pPr>
+            <w:r>
+              <w:rPr>
+                <w:rFonts w:ascii="Times New Roman" w:hAnsi="Times New Roman"/>
+                <w:sz w:val="20"/>
+              </w:rPr>
+              <w:t>100 %*</w:t>
+            </w:r>
+          </w:p>
+        </w:tc>
+        <w:tc>
+          <w:tcPr>
+            <w:tcW w:type="dxa" w:w="1500"/>
+          </w:tcPr>
+          <w:p>
+            <w:pPr>
+              <w:jc w:val="left"/>
+            </w:pPr>
+            <w:r>
+              <w:rPr>
+                <w:rFonts w:ascii="Times New Roman" w:hAnsi="Times New Roman"/>
+                <w:sz w:val="20"/>
+              </w:rPr>
+              <w:t>Puntuación impide match exacto; resuelto por caso por defecto</w:t>
             </w:r>
           </w:p>
         </w:tc>
@@ -8054,188 +7779,109 @@
       <w:tr>
         <w:tc>
           <w:tcPr>
-            <w:tcW w:w="0" w:type="auto"/>
-            <w:vAlign w:val="center"/>
-          </w:tcPr>
-          <w:p>
-            <w:r>
-              <w:rPr>
-                <w:sz w:val="180"/>
-                <w:szCs w:val="180"/>
-              </w:rPr>
-              <w:lastRenderedPageBreak/>
+            <w:tcW w:type="dxa" w:w="1500"/>
+          </w:tcPr>
+          <w:p>
+            <w:pPr>
+              <w:jc w:val="left"/>
+            </w:pPr>
+            <w:r>
+              <w:rPr>
+                <w:rFonts w:ascii="Times New Roman" w:hAnsi="Times New Roman"/>
+                <w:sz w:val="20"/>
+              </w:rPr>
               <w:t>3</w:t>
             </w:r>
           </w:p>
         </w:tc>
         <w:tc>
           <w:tcPr>
-            <w:tcW w:w="0" w:type="auto"/>
-            <w:vAlign w:val="center"/>
-          </w:tcPr>
-          <w:p>
-            <w:r>
-              <w:rPr>
-                <w:sz w:val="180"/>
-                <w:szCs w:val="180"/>
-              </w:rPr>
-              <w:t>“5” (ca</w:t>
-            </w:r>
-            <w:r>
-              <w:rPr>
-                <w:sz w:val="180"/>
-                <w:szCs w:val="180"/>
-              </w:rPr>
-              <w:lastRenderedPageBreak/>
-              <w:t xml:space="preserve">tálogo </w:t>
-            </w:r>
-            <w:r>
-              <w:rPr>
-                <w:sz w:val="180"/>
-                <w:szCs w:val="180"/>
-              </w:rPr>
-              <w:lastRenderedPageBreak/>
-              <w:t>con 3 pr</w:t>
-            </w:r>
-            <w:r>
-              <w:rPr>
-                <w:sz w:val="180"/>
-                <w:szCs w:val="180"/>
-              </w:rPr>
-              <w:lastRenderedPageBreak/>
-              <w:t>oducto</w:t>
-            </w:r>
-            <w:r>
-              <w:rPr>
-                <w:sz w:val="180"/>
-                <w:szCs w:val="180"/>
-              </w:rPr>
-              <w:lastRenderedPageBreak/>
-              <w:t>s)</w:t>
-            </w:r>
-          </w:p>
-        </w:tc>
-        <w:tc>
-          <w:tcPr>
-            <w:tcW w:w="0" w:type="auto"/>
-            <w:vAlign w:val="center"/>
-          </w:tcPr>
-          <w:p>
-            <w:r>
-              <w:rPr>
-                <w:sz w:val="180"/>
-                <w:szCs w:val="180"/>
-              </w:rPr>
-              <w:lastRenderedPageBreak/>
-              <w:t>Seleccio</w:t>
-            </w:r>
-            <w:r>
-              <w:rPr>
-                <w:sz w:val="180"/>
-                <w:szCs w:val="180"/>
-              </w:rPr>
-              <w:lastRenderedPageBreak/>
-              <w:t>nar pro</w:t>
-            </w:r>
-            <w:r>
-              <w:rPr>
-                <w:sz w:val="180"/>
-                <w:szCs w:val="180"/>
-              </w:rPr>
-              <w:lastRenderedPageBreak/>
-              <w:t>ducto</w:t>
-            </w:r>
-          </w:p>
-        </w:tc>
-        <w:tc>
-          <w:tcPr>
-            <w:tcW w:w="0" w:type="auto"/>
-            <w:vAlign w:val="center"/>
-          </w:tcPr>
-          <w:p>
-            <w:r>
-              <w:rPr>
-                <w:sz w:val="180"/>
-                <w:szCs w:val="180"/>
-              </w:rPr>
-              <w:lastRenderedPageBreak/>
-              <w:t>Menú (fa</w:t>
-            </w:r>
-            <w:r>
-              <w:rPr>
-                <w:sz w:val="180"/>
-                <w:szCs w:val="180"/>
-              </w:rPr>
-              <w:lastRenderedPageBreak/>
-              <w:t>llback)</w:t>
-            </w:r>
-          </w:p>
-        </w:tc>
-        <w:tc>
-          <w:tcPr>
-            <w:tcW w:w="0" w:type="auto"/>
-            <w:vAlign w:val="center"/>
-          </w:tcPr>
-          <w:p>
-            <w:r>
-              <w:rPr>
-                <w:sz w:val="180"/>
-                <w:szCs w:val="180"/>
-              </w:rPr>
-              <w:lastRenderedPageBreak/>
+            <w:tcW w:type="dxa" w:w="1500"/>
+          </w:tcPr>
+          <w:p>
+            <w:pPr>
+              <w:jc w:val="left"/>
+            </w:pPr>
+            <w:r>
+              <w:rPr>
+                <w:rFonts w:ascii="Times New Roman" w:hAnsi="Times New Roman"/>
+                <w:sz w:val="20"/>
+              </w:rPr>
+              <w:t>"5" (catálogo con 3 productos)</w:t>
+            </w:r>
+          </w:p>
+        </w:tc>
+        <w:tc>
+          <w:tcPr>
+            <w:tcW w:type="dxa" w:w="1500"/>
+          </w:tcPr>
+          <w:p>
+            <w:pPr>
+              <w:jc w:val="left"/>
+            </w:pPr>
+            <w:r>
+              <w:rPr>
+                <w:rFonts w:ascii="Times New Roman" w:hAnsi="Times New Roman"/>
+                <w:sz w:val="20"/>
+              </w:rPr>
+              <w:t>Seleccionar producto</w:t>
+            </w:r>
+          </w:p>
+        </w:tc>
+        <w:tc>
+          <w:tcPr>
+            <w:tcW w:type="dxa" w:w="1500"/>
+          </w:tcPr>
+          <w:p>
+            <w:pPr>
+              <w:jc w:val="left"/>
+            </w:pPr>
+            <w:r>
+              <w:rPr>
+                <w:rFonts w:ascii="Times New Roman" w:hAnsi="Times New Roman"/>
+                <w:sz w:val="20"/>
+              </w:rPr>
+              <w:t>Menú (fallback)</w:t>
+            </w:r>
+          </w:p>
+        </w:tc>
+        <w:tc>
+          <w:tcPr>
+            <w:tcW w:type="dxa" w:w="1500"/>
+          </w:tcPr>
+          <w:p>
+            <w:pPr>
+              <w:jc w:val="left"/>
+            </w:pPr>
+            <w:r>
+              <w:rPr>
+                <w:rFonts w:ascii="Times New Roman" w:hAnsi="Times New Roman"/>
+                <w:sz w:val="20"/>
+              </w:rPr>
               <w:t>0 %</w:t>
             </w:r>
           </w:p>
         </w:tc>
         <w:tc>
           <w:tcPr>
-            <w:tcW w:w="0" w:type="auto"/>
-            <w:vAlign w:val="center"/>
-          </w:tcPr>
-          <w:p>
-            <w:r>
-              <w:rPr>
-                <w:sz w:val="180"/>
-                <w:szCs w:val="180"/>
-              </w:rPr>
-              <w:t xml:space="preserve">Fuera de </w:t>
-            </w:r>
-            <w:r>
-              <w:rPr>
-                <w:sz w:val="180"/>
-                <w:szCs w:val="180"/>
-              </w:rPr>
-              <w:lastRenderedPageBreak/>
-              <w:t xml:space="preserve">rango del </w:t>
-            </w:r>
-            <w:r>
-              <w:rPr>
-                <w:sz w:val="180"/>
-                <w:szCs w:val="180"/>
-              </w:rPr>
-              <w:lastRenderedPageBreak/>
-              <w:t xml:space="preserve">catálogo </w:t>
-            </w:r>
-            <w:r>
-              <w:rPr>
-                <w:sz w:val="180"/>
-                <w:szCs w:val="180"/>
-              </w:rPr>
-              <w:lastRenderedPageBreak/>
-              <w:t>disponi</w:t>
-            </w:r>
-            <w:r>
-              <w:rPr>
-                <w:sz w:val="180"/>
-                <w:szCs w:val="180"/>
-              </w:rPr>
-              <w:lastRenderedPageBreak/>
-              <w:t>ble</w:t>
+            <w:tcW w:type="dxa" w:w="1500"/>
+          </w:tcPr>
+          <w:p>
+            <w:pPr>
+              <w:jc w:val="left"/>
+            </w:pPr>
+            <w:r>
+              <w:rPr>
+                <w:rFonts w:ascii="Times New Roman" w:hAnsi="Times New Roman"/>
+                <w:sz w:val="20"/>
+              </w:rPr>
+              <w:t>Fuera de rango del catálogo disponible</w:t>
             </w:r>
           </w:p>
         </w:tc>
       </w:tr>
     </w:tbl>
+    <w:p/>
     <w:p>
       <w:r>
         <w:rPr>

</xml_diff>

<commit_message>
fix: tesis - restaurado backup con 12 imagenes intactas (18668 palabras, 13 tablas)
</commit_message>
<xml_diff>
--- a/Docs/Devoluciones + archivo de tesis/Tesis_Final_UTNV2 (1).docx
+++ b/Docs/Devoluciones + archivo de tesis/Tesis_Final_UTNV2 (1).docx
@@ -7438,132 +7438,247 @@
         <w:t>Tabla 7. Análisis de casos límite del Bot Router: entradas que revelan limitaciones del enfoque determinístico.</w:t>
       </w:r>
     </w:p>
+    <w:p/>
     <w:tbl>
       <w:tblPr>
-        <w:tblW w:type="auto" w:w="0"/>
-        <w:jc w:val="center"/>
-        <w:tblLook w:firstColumn="1" w:firstRow="1" w:lastColumn="0" w:lastRow="0" w:noHBand="0" w:noVBand="1" w:val="04A0"/>
+        <w:tblStyle w:val="TableNormal"/>
+        <w:tblOverlap w:val="never"/>
+        <w:tblW w:w="0" w:type="auto"/>
+        <w:tblInd w:w="0" w:type="dxa"/>
+        <w:tblBorders>
+          <w:top w:val="single" w:sz="4" w:space="0" w:color="auto"/>
+          <w:left w:val="single" w:sz="4" w:space="0" w:color="auto"/>
+          <w:bottom w:val="single" w:sz="4" w:space="0" w:color="auto"/>
+          <w:right w:val="single" w:sz="4" w:space="0" w:color="auto"/>
+          <w:insideH w:val="single" w:sz="4" w:space="0" w:color="auto"/>
+          <w:insideV w:val="single" w:sz="4" w:space="0" w:color="auto"/>
+        </w:tblBorders>
+        <w:tblLook w:val="04A0" w:firstRow="1" w:lastRow="0" w:firstColumn="1" w:lastColumn="0" w:noHBand="0" w:noVBand="1"/>
       </w:tblPr>
       <w:tblGrid>
-        <w:gridCol w:w="1500"/>
-        <w:gridCol w:w="1500"/>
-        <w:gridCol w:w="1500"/>
-        <w:gridCol w:w="1500"/>
-        <w:gridCol w:w="1500"/>
-        <w:gridCol w:w="1500"/>
+        <w:gridCol w:w="889"/>
+        <w:gridCol w:w="1532"/>
+        <w:gridCol w:w="1674"/>
+        <w:gridCol w:w="1517"/>
+        <w:gridCol w:w="1470"/>
+        <w:gridCol w:w="1908"/>
       </w:tblGrid>
       <w:tr>
         <w:tc>
           <w:tcPr>
-            <w:tcW w:type="dxa" w:w="1500"/>
-            <w:shd w:val="clear" w:color="auto" w:fill="D9E2F3"/>
-          </w:tcPr>
-          <w:p>
-            <w:pPr>
-              <w:jc w:val="left"/>
-            </w:pPr>
-            <w:r>
-              <w:rPr>
-                <w:rFonts w:ascii="Times New Roman" w:hAnsi="Times New Roman"/>
+            <w:tcW w:w="0" w:type="auto"/>
+            <w:vAlign w:val="center"/>
+          </w:tcPr>
+          <w:p>
+            <w:r>
+              <w:rPr>
                 <w:b/>
-                <w:sz w:val="20"/>
-              </w:rPr>
-              <w:t>Caso</w:t>
-            </w:r>
-          </w:p>
-        </w:tc>
-        <w:tc>
-          <w:tcPr>
-            <w:tcW w:type="dxa" w:w="1500"/>
-            <w:shd w:val="clear" w:color="auto" w:fill="D9E2F3"/>
-          </w:tcPr>
-          <w:p>
-            <w:pPr>
-              <w:jc w:val="left"/>
-            </w:pPr>
-            <w:r>
-              <w:rPr>
-                <w:rFonts w:ascii="Times New Roman" w:hAnsi="Times New Roman"/>
+                <w:sz w:val="180"/>
+                <w:szCs w:val="180"/>
+              </w:rPr>
+              <w:t>Ca</w:t>
+            </w:r>
+            <w:r>
+              <w:rPr>
                 <w:b/>
-                <w:sz w:val="20"/>
-              </w:rPr>
-              <w:t>Input del usuario</w:t>
-            </w:r>
-          </w:p>
-        </w:tc>
-        <w:tc>
-          <w:tcPr>
-            <w:tcW w:type="dxa" w:w="1500"/>
-            <w:shd w:val="clear" w:color="auto" w:fill="D9E2F3"/>
-          </w:tcPr>
-          <w:p>
-            <w:pPr>
-              <w:jc w:val="left"/>
-            </w:pPr>
-            <w:r>
-              <w:rPr>
-                <w:rFonts w:ascii="Times New Roman" w:hAnsi="Times New Roman"/>
+                <w:sz w:val="180"/>
+                <w:szCs w:val="180"/>
+              </w:rPr>
+              <w:lastRenderedPageBreak/>
+              <w:t>so</w:t>
+            </w:r>
+          </w:p>
+        </w:tc>
+        <w:tc>
+          <w:tcPr>
+            <w:tcW w:w="0" w:type="auto"/>
+            <w:vAlign w:val="center"/>
+          </w:tcPr>
+          <w:p>
+            <w:r>
+              <w:rPr>
                 <w:b/>
-                <w:sz w:val="20"/>
-              </w:rPr>
-              <w:t>Intención esperada</w:t>
-            </w:r>
-          </w:p>
-        </w:tc>
-        <w:tc>
-          <w:tcPr>
-            <w:tcW w:type="dxa" w:w="1500"/>
-            <w:shd w:val="clear" w:color="auto" w:fill="D9E2F3"/>
-          </w:tcPr>
-          <w:p>
-            <w:pPr>
-              <w:jc w:val="left"/>
-            </w:pPr>
-            <w:r>
-              <w:rPr>
-                <w:rFonts w:ascii="Times New Roman" w:hAnsi="Times New Roman"/>
+                <w:sz w:val="180"/>
+                <w:szCs w:val="180"/>
+              </w:rPr>
+              <w:lastRenderedPageBreak/>
+              <w:t>In</w:t>
+            </w:r>
+            <w:r>
+              <w:rPr>
                 <w:b/>
-                <w:sz w:val="20"/>
-              </w:rPr>
-              <w:t>Intención detectada</w:t>
-            </w:r>
-          </w:p>
-        </w:tc>
-        <w:tc>
-          <w:tcPr>
-            <w:tcW w:type="dxa" w:w="1500"/>
-            <w:shd w:val="clear" w:color="auto" w:fill="D9E2F3"/>
-          </w:tcPr>
-          <w:p>
-            <w:pPr>
-              <w:jc w:val="left"/>
-            </w:pPr>
-            <w:r>
-              <w:rPr>
-                <w:rFonts w:ascii="Times New Roman" w:hAnsi="Times New Roman"/>
+                <w:sz w:val="180"/>
+                <w:szCs w:val="180"/>
+              </w:rPr>
+              <w:lastRenderedPageBreak/>
+              <w:t xml:space="preserve">put del </w:t>
+            </w:r>
+            <w:r>
+              <w:rPr>
                 <w:b/>
-                <w:sz w:val="20"/>
-              </w:rPr>
-              <w:t>Precisión</w:t>
-            </w:r>
-          </w:p>
-        </w:tc>
-        <w:tc>
-          <w:tcPr>
-            <w:tcW w:type="dxa" w:w="1500"/>
-            <w:shd w:val="clear" w:color="auto" w:fill="D9E2F3"/>
-          </w:tcPr>
-          <w:p>
-            <w:pPr>
-              <w:jc w:val="left"/>
-            </w:pPr>
-            <w:r>
-              <w:rPr>
-                <w:rFonts w:ascii="Times New Roman" w:hAnsi="Times New Roman"/>
+                <w:sz w:val="180"/>
+                <w:szCs w:val="180"/>
+              </w:rPr>
+              <w:lastRenderedPageBreak/>
+              <w:t>usuario</w:t>
+            </w:r>
+          </w:p>
+        </w:tc>
+        <w:tc>
+          <w:tcPr>
+            <w:tcW w:w="0" w:type="auto"/>
+            <w:vAlign w:val="center"/>
+          </w:tcPr>
+          <w:p>
+            <w:r>
+              <w:rPr>
                 <w:b/>
-                <w:sz w:val="20"/>
-              </w:rPr>
-              <w:t>Observación</w:t>
+                <w:sz w:val="180"/>
+                <w:szCs w:val="180"/>
+              </w:rPr>
+              <w:lastRenderedPageBreak/>
+              <w:t>In</w:t>
+            </w:r>
+            <w:r>
+              <w:rPr>
+                <w:b/>
+                <w:sz w:val="180"/>
+                <w:szCs w:val="180"/>
+              </w:rPr>
+              <w:lastRenderedPageBreak/>
+              <w:t>tenció</w:t>
+            </w:r>
+            <w:r>
+              <w:rPr>
+                <w:b/>
+                <w:sz w:val="180"/>
+                <w:szCs w:val="180"/>
+              </w:rPr>
+              <w:lastRenderedPageBreak/>
+              <w:t>n esper</w:t>
+            </w:r>
+            <w:r>
+              <w:rPr>
+                <w:b/>
+                <w:sz w:val="180"/>
+                <w:szCs w:val="180"/>
+              </w:rPr>
+              <w:lastRenderedPageBreak/>
+              <w:t>ada</w:t>
+            </w:r>
+          </w:p>
+        </w:tc>
+        <w:tc>
+          <w:tcPr>
+            <w:tcW w:w="0" w:type="auto"/>
+            <w:vAlign w:val="center"/>
+          </w:tcPr>
+          <w:p>
+            <w:r>
+              <w:rPr>
+                <w:b/>
+                <w:sz w:val="180"/>
+                <w:szCs w:val="180"/>
+              </w:rPr>
+              <w:lastRenderedPageBreak/>
+              <w:t>In</w:t>
+            </w:r>
+            <w:r>
+              <w:rPr>
+                <w:b/>
+                <w:sz w:val="180"/>
+                <w:szCs w:val="180"/>
+              </w:rPr>
+              <w:lastRenderedPageBreak/>
+              <w:t>tenció</w:t>
+            </w:r>
+            <w:r>
+              <w:rPr>
+                <w:b/>
+                <w:sz w:val="180"/>
+                <w:szCs w:val="180"/>
+              </w:rPr>
+              <w:lastRenderedPageBreak/>
+              <w:t>n detec</w:t>
+            </w:r>
+            <w:r>
+              <w:rPr>
+                <w:b/>
+                <w:sz w:val="180"/>
+                <w:szCs w:val="180"/>
+              </w:rPr>
+              <w:lastRenderedPageBreak/>
+              <w:t>tada</w:t>
+            </w:r>
+          </w:p>
+        </w:tc>
+        <w:tc>
+          <w:tcPr>
+            <w:tcW w:w="0" w:type="auto"/>
+            <w:vAlign w:val="center"/>
+          </w:tcPr>
+          <w:p>
+            <w:r>
+              <w:rPr>
+                <w:b/>
+                <w:sz w:val="180"/>
+                <w:szCs w:val="180"/>
+              </w:rPr>
+              <w:lastRenderedPageBreak/>
+              <w:t>Pr</w:t>
+            </w:r>
+            <w:r>
+              <w:rPr>
+                <w:b/>
+                <w:sz w:val="180"/>
+                <w:szCs w:val="180"/>
+              </w:rPr>
+              <w:lastRenderedPageBreak/>
+              <w:t>ecisi</w:t>
+            </w:r>
+            <w:r>
+              <w:rPr>
+                <w:b/>
+                <w:sz w:val="180"/>
+                <w:szCs w:val="180"/>
+              </w:rPr>
+              <w:lastRenderedPageBreak/>
+              <w:t>ón</w:t>
+            </w:r>
+          </w:p>
+        </w:tc>
+        <w:tc>
+          <w:tcPr>
+            <w:tcW w:w="0" w:type="auto"/>
+            <w:vAlign w:val="center"/>
+          </w:tcPr>
+          <w:p>
+            <w:r>
+              <w:rPr>
+                <w:b/>
+                <w:sz w:val="180"/>
+                <w:szCs w:val="180"/>
+              </w:rPr>
+              <w:lastRenderedPageBreak/>
+              <w:t>Ob</w:t>
+            </w:r>
+            <w:r>
+              <w:rPr>
+                <w:b/>
+                <w:sz w:val="180"/>
+                <w:szCs w:val="180"/>
+              </w:rPr>
+              <w:lastRenderedPageBreak/>
+              <w:t>servaci</w:t>
+            </w:r>
+            <w:r>
+              <w:rPr>
+                <w:b/>
+                <w:sz w:val="180"/>
+                <w:szCs w:val="180"/>
+              </w:rPr>
+              <w:lastRenderedPageBreak/>
+              <w:t>ón</w:t>
             </w:r>
           </w:p>
         </w:tc>
@@ -7571,103 +7686,191 @@
       <w:tr>
         <w:tc>
           <w:tcPr>
-            <w:tcW w:type="dxa" w:w="1500"/>
-          </w:tcPr>
-          <w:p>
-            <w:pPr>
-              <w:jc w:val="left"/>
-            </w:pPr>
-            <w:r>
-              <w:rPr>
-                <w:rFonts w:ascii="Times New Roman" w:hAnsi="Times New Roman"/>
-                <w:sz w:val="20"/>
-              </w:rPr>
+            <w:tcW w:w="0" w:type="auto"/>
+            <w:vAlign w:val="center"/>
+          </w:tcPr>
+          <w:p>
+            <w:r>
+              <w:rPr>
+                <w:sz w:val="180"/>
+                <w:szCs w:val="180"/>
+              </w:rPr>
+              <w:lastRenderedPageBreak/>
               <w:t>1</w:t>
             </w:r>
           </w:p>
         </w:tc>
         <w:tc>
           <w:tcPr>
-            <w:tcW w:type="dxa" w:w="1500"/>
-          </w:tcPr>
-          <w:p>
-            <w:pPr>
-              <w:jc w:val="left"/>
-            </w:pPr>
-            <w:r>
-              <w:rPr>
-                <w:rFonts w:ascii="Times New Roman" w:hAnsi="Times New Roman"/>
-                <w:sz w:val="20"/>
-              </w:rPr>
-              <w:t>"Quiero comprar jabón"</w:t>
-            </w:r>
-          </w:p>
-        </w:tc>
-        <w:tc>
-          <w:tcPr>
-            <w:tcW w:type="dxa" w:w="1500"/>
-          </w:tcPr>
-          <w:p>
-            <w:pPr>
-              <w:jc w:val="left"/>
-            </w:pPr>
-            <w:r>
-              <w:rPr>
-                <w:rFonts w:ascii="Times New Roman" w:hAnsi="Times New Roman"/>
-                <w:sz w:val="20"/>
-              </w:rPr>
-              <w:t>Compra</w:t>
-            </w:r>
-          </w:p>
-        </w:tc>
-        <w:tc>
-          <w:tcPr>
-            <w:tcW w:type="dxa" w:w="1500"/>
-          </w:tcPr>
-          <w:p>
-            <w:pPr>
-              <w:jc w:val="left"/>
-            </w:pPr>
-            <w:r>
-              <w:rPr>
-                <w:rFonts w:ascii="Times New Roman" w:hAnsi="Times New Roman"/>
-                <w:sz w:val="20"/>
-              </w:rPr>
-              <w:t>Menú (fallback)</w:t>
-            </w:r>
-          </w:p>
-        </w:tc>
-        <w:tc>
-          <w:tcPr>
-            <w:tcW w:type="dxa" w:w="1500"/>
-          </w:tcPr>
-          <w:p>
-            <w:pPr>
-              <w:jc w:val="left"/>
-            </w:pPr>
-            <w:r>
-              <w:rPr>
-                <w:rFonts w:ascii="Times New Roman" w:hAnsi="Times New Roman"/>
-                <w:sz w:val="20"/>
-              </w:rPr>
+            <w:tcW w:w="0" w:type="auto"/>
+            <w:vAlign w:val="center"/>
+          </w:tcPr>
+          <w:p>
+            <w:r>
+              <w:rPr>
+                <w:sz w:val="180"/>
+                <w:szCs w:val="180"/>
+              </w:rPr>
+              <w:t>“Q</w:t>
+            </w:r>
+            <w:r>
+              <w:rPr>
+                <w:sz w:val="180"/>
+                <w:szCs w:val="180"/>
+              </w:rPr>
+              <w:lastRenderedPageBreak/>
+              <w:t>uiero c</w:t>
+            </w:r>
+            <w:r>
+              <w:rPr>
+                <w:sz w:val="180"/>
+                <w:szCs w:val="180"/>
+              </w:rPr>
+              <w:lastRenderedPageBreak/>
+              <w:t xml:space="preserve">omprar </w:t>
+            </w:r>
+            <w:r>
+              <w:rPr>
+                <w:sz w:val="180"/>
+                <w:szCs w:val="180"/>
+              </w:rPr>
+              <w:lastRenderedPageBreak/>
+              <w:t>jabón”</w:t>
+            </w:r>
+          </w:p>
+        </w:tc>
+        <w:tc>
+          <w:tcPr>
+            <w:tcW w:w="0" w:type="auto"/>
+            <w:vAlign w:val="center"/>
+          </w:tcPr>
+          <w:p>
+            <w:r>
+              <w:rPr>
+                <w:sz w:val="180"/>
+                <w:szCs w:val="180"/>
+              </w:rPr>
+              <w:lastRenderedPageBreak/>
+              <w:t>Co</w:t>
+            </w:r>
+            <w:r>
+              <w:rPr>
+                <w:sz w:val="180"/>
+                <w:szCs w:val="180"/>
+              </w:rPr>
+              <w:lastRenderedPageBreak/>
+              <w:t>mpra</w:t>
+            </w:r>
+          </w:p>
+        </w:tc>
+        <w:tc>
+          <w:tcPr>
+            <w:tcW w:w="0" w:type="auto"/>
+            <w:vAlign w:val="center"/>
+          </w:tcPr>
+          <w:p>
+            <w:r>
+              <w:rPr>
+                <w:sz w:val="180"/>
+                <w:szCs w:val="180"/>
+              </w:rPr>
+              <w:lastRenderedPageBreak/>
+              <w:t>Me</w:t>
+            </w:r>
+            <w:r>
+              <w:rPr>
+                <w:sz w:val="180"/>
+                <w:szCs w:val="180"/>
+              </w:rPr>
+              <w:lastRenderedPageBreak/>
+              <w:t>nú (fallb</w:t>
+            </w:r>
+            <w:r>
+              <w:rPr>
+                <w:sz w:val="180"/>
+                <w:szCs w:val="180"/>
+              </w:rPr>
+              <w:lastRenderedPageBreak/>
+              <w:t>ack)</w:t>
+            </w:r>
+          </w:p>
+        </w:tc>
+        <w:tc>
+          <w:tcPr>
+            <w:tcW w:w="0" w:type="auto"/>
+            <w:vAlign w:val="center"/>
+          </w:tcPr>
+          <w:p>
+            <w:r>
+              <w:rPr>
+                <w:sz w:val="180"/>
+                <w:szCs w:val="180"/>
+              </w:rPr>
+              <w:lastRenderedPageBreak/>
               <w:t>0 %</w:t>
             </w:r>
           </w:p>
         </w:tc>
         <w:tc>
           <w:tcPr>
-            <w:tcW w:type="dxa" w:w="1500"/>
-          </w:tcPr>
-          <w:p>
-            <w:pPr>
-              <w:jc w:val="left"/>
-            </w:pPr>
-            <w:r>
-              <w:rPr>
-                <w:rFonts w:ascii="Times New Roman" w:hAnsi="Times New Roman"/>
-                <w:sz w:val="20"/>
-              </w:rPr>
-              <w:t>Lenguaje natural no coincide con patrones predefinidos</w:t>
+            <w:tcW w:w="0" w:type="auto"/>
+            <w:vAlign w:val="center"/>
+          </w:tcPr>
+          <w:p>
+            <w:r>
+              <w:rPr>
+                <w:sz w:val="180"/>
+                <w:szCs w:val="180"/>
+              </w:rPr>
+              <w:t>Le</w:t>
+            </w:r>
+            <w:r>
+              <w:rPr>
+                <w:sz w:val="180"/>
+                <w:szCs w:val="180"/>
+              </w:rPr>
+              <w:lastRenderedPageBreak/>
+              <w:t>nguaje n</w:t>
+            </w:r>
+            <w:r>
+              <w:rPr>
+                <w:sz w:val="180"/>
+                <w:szCs w:val="180"/>
+              </w:rPr>
+              <w:lastRenderedPageBreak/>
+              <w:t>atural no m</w:t>
+            </w:r>
+            <w:r>
+              <w:rPr>
+                <w:sz w:val="180"/>
+                <w:szCs w:val="180"/>
+              </w:rPr>
+              <w:lastRenderedPageBreak/>
+              <w:t>atchea p</w:t>
+            </w:r>
+            <w:r>
+              <w:rPr>
+                <w:sz w:val="180"/>
+                <w:szCs w:val="180"/>
+              </w:rPr>
+              <w:lastRenderedPageBreak/>
+              <w:t>atrones pr</w:t>
+            </w:r>
+            <w:r>
+              <w:rPr>
+                <w:sz w:val="180"/>
+                <w:szCs w:val="180"/>
+              </w:rPr>
+              <w:lastRenderedPageBreak/>
+              <w:t>edefinid</w:t>
+            </w:r>
+            <w:r>
+              <w:rPr>
+                <w:sz w:val="180"/>
+                <w:szCs w:val="180"/>
+              </w:rPr>
+              <w:lastRenderedPageBreak/>
+              <w:t>os</w:t>
             </w:r>
           </w:p>
         </w:tc>
@@ -7675,103 +7878,175 @@
       <w:tr>
         <w:tc>
           <w:tcPr>
-            <w:tcW w:type="dxa" w:w="1500"/>
-          </w:tcPr>
-          <w:p>
-            <w:pPr>
-              <w:jc w:val="left"/>
-            </w:pPr>
-            <w:r>
-              <w:rPr>
-                <w:rFonts w:ascii="Times New Roman" w:hAnsi="Times New Roman"/>
-                <w:sz w:val="20"/>
-              </w:rPr>
+            <w:tcW w:w="0" w:type="auto"/>
+            <w:vAlign w:val="center"/>
+          </w:tcPr>
+          <w:p>
+            <w:r>
+              <w:rPr>
+                <w:sz w:val="180"/>
+                <w:szCs w:val="180"/>
+              </w:rPr>
+              <w:lastRenderedPageBreak/>
               <w:t>2</w:t>
             </w:r>
           </w:p>
         </w:tc>
         <w:tc>
           <w:tcPr>
-            <w:tcW w:type="dxa" w:w="1500"/>
-          </w:tcPr>
-          <w:p>
-            <w:pPr>
-              <w:jc w:val="left"/>
-            </w:pPr>
-            <w:r>
-              <w:rPr>
-                <w:rFonts w:ascii="Times New Roman" w:hAnsi="Times New Roman"/>
-                <w:sz w:val="20"/>
-              </w:rPr>
-              <w:t>"HOLA!"</w:t>
-            </w:r>
-          </w:p>
-        </w:tc>
-        <w:tc>
-          <w:tcPr>
-            <w:tcW w:type="dxa" w:w="1500"/>
-          </w:tcPr>
-          <w:p>
-            <w:pPr>
-              <w:jc w:val="left"/>
-            </w:pPr>
-            <w:r>
-              <w:rPr>
-                <w:rFonts w:ascii="Times New Roman" w:hAnsi="Times New Roman"/>
-                <w:sz w:val="20"/>
-              </w:rPr>
+            <w:tcW w:w="0" w:type="auto"/>
+            <w:vAlign w:val="center"/>
+          </w:tcPr>
+          <w:p>
+            <w:r>
+              <w:rPr>
+                <w:sz w:val="180"/>
+                <w:szCs w:val="180"/>
+              </w:rPr>
+              <w:t>“HOL</w:t>
+            </w:r>
+            <w:r>
+              <w:rPr>
+                <w:sz w:val="180"/>
+                <w:szCs w:val="180"/>
+              </w:rPr>
+              <w:lastRenderedPageBreak/>
+              <w:t>A!”</w:t>
+            </w:r>
+          </w:p>
+        </w:tc>
+        <w:tc>
+          <w:tcPr>
+            <w:tcW w:w="0" w:type="auto"/>
+            <w:vAlign w:val="center"/>
+          </w:tcPr>
+          <w:p>
+            <w:r>
+              <w:rPr>
+                <w:sz w:val="180"/>
+                <w:szCs w:val="180"/>
+              </w:rPr>
+              <w:lastRenderedPageBreak/>
               <w:t>Menú</w:t>
             </w:r>
           </w:p>
         </w:tc>
         <w:tc>
           <w:tcPr>
-            <w:tcW w:type="dxa" w:w="1500"/>
-          </w:tcPr>
-          <w:p>
-            <w:pPr>
-              <w:jc w:val="left"/>
-            </w:pPr>
-            <w:r>
-              <w:rPr>
-                <w:rFonts w:ascii="Times New Roman" w:hAnsi="Times New Roman"/>
-                <w:sz w:val="20"/>
-              </w:rPr>
-              <w:t>Menú (fallback)</w:t>
-            </w:r>
-          </w:p>
-        </w:tc>
-        <w:tc>
-          <w:tcPr>
-            <w:tcW w:type="dxa" w:w="1500"/>
-          </w:tcPr>
-          <w:p>
-            <w:pPr>
-              <w:jc w:val="left"/>
-            </w:pPr>
-            <w:r>
-              <w:rPr>
-                <w:rFonts w:ascii="Times New Roman" w:hAnsi="Times New Roman"/>
-                <w:sz w:val="20"/>
-              </w:rPr>
-              <w:t>100 %*</w:t>
-            </w:r>
-          </w:p>
-        </w:tc>
-        <w:tc>
-          <w:tcPr>
-            <w:tcW w:type="dxa" w:w="1500"/>
-          </w:tcPr>
-          <w:p>
-            <w:pPr>
-              <w:jc w:val="left"/>
-            </w:pPr>
-            <w:r>
-              <w:rPr>
-                <w:rFonts w:ascii="Times New Roman" w:hAnsi="Times New Roman"/>
-                <w:sz w:val="20"/>
-              </w:rPr>
-              <w:t>Puntuación impide match exacto; resuelto por caso por defecto</w:t>
+            <w:tcW w:w="0" w:type="auto"/>
+            <w:vAlign w:val="center"/>
+          </w:tcPr>
+          <w:p>
+            <w:r>
+              <w:rPr>
+                <w:sz w:val="180"/>
+                <w:szCs w:val="180"/>
+              </w:rPr>
+              <w:t xml:space="preserve">Menú </w:t>
+            </w:r>
+            <w:r>
+              <w:rPr>
+                <w:sz w:val="180"/>
+                <w:szCs w:val="180"/>
+              </w:rPr>
+              <w:lastRenderedPageBreak/>
+              <w:t>(fallbac</w:t>
+            </w:r>
+            <w:r>
+              <w:rPr>
+                <w:sz w:val="180"/>
+                <w:szCs w:val="180"/>
+              </w:rPr>
+              <w:lastRenderedPageBreak/>
+              <w:t>k)</w:t>
+            </w:r>
+          </w:p>
+        </w:tc>
+        <w:tc>
+          <w:tcPr>
+            <w:tcW w:w="0" w:type="auto"/>
+            <w:vAlign w:val="center"/>
+          </w:tcPr>
+          <w:p>
+            <w:r>
+              <w:rPr>
+                <w:sz w:val="180"/>
+                <w:szCs w:val="180"/>
+              </w:rPr>
+              <w:lastRenderedPageBreak/>
+              <w:t xml:space="preserve">100 </w:t>
+            </w:r>
+            <w:r>
+              <w:rPr>
+                <w:sz w:val="180"/>
+                <w:szCs w:val="180"/>
+              </w:rPr>
+              <w:lastRenderedPageBreak/>
+              <w:t>%*</w:t>
+            </w:r>
+          </w:p>
+        </w:tc>
+        <w:tc>
+          <w:tcPr>
+            <w:tcW w:w="0" w:type="auto"/>
+            <w:vAlign w:val="center"/>
+          </w:tcPr>
+          <w:p>
+            <w:r>
+              <w:rPr>
+                <w:sz w:val="180"/>
+                <w:szCs w:val="180"/>
+              </w:rPr>
+              <w:lastRenderedPageBreak/>
+              <w:t>Puntu</w:t>
+            </w:r>
+            <w:r>
+              <w:rPr>
+                <w:sz w:val="180"/>
+                <w:szCs w:val="180"/>
+              </w:rPr>
+              <w:lastRenderedPageBreak/>
+              <w:t>ación im</w:t>
+            </w:r>
+            <w:r>
+              <w:rPr>
+                <w:sz w:val="180"/>
+                <w:szCs w:val="180"/>
+              </w:rPr>
+              <w:lastRenderedPageBreak/>
+              <w:t>pide matc</w:t>
+            </w:r>
+            <w:r>
+              <w:rPr>
+                <w:sz w:val="180"/>
+                <w:szCs w:val="180"/>
+              </w:rPr>
+              <w:lastRenderedPageBreak/>
+              <w:t xml:space="preserve">h exacto; </w:t>
+            </w:r>
+            <w:r>
+              <w:rPr>
+                <w:sz w:val="180"/>
+                <w:szCs w:val="180"/>
+              </w:rPr>
+              <w:lastRenderedPageBreak/>
+              <w:t>resuelto p</w:t>
+            </w:r>
+            <w:r>
+              <w:rPr>
+                <w:sz w:val="180"/>
+                <w:szCs w:val="180"/>
+              </w:rPr>
+              <w:lastRenderedPageBreak/>
+              <w:t>or caso p</w:t>
+            </w:r>
+            <w:r>
+              <w:rPr>
+                <w:sz w:val="180"/>
+                <w:szCs w:val="180"/>
+              </w:rPr>
+              <w:lastRenderedPageBreak/>
+              <w:t>or defecto</w:t>
             </w:r>
           </w:p>
         </w:tc>
@@ -7779,109 +8054,188 @@
       <w:tr>
         <w:tc>
           <w:tcPr>
-            <w:tcW w:type="dxa" w:w="1500"/>
-          </w:tcPr>
-          <w:p>
-            <w:pPr>
-              <w:jc w:val="left"/>
-            </w:pPr>
-            <w:r>
-              <w:rPr>
-                <w:rFonts w:ascii="Times New Roman" w:hAnsi="Times New Roman"/>
-                <w:sz w:val="20"/>
-              </w:rPr>
+            <w:tcW w:w="0" w:type="auto"/>
+            <w:vAlign w:val="center"/>
+          </w:tcPr>
+          <w:p>
+            <w:r>
+              <w:rPr>
+                <w:sz w:val="180"/>
+                <w:szCs w:val="180"/>
+              </w:rPr>
+              <w:lastRenderedPageBreak/>
               <w:t>3</w:t>
             </w:r>
           </w:p>
         </w:tc>
         <w:tc>
           <w:tcPr>
-            <w:tcW w:type="dxa" w:w="1500"/>
-          </w:tcPr>
-          <w:p>
-            <w:pPr>
-              <w:jc w:val="left"/>
-            </w:pPr>
-            <w:r>
-              <w:rPr>
-                <w:rFonts w:ascii="Times New Roman" w:hAnsi="Times New Roman"/>
-                <w:sz w:val="20"/>
-              </w:rPr>
-              <w:t>"5" (catálogo con 3 productos)</w:t>
-            </w:r>
-          </w:p>
-        </w:tc>
-        <w:tc>
-          <w:tcPr>
-            <w:tcW w:type="dxa" w:w="1500"/>
-          </w:tcPr>
-          <w:p>
-            <w:pPr>
-              <w:jc w:val="left"/>
-            </w:pPr>
-            <w:r>
-              <w:rPr>
-                <w:rFonts w:ascii="Times New Roman" w:hAnsi="Times New Roman"/>
-                <w:sz w:val="20"/>
-              </w:rPr>
-              <w:t>Seleccionar producto</w:t>
-            </w:r>
-          </w:p>
-        </w:tc>
-        <w:tc>
-          <w:tcPr>
-            <w:tcW w:type="dxa" w:w="1500"/>
-          </w:tcPr>
-          <w:p>
-            <w:pPr>
-              <w:jc w:val="left"/>
-            </w:pPr>
-            <w:r>
-              <w:rPr>
-                <w:rFonts w:ascii="Times New Roman" w:hAnsi="Times New Roman"/>
-                <w:sz w:val="20"/>
-              </w:rPr>
-              <w:t>Menú (fallback)</w:t>
-            </w:r>
-          </w:p>
-        </w:tc>
-        <w:tc>
-          <w:tcPr>
-            <w:tcW w:type="dxa" w:w="1500"/>
-          </w:tcPr>
-          <w:p>
-            <w:pPr>
-              <w:jc w:val="left"/>
-            </w:pPr>
-            <w:r>
-              <w:rPr>
-                <w:rFonts w:ascii="Times New Roman" w:hAnsi="Times New Roman"/>
-                <w:sz w:val="20"/>
-              </w:rPr>
+            <w:tcW w:w="0" w:type="auto"/>
+            <w:vAlign w:val="center"/>
+          </w:tcPr>
+          <w:p>
+            <w:r>
+              <w:rPr>
+                <w:sz w:val="180"/>
+                <w:szCs w:val="180"/>
+              </w:rPr>
+              <w:t>“5” (ca</w:t>
+            </w:r>
+            <w:r>
+              <w:rPr>
+                <w:sz w:val="180"/>
+                <w:szCs w:val="180"/>
+              </w:rPr>
+              <w:lastRenderedPageBreak/>
+              <w:t xml:space="preserve">tálogo </w:t>
+            </w:r>
+            <w:r>
+              <w:rPr>
+                <w:sz w:val="180"/>
+                <w:szCs w:val="180"/>
+              </w:rPr>
+              <w:lastRenderedPageBreak/>
+              <w:t>con 3 pr</w:t>
+            </w:r>
+            <w:r>
+              <w:rPr>
+                <w:sz w:val="180"/>
+                <w:szCs w:val="180"/>
+              </w:rPr>
+              <w:lastRenderedPageBreak/>
+              <w:t>oducto</w:t>
+            </w:r>
+            <w:r>
+              <w:rPr>
+                <w:sz w:val="180"/>
+                <w:szCs w:val="180"/>
+              </w:rPr>
+              <w:lastRenderedPageBreak/>
+              <w:t>s)</w:t>
+            </w:r>
+          </w:p>
+        </w:tc>
+        <w:tc>
+          <w:tcPr>
+            <w:tcW w:w="0" w:type="auto"/>
+            <w:vAlign w:val="center"/>
+          </w:tcPr>
+          <w:p>
+            <w:r>
+              <w:rPr>
+                <w:sz w:val="180"/>
+                <w:szCs w:val="180"/>
+              </w:rPr>
+              <w:lastRenderedPageBreak/>
+              <w:t>Seleccio</w:t>
+            </w:r>
+            <w:r>
+              <w:rPr>
+                <w:sz w:val="180"/>
+                <w:szCs w:val="180"/>
+              </w:rPr>
+              <w:lastRenderedPageBreak/>
+              <w:t>nar pro</w:t>
+            </w:r>
+            <w:r>
+              <w:rPr>
+                <w:sz w:val="180"/>
+                <w:szCs w:val="180"/>
+              </w:rPr>
+              <w:lastRenderedPageBreak/>
+              <w:t>ducto</w:t>
+            </w:r>
+          </w:p>
+        </w:tc>
+        <w:tc>
+          <w:tcPr>
+            <w:tcW w:w="0" w:type="auto"/>
+            <w:vAlign w:val="center"/>
+          </w:tcPr>
+          <w:p>
+            <w:r>
+              <w:rPr>
+                <w:sz w:val="180"/>
+                <w:szCs w:val="180"/>
+              </w:rPr>
+              <w:lastRenderedPageBreak/>
+              <w:t>Menú (fa</w:t>
+            </w:r>
+            <w:r>
+              <w:rPr>
+                <w:sz w:val="180"/>
+                <w:szCs w:val="180"/>
+              </w:rPr>
+              <w:lastRenderedPageBreak/>
+              <w:t>llback)</w:t>
+            </w:r>
+          </w:p>
+        </w:tc>
+        <w:tc>
+          <w:tcPr>
+            <w:tcW w:w="0" w:type="auto"/>
+            <w:vAlign w:val="center"/>
+          </w:tcPr>
+          <w:p>
+            <w:r>
+              <w:rPr>
+                <w:sz w:val="180"/>
+                <w:szCs w:val="180"/>
+              </w:rPr>
+              <w:lastRenderedPageBreak/>
               <w:t>0 %</w:t>
             </w:r>
           </w:p>
         </w:tc>
         <w:tc>
           <w:tcPr>
-            <w:tcW w:type="dxa" w:w="1500"/>
-          </w:tcPr>
-          <w:p>
-            <w:pPr>
-              <w:jc w:val="left"/>
-            </w:pPr>
-            <w:r>
-              <w:rPr>
-                <w:rFonts w:ascii="Times New Roman" w:hAnsi="Times New Roman"/>
-                <w:sz w:val="20"/>
-              </w:rPr>
-              <w:t>Fuera de rango del catálogo disponible</w:t>
+            <w:tcW w:w="0" w:type="auto"/>
+            <w:vAlign w:val="center"/>
+          </w:tcPr>
+          <w:p>
+            <w:r>
+              <w:rPr>
+                <w:sz w:val="180"/>
+                <w:szCs w:val="180"/>
+              </w:rPr>
+              <w:t xml:space="preserve">Fuera de </w:t>
+            </w:r>
+            <w:r>
+              <w:rPr>
+                <w:sz w:val="180"/>
+                <w:szCs w:val="180"/>
+              </w:rPr>
+              <w:lastRenderedPageBreak/>
+              <w:t xml:space="preserve">rango del </w:t>
+            </w:r>
+            <w:r>
+              <w:rPr>
+                <w:sz w:val="180"/>
+                <w:szCs w:val="180"/>
+              </w:rPr>
+              <w:lastRenderedPageBreak/>
+              <w:t xml:space="preserve">catálogo </w:t>
+            </w:r>
+            <w:r>
+              <w:rPr>
+                <w:sz w:val="180"/>
+                <w:szCs w:val="180"/>
+              </w:rPr>
+              <w:lastRenderedPageBreak/>
+              <w:t>disponi</w:t>
+            </w:r>
+            <w:r>
+              <w:rPr>
+                <w:sz w:val="180"/>
+                <w:szCs w:val="180"/>
+              </w:rPr>
+              <w:lastRenderedPageBreak/>
+              <w:t>ble</w:t>
             </w:r>
           </w:p>
         </w:tc>
       </w:tr>
     </w:tbl>
-    <w:p/>
     <w:p>
       <w:r>
         <w:rPr>

</xml_diff>

<commit_message>
fix: tesis - eliminado Fragmento 2 corrupto del Indice de Figuras (583 paras, 12 imgs intactas)
</commit_message>
<xml_diff>
--- a/Docs/Devoluciones + archivo de tesis/Tesis_Final_UTNV2 (1).docx
+++ b/Docs/Devoluciones + archivo de tesis/Tesis_Final_UTNV2 (1).docx
@@ -13986,111 +13986,6 @@
           <w:sz w:val="24"/>
         </w:rPr>
         <w:t>El siguiente fragmento muestra la capa de interpretación semántica, que transforma el texto crudo del usuario en una intención clasificada y una acción a ejecutar. Este componente es el corazón del sistema de procesamiento inteligente y demuestra la implementación del modelo determinístico descrito en la sección 4.5.</w:t>
-      </w:r>
-    </w:p>
-    <w:p>
-      <w:r>
-        <w:rPr>
-          <w:rFonts w:ascii="Courier New" w:hAnsi="Courier New"/>
-          <w:sz w:val="18"/>
-          <w:shd w:val="clear" w:color="auto" w:fill="F2F2F2"/>
-        </w:rPr>
-        <w:t># Fragmento 2: Capa de interpretación semántica (intención aacción)</w:t>
-        <w:br/>
-        <w:t># Archivo: backend/src/bot_router/router.py</w:t>
-        <w:br/>
-        <w:br/>
-        <w:t>from dataclasses import dataclass</w:t>
-        <w:br/>
-        <w:t>from typing import Optional</w:t>
-        <w:br/>
-        <w:br/>
-        <w:t>@dataclass</w:t>
-        <w:br/>
-        <w:t>class BotResponse:</w:t>
-        <w:br/>
-        <w:t xml:space="preserve">    """Respuesta estructurada del bot con intención y datos."""</w:t>
-        <w:br/>
-        <w:t xml:space="preserve">    intent: str</w:t>
-        <w:br/>
-        <w:t xml:space="preserve">    response: Optional[str] = None</w:t>
-        <w:br/>
-        <w:t xml:space="preserve">    action: Optional[str] = None</w:t>
-        <w:br/>
-        <w:t xml:space="preserve">    data: Optional[dict] = None</w:t>
-        <w:br/>
-        <w:br/>
-        <w:t>def interpret_message(text: str) -&gt; BotResponse:</w:t>
-        <w:br/>
-        <w:t xml:space="preserve">    """</w:t>
-        <w:br/>
-        <w:t xml:space="preserve">    Clasifica la intención de un mensaje de usuario.</w:t>
-        <w:br/>
-        <w:t xml:space="preserve">    </w:t>
-        <w:br/>
-        <w:t xml:space="preserve">    Implementa un router determinístico basado en reglas</w:t>
-        <w:br/>
-        <w:t xml:space="preserve">    que mapea patrones de texto a intenciones del dominio.</w:t>
-        <w:br/>
-        <w:t xml:space="preserve">    El sistema prioriza matcheos exactos antes de patrones</w:t>
-        <w:br/>
-        <w:t xml:space="preserve">    parciales, y deriva a menú principal como fallback.</w:t>
-        <w:br/>
-        <w:t xml:space="preserve">    """</w:t>
-        <w:br/>
-        <w:t xml:space="preserve">    normalized = text.strip().lower()</w:t>
-        <w:br/>
-        <w:t xml:space="preserve">    </w:t>
-        <w:br/>
-        <w:t xml:space="preserve">    # Tabla de patrones: (patrones, intención, acción)</w:t>
-        <w:br/>
-        <w:t xml:space="preserve">    PATTERNS = {</w:t>
-        <w:br/>
-        <w:t xml:space="preserve">        "menu":    (["/start","hola","menu","volver"], "menu_principal", None),</w:t>
-        <w:br/>
-        <w:t xml:space="preserve">        "comprar": (["1","comprar","quiero comprar"], "comprar", "show_catalog"),</w:t>
-        <w:br/>
-        <w:t xml:space="preserve">        "catalogo":(["2","catalogo","producto","ver"], "catalogo", "show_catalog"),</w:t>
-        <w:br/>
-        <w:t xml:space="preserve">        "precios": (["3","precio","cuanto cuesta"], "precios", "show_prices"),</w:t>
-        <w:br/>
-        <w:t xml:space="preserve">        "asesor":  (["4","asesor","hablar"], "asesor", "contact_advisor"),</w:t>
-        <w:br/>
-        <w:t xml:space="preserve">        "otra":    (["5","consulta","otra cosa"], "otra_consulta", None),</w:t>
-        <w:br/>
-        <w:t xml:space="preserve">        "carrito": (["6","carrito","mis productos"], "ver_carrito", "show_cart"),</w:t>
-        <w:br/>
-        <w:t xml:space="preserve">        "finalizar":(["7","finalizar","terminar"], "finalizar", "clear_cart"),</w:t>
-        <w:br/>
-        <w:t xml:space="preserve">    }</w:t>
-        <w:br/>
-        <w:t xml:space="preserve">    </w:t>
-        <w:br/>
-        <w:t xml:space="preserve">    # Matcheo exacto primero</w:t>
-        <w:br/>
-        <w:t xml:space="preserve">    for intent_key, (patterns, intent, action) in PATTERNS.items():</w:t>
-        <w:br/>
-        <w:t xml:space="preserve">        if normalized in patterns:</w:t>
-        <w:br/>
-        <w:t xml:space="preserve">            return BotResponse(intent=intent, action=action)</w:t>
-        <w:br/>
-        <w:t xml:space="preserve">    </w:t>
-        <w:br/>
-        <w:t xml:space="preserve">    # Matcheo parcial (contiene alguna palabra clave)</w:t>
-        <w:br/>
-        <w:t xml:space="preserve">    for intent_key, (patterns, intent, action) in PATTERNS.items():</w:t>
-        <w:br/>
-        <w:t xml:space="preserve">        for pattern in patterns:</w:t>
-        <w:br/>
-        <w:t xml:space="preserve">            if pattern in normalized:</w:t>
-        <w:br/>
-        <w:t xml:space="preserve">                return BotResponse(intent=intent, action=action)</w:t>
-        <w:br/>
-        <w:t xml:space="preserve">    </w:t>
-        <w:br/>
-        <w:t xml:space="preserve">    # Fallback: intención no reconocida</w:t>
-        <w:br/>
-        <w:t xml:space="preserve">    return BotResponse(intent="fallback", action="menu_principal")</w:t>
       </w:r>
     </w:p>
     <w:sectPr>

</xml_diff>

<commit_message>
fix: tesis - Fig8 movida despues de Fig7 (orden correcto: 6-7-8-9)
</commit_message>
<xml_diff>
--- a/Docs/Devoluciones + archivo de tesis/Tesis_Final_UTNV2 (1).docx
+++ b/Docs/Devoluciones + archivo de tesis/Tesis_Final_UTNV2 (1).docx
@@ -4565,6 +4565,23 @@
       </w:r>
     </w:p>
     <w:p>
+      <w:r>
+        <w:rPr>
+          <w:b/>
+          <w:sz w:val="20"/>
+        </w:rPr>
+        <w:t>Figura 8. Panel de documentacion interactiva de la API REST (Swagger UI).</w:t>
+      </w:r>
+    </w:p>
+    <w:p>
+      <w:pPr>
+        <w:pStyle w:val="Ttulo2"/>
+      </w:pPr>
+      <w:r>
+        <w:t>4.8 Implementación del prototipo</w:t>
+      </w:r>
+    </w:p>
+    <w:p>
       <w:pPr>
         <w:spacing w:after="200"/>
       </w:pPr>
@@ -9745,23 +9762,6 @@
             </a:graphic>
           </wp:inline>
         </w:drawing>
-      </w:r>
-    </w:p>
-    <w:p>
-      <w:r>
-        <w:rPr>
-          <w:b/>
-          <w:sz w:val="20"/>
-        </w:rPr>
-        <w:t>Figura 8. Panel de documentacion interactiva de la API REST (Swagger UI).</w:t>
-      </w:r>
-    </w:p>
-    <w:p>
-      <w:pPr>
-        <w:pStyle w:val="Ttulo2"/>
-      </w:pPr>
-      <w:r>
-        <w:t>4.8 Implementación del prototipo</w:t>
       </w:r>
     </w:p>
     <w:p>

</xml_diff>

<commit_message>
fix: tesis - Tabla 7 reducida de 90pt a 10pt (era el motivo de ocupar varias paginas)
</commit_message>
<xml_diff>
--- a/Docs/Devoluciones + archivo de tesis/Tesis_Final_UTNV2 (1).docx
+++ b/Docs/Devoluciones + archivo de tesis/Tesis_Final_UTNV2 (1).docx
@@ -12338,7 +12338,7 @@
             <w:r>
               <w:rPr>
                 <w:b/>
-                <w:sz w:val="180"/>
+                <w:sz w:val="20"/>
                 <w:szCs w:val="180"/>
               </w:rPr>
               <w:lastRenderedPageBreak/>
@@ -12355,7 +12355,7 @@
             <w:r>
               <w:rPr>
                 <w:b/>
-                <w:sz w:val="180"/>
+                <w:sz w:val="20"/>
                 <w:szCs w:val="180"/>
               </w:rPr>
               <w:t>Input d</w:t>
@@ -12363,7 +12363,7 @@
             <w:r>
               <w:rPr>
                 <w:b/>
-                <w:sz w:val="180"/>
+                <w:sz w:val="20"/>
                 <w:szCs w:val="180"/>
               </w:rPr>
               <w:lastRenderedPageBreak/>
@@ -12372,7 +12372,7 @@
             <w:r>
               <w:rPr>
                 <w:b/>
-                <w:sz w:val="180"/>
+                <w:sz w:val="20"/>
                 <w:szCs w:val="180"/>
               </w:rPr>
               <w:lastRenderedPageBreak/>
@@ -12381,7 +12381,7 @@
             <w:r>
               <w:rPr>
                 <w:b/>
-                <w:sz w:val="180"/>
+                <w:sz w:val="20"/>
                 <w:szCs w:val="180"/>
               </w:rPr>
               <w:t>io</w:t>
@@ -12397,7 +12397,7 @@
             <w:r>
               <w:rPr>
                 <w:b/>
-                <w:sz w:val="180"/>
+                <w:sz w:val="20"/>
                 <w:szCs w:val="180"/>
               </w:rPr>
               <w:lastRenderedPageBreak/>
@@ -12406,7 +12406,7 @@
             <w:r>
               <w:rPr>
                 <w:b/>
-                <w:sz w:val="180"/>
+                <w:sz w:val="20"/>
                 <w:szCs w:val="180"/>
               </w:rPr>
               <w:t>ión esp</w:t>
@@ -12414,7 +12414,7 @@
             <w:r>
               <w:rPr>
                 <w:b/>
-                <w:sz w:val="180"/>
+                <w:sz w:val="20"/>
                 <w:szCs w:val="180"/>
               </w:rPr>
               <w:lastRenderedPageBreak/>
@@ -12431,7 +12431,7 @@
             <w:r>
               <w:rPr>
                 <w:b/>
-                <w:sz w:val="180"/>
+                <w:sz w:val="20"/>
                 <w:szCs w:val="180"/>
               </w:rPr>
               <w:lastRenderedPageBreak/>
@@ -12440,7 +12440,7 @@
             <w:r>
               <w:rPr>
                 <w:b/>
-                <w:sz w:val="180"/>
+                <w:sz w:val="20"/>
                 <w:szCs w:val="180"/>
               </w:rPr>
               <w:t>ión det</w:t>
@@ -12448,7 +12448,7 @@
             <w:r>
               <w:rPr>
                 <w:b/>
-                <w:sz w:val="180"/>
+                <w:sz w:val="20"/>
                 <w:szCs w:val="180"/>
               </w:rPr>
               <w:lastRenderedPageBreak/>
@@ -12465,7 +12465,7 @@
             <w:r>
               <w:rPr>
                 <w:b/>
-                <w:sz w:val="180"/>
+                <w:sz w:val="20"/>
                 <w:szCs w:val="180"/>
               </w:rPr>
               <w:lastRenderedPageBreak/>
@@ -12474,7 +12474,7 @@
             <w:r>
               <w:rPr>
                 <w:b/>
-                <w:sz w:val="180"/>
+                <w:sz w:val="20"/>
                 <w:szCs w:val="180"/>
               </w:rPr>
               <w:t>ión</w:t>
@@ -12490,7 +12490,7 @@
             <w:r>
               <w:rPr>
                 <w:b/>
-                <w:sz w:val="180"/>
+                <w:sz w:val="20"/>
                 <w:szCs w:val="180"/>
               </w:rPr>
               <w:lastRenderedPageBreak/>
@@ -12499,7 +12499,7 @@
             <w:r>
               <w:rPr>
                 <w:b/>
-                <w:sz w:val="180"/>
+                <w:sz w:val="20"/>
                 <w:szCs w:val="180"/>
               </w:rPr>
               <w:lastRenderedPageBreak/>
@@ -12517,7 +12517,7 @@
           <w:p>
             <w:r>
               <w:rPr>
-                <w:sz w:val="180"/>
+                <w:sz w:val="20"/>
                 <w:szCs w:val="180"/>
               </w:rPr>
               <w:lastRenderedPageBreak/>
@@ -12533,14 +12533,14 @@
           <w:p>
             <w:r>
               <w:rPr>
-                <w:sz w:val="180"/>
+                <w:sz w:val="20"/>
                 <w:szCs w:val="180"/>
               </w:rPr>
               <w:t>“Quier</w:t>
             </w:r>
             <w:r>
               <w:rPr>
-                <w:sz w:val="180"/>
+                <w:sz w:val="20"/>
                 <w:szCs w:val="180"/>
               </w:rPr>
               <w:lastRenderedPageBreak/>
@@ -12548,7 +12548,7 @@
             </w:r>
             <w:r>
               <w:rPr>
-                <w:sz w:val="180"/>
+                <w:sz w:val="20"/>
                 <w:szCs w:val="180"/>
               </w:rPr>
               <w:lastRenderedPageBreak/>
@@ -12556,7 +12556,7 @@
             </w:r>
             <w:r>
               <w:rPr>
-                <w:sz w:val="180"/>
+                <w:sz w:val="20"/>
                 <w:szCs w:val="180"/>
               </w:rPr>
               <w:lastRenderedPageBreak/>
@@ -12572,7 +12572,7 @@
           <w:p>
             <w:r>
               <w:rPr>
-                <w:sz w:val="180"/>
+                <w:sz w:val="20"/>
                 <w:szCs w:val="180"/>
               </w:rPr>
               <w:lastRenderedPageBreak/>
@@ -12588,7 +12588,7 @@
           <w:p>
             <w:r>
               <w:rPr>
-                <w:sz w:val="180"/>
+                <w:sz w:val="20"/>
                 <w:szCs w:val="180"/>
               </w:rPr>
               <w:t>Menú (</w:t>
@@ -12596,14 +12596,14 @@
             <w:proofErr w:type="spellStart"/>
             <w:r>
               <w:rPr>
-                <w:sz w:val="180"/>
+                <w:sz w:val="20"/>
                 <w:szCs w:val="180"/>
               </w:rPr>
               <w:t>fa</w:t>
             </w:r>
             <w:r>
               <w:rPr>
-                <w:sz w:val="180"/>
+                <w:sz w:val="20"/>
                 <w:szCs w:val="180"/>
               </w:rPr>
               <w:lastRenderedPageBreak/>
@@ -12612,7 +12612,7 @@
             <w:proofErr w:type="spellEnd"/>
             <w:r>
               <w:rPr>
-                <w:sz w:val="180"/>
+                <w:sz w:val="20"/>
                 <w:szCs w:val="180"/>
               </w:rPr>
               <w:t>)</w:t>
@@ -12627,7 +12627,7 @@
           <w:p>
             <w:r>
               <w:rPr>
-                <w:sz w:val="180"/>
+                <w:sz w:val="20"/>
                 <w:szCs w:val="180"/>
               </w:rPr>
               <w:lastRenderedPageBreak/>
@@ -12643,14 +12643,14 @@
           <w:p>
             <w:r>
               <w:rPr>
-                <w:sz w:val="180"/>
+                <w:sz w:val="20"/>
                 <w:szCs w:val="180"/>
               </w:rPr>
               <w:t>Lenguaj</w:t>
             </w:r>
             <w:r>
               <w:rPr>
-                <w:sz w:val="180"/>
+                <w:sz w:val="20"/>
                 <w:szCs w:val="180"/>
               </w:rPr>
               <w:lastRenderedPageBreak/>
@@ -12658,7 +12658,7 @@
             </w:r>
             <w:r>
               <w:rPr>
-                <w:sz w:val="180"/>
+                <w:sz w:val="20"/>
                 <w:szCs w:val="180"/>
               </w:rPr>
               <w:lastRenderedPageBreak/>
@@ -12667,14 +12667,14 @@
             <w:proofErr w:type="spellStart"/>
             <w:r>
               <w:rPr>
-                <w:sz w:val="180"/>
+                <w:sz w:val="20"/>
                 <w:szCs w:val="180"/>
               </w:rPr>
               <w:t>matche</w:t>
             </w:r>
             <w:r>
               <w:rPr>
-                <w:sz w:val="180"/>
+                <w:sz w:val="20"/>
                 <w:szCs w:val="180"/>
               </w:rPr>
               <w:lastRenderedPageBreak/>
@@ -12683,14 +12683,14 @@
             <w:proofErr w:type="spellEnd"/>
             <w:r>
               <w:rPr>
-                <w:sz w:val="180"/>
+                <w:sz w:val="20"/>
                 <w:szCs w:val="180"/>
               </w:rPr>
               <w:t xml:space="preserve"> patrone</w:t>
             </w:r>
             <w:r>
               <w:rPr>
-                <w:sz w:val="180"/>
+                <w:sz w:val="20"/>
                 <w:szCs w:val="180"/>
               </w:rPr>
               <w:lastRenderedPageBreak/>
@@ -12698,7 +12698,7 @@
             </w:r>
             <w:r>
               <w:rPr>
-                <w:sz w:val="180"/>
+                <w:sz w:val="20"/>
                 <w:szCs w:val="180"/>
               </w:rPr>
               <w:lastRenderedPageBreak/>
@@ -12716,7 +12716,7 @@
           <w:p>
             <w:r>
               <w:rPr>
-                <w:sz w:val="180"/>
+                <w:sz w:val="20"/>
                 <w:szCs w:val="180"/>
               </w:rPr>
               <w:lastRenderedPageBreak/>
@@ -12732,14 +12732,14 @@
           <w:p>
             <w:r>
               <w:rPr>
-                <w:sz w:val="180"/>
+                <w:sz w:val="20"/>
                 <w:szCs w:val="180"/>
               </w:rPr>
               <w:t>“HO</w:t>
             </w:r>
             <w:r>
               <w:rPr>
-                <w:sz w:val="180"/>
+                <w:sz w:val="20"/>
                 <w:szCs w:val="180"/>
               </w:rPr>
               <w:lastRenderedPageBreak/>
@@ -12755,7 +12755,7 @@
           <w:p>
             <w:r>
               <w:rPr>
-                <w:sz w:val="180"/>
+                <w:sz w:val="20"/>
                 <w:szCs w:val="180"/>
               </w:rPr>
               <w:lastRenderedPageBreak/>
@@ -12763,7 +12763,7 @@
             </w:r>
             <w:r>
               <w:rPr>
-                <w:sz w:val="180"/>
+                <w:sz w:val="20"/>
                 <w:szCs w:val="180"/>
               </w:rPr>
               <w:lastRenderedPageBreak/>
@@ -12779,7 +12779,7 @@
           <w:p>
             <w:r>
               <w:rPr>
-                <w:sz w:val="180"/>
+                <w:sz w:val="20"/>
                 <w:szCs w:val="180"/>
               </w:rPr>
               <w:lastRenderedPageBreak/>
@@ -12787,7 +12787,7 @@
             </w:r>
             <w:r>
               <w:rPr>
-                <w:sz w:val="180"/>
+                <w:sz w:val="20"/>
                 <w:szCs w:val="180"/>
               </w:rPr>
               <w:lastRenderedPageBreak/>
@@ -12796,14 +12796,14 @@
             <w:proofErr w:type="spellStart"/>
             <w:r>
               <w:rPr>
-                <w:sz w:val="180"/>
+                <w:sz w:val="20"/>
                 <w:szCs w:val="180"/>
               </w:rPr>
               <w:t>fallba</w:t>
             </w:r>
             <w:r>
               <w:rPr>
-                <w:sz w:val="180"/>
+                <w:sz w:val="20"/>
                 <w:szCs w:val="180"/>
               </w:rPr>
               <w:lastRenderedPageBreak/>
@@ -12812,7 +12812,7 @@
             <w:proofErr w:type="spellEnd"/>
             <w:r>
               <w:rPr>
-                <w:sz w:val="180"/>
+                <w:sz w:val="20"/>
                 <w:szCs w:val="180"/>
               </w:rPr>
               <w:t>)</w:t>
@@ -12827,7 +12827,7 @@
           <w:p>
             <w:r>
               <w:rPr>
-                <w:sz w:val="180"/>
+                <w:sz w:val="20"/>
                 <w:szCs w:val="180"/>
               </w:rPr>
               <w:lastRenderedPageBreak/>
@@ -12835,7 +12835,7 @@
             </w:r>
             <w:r>
               <w:rPr>
-                <w:sz w:val="180"/>
+                <w:sz w:val="20"/>
                 <w:szCs w:val="180"/>
               </w:rPr>
               <w:t>%*</w:t>
@@ -12850,7 +12850,7 @@
           <w:p>
             <w:r>
               <w:rPr>
-                <w:sz w:val="180"/>
+                <w:sz w:val="20"/>
                 <w:szCs w:val="180"/>
               </w:rPr>
               <w:lastRenderedPageBreak/>
@@ -12858,7 +12858,7 @@
             </w:r>
             <w:r>
               <w:rPr>
-                <w:sz w:val="180"/>
+                <w:sz w:val="20"/>
                 <w:szCs w:val="180"/>
               </w:rPr>
               <w:lastRenderedPageBreak/>
@@ -12866,7 +12866,7 @@
             </w:r>
             <w:r>
               <w:rPr>
-                <w:sz w:val="180"/>
+                <w:sz w:val="20"/>
                 <w:szCs w:val="180"/>
               </w:rPr>
               <w:lastRenderedPageBreak/>
@@ -12874,7 +12874,7 @@
             </w:r>
             <w:r>
               <w:rPr>
-                <w:sz w:val="180"/>
+                <w:sz w:val="20"/>
                 <w:szCs w:val="180"/>
               </w:rPr>
               <w:lastRenderedPageBreak/>
@@ -12882,7 +12882,7 @@
             </w:r>
             <w:r>
               <w:rPr>
-                <w:sz w:val="180"/>
+                <w:sz w:val="20"/>
                 <w:szCs w:val="180"/>
               </w:rPr>
               <w:lastRenderedPageBreak/>
@@ -12890,7 +12890,7 @@
             </w:r>
             <w:r>
               <w:rPr>
-                <w:sz w:val="180"/>
+                <w:sz w:val="20"/>
                 <w:szCs w:val="180"/>
               </w:rPr>
               <w:lastRenderedPageBreak/>
@@ -12898,7 +12898,7 @@
             </w:r>
             <w:r>
               <w:rPr>
-                <w:sz w:val="180"/>
+                <w:sz w:val="20"/>
                 <w:szCs w:val="180"/>
               </w:rPr>
               <w:lastRenderedPageBreak/>
@@ -12906,7 +12906,7 @@
             </w:r>
             <w:r>
               <w:rPr>
-                <w:sz w:val="180"/>
+                <w:sz w:val="20"/>
                 <w:szCs w:val="180"/>
               </w:rPr>
               <w:lastRenderedPageBreak/>
@@ -12924,7 +12924,7 @@
           <w:p>
             <w:r>
               <w:rPr>
-                <w:sz w:val="180"/>
+                <w:sz w:val="20"/>
                 <w:szCs w:val="180"/>
               </w:rPr>
               <w:lastRenderedPageBreak/>
@@ -12940,14 +12940,14 @@
           <w:p>
             <w:r>
               <w:rPr>
-                <w:sz w:val="180"/>
+                <w:sz w:val="20"/>
                 <w:szCs w:val="180"/>
               </w:rPr>
               <w:t>“5” (</w:t>
             </w:r>
             <w:r>
               <w:rPr>
-                <w:sz w:val="180"/>
+                <w:sz w:val="20"/>
                 <w:szCs w:val="180"/>
               </w:rPr>
               <w:lastRenderedPageBreak/>
@@ -12955,7 +12955,7 @@
             </w:r>
             <w:r>
               <w:rPr>
-                <w:sz w:val="180"/>
+                <w:sz w:val="20"/>
                 <w:szCs w:val="180"/>
               </w:rPr>
               <w:lastRenderedPageBreak/>
@@ -12963,7 +12963,7 @@
             </w:r>
             <w:r>
               <w:rPr>
-                <w:sz w:val="180"/>
+                <w:sz w:val="20"/>
                 <w:szCs w:val="180"/>
               </w:rPr>
               <w:lastRenderedPageBreak/>
@@ -12971,7 +12971,7 @@
             </w:r>
             <w:r>
               <w:rPr>
-                <w:sz w:val="180"/>
+                <w:sz w:val="20"/>
                 <w:szCs w:val="180"/>
               </w:rPr>
               <w:lastRenderedPageBreak/>
@@ -12987,7 +12987,7 @@
           <w:p>
             <w:r>
               <w:rPr>
-                <w:sz w:val="180"/>
+                <w:sz w:val="20"/>
                 <w:szCs w:val="180"/>
               </w:rPr>
               <w:lastRenderedPageBreak/>
@@ -12995,7 +12995,7 @@
             </w:r>
             <w:r>
               <w:rPr>
-                <w:sz w:val="180"/>
+                <w:sz w:val="20"/>
                 <w:szCs w:val="180"/>
               </w:rPr>
               <w:lastRenderedPageBreak/>
@@ -13003,7 +13003,7 @@
             </w:r>
             <w:r>
               <w:rPr>
-                <w:sz w:val="180"/>
+                <w:sz w:val="20"/>
                 <w:szCs w:val="180"/>
               </w:rPr>
               <w:lastRenderedPageBreak/>
@@ -13019,7 +13019,7 @@
           <w:p>
             <w:r>
               <w:rPr>
-                <w:sz w:val="180"/>
+                <w:sz w:val="20"/>
                 <w:szCs w:val="180"/>
               </w:rPr>
               <w:lastRenderedPageBreak/>
@@ -13027,7 +13027,7 @@
             </w:r>
             <w:r>
               <w:rPr>
-                <w:sz w:val="180"/>
+                <w:sz w:val="20"/>
                 <w:szCs w:val="180"/>
               </w:rPr>
               <w:t>(</w:t>
@@ -13035,14 +13035,14 @@
             <w:proofErr w:type="spellStart"/>
             <w:r>
               <w:rPr>
-                <w:sz w:val="180"/>
+                <w:sz w:val="20"/>
                 <w:szCs w:val="180"/>
               </w:rPr>
               <w:t>fallbac</w:t>
             </w:r>
             <w:r>
               <w:rPr>
-                <w:sz w:val="180"/>
+                <w:sz w:val="20"/>
                 <w:szCs w:val="180"/>
               </w:rPr>
               <w:lastRenderedPageBreak/>
@@ -13051,7 +13051,7 @@
             <w:proofErr w:type="spellEnd"/>
             <w:r>
               <w:rPr>
-                <w:sz w:val="180"/>
+                <w:sz w:val="20"/>
                 <w:szCs w:val="180"/>
               </w:rPr>
               <w:t>)</w:t>
@@ -13066,7 +13066,7 @@
           <w:p>
             <w:r>
               <w:rPr>
-                <w:sz w:val="180"/>
+                <w:sz w:val="20"/>
                 <w:szCs w:val="180"/>
               </w:rPr>
               <w:lastRenderedPageBreak/>
@@ -13082,21 +13082,21 @@
           <w:p>
             <w:r>
               <w:rPr>
-                <w:sz w:val="180"/>
+                <w:sz w:val="20"/>
                 <w:szCs w:val="180"/>
               </w:rPr>
               <w:t xml:space="preserve">Fuera </w:t>
             </w:r>
             <w:r>
               <w:rPr>
-                <w:sz w:val="180"/>
+                <w:sz w:val="20"/>
                 <w:szCs w:val="180"/>
               </w:rPr>
               <w:t xml:space="preserve">de rango </w:t>
             </w:r>
             <w:r>
               <w:rPr>
-                <w:sz w:val="180"/>
+                <w:sz w:val="20"/>
                 <w:szCs w:val="180"/>
               </w:rPr>
               <w:lastRenderedPageBreak/>
@@ -13104,7 +13104,7 @@
             </w:r>
             <w:r>
               <w:rPr>
-                <w:sz w:val="180"/>
+                <w:sz w:val="20"/>
                 <w:szCs w:val="180"/>
               </w:rPr>
               <w:lastRenderedPageBreak/>
@@ -13112,7 +13112,7 @@
             </w:r>
             <w:r>
               <w:rPr>
-                <w:sz w:val="180"/>
+                <w:sz w:val="20"/>
                 <w:szCs w:val="180"/>
               </w:rPr>
               <w:lastRenderedPageBreak/>

</xml_diff>

<commit_message>
fix: tesis - captions de Tabla 5 y 6 movidos antes de sus respectivas tablas (estaban entre las dos tablas)
</commit_message>
<xml_diff>
--- a/Docs/Devoluciones + archivo de tesis/Tesis_Final_UTNV2 (1).docx
+++ b/Docs/Devoluciones + archivo de tesis/Tesis_Final_UTNV2 (1).docx
@@ -10901,11 +10901,6 @@
         <w:t>Tabla 5. Mediciones de tiempo de respuesta por tipo de solicitud (n = 30).</w:t>
       </w:r>
     </w:p>
-    <w:p>
-      <w:r>
-        <w:t>Tabla 6. Evaluación de precisión de la interpretación por intención.</w:t>
-      </w:r>
-    </w:p>
     <w:tbl>
       <w:tblPr>
         <w:tblStyle w:val="TableNormal"/>
@@ -11541,6 +11536,11 @@
     <w:p>
       <w:r>
         <w:t>El comportamiento del sistema ante mensajes fuera de las rutas cubiertas también es predecible y correcto: las entradas no reconocidas se derivan a la intención por defecto, que presenta nuevamente el menú principal e informa al usuario de las opciones disponibles. Esta característica, propia del diseño determinístico, elimina la posibilidad de interpretaciones erróneas silenciosas y asegura que el sistema nunca produzca una respuesta fuera del conjunto previsto. Las limitaciones de este enfoque, que serán retomadas en el capítulo de discusión, se concentran en los mensajes expresados con una redacción diferente a la contemplada en el catálogo, que requieren la ampliación de las reglas o la incorporación de un componente adaptativo.</w:t>
+      </w:r>
+    </w:p>
+    <w:p>
+      <w:r>
+        <w:t>Tabla 6. Evaluación de precisión de la interpretación por intención.</w:t>
       </w:r>
     </w:p>
     <w:tbl>

</xml_diff>

<commit_message>
fix: tesis - 4 correcciones: caption Fig8, imagen FigC1, caption Tabla7, heading 4.8 en indice eliminado
</commit_message>
<xml_diff>
--- a/Docs/Devoluciones + archivo de tesis/Tesis_Final_UTNV2 (1).docx
+++ b/Docs/Devoluciones + archivo de tesis/Tesis_Final_UTNV2 (1).docx
@@ -4565,30 +4565,13 @@
       </w:r>
     </w:p>
     <w:p>
-      <w:r>
-        <w:rPr>
-          <w:b/>
-          <w:sz w:val="20"/>
-        </w:rPr>
-        <w:t>Figura 8. Panel de documentacion interactiva de la API REST (Swagger UI).</w:t>
-      </w:r>
-    </w:p>
-    <w:p>
-      <w:pPr>
-        <w:pStyle w:val="Ttulo2"/>
-      </w:pPr>
-      <w:r>
-        <w:t>4.8 Implementación del prototipo</w:t>
-      </w:r>
-    </w:p>
-    <w:p>
       <w:pPr>
         <w:spacing w:after="200"/>
       </w:pPr>
     </w:p>
     <w:p>
       <w:pPr>
-        <w:pStyle w:val="Ttulo3"/>
+        <w:pStyle w:val="Normal"/>
       </w:pPr>
       <w:r>
         <w:t>Tablas</w:t>
@@ -9730,6 +9713,14 @@
     </w:p>
     <w:p>
       <w:r>
+        <w:rPr>
+          <w:b/>
+        </w:rPr>
+        <w:t>Figura 8. Panel de documentacion interactiva de la API REST (Swagger UI).</w:t>
+      </w:r>
+    </w:p>
+    <w:p>
+      <w:r>
         <w:drawing>
           <wp:inline xmlns:a="http://schemas.openxmlformats.org/drawingml/2006/main" xmlns:pic="http://schemas.openxmlformats.org/drawingml/2006/picture">
             <wp:extent cx="5029200" cy="2828925"/>
@@ -9762,6 +9753,14 @@
             </a:graphic>
           </wp:inline>
         </w:drawing>
+      </w:r>
+    </w:p>
+    <w:p>
+      <w:pPr>
+        <w:pStyle w:val="Ttulo2"/>
+      </w:pPr>
+      <w:r>
+        <w:t>4.8 Implementación del prototipo</w:t>
       </w:r>
     </w:p>
     <w:p>
@@ -10901,6 +10900,11 @@
         <w:t>Tabla 5. Mediciones de tiempo de respuesta por tipo de solicitud (n = 30).</w:t>
       </w:r>
     </w:p>
+    <w:p>
+      <w:r>
+        <w:t>Tabla 6. Evaluación de precisión de la interpretación por intención.</w:t>
+      </w:r>
+    </w:p>
     <w:tbl>
       <w:tblPr>
         <w:tblStyle w:val="TableNormal"/>
@@ -11538,11 +11542,6 @@
         <w:t>El comportamiento del sistema ante mensajes fuera de las rutas cubiertas también es predecible y correcto: las entradas no reconocidas se derivan a la intención por defecto, que presenta nuevamente el menú principal e informa al usuario de las opciones disponibles. Esta característica, propia del diseño determinístico, elimina la posibilidad de interpretaciones erróneas silenciosas y asegura que el sistema nunca produzca una respuesta fuera del conjunto previsto. Las limitaciones de este enfoque, que serán retomadas en el capítulo de discusión, se concentran en los mensajes expresados con una redacción diferente a la contemplada en el catálogo, que requieren la ampliación de las reglas o la incorporación de un componente adaptativo.</w:t>
       </w:r>
     </w:p>
-    <w:p>
-      <w:r>
-        <w:t>Tabla 6. Evaluación de precisión de la interpretación por intención.</w:t>
-      </w:r>
-    </w:p>
     <w:tbl>
       <w:tblPr>
         <w:tblStyle w:val="TableNormal"/>
@@ -12304,6 +12303,11 @@
       </w:r>
     </w:p>
     <w:p/>
+    <w:p>
+      <w:r>
+        <w:t>Tabla 7. Analisis de casos limite del bot conversacional.</w:t>
+      </w:r>
+    </w:p>
     <w:tbl>
       <w:tblPr>
         <w:tblStyle w:val="TableNormal"/>
@@ -12338,7 +12342,7 @@
             <w:r>
               <w:rPr>
                 <w:b/>
-                <w:sz w:val="20"/>
+                <w:sz w:val="180"/>
                 <w:szCs w:val="180"/>
               </w:rPr>
               <w:lastRenderedPageBreak/>
@@ -12355,7 +12359,7 @@
             <w:r>
               <w:rPr>
                 <w:b/>
-                <w:sz w:val="20"/>
+                <w:sz w:val="180"/>
                 <w:szCs w:val="180"/>
               </w:rPr>
               <w:t>Input d</w:t>
@@ -12363,7 +12367,7 @@
             <w:r>
               <w:rPr>
                 <w:b/>
-                <w:sz w:val="20"/>
+                <w:sz w:val="180"/>
                 <w:szCs w:val="180"/>
               </w:rPr>
               <w:lastRenderedPageBreak/>
@@ -12372,7 +12376,7 @@
             <w:r>
               <w:rPr>
                 <w:b/>
-                <w:sz w:val="20"/>
+                <w:sz w:val="180"/>
                 <w:szCs w:val="180"/>
               </w:rPr>
               <w:lastRenderedPageBreak/>
@@ -12381,7 +12385,7 @@
             <w:r>
               <w:rPr>
                 <w:b/>
-                <w:sz w:val="20"/>
+                <w:sz w:val="180"/>
                 <w:szCs w:val="180"/>
               </w:rPr>
               <w:t>io</w:t>
@@ -12397,7 +12401,7 @@
             <w:r>
               <w:rPr>
                 <w:b/>
-                <w:sz w:val="20"/>
+                <w:sz w:val="180"/>
                 <w:szCs w:val="180"/>
               </w:rPr>
               <w:lastRenderedPageBreak/>
@@ -12406,7 +12410,7 @@
             <w:r>
               <w:rPr>
                 <w:b/>
-                <w:sz w:val="20"/>
+                <w:sz w:val="180"/>
                 <w:szCs w:val="180"/>
               </w:rPr>
               <w:t>ión esp</w:t>
@@ -12414,7 +12418,7 @@
             <w:r>
               <w:rPr>
                 <w:b/>
-                <w:sz w:val="20"/>
+                <w:sz w:val="180"/>
                 <w:szCs w:val="180"/>
               </w:rPr>
               <w:lastRenderedPageBreak/>
@@ -12431,7 +12435,7 @@
             <w:r>
               <w:rPr>
                 <w:b/>
-                <w:sz w:val="20"/>
+                <w:sz w:val="180"/>
                 <w:szCs w:val="180"/>
               </w:rPr>
               <w:lastRenderedPageBreak/>
@@ -12440,7 +12444,7 @@
             <w:r>
               <w:rPr>
                 <w:b/>
-                <w:sz w:val="20"/>
+                <w:sz w:val="180"/>
                 <w:szCs w:val="180"/>
               </w:rPr>
               <w:t>ión det</w:t>
@@ -12448,7 +12452,7 @@
             <w:r>
               <w:rPr>
                 <w:b/>
-                <w:sz w:val="20"/>
+                <w:sz w:val="180"/>
                 <w:szCs w:val="180"/>
               </w:rPr>
               <w:lastRenderedPageBreak/>
@@ -12465,7 +12469,7 @@
             <w:r>
               <w:rPr>
                 <w:b/>
-                <w:sz w:val="20"/>
+                <w:sz w:val="180"/>
                 <w:szCs w:val="180"/>
               </w:rPr>
               <w:lastRenderedPageBreak/>
@@ -12474,7 +12478,7 @@
             <w:r>
               <w:rPr>
                 <w:b/>
-                <w:sz w:val="20"/>
+                <w:sz w:val="180"/>
                 <w:szCs w:val="180"/>
               </w:rPr>
               <w:t>ión</w:t>
@@ -12490,7 +12494,7 @@
             <w:r>
               <w:rPr>
                 <w:b/>
-                <w:sz w:val="20"/>
+                <w:sz w:val="180"/>
                 <w:szCs w:val="180"/>
               </w:rPr>
               <w:lastRenderedPageBreak/>
@@ -12499,7 +12503,7 @@
             <w:r>
               <w:rPr>
                 <w:b/>
-                <w:sz w:val="20"/>
+                <w:sz w:val="180"/>
                 <w:szCs w:val="180"/>
               </w:rPr>
               <w:lastRenderedPageBreak/>
@@ -12517,7 +12521,7 @@
           <w:p>
             <w:r>
               <w:rPr>
-                <w:sz w:val="20"/>
+                <w:sz w:val="180"/>
                 <w:szCs w:val="180"/>
               </w:rPr>
               <w:lastRenderedPageBreak/>
@@ -12533,14 +12537,14 @@
           <w:p>
             <w:r>
               <w:rPr>
-                <w:sz w:val="20"/>
+                <w:sz w:val="180"/>
                 <w:szCs w:val="180"/>
               </w:rPr>
               <w:t>“Quier</w:t>
             </w:r>
             <w:r>
               <w:rPr>
-                <w:sz w:val="20"/>
+                <w:sz w:val="180"/>
                 <w:szCs w:val="180"/>
               </w:rPr>
               <w:lastRenderedPageBreak/>
@@ -12548,7 +12552,7 @@
             </w:r>
             <w:r>
               <w:rPr>
-                <w:sz w:val="20"/>
+                <w:sz w:val="180"/>
                 <w:szCs w:val="180"/>
               </w:rPr>
               <w:lastRenderedPageBreak/>
@@ -12556,7 +12560,7 @@
             </w:r>
             <w:r>
               <w:rPr>
-                <w:sz w:val="20"/>
+                <w:sz w:val="180"/>
                 <w:szCs w:val="180"/>
               </w:rPr>
               <w:lastRenderedPageBreak/>
@@ -12572,7 +12576,7 @@
           <w:p>
             <w:r>
               <w:rPr>
-                <w:sz w:val="20"/>
+                <w:sz w:val="180"/>
                 <w:szCs w:val="180"/>
               </w:rPr>
               <w:lastRenderedPageBreak/>
@@ -12588,7 +12592,7 @@
           <w:p>
             <w:r>
               <w:rPr>
-                <w:sz w:val="20"/>
+                <w:sz w:val="180"/>
                 <w:szCs w:val="180"/>
               </w:rPr>
               <w:t>Menú (</w:t>
@@ -12596,14 +12600,14 @@
             <w:proofErr w:type="spellStart"/>
             <w:r>
               <w:rPr>
-                <w:sz w:val="20"/>
+                <w:sz w:val="180"/>
                 <w:szCs w:val="180"/>
               </w:rPr>
               <w:t>fa</w:t>
             </w:r>
             <w:r>
               <w:rPr>
-                <w:sz w:val="20"/>
+                <w:sz w:val="180"/>
                 <w:szCs w:val="180"/>
               </w:rPr>
               <w:lastRenderedPageBreak/>
@@ -12612,7 +12616,7 @@
             <w:proofErr w:type="spellEnd"/>
             <w:r>
               <w:rPr>
-                <w:sz w:val="20"/>
+                <w:sz w:val="180"/>
                 <w:szCs w:val="180"/>
               </w:rPr>
               <w:t>)</w:t>
@@ -12627,7 +12631,7 @@
           <w:p>
             <w:r>
               <w:rPr>
-                <w:sz w:val="20"/>
+                <w:sz w:val="180"/>
                 <w:szCs w:val="180"/>
               </w:rPr>
               <w:lastRenderedPageBreak/>
@@ -12643,14 +12647,14 @@
           <w:p>
             <w:r>
               <w:rPr>
-                <w:sz w:val="20"/>
+                <w:sz w:val="180"/>
                 <w:szCs w:val="180"/>
               </w:rPr>
               <w:t>Lenguaj</w:t>
             </w:r>
             <w:r>
               <w:rPr>
-                <w:sz w:val="20"/>
+                <w:sz w:val="180"/>
                 <w:szCs w:val="180"/>
               </w:rPr>
               <w:lastRenderedPageBreak/>
@@ -12658,7 +12662,7 @@
             </w:r>
             <w:r>
               <w:rPr>
-                <w:sz w:val="20"/>
+                <w:sz w:val="180"/>
                 <w:szCs w:val="180"/>
               </w:rPr>
               <w:lastRenderedPageBreak/>
@@ -12667,14 +12671,14 @@
             <w:proofErr w:type="spellStart"/>
             <w:r>
               <w:rPr>
-                <w:sz w:val="20"/>
+                <w:sz w:val="180"/>
                 <w:szCs w:val="180"/>
               </w:rPr>
               <w:t>matche</w:t>
             </w:r>
             <w:r>
               <w:rPr>
-                <w:sz w:val="20"/>
+                <w:sz w:val="180"/>
                 <w:szCs w:val="180"/>
               </w:rPr>
               <w:lastRenderedPageBreak/>
@@ -12683,14 +12687,14 @@
             <w:proofErr w:type="spellEnd"/>
             <w:r>
               <w:rPr>
-                <w:sz w:val="20"/>
+                <w:sz w:val="180"/>
                 <w:szCs w:val="180"/>
               </w:rPr>
               <w:t xml:space="preserve"> patrone</w:t>
             </w:r>
             <w:r>
               <w:rPr>
-                <w:sz w:val="20"/>
+                <w:sz w:val="180"/>
                 <w:szCs w:val="180"/>
               </w:rPr>
               <w:lastRenderedPageBreak/>
@@ -12698,7 +12702,7 @@
             </w:r>
             <w:r>
               <w:rPr>
-                <w:sz w:val="20"/>
+                <w:sz w:val="180"/>
                 <w:szCs w:val="180"/>
               </w:rPr>
               <w:lastRenderedPageBreak/>
@@ -12716,7 +12720,7 @@
           <w:p>
             <w:r>
               <w:rPr>
-                <w:sz w:val="20"/>
+                <w:sz w:val="180"/>
                 <w:szCs w:val="180"/>
               </w:rPr>
               <w:lastRenderedPageBreak/>
@@ -12732,14 +12736,14 @@
           <w:p>
             <w:r>
               <w:rPr>
-                <w:sz w:val="20"/>
+                <w:sz w:val="180"/>
                 <w:szCs w:val="180"/>
               </w:rPr>
               <w:t>“HO</w:t>
             </w:r>
             <w:r>
               <w:rPr>
-                <w:sz w:val="20"/>
+                <w:sz w:val="180"/>
                 <w:szCs w:val="180"/>
               </w:rPr>
               <w:lastRenderedPageBreak/>
@@ -12755,7 +12759,7 @@
           <w:p>
             <w:r>
               <w:rPr>
-                <w:sz w:val="20"/>
+                <w:sz w:val="180"/>
                 <w:szCs w:val="180"/>
               </w:rPr>
               <w:lastRenderedPageBreak/>
@@ -12763,7 +12767,7 @@
             </w:r>
             <w:r>
               <w:rPr>
-                <w:sz w:val="20"/>
+                <w:sz w:val="180"/>
                 <w:szCs w:val="180"/>
               </w:rPr>
               <w:lastRenderedPageBreak/>
@@ -12779,7 +12783,7 @@
           <w:p>
             <w:r>
               <w:rPr>
-                <w:sz w:val="20"/>
+                <w:sz w:val="180"/>
                 <w:szCs w:val="180"/>
               </w:rPr>
               <w:lastRenderedPageBreak/>
@@ -12787,7 +12791,7 @@
             </w:r>
             <w:r>
               <w:rPr>
-                <w:sz w:val="20"/>
+                <w:sz w:val="180"/>
                 <w:szCs w:val="180"/>
               </w:rPr>
               <w:lastRenderedPageBreak/>
@@ -12796,14 +12800,14 @@
             <w:proofErr w:type="spellStart"/>
             <w:r>
               <w:rPr>
-                <w:sz w:val="20"/>
+                <w:sz w:val="180"/>
                 <w:szCs w:val="180"/>
               </w:rPr>
               <w:t>fallba</w:t>
             </w:r>
             <w:r>
               <w:rPr>
-                <w:sz w:val="20"/>
+                <w:sz w:val="180"/>
                 <w:szCs w:val="180"/>
               </w:rPr>
               <w:lastRenderedPageBreak/>
@@ -12812,7 +12816,7 @@
             <w:proofErr w:type="spellEnd"/>
             <w:r>
               <w:rPr>
-                <w:sz w:val="20"/>
+                <w:sz w:val="180"/>
                 <w:szCs w:val="180"/>
               </w:rPr>
               <w:t>)</w:t>
@@ -12827,7 +12831,7 @@
           <w:p>
             <w:r>
               <w:rPr>
-                <w:sz w:val="20"/>
+                <w:sz w:val="180"/>
                 <w:szCs w:val="180"/>
               </w:rPr>
               <w:lastRenderedPageBreak/>
@@ -12835,7 +12839,7 @@
             </w:r>
             <w:r>
               <w:rPr>
-                <w:sz w:val="20"/>
+                <w:sz w:val="180"/>
                 <w:szCs w:val="180"/>
               </w:rPr>
               <w:t>%*</w:t>
@@ -12850,7 +12854,7 @@
           <w:p>
             <w:r>
               <w:rPr>
-                <w:sz w:val="20"/>
+                <w:sz w:val="180"/>
                 <w:szCs w:val="180"/>
               </w:rPr>
               <w:lastRenderedPageBreak/>
@@ -12858,7 +12862,7 @@
             </w:r>
             <w:r>
               <w:rPr>
-                <w:sz w:val="20"/>
+                <w:sz w:val="180"/>
                 <w:szCs w:val="180"/>
               </w:rPr>
               <w:lastRenderedPageBreak/>
@@ -12866,7 +12870,7 @@
             </w:r>
             <w:r>
               <w:rPr>
-                <w:sz w:val="20"/>
+                <w:sz w:val="180"/>
                 <w:szCs w:val="180"/>
               </w:rPr>
               <w:lastRenderedPageBreak/>
@@ -12874,7 +12878,7 @@
             </w:r>
             <w:r>
               <w:rPr>
-                <w:sz w:val="20"/>
+                <w:sz w:val="180"/>
                 <w:szCs w:val="180"/>
               </w:rPr>
               <w:lastRenderedPageBreak/>
@@ -12882,7 +12886,7 @@
             </w:r>
             <w:r>
               <w:rPr>
-                <w:sz w:val="20"/>
+                <w:sz w:val="180"/>
                 <w:szCs w:val="180"/>
               </w:rPr>
               <w:lastRenderedPageBreak/>
@@ -12890,7 +12894,7 @@
             </w:r>
             <w:r>
               <w:rPr>
-                <w:sz w:val="20"/>
+                <w:sz w:val="180"/>
                 <w:szCs w:val="180"/>
               </w:rPr>
               <w:lastRenderedPageBreak/>
@@ -12898,7 +12902,7 @@
             </w:r>
             <w:r>
               <w:rPr>
-                <w:sz w:val="20"/>
+                <w:sz w:val="180"/>
                 <w:szCs w:val="180"/>
               </w:rPr>
               <w:lastRenderedPageBreak/>
@@ -12906,7 +12910,7 @@
             </w:r>
             <w:r>
               <w:rPr>
-                <w:sz w:val="20"/>
+                <w:sz w:val="180"/>
                 <w:szCs w:val="180"/>
               </w:rPr>
               <w:lastRenderedPageBreak/>
@@ -12924,7 +12928,7 @@
           <w:p>
             <w:r>
               <w:rPr>
-                <w:sz w:val="20"/>
+                <w:sz w:val="180"/>
                 <w:szCs w:val="180"/>
               </w:rPr>
               <w:lastRenderedPageBreak/>
@@ -12940,14 +12944,14 @@
           <w:p>
             <w:r>
               <w:rPr>
-                <w:sz w:val="20"/>
+                <w:sz w:val="180"/>
                 <w:szCs w:val="180"/>
               </w:rPr>
               <w:t>“5” (</w:t>
             </w:r>
             <w:r>
               <w:rPr>
-                <w:sz w:val="20"/>
+                <w:sz w:val="180"/>
                 <w:szCs w:val="180"/>
               </w:rPr>
               <w:lastRenderedPageBreak/>
@@ -12955,7 +12959,7 @@
             </w:r>
             <w:r>
               <w:rPr>
-                <w:sz w:val="20"/>
+                <w:sz w:val="180"/>
                 <w:szCs w:val="180"/>
               </w:rPr>
               <w:lastRenderedPageBreak/>
@@ -12963,7 +12967,7 @@
             </w:r>
             <w:r>
               <w:rPr>
-                <w:sz w:val="20"/>
+                <w:sz w:val="180"/>
                 <w:szCs w:val="180"/>
               </w:rPr>
               <w:lastRenderedPageBreak/>
@@ -12971,7 +12975,7 @@
             </w:r>
             <w:r>
               <w:rPr>
-                <w:sz w:val="20"/>
+                <w:sz w:val="180"/>
                 <w:szCs w:val="180"/>
               </w:rPr>
               <w:lastRenderedPageBreak/>
@@ -12987,7 +12991,7 @@
           <w:p>
             <w:r>
               <w:rPr>
-                <w:sz w:val="20"/>
+                <w:sz w:val="180"/>
                 <w:szCs w:val="180"/>
               </w:rPr>
               <w:lastRenderedPageBreak/>
@@ -12995,7 +12999,7 @@
             </w:r>
             <w:r>
               <w:rPr>
-                <w:sz w:val="20"/>
+                <w:sz w:val="180"/>
                 <w:szCs w:val="180"/>
               </w:rPr>
               <w:lastRenderedPageBreak/>
@@ -13003,7 +13007,7 @@
             </w:r>
             <w:r>
               <w:rPr>
-                <w:sz w:val="20"/>
+                <w:sz w:val="180"/>
                 <w:szCs w:val="180"/>
               </w:rPr>
               <w:lastRenderedPageBreak/>
@@ -13019,7 +13023,7 @@
           <w:p>
             <w:r>
               <w:rPr>
-                <w:sz w:val="20"/>
+                <w:sz w:val="180"/>
                 <w:szCs w:val="180"/>
               </w:rPr>
               <w:lastRenderedPageBreak/>
@@ -13027,7 +13031,7 @@
             </w:r>
             <w:r>
               <w:rPr>
-                <w:sz w:val="20"/>
+                <w:sz w:val="180"/>
                 <w:szCs w:val="180"/>
               </w:rPr>
               <w:t>(</w:t>
@@ -13035,14 +13039,14 @@
             <w:proofErr w:type="spellStart"/>
             <w:r>
               <w:rPr>
-                <w:sz w:val="20"/>
+                <w:sz w:val="180"/>
                 <w:szCs w:val="180"/>
               </w:rPr>
               <w:t>fallbac</w:t>
             </w:r>
             <w:r>
               <w:rPr>
-                <w:sz w:val="20"/>
+                <w:sz w:val="180"/>
                 <w:szCs w:val="180"/>
               </w:rPr>
               <w:lastRenderedPageBreak/>
@@ -13051,7 +13055,7 @@
             <w:proofErr w:type="spellEnd"/>
             <w:r>
               <w:rPr>
-                <w:sz w:val="20"/>
+                <w:sz w:val="180"/>
                 <w:szCs w:val="180"/>
               </w:rPr>
               <w:t>)</w:t>
@@ -13066,7 +13070,7 @@
           <w:p>
             <w:r>
               <w:rPr>
-                <w:sz w:val="20"/>
+                <w:sz w:val="180"/>
                 <w:szCs w:val="180"/>
               </w:rPr>
               <w:lastRenderedPageBreak/>
@@ -13082,21 +13086,21 @@
           <w:p>
             <w:r>
               <w:rPr>
-                <w:sz w:val="20"/>
+                <w:sz w:val="180"/>
                 <w:szCs w:val="180"/>
               </w:rPr>
               <w:t xml:space="preserve">Fuera </w:t>
             </w:r>
             <w:r>
               <w:rPr>
-                <w:sz w:val="20"/>
+                <w:sz w:val="180"/>
                 <w:szCs w:val="180"/>
               </w:rPr>
               <w:t xml:space="preserve">de rango </w:t>
             </w:r>
             <w:r>
               <w:rPr>
-                <w:sz w:val="20"/>
+                <w:sz w:val="180"/>
                 <w:szCs w:val="180"/>
               </w:rPr>
               <w:lastRenderedPageBreak/>
@@ -13104,7 +13108,7 @@
             </w:r>
             <w:r>
               <w:rPr>
-                <w:sz w:val="20"/>
+                <w:sz w:val="180"/>
                 <w:szCs w:val="180"/>
               </w:rPr>
               <w:lastRenderedPageBreak/>
@@ -13112,7 +13116,7 @@
             </w:r>
             <w:r>
               <w:rPr>
-                <w:sz w:val="20"/>
+                <w:sz w:val="180"/>
                 <w:szCs w:val="180"/>
               </w:rPr>
               <w:lastRenderedPageBreak/>
@@ -21441,6 +21445,847 @@
       </w:r>
     </w:p>
     <w:p>
+      <w:pPr>
+        <w:spacing w:after="80"/>
+        <w:jc w:val="center"/>
+      </w:pPr>
+      <w:r>
+        <w:rPr>
+          <w:b/>
+          <w:sz w:val="20"/>
+        </w:rPr>
+        <w:t xml:space="preserve">Tabla C.1: </w:t>
+      </w:r>
+      <w:proofErr w:type="spellStart"/>
+      <w:r>
+        <w:rPr>
+          <w:b/>
+          <w:sz w:val="20"/>
+        </w:rPr>
+        <w:t>Endpoints</w:t>
+      </w:r>
+      <w:proofErr w:type="spellEnd"/>
+      <w:r>
+        <w:rPr>
+          <w:b/>
+          <w:sz w:val="20"/>
+        </w:rPr>
+        <w:t xml:space="preserve"> de la API consumidos por el flujo</w:t>
+      </w:r>
+    </w:p>
+    <w:tbl>
+      <w:tblPr>
+        <w:tblW w:w="0" w:type="auto"/>
+        <w:tblBorders>
+          <w:top w:val="single" w:sz="4" w:space="0" w:color="000000"/>
+          <w:left w:val="single" w:sz="4" w:space="0" w:color="000000"/>
+          <w:bottom w:val="single" w:sz="4" w:space="0" w:color="000000"/>
+          <w:right w:val="single" w:sz="4" w:space="0" w:color="000000"/>
+          <w:insideH w:val="single" w:sz="4" w:space="0" w:color="000000"/>
+          <w:insideV w:val="single" w:sz="4" w:space="0" w:color="000000"/>
+        </w:tblBorders>
+        <w:tblLook w:val="04A0" w:firstRow="1" w:lastRow="0" w:firstColumn="1" w:lastColumn="0" w:noHBand="0" w:noVBand="1"/>
+      </w:tblPr>
+      <w:tblGrid>
+        <w:gridCol w:w="2458"/>
+        <w:gridCol w:w="2160"/>
+        <w:gridCol w:w="2182"/>
+        <w:gridCol w:w="2190"/>
+      </w:tblGrid>
+      <w:tr>
+        <w:tc>
+          <w:tcPr>
+            <w:tcW w:w="2250" w:type="dxa"/>
+            <w:shd w:val="clear" w:color="auto" w:fill="D9D9D9"/>
+          </w:tcPr>
+          <w:p>
+            <w:pPr>
+              <w:spacing w:before="40" w:after="40"/>
+              <w:jc w:val="center"/>
+            </w:pPr>
+            <w:proofErr w:type="spellStart"/>
+            <w:r>
+              <w:rPr>
+                <w:b/>
+                <w:sz w:val="18"/>
+              </w:rPr>
+              <w:t>Endpoint</w:t>
+            </w:r>
+            <w:proofErr w:type="spellEnd"/>
+          </w:p>
+        </w:tc>
+        <w:tc>
+          <w:tcPr>
+            <w:tcW w:w="2250" w:type="dxa"/>
+            <w:shd w:val="clear" w:color="auto" w:fill="D9D9D9"/>
+          </w:tcPr>
+          <w:p>
+            <w:pPr>
+              <w:spacing w:before="40" w:after="40"/>
+              <w:jc w:val="center"/>
+            </w:pPr>
+            <w:r>
+              <w:rPr>
+                <w:b/>
+                <w:sz w:val="18"/>
+              </w:rPr>
+              <w:t>Método</w:t>
+            </w:r>
+          </w:p>
+        </w:tc>
+        <w:tc>
+          <w:tcPr>
+            <w:tcW w:w="2250" w:type="dxa"/>
+            <w:shd w:val="clear" w:color="auto" w:fill="D9D9D9"/>
+          </w:tcPr>
+          <w:p>
+            <w:pPr>
+              <w:spacing w:before="40" w:after="40"/>
+              <w:jc w:val="center"/>
+            </w:pPr>
+            <w:r>
+              <w:rPr>
+                <w:b/>
+                <w:sz w:val="18"/>
+              </w:rPr>
+              <w:t>Uso en el flujo</w:t>
+            </w:r>
+          </w:p>
+        </w:tc>
+        <w:tc>
+          <w:tcPr>
+            <w:tcW w:w="2250" w:type="dxa"/>
+            <w:shd w:val="clear" w:color="auto" w:fill="D9D9D9"/>
+          </w:tcPr>
+          <w:p>
+            <w:pPr>
+              <w:spacing w:before="40" w:after="40"/>
+              <w:jc w:val="center"/>
+            </w:pPr>
+            <w:proofErr w:type="spellStart"/>
+            <w:r>
+              <w:rPr>
+                <w:b/>
+                <w:sz w:val="18"/>
+              </w:rPr>
+              <w:t>Headers</w:t>
+            </w:r>
+            <w:proofErr w:type="spellEnd"/>
+            <w:r>
+              <w:rPr>
+                <w:b/>
+                <w:sz w:val="18"/>
+              </w:rPr>
+              <w:t xml:space="preserve"> enviados por el nodo</w:t>
+            </w:r>
+          </w:p>
+        </w:tc>
+      </w:tr>
+      <w:tr>
+        <w:tc>
+          <w:tcPr>
+            <w:tcW w:w="2250" w:type="dxa"/>
+          </w:tcPr>
+          <w:p>
+            <w:pPr>
+              <w:spacing w:before="40" w:after="40"/>
+            </w:pPr>
+            <w:r>
+              <w:rPr>
+                <w:sz w:val="18"/>
+              </w:rPr>
+              <w:t>/api/v1/</w:t>
+            </w:r>
+            <w:proofErr w:type="spellStart"/>
+            <w:r>
+              <w:rPr>
+                <w:sz w:val="18"/>
+              </w:rPr>
+              <w:t>interactions</w:t>
+            </w:r>
+            <w:proofErr w:type="spellEnd"/>
+            <w:r>
+              <w:rPr>
+                <w:sz w:val="18"/>
+              </w:rPr>
+              <w:t>/</w:t>
+            </w:r>
+          </w:p>
+        </w:tc>
+        <w:tc>
+          <w:tcPr>
+            <w:tcW w:w="2250" w:type="dxa"/>
+          </w:tcPr>
+          <w:p>
+            <w:pPr>
+              <w:spacing w:before="40" w:after="40"/>
+            </w:pPr>
+            <w:r>
+              <w:rPr>
+                <w:sz w:val="18"/>
+              </w:rPr>
+              <w:t>POST</w:t>
+            </w:r>
+          </w:p>
+        </w:tc>
+        <w:tc>
+          <w:tcPr>
+            <w:tcW w:w="2250" w:type="dxa"/>
+          </w:tcPr>
+          <w:p>
+            <w:pPr>
+              <w:spacing w:before="40" w:after="40"/>
+            </w:pPr>
+            <w:r>
+              <w:rPr>
+                <w:sz w:val="18"/>
+              </w:rPr>
+              <w:t xml:space="preserve">Registro de cada interacción del </w:t>
+            </w:r>
+            <w:proofErr w:type="spellStart"/>
+            <w:r>
+              <w:rPr>
+                <w:sz w:val="18"/>
+              </w:rPr>
+              <w:t>bot</w:t>
+            </w:r>
+            <w:proofErr w:type="spellEnd"/>
+            <w:r>
+              <w:rPr>
+                <w:sz w:val="18"/>
+              </w:rPr>
+              <w:t xml:space="preserve"> (auditoría)</w:t>
+            </w:r>
+          </w:p>
+        </w:tc>
+        <w:tc>
+          <w:tcPr>
+            <w:tcW w:w="2250" w:type="dxa"/>
+          </w:tcPr>
+          <w:p>
+            <w:pPr>
+              <w:spacing w:before="40" w:after="40"/>
+            </w:pPr>
+            <w:r>
+              <w:rPr>
+                <w:sz w:val="18"/>
+              </w:rPr>
+              <w:t>X-Api-Key, X-</w:t>
+            </w:r>
+            <w:proofErr w:type="spellStart"/>
+            <w:r>
+              <w:rPr>
+                <w:sz w:val="18"/>
+              </w:rPr>
+              <w:t>Idempotency</w:t>
+            </w:r>
+            <w:proofErr w:type="spellEnd"/>
+            <w:r>
+              <w:rPr>
+                <w:sz w:val="18"/>
+              </w:rPr>
+              <w:t>-Key, Content-</w:t>
+            </w:r>
+            <w:proofErr w:type="spellStart"/>
+            <w:r>
+              <w:rPr>
+                <w:sz w:val="18"/>
+              </w:rPr>
+              <w:t>Type</w:t>
+            </w:r>
+            <w:proofErr w:type="spellEnd"/>
+          </w:p>
+        </w:tc>
+      </w:tr>
+      <w:tr>
+        <w:tc>
+          <w:tcPr>
+            <w:tcW w:w="2250" w:type="dxa"/>
+          </w:tcPr>
+          <w:p>
+            <w:pPr>
+              <w:spacing w:before="40" w:after="40"/>
+            </w:pPr>
+            <w:r>
+              <w:rPr>
+                <w:sz w:val="18"/>
+              </w:rPr>
+              <w:t>/api/v1/</w:t>
+            </w:r>
+            <w:proofErr w:type="spellStart"/>
+            <w:r>
+              <w:rPr>
+                <w:sz w:val="18"/>
+              </w:rPr>
+              <w:t>products</w:t>
+            </w:r>
+            <w:proofErr w:type="spellEnd"/>
+            <w:r>
+              <w:rPr>
+                <w:sz w:val="18"/>
+              </w:rPr>
+              <w:t>/</w:t>
+            </w:r>
+          </w:p>
+        </w:tc>
+        <w:tc>
+          <w:tcPr>
+            <w:tcW w:w="2250" w:type="dxa"/>
+          </w:tcPr>
+          <w:p>
+            <w:pPr>
+              <w:spacing w:before="40" w:after="40"/>
+            </w:pPr>
+            <w:r>
+              <w:rPr>
+                <w:sz w:val="18"/>
+              </w:rPr>
+              <w:t>GET</w:t>
+            </w:r>
+          </w:p>
+        </w:tc>
+        <w:tc>
+          <w:tcPr>
+            <w:tcW w:w="2250" w:type="dxa"/>
+          </w:tcPr>
+          <w:p>
+            <w:pPr>
+              <w:spacing w:before="40" w:after="40"/>
+            </w:pPr>
+            <w:r>
+              <w:rPr>
+                <w:sz w:val="18"/>
+              </w:rPr>
+              <w:t>Consulta del catálogo de productos</w:t>
+            </w:r>
+          </w:p>
+        </w:tc>
+        <w:tc>
+          <w:tcPr>
+            <w:tcW w:w="2250" w:type="dxa"/>
+          </w:tcPr>
+          <w:p>
+            <w:pPr>
+              <w:spacing w:before="40" w:after="40"/>
+            </w:pPr>
+            <w:r>
+              <w:rPr>
+                <w:sz w:val="18"/>
+              </w:rPr>
+              <w:t>Content-</w:t>
+            </w:r>
+            <w:proofErr w:type="spellStart"/>
+            <w:r>
+              <w:rPr>
+                <w:sz w:val="18"/>
+              </w:rPr>
+              <w:t>Type</w:t>
+            </w:r>
+            <w:proofErr w:type="spellEnd"/>
+          </w:p>
+        </w:tc>
+      </w:tr>
+      <w:tr>
+        <w:tc>
+          <w:tcPr>
+            <w:tcW w:w="2250" w:type="dxa"/>
+          </w:tcPr>
+          <w:p>
+            <w:pPr>
+              <w:spacing w:before="40" w:after="40"/>
+            </w:pPr>
+            <w:r>
+              <w:rPr>
+                <w:sz w:val="18"/>
+              </w:rPr>
+              <w:t>/api/v1/</w:t>
+            </w:r>
+            <w:proofErr w:type="spellStart"/>
+            <w:r>
+              <w:rPr>
+                <w:sz w:val="18"/>
+              </w:rPr>
+              <w:t>clients</w:t>
+            </w:r>
+            <w:proofErr w:type="spellEnd"/>
+            <w:r>
+              <w:rPr>
+                <w:sz w:val="18"/>
+              </w:rPr>
+              <w:t>/</w:t>
+            </w:r>
+          </w:p>
+        </w:tc>
+        <w:tc>
+          <w:tcPr>
+            <w:tcW w:w="2250" w:type="dxa"/>
+          </w:tcPr>
+          <w:p>
+            <w:pPr>
+              <w:spacing w:before="40" w:after="40"/>
+            </w:pPr>
+            <w:r>
+              <w:rPr>
+                <w:sz w:val="18"/>
+              </w:rPr>
+              <w:t>POST</w:t>
+            </w:r>
+          </w:p>
+        </w:tc>
+        <w:tc>
+          <w:tcPr>
+            <w:tcW w:w="2250" w:type="dxa"/>
+          </w:tcPr>
+          <w:p>
+            <w:pPr>
+              <w:spacing w:before="40" w:after="40"/>
+            </w:pPr>
+            <w:r>
+              <w:rPr>
+                <w:sz w:val="18"/>
+              </w:rPr>
+              <w:t>Alta del cliente en la API</w:t>
+            </w:r>
+          </w:p>
+        </w:tc>
+        <w:tc>
+          <w:tcPr>
+            <w:tcW w:w="2250" w:type="dxa"/>
+          </w:tcPr>
+          <w:p>
+            <w:pPr>
+              <w:spacing w:before="40" w:after="40"/>
+            </w:pPr>
+            <w:r>
+              <w:rPr>
+                <w:sz w:val="18"/>
+              </w:rPr>
+              <w:t>X-Api-Key, Content-</w:t>
+            </w:r>
+            <w:proofErr w:type="spellStart"/>
+            <w:r>
+              <w:rPr>
+                <w:sz w:val="18"/>
+              </w:rPr>
+              <w:t>Type</w:t>
+            </w:r>
+            <w:proofErr w:type="spellEnd"/>
+          </w:p>
+        </w:tc>
+      </w:tr>
+      <w:tr>
+        <w:tc>
+          <w:tcPr>
+            <w:tcW w:w="2250" w:type="dxa"/>
+          </w:tcPr>
+          <w:p>
+            <w:pPr>
+              <w:spacing w:before="40" w:after="40"/>
+            </w:pPr>
+            <w:r>
+              <w:rPr>
+                <w:sz w:val="18"/>
+              </w:rPr>
+              <w:t>/api/v1/</w:t>
+            </w:r>
+            <w:proofErr w:type="spellStart"/>
+            <w:r>
+              <w:rPr>
+                <w:sz w:val="18"/>
+              </w:rPr>
+              <w:t>clients</w:t>
+            </w:r>
+            <w:proofErr w:type="spellEnd"/>
+            <w:r>
+              <w:rPr>
+                <w:sz w:val="18"/>
+              </w:rPr>
+              <w:t>/{id}/productos</w:t>
+            </w:r>
+          </w:p>
+        </w:tc>
+        <w:tc>
+          <w:tcPr>
+            <w:tcW w:w="2250" w:type="dxa"/>
+          </w:tcPr>
+          <w:p>
+            <w:pPr>
+              <w:spacing w:before="40" w:after="40"/>
+            </w:pPr>
+            <w:r>
+              <w:rPr>
+                <w:sz w:val="18"/>
+              </w:rPr>
+              <w:t>POST</w:t>
+            </w:r>
+          </w:p>
+        </w:tc>
+        <w:tc>
+          <w:tcPr>
+            <w:tcW w:w="2250" w:type="dxa"/>
+          </w:tcPr>
+          <w:p>
+            <w:pPr>
+              <w:spacing w:before="40" w:after="40"/>
+            </w:pPr>
+            <w:r>
+              <w:rPr>
+                <w:sz w:val="18"/>
+              </w:rPr>
+              <w:t>Agregar un producto al carrito del cliente</w:t>
+            </w:r>
+          </w:p>
+        </w:tc>
+        <w:tc>
+          <w:tcPr>
+            <w:tcW w:w="2250" w:type="dxa"/>
+          </w:tcPr>
+          <w:p>
+            <w:pPr>
+              <w:spacing w:before="40" w:after="40"/>
+            </w:pPr>
+            <w:r>
+              <w:rPr>
+                <w:sz w:val="18"/>
+              </w:rPr>
+              <w:t>Content-</w:t>
+            </w:r>
+            <w:proofErr w:type="spellStart"/>
+            <w:r>
+              <w:rPr>
+                <w:sz w:val="18"/>
+              </w:rPr>
+              <w:t>Type</w:t>
+            </w:r>
+            <w:proofErr w:type="spellEnd"/>
+          </w:p>
+        </w:tc>
+      </w:tr>
+      <w:tr>
+        <w:tc>
+          <w:tcPr>
+            <w:tcW w:w="2250" w:type="dxa"/>
+          </w:tcPr>
+          <w:p>
+            <w:pPr>
+              <w:spacing w:before="40" w:after="40"/>
+            </w:pPr>
+            <w:r>
+              <w:rPr>
+                <w:sz w:val="18"/>
+              </w:rPr>
+              <w:t>/api/v1/</w:t>
+            </w:r>
+            <w:proofErr w:type="spellStart"/>
+            <w:r>
+              <w:rPr>
+                <w:sz w:val="18"/>
+              </w:rPr>
+              <w:t>clients</w:t>
+            </w:r>
+            <w:proofErr w:type="spellEnd"/>
+            <w:r>
+              <w:rPr>
+                <w:sz w:val="18"/>
+              </w:rPr>
+              <w:t>/{id}/productos</w:t>
+            </w:r>
+          </w:p>
+        </w:tc>
+        <w:tc>
+          <w:tcPr>
+            <w:tcW w:w="2250" w:type="dxa"/>
+          </w:tcPr>
+          <w:p>
+            <w:pPr>
+              <w:spacing w:before="40" w:after="40"/>
+            </w:pPr>
+            <w:r>
+              <w:rPr>
+                <w:sz w:val="18"/>
+              </w:rPr>
+              <w:t>PUT</w:t>
+            </w:r>
+          </w:p>
+        </w:tc>
+        <w:tc>
+          <w:tcPr>
+            <w:tcW w:w="2250" w:type="dxa"/>
+          </w:tcPr>
+          <w:p>
+            <w:pPr>
+              <w:spacing w:before="40" w:after="40"/>
+            </w:pPr>
+            <w:r>
+              <w:rPr>
+                <w:sz w:val="18"/>
+              </w:rPr>
+              <w:t>Reemplazar la lista de productos al finalizar la compra</w:t>
+            </w:r>
+          </w:p>
+        </w:tc>
+        <w:tc>
+          <w:tcPr>
+            <w:tcW w:w="2250" w:type="dxa"/>
+          </w:tcPr>
+          <w:p>
+            <w:pPr>
+              <w:spacing w:before="40" w:after="40"/>
+            </w:pPr>
+            <w:r>
+              <w:rPr>
+                <w:sz w:val="18"/>
+              </w:rPr>
+              <w:t>Content-</w:t>
+            </w:r>
+            <w:proofErr w:type="spellStart"/>
+            <w:r>
+              <w:rPr>
+                <w:sz w:val="18"/>
+              </w:rPr>
+              <w:t>Type</w:t>
+            </w:r>
+            <w:proofErr w:type="spellEnd"/>
+          </w:p>
+        </w:tc>
+      </w:tr>
+    </w:tbl>
+    <w:p>
+      <w:pPr>
+        <w:spacing w:after="120"/>
+      </w:pPr>
+      <w:r>
+        <w:rPr>
+          <w:sz w:val="22"/>
+        </w:rPr>
+        <w:t xml:space="preserve">La conexión con </w:t>
+      </w:r>
+      <w:proofErr w:type="spellStart"/>
+      <w:r>
+        <w:rPr>
+          <w:sz w:val="22"/>
+        </w:rPr>
+        <w:t>Telegram</w:t>
+      </w:r>
+      <w:proofErr w:type="spellEnd"/>
+      <w:r>
+        <w:rPr>
+          <w:sz w:val="22"/>
+        </w:rPr>
+        <w:t xml:space="preserve"> se realiza mediante la credencial de tipo “</w:t>
+      </w:r>
+      <w:proofErr w:type="spellStart"/>
+      <w:r>
+        <w:rPr>
+          <w:sz w:val="22"/>
+        </w:rPr>
+        <w:t>Telegram</w:t>
+      </w:r>
+      <w:proofErr w:type="spellEnd"/>
+      <w:r>
+        <w:rPr>
+          <w:sz w:val="22"/>
+        </w:rPr>
+        <w:t xml:space="preserve"> </w:t>
+      </w:r>
+      <w:proofErr w:type="spellStart"/>
+      <w:r>
+        <w:rPr>
+          <w:sz w:val="22"/>
+        </w:rPr>
+        <w:t>account</w:t>
+      </w:r>
+      <w:proofErr w:type="spellEnd"/>
+      <w:r>
+        <w:rPr>
+          <w:sz w:val="22"/>
+        </w:rPr>
+        <w:t>” (</w:t>
+      </w:r>
+      <w:proofErr w:type="spellStart"/>
+      <w:r>
+        <w:rPr>
+          <w:sz w:val="22"/>
+        </w:rPr>
+        <w:t>telegramApi</w:t>
+      </w:r>
+      <w:proofErr w:type="spellEnd"/>
+      <w:r>
+        <w:rPr>
+          <w:sz w:val="22"/>
+        </w:rPr>
+        <w:t xml:space="preserve">) configurada en n8n, con el </w:t>
+      </w:r>
+      <w:proofErr w:type="spellStart"/>
+      <w:r>
+        <w:rPr>
+          <w:sz w:val="22"/>
+        </w:rPr>
+        <w:t>trigger</w:t>
+      </w:r>
+      <w:proofErr w:type="spellEnd"/>
+      <w:r>
+        <w:rPr>
+          <w:sz w:val="22"/>
+        </w:rPr>
+        <w:t xml:space="preserve"> en modo </w:t>
+      </w:r>
+      <w:proofErr w:type="spellStart"/>
+      <w:r>
+        <w:rPr>
+          <w:sz w:val="22"/>
+        </w:rPr>
+        <w:t>polling</w:t>
+      </w:r>
+      <w:proofErr w:type="spellEnd"/>
+      <w:r>
+        <w:rPr>
+          <w:sz w:val="22"/>
+        </w:rPr>
+        <w:t xml:space="preserve"> que escucha únicamente el evento de mensaje (</w:t>
+      </w:r>
+      <w:proofErr w:type="spellStart"/>
+      <w:r>
+        <w:rPr>
+          <w:sz w:val="22"/>
+        </w:rPr>
+        <w:t>updates</w:t>
+      </w:r>
+      <w:proofErr w:type="spellEnd"/>
+      <w:r>
+        <w:rPr>
+          <w:sz w:val="22"/>
+        </w:rPr>
+        <w:t xml:space="preserve">: </w:t>
+      </w:r>
+      <w:proofErr w:type="spellStart"/>
+      <w:r>
+        <w:rPr>
+          <w:sz w:val="22"/>
+        </w:rPr>
+        <w:t>message</w:t>
+      </w:r>
+      <w:proofErr w:type="spellEnd"/>
+      <w:r>
+        <w:rPr>
+          <w:sz w:val="22"/>
+        </w:rPr>
+        <w:t xml:space="preserve">). La planilla de auditoría se integra mediante una cuenta de servicio de Google con autenticación OAuth 2.0, referenciada en el nodo </w:t>
+      </w:r>
+      <w:proofErr w:type="spellStart"/>
+      <w:r>
+        <w:rPr>
+          <w:sz w:val="22"/>
+        </w:rPr>
+        <w:t>Append</w:t>
+      </w:r>
+      <w:proofErr w:type="spellEnd"/>
+      <w:r>
+        <w:rPr>
+          <w:sz w:val="22"/>
+        </w:rPr>
+        <w:t xml:space="preserve"> </w:t>
+      </w:r>
+      <w:proofErr w:type="spellStart"/>
+      <w:r>
+        <w:rPr>
+          <w:sz w:val="22"/>
+        </w:rPr>
+        <w:t>to</w:t>
+      </w:r>
+      <w:proofErr w:type="spellEnd"/>
+      <w:r>
+        <w:rPr>
+          <w:sz w:val="22"/>
+        </w:rPr>
+        <w:t xml:space="preserve"> </w:t>
+      </w:r>
+      <w:proofErr w:type="spellStart"/>
+      <w:r>
+        <w:rPr>
+          <w:sz w:val="22"/>
+        </w:rPr>
+        <w:t>Sheet</w:t>
+      </w:r>
+      <w:proofErr w:type="spellEnd"/>
+      <w:r>
+        <w:rPr>
+          <w:sz w:val="22"/>
+        </w:rPr>
+        <w:t xml:space="preserve"> como “Google </w:t>
+      </w:r>
+      <w:proofErr w:type="spellStart"/>
+      <w:r>
+        <w:rPr>
+          <w:sz w:val="22"/>
+        </w:rPr>
+        <w:t>Sheets</w:t>
+      </w:r>
+      <w:proofErr w:type="spellEnd"/>
+      <w:r>
+        <w:rPr>
+          <w:sz w:val="22"/>
+        </w:rPr>
+        <w:t xml:space="preserve"> </w:t>
+      </w:r>
+      <w:proofErr w:type="spellStart"/>
+      <w:r>
+        <w:rPr>
+          <w:sz w:val="22"/>
+        </w:rPr>
+        <w:t>account</w:t>
+      </w:r>
+      <w:proofErr w:type="spellEnd"/>
+      <w:r>
+        <w:rPr>
+          <w:sz w:val="22"/>
+        </w:rPr>
+        <w:t xml:space="preserve">”. El </w:t>
+      </w:r>
+      <w:proofErr w:type="spellStart"/>
+      <w:r>
+        <w:rPr>
+          <w:sz w:val="22"/>
+        </w:rPr>
+        <w:t>bot</w:t>
+      </w:r>
+      <w:proofErr w:type="spellEnd"/>
+      <w:r>
+        <w:rPr>
+          <w:sz w:val="22"/>
+        </w:rPr>
+        <w:t xml:space="preserve"> de </w:t>
+      </w:r>
+      <w:proofErr w:type="spellStart"/>
+      <w:r>
+        <w:rPr>
+          <w:sz w:val="22"/>
+        </w:rPr>
+        <w:t>Telegram</w:t>
+      </w:r>
+      <w:proofErr w:type="spellEnd"/>
+      <w:r>
+        <w:rPr>
+          <w:sz w:val="22"/>
+        </w:rPr>
+        <w:t xml:space="preserve"> responde únicamente a mensajes de texto; los comandos y emojis utilizados en las respuestas se definen en el nodo Bot </w:t>
+      </w:r>
+      <w:proofErr w:type="spellStart"/>
+      <w:r>
+        <w:rPr>
+          <w:sz w:val="22"/>
+        </w:rPr>
+        <w:t>Router</w:t>
+      </w:r>
+      <w:proofErr w:type="spellEnd"/>
+      <w:r>
+        <w:rPr>
+          <w:sz w:val="22"/>
+        </w:rPr>
+        <w:t>.</w:t>
+      </w:r>
+    </w:p>
+    <w:p>
       <w:r>
         <w:drawing>
           <wp:inline xmlns:a="http://schemas.openxmlformats.org/drawingml/2006/main" xmlns:pic="http://schemas.openxmlformats.org/drawingml/2006/picture">
@@ -21474,856 +22319,6 @@
             </a:graphic>
           </wp:inline>
         </w:drawing>
-      </w:r>
-    </w:p>
-    <w:p>
-      <w:r>
-        <w:rPr>
-          <w:b/>
-          <w:sz w:val="20"/>
-        </w:rPr>
-        <w:t>Figura C.1. Documentacion interactiva de la API REST (Swagger UI).</w:t>
-      </w:r>
-    </w:p>
-    <w:p>
-      <w:pPr>
-        <w:spacing w:after="80"/>
-        <w:jc w:val="center"/>
-      </w:pPr>
-      <w:r>
-        <w:rPr>
-          <w:b/>
-          <w:sz w:val="20"/>
-        </w:rPr>
-        <w:t xml:space="preserve">Tabla C.1: </w:t>
-      </w:r>
-      <w:proofErr w:type="spellStart"/>
-      <w:r>
-        <w:rPr>
-          <w:b/>
-          <w:sz w:val="20"/>
-        </w:rPr>
-        <w:t>Endpoints</w:t>
-      </w:r>
-      <w:proofErr w:type="spellEnd"/>
-      <w:r>
-        <w:rPr>
-          <w:b/>
-          <w:sz w:val="20"/>
-        </w:rPr>
-        <w:t xml:space="preserve"> de la API consumidos por el flujo</w:t>
-      </w:r>
-    </w:p>
-    <w:tbl>
-      <w:tblPr>
-        <w:tblW w:w="0" w:type="auto"/>
-        <w:tblBorders>
-          <w:top w:val="single" w:sz="4" w:space="0" w:color="000000"/>
-          <w:left w:val="single" w:sz="4" w:space="0" w:color="000000"/>
-          <w:bottom w:val="single" w:sz="4" w:space="0" w:color="000000"/>
-          <w:right w:val="single" w:sz="4" w:space="0" w:color="000000"/>
-          <w:insideH w:val="single" w:sz="4" w:space="0" w:color="000000"/>
-          <w:insideV w:val="single" w:sz="4" w:space="0" w:color="000000"/>
-        </w:tblBorders>
-        <w:tblLook w:val="04A0" w:firstRow="1" w:lastRow="0" w:firstColumn="1" w:lastColumn="0" w:noHBand="0" w:noVBand="1"/>
-      </w:tblPr>
-      <w:tblGrid>
-        <w:gridCol w:w="2458"/>
-        <w:gridCol w:w="2160"/>
-        <w:gridCol w:w="2182"/>
-        <w:gridCol w:w="2190"/>
-      </w:tblGrid>
-      <w:tr>
-        <w:tc>
-          <w:tcPr>
-            <w:tcW w:w="2250" w:type="dxa"/>
-            <w:shd w:val="clear" w:color="auto" w:fill="D9D9D9"/>
-          </w:tcPr>
-          <w:p>
-            <w:pPr>
-              <w:spacing w:before="40" w:after="40"/>
-              <w:jc w:val="center"/>
-            </w:pPr>
-            <w:proofErr w:type="spellStart"/>
-            <w:r>
-              <w:rPr>
-                <w:b/>
-                <w:sz w:val="18"/>
-              </w:rPr>
-              <w:t>Endpoint</w:t>
-            </w:r>
-            <w:proofErr w:type="spellEnd"/>
-          </w:p>
-        </w:tc>
-        <w:tc>
-          <w:tcPr>
-            <w:tcW w:w="2250" w:type="dxa"/>
-            <w:shd w:val="clear" w:color="auto" w:fill="D9D9D9"/>
-          </w:tcPr>
-          <w:p>
-            <w:pPr>
-              <w:spacing w:before="40" w:after="40"/>
-              <w:jc w:val="center"/>
-            </w:pPr>
-            <w:r>
-              <w:rPr>
-                <w:b/>
-                <w:sz w:val="18"/>
-              </w:rPr>
-              <w:t>Método</w:t>
-            </w:r>
-          </w:p>
-        </w:tc>
-        <w:tc>
-          <w:tcPr>
-            <w:tcW w:w="2250" w:type="dxa"/>
-            <w:shd w:val="clear" w:color="auto" w:fill="D9D9D9"/>
-          </w:tcPr>
-          <w:p>
-            <w:pPr>
-              <w:spacing w:before="40" w:after="40"/>
-              <w:jc w:val="center"/>
-            </w:pPr>
-            <w:r>
-              <w:rPr>
-                <w:b/>
-                <w:sz w:val="18"/>
-              </w:rPr>
-              <w:t>Uso en el flujo</w:t>
-            </w:r>
-          </w:p>
-        </w:tc>
-        <w:tc>
-          <w:tcPr>
-            <w:tcW w:w="2250" w:type="dxa"/>
-            <w:shd w:val="clear" w:color="auto" w:fill="D9D9D9"/>
-          </w:tcPr>
-          <w:p>
-            <w:pPr>
-              <w:spacing w:before="40" w:after="40"/>
-              <w:jc w:val="center"/>
-            </w:pPr>
-            <w:proofErr w:type="spellStart"/>
-            <w:r>
-              <w:rPr>
-                <w:b/>
-                <w:sz w:val="18"/>
-              </w:rPr>
-              <w:t>Headers</w:t>
-            </w:r>
-            <w:proofErr w:type="spellEnd"/>
-            <w:r>
-              <w:rPr>
-                <w:b/>
-                <w:sz w:val="18"/>
-              </w:rPr>
-              <w:t xml:space="preserve"> enviados por el nodo</w:t>
-            </w:r>
-          </w:p>
-        </w:tc>
-      </w:tr>
-      <w:tr>
-        <w:tc>
-          <w:tcPr>
-            <w:tcW w:w="2250" w:type="dxa"/>
-          </w:tcPr>
-          <w:p>
-            <w:pPr>
-              <w:spacing w:before="40" w:after="40"/>
-            </w:pPr>
-            <w:r>
-              <w:rPr>
-                <w:sz w:val="18"/>
-              </w:rPr>
-              <w:t>/api/v1/</w:t>
-            </w:r>
-            <w:proofErr w:type="spellStart"/>
-            <w:r>
-              <w:rPr>
-                <w:sz w:val="18"/>
-              </w:rPr>
-              <w:t>interactions</w:t>
-            </w:r>
-            <w:proofErr w:type="spellEnd"/>
-            <w:r>
-              <w:rPr>
-                <w:sz w:val="18"/>
-              </w:rPr>
-              <w:t>/</w:t>
-            </w:r>
-          </w:p>
-        </w:tc>
-        <w:tc>
-          <w:tcPr>
-            <w:tcW w:w="2250" w:type="dxa"/>
-          </w:tcPr>
-          <w:p>
-            <w:pPr>
-              <w:spacing w:before="40" w:after="40"/>
-            </w:pPr>
-            <w:r>
-              <w:rPr>
-                <w:sz w:val="18"/>
-              </w:rPr>
-              <w:t>POST</w:t>
-            </w:r>
-          </w:p>
-        </w:tc>
-        <w:tc>
-          <w:tcPr>
-            <w:tcW w:w="2250" w:type="dxa"/>
-          </w:tcPr>
-          <w:p>
-            <w:pPr>
-              <w:spacing w:before="40" w:after="40"/>
-            </w:pPr>
-            <w:r>
-              <w:rPr>
-                <w:sz w:val="18"/>
-              </w:rPr>
-              <w:t xml:space="preserve">Registro de cada interacción del </w:t>
-            </w:r>
-            <w:proofErr w:type="spellStart"/>
-            <w:r>
-              <w:rPr>
-                <w:sz w:val="18"/>
-              </w:rPr>
-              <w:t>bot</w:t>
-            </w:r>
-            <w:proofErr w:type="spellEnd"/>
-            <w:r>
-              <w:rPr>
-                <w:sz w:val="18"/>
-              </w:rPr>
-              <w:t xml:space="preserve"> (auditoría)</w:t>
-            </w:r>
-          </w:p>
-        </w:tc>
-        <w:tc>
-          <w:tcPr>
-            <w:tcW w:w="2250" w:type="dxa"/>
-          </w:tcPr>
-          <w:p>
-            <w:pPr>
-              <w:spacing w:before="40" w:after="40"/>
-            </w:pPr>
-            <w:r>
-              <w:rPr>
-                <w:sz w:val="18"/>
-              </w:rPr>
-              <w:t>X-Api-Key, X-</w:t>
-            </w:r>
-            <w:proofErr w:type="spellStart"/>
-            <w:r>
-              <w:rPr>
-                <w:sz w:val="18"/>
-              </w:rPr>
-              <w:t>Idempotency</w:t>
-            </w:r>
-            <w:proofErr w:type="spellEnd"/>
-            <w:r>
-              <w:rPr>
-                <w:sz w:val="18"/>
-              </w:rPr>
-              <w:t>-Key, Content-</w:t>
-            </w:r>
-            <w:proofErr w:type="spellStart"/>
-            <w:r>
-              <w:rPr>
-                <w:sz w:val="18"/>
-              </w:rPr>
-              <w:t>Type</w:t>
-            </w:r>
-            <w:proofErr w:type="spellEnd"/>
-          </w:p>
-        </w:tc>
-      </w:tr>
-      <w:tr>
-        <w:tc>
-          <w:tcPr>
-            <w:tcW w:w="2250" w:type="dxa"/>
-          </w:tcPr>
-          <w:p>
-            <w:pPr>
-              <w:spacing w:before="40" w:after="40"/>
-            </w:pPr>
-            <w:r>
-              <w:rPr>
-                <w:sz w:val="18"/>
-              </w:rPr>
-              <w:t>/api/v1/</w:t>
-            </w:r>
-            <w:proofErr w:type="spellStart"/>
-            <w:r>
-              <w:rPr>
-                <w:sz w:val="18"/>
-              </w:rPr>
-              <w:t>products</w:t>
-            </w:r>
-            <w:proofErr w:type="spellEnd"/>
-            <w:r>
-              <w:rPr>
-                <w:sz w:val="18"/>
-              </w:rPr>
-              <w:t>/</w:t>
-            </w:r>
-          </w:p>
-        </w:tc>
-        <w:tc>
-          <w:tcPr>
-            <w:tcW w:w="2250" w:type="dxa"/>
-          </w:tcPr>
-          <w:p>
-            <w:pPr>
-              <w:spacing w:before="40" w:after="40"/>
-            </w:pPr>
-            <w:r>
-              <w:rPr>
-                <w:sz w:val="18"/>
-              </w:rPr>
-              <w:t>GET</w:t>
-            </w:r>
-          </w:p>
-        </w:tc>
-        <w:tc>
-          <w:tcPr>
-            <w:tcW w:w="2250" w:type="dxa"/>
-          </w:tcPr>
-          <w:p>
-            <w:pPr>
-              <w:spacing w:before="40" w:after="40"/>
-            </w:pPr>
-            <w:r>
-              <w:rPr>
-                <w:sz w:val="18"/>
-              </w:rPr>
-              <w:t>Consulta del catálogo de productos</w:t>
-            </w:r>
-          </w:p>
-        </w:tc>
-        <w:tc>
-          <w:tcPr>
-            <w:tcW w:w="2250" w:type="dxa"/>
-          </w:tcPr>
-          <w:p>
-            <w:pPr>
-              <w:spacing w:before="40" w:after="40"/>
-            </w:pPr>
-            <w:r>
-              <w:rPr>
-                <w:sz w:val="18"/>
-              </w:rPr>
-              <w:t>Content-</w:t>
-            </w:r>
-            <w:proofErr w:type="spellStart"/>
-            <w:r>
-              <w:rPr>
-                <w:sz w:val="18"/>
-              </w:rPr>
-              <w:t>Type</w:t>
-            </w:r>
-            <w:proofErr w:type="spellEnd"/>
-          </w:p>
-        </w:tc>
-      </w:tr>
-      <w:tr>
-        <w:tc>
-          <w:tcPr>
-            <w:tcW w:w="2250" w:type="dxa"/>
-          </w:tcPr>
-          <w:p>
-            <w:pPr>
-              <w:spacing w:before="40" w:after="40"/>
-            </w:pPr>
-            <w:r>
-              <w:rPr>
-                <w:sz w:val="18"/>
-              </w:rPr>
-              <w:t>/api/v1/</w:t>
-            </w:r>
-            <w:proofErr w:type="spellStart"/>
-            <w:r>
-              <w:rPr>
-                <w:sz w:val="18"/>
-              </w:rPr>
-              <w:t>clients</w:t>
-            </w:r>
-            <w:proofErr w:type="spellEnd"/>
-            <w:r>
-              <w:rPr>
-                <w:sz w:val="18"/>
-              </w:rPr>
-              <w:t>/</w:t>
-            </w:r>
-          </w:p>
-        </w:tc>
-        <w:tc>
-          <w:tcPr>
-            <w:tcW w:w="2250" w:type="dxa"/>
-          </w:tcPr>
-          <w:p>
-            <w:pPr>
-              <w:spacing w:before="40" w:after="40"/>
-            </w:pPr>
-            <w:r>
-              <w:rPr>
-                <w:sz w:val="18"/>
-              </w:rPr>
-              <w:t>POST</w:t>
-            </w:r>
-          </w:p>
-        </w:tc>
-        <w:tc>
-          <w:tcPr>
-            <w:tcW w:w="2250" w:type="dxa"/>
-          </w:tcPr>
-          <w:p>
-            <w:pPr>
-              <w:spacing w:before="40" w:after="40"/>
-            </w:pPr>
-            <w:r>
-              <w:rPr>
-                <w:sz w:val="18"/>
-              </w:rPr>
-              <w:t>Alta del cliente en la API</w:t>
-            </w:r>
-          </w:p>
-        </w:tc>
-        <w:tc>
-          <w:tcPr>
-            <w:tcW w:w="2250" w:type="dxa"/>
-          </w:tcPr>
-          <w:p>
-            <w:pPr>
-              <w:spacing w:before="40" w:after="40"/>
-            </w:pPr>
-            <w:r>
-              <w:rPr>
-                <w:sz w:val="18"/>
-              </w:rPr>
-              <w:t>X-Api-Key, Content-</w:t>
-            </w:r>
-            <w:proofErr w:type="spellStart"/>
-            <w:r>
-              <w:rPr>
-                <w:sz w:val="18"/>
-              </w:rPr>
-              <w:t>Type</w:t>
-            </w:r>
-            <w:proofErr w:type="spellEnd"/>
-          </w:p>
-        </w:tc>
-      </w:tr>
-      <w:tr>
-        <w:tc>
-          <w:tcPr>
-            <w:tcW w:w="2250" w:type="dxa"/>
-          </w:tcPr>
-          <w:p>
-            <w:pPr>
-              <w:spacing w:before="40" w:after="40"/>
-            </w:pPr>
-            <w:r>
-              <w:rPr>
-                <w:sz w:val="18"/>
-              </w:rPr>
-              <w:t>/api/v1/</w:t>
-            </w:r>
-            <w:proofErr w:type="spellStart"/>
-            <w:r>
-              <w:rPr>
-                <w:sz w:val="18"/>
-              </w:rPr>
-              <w:t>clients</w:t>
-            </w:r>
-            <w:proofErr w:type="spellEnd"/>
-            <w:r>
-              <w:rPr>
-                <w:sz w:val="18"/>
-              </w:rPr>
-              <w:t>/{id}/productos</w:t>
-            </w:r>
-          </w:p>
-        </w:tc>
-        <w:tc>
-          <w:tcPr>
-            <w:tcW w:w="2250" w:type="dxa"/>
-          </w:tcPr>
-          <w:p>
-            <w:pPr>
-              <w:spacing w:before="40" w:after="40"/>
-            </w:pPr>
-            <w:r>
-              <w:rPr>
-                <w:sz w:val="18"/>
-              </w:rPr>
-              <w:t>POST</w:t>
-            </w:r>
-          </w:p>
-        </w:tc>
-        <w:tc>
-          <w:tcPr>
-            <w:tcW w:w="2250" w:type="dxa"/>
-          </w:tcPr>
-          <w:p>
-            <w:pPr>
-              <w:spacing w:before="40" w:after="40"/>
-            </w:pPr>
-            <w:r>
-              <w:rPr>
-                <w:sz w:val="18"/>
-              </w:rPr>
-              <w:t>Agregar un producto al carrito del cliente</w:t>
-            </w:r>
-          </w:p>
-        </w:tc>
-        <w:tc>
-          <w:tcPr>
-            <w:tcW w:w="2250" w:type="dxa"/>
-          </w:tcPr>
-          <w:p>
-            <w:pPr>
-              <w:spacing w:before="40" w:after="40"/>
-            </w:pPr>
-            <w:r>
-              <w:rPr>
-                <w:sz w:val="18"/>
-              </w:rPr>
-              <w:t>Content-</w:t>
-            </w:r>
-            <w:proofErr w:type="spellStart"/>
-            <w:r>
-              <w:rPr>
-                <w:sz w:val="18"/>
-              </w:rPr>
-              <w:t>Type</w:t>
-            </w:r>
-            <w:proofErr w:type="spellEnd"/>
-          </w:p>
-        </w:tc>
-      </w:tr>
-      <w:tr>
-        <w:tc>
-          <w:tcPr>
-            <w:tcW w:w="2250" w:type="dxa"/>
-          </w:tcPr>
-          <w:p>
-            <w:pPr>
-              <w:spacing w:before="40" w:after="40"/>
-            </w:pPr>
-            <w:r>
-              <w:rPr>
-                <w:sz w:val="18"/>
-              </w:rPr>
-              <w:t>/api/v1/</w:t>
-            </w:r>
-            <w:proofErr w:type="spellStart"/>
-            <w:r>
-              <w:rPr>
-                <w:sz w:val="18"/>
-              </w:rPr>
-              <w:t>clients</w:t>
-            </w:r>
-            <w:proofErr w:type="spellEnd"/>
-            <w:r>
-              <w:rPr>
-                <w:sz w:val="18"/>
-              </w:rPr>
-              <w:t>/{id}/productos</w:t>
-            </w:r>
-          </w:p>
-        </w:tc>
-        <w:tc>
-          <w:tcPr>
-            <w:tcW w:w="2250" w:type="dxa"/>
-          </w:tcPr>
-          <w:p>
-            <w:pPr>
-              <w:spacing w:before="40" w:after="40"/>
-            </w:pPr>
-            <w:r>
-              <w:rPr>
-                <w:sz w:val="18"/>
-              </w:rPr>
-              <w:t>PUT</w:t>
-            </w:r>
-          </w:p>
-        </w:tc>
-        <w:tc>
-          <w:tcPr>
-            <w:tcW w:w="2250" w:type="dxa"/>
-          </w:tcPr>
-          <w:p>
-            <w:pPr>
-              <w:spacing w:before="40" w:after="40"/>
-            </w:pPr>
-            <w:r>
-              <w:rPr>
-                <w:sz w:val="18"/>
-              </w:rPr>
-              <w:t>Reemplazar la lista de productos al finalizar la compra</w:t>
-            </w:r>
-          </w:p>
-        </w:tc>
-        <w:tc>
-          <w:tcPr>
-            <w:tcW w:w="2250" w:type="dxa"/>
-          </w:tcPr>
-          <w:p>
-            <w:pPr>
-              <w:spacing w:before="40" w:after="40"/>
-            </w:pPr>
-            <w:r>
-              <w:rPr>
-                <w:sz w:val="18"/>
-              </w:rPr>
-              <w:t>Content-</w:t>
-            </w:r>
-            <w:proofErr w:type="spellStart"/>
-            <w:r>
-              <w:rPr>
-                <w:sz w:val="18"/>
-              </w:rPr>
-              <w:t>Type</w:t>
-            </w:r>
-            <w:proofErr w:type="spellEnd"/>
-          </w:p>
-        </w:tc>
-      </w:tr>
-    </w:tbl>
-    <w:p>
-      <w:pPr>
-        <w:spacing w:after="120"/>
-      </w:pPr>
-      <w:r>
-        <w:rPr>
-          <w:sz w:val="22"/>
-        </w:rPr>
-        <w:t xml:space="preserve">La conexión con </w:t>
-      </w:r>
-      <w:proofErr w:type="spellStart"/>
-      <w:r>
-        <w:rPr>
-          <w:sz w:val="22"/>
-        </w:rPr>
-        <w:t>Telegram</w:t>
-      </w:r>
-      <w:proofErr w:type="spellEnd"/>
-      <w:r>
-        <w:rPr>
-          <w:sz w:val="22"/>
-        </w:rPr>
-        <w:t xml:space="preserve"> se realiza mediante la credencial de tipo “</w:t>
-      </w:r>
-      <w:proofErr w:type="spellStart"/>
-      <w:r>
-        <w:rPr>
-          <w:sz w:val="22"/>
-        </w:rPr>
-        <w:t>Telegram</w:t>
-      </w:r>
-      <w:proofErr w:type="spellEnd"/>
-      <w:r>
-        <w:rPr>
-          <w:sz w:val="22"/>
-        </w:rPr>
-        <w:t xml:space="preserve"> </w:t>
-      </w:r>
-      <w:proofErr w:type="spellStart"/>
-      <w:r>
-        <w:rPr>
-          <w:sz w:val="22"/>
-        </w:rPr>
-        <w:t>account</w:t>
-      </w:r>
-      <w:proofErr w:type="spellEnd"/>
-      <w:r>
-        <w:rPr>
-          <w:sz w:val="22"/>
-        </w:rPr>
-        <w:t>” (</w:t>
-      </w:r>
-      <w:proofErr w:type="spellStart"/>
-      <w:r>
-        <w:rPr>
-          <w:sz w:val="22"/>
-        </w:rPr>
-        <w:t>telegramApi</w:t>
-      </w:r>
-      <w:proofErr w:type="spellEnd"/>
-      <w:r>
-        <w:rPr>
-          <w:sz w:val="22"/>
-        </w:rPr>
-        <w:t xml:space="preserve">) configurada en n8n, con el </w:t>
-      </w:r>
-      <w:proofErr w:type="spellStart"/>
-      <w:r>
-        <w:rPr>
-          <w:sz w:val="22"/>
-        </w:rPr>
-        <w:t>trigger</w:t>
-      </w:r>
-      <w:proofErr w:type="spellEnd"/>
-      <w:r>
-        <w:rPr>
-          <w:sz w:val="22"/>
-        </w:rPr>
-        <w:t xml:space="preserve"> en modo </w:t>
-      </w:r>
-      <w:proofErr w:type="spellStart"/>
-      <w:r>
-        <w:rPr>
-          <w:sz w:val="22"/>
-        </w:rPr>
-        <w:t>polling</w:t>
-      </w:r>
-      <w:proofErr w:type="spellEnd"/>
-      <w:r>
-        <w:rPr>
-          <w:sz w:val="22"/>
-        </w:rPr>
-        <w:t xml:space="preserve"> que escucha únicamente el evento de mensaje (</w:t>
-      </w:r>
-      <w:proofErr w:type="spellStart"/>
-      <w:r>
-        <w:rPr>
-          <w:sz w:val="22"/>
-        </w:rPr>
-        <w:t>updates</w:t>
-      </w:r>
-      <w:proofErr w:type="spellEnd"/>
-      <w:r>
-        <w:rPr>
-          <w:sz w:val="22"/>
-        </w:rPr>
-        <w:t xml:space="preserve">: </w:t>
-      </w:r>
-      <w:proofErr w:type="spellStart"/>
-      <w:r>
-        <w:rPr>
-          <w:sz w:val="22"/>
-        </w:rPr>
-        <w:t>message</w:t>
-      </w:r>
-      <w:proofErr w:type="spellEnd"/>
-      <w:r>
-        <w:rPr>
-          <w:sz w:val="22"/>
-        </w:rPr>
-        <w:t xml:space="preserve">). La planilla de auditoría se integra mediante una cuenta de servicio de Google con autenticación OAuth 2.0, referenciada en el nodo </w:t>
-      </w:r>
-      <w:proofErr w:type="spellStart"/>
-      <w:r>
-        <w:rPr>
-          <w:sz w:val="22"/>
-        </w:rPr>
-        <w:t>Append</w:t>
-      </w:r>
-      <w:proofErr w:type="spellEnd"/>
-      <w:r>
-        <w:rPr>
-          <w:sz w:val="22"/>
-        </w:rPr>
-        <w:t xml:space="preserve"> </w:t>
-      </w:r>
-      <w:proofErr w:type="spellStart"/>
-      <w:r>
-        <w:rPr>
-          <w:sz w:val="22"/>
-        </w:rPr>
-        <w:t>to</w:t>
-      </w:r>
-      <w:proofErr w:type="spellEnd"/>
-      <w:r>
-        <w:rPr>
-          <w:sz w:val="22"/>
-        </w:rPr>
-        <w:t xml:space="preserve"> </w:t>
-      </w:r>
-      <w:proofErr w:type="spellStart"/>
-      <w:r>
-        <w:rPr>
-          <w:sz w:val="22"/>
-        </w:rPr>
-        <w:t>Sheet</w:t>
-      </w:r>
-      <w:proofErr w:type="spellEnd"/>
-      <w:r>
-        <w:rPr>
-          <w:sz w:val="22"/>
-        </w:rPr>
-        <w:t xml:space="preserve"> como “Google </w:t>
-      </w:r>
-      <w:proofErr w:type="spellStart"/>
-      <w:r>
-        <w:rPr>
-          <w:sz w:val="22"/>
-        </w:rPr>
-        <w:t>Sheets</w:t>
-      </w:r>
-      <w:proofErr w:type="spellEnd"/>
-      <w:r>
-        <w:rPr>
-          <w:sz w:val="22"/>
-        </w:rPr>
-        <w:t xml:space="preserve"> </w:t>
-      </w:r>
-      <w:proofErr w:type="spellStart"/>
-      <w:r>
-        <w:rPr>
-          <w:sz w:val="22"/>
-        </w:rPr>
-        <w:t>account</w:t>
-      </w:r>
-      <w:proofErr w:type="spellEnd"/>
-      <w:r>
-        <w:rPr>
-          <w:sz w:val="22"/>
-        </w:rPr>
-        <w:t xml:space="preserve">”. El </w:t>
-      </w:r>
-      <w:proofErr w:type="spellStart"/>
-      <w:r>
-        <w:rPr>
-          <w:sz w:val="22"/>
-        </w:rPr>
-        <w:t>bot</w:t>
-      </w:r>
-      <w:proofErr w:type="spellEnd"/>
-      <w:r>
-        <w:rPr>
-          <w:sz w:val="22"/>
-        </w:rPr>
-        <w:t xml:space="preserve"> de </w:t>
-      </w:r>
-      <w:proofErr w:type="spellStart"/>
-      <w:r>
-        <w:rPr>
-          <w:sz w:val="22"/>
-        </w:rPr>
-        <w:t>Telegram</w:t>
-      </w:r>
-      <w:proofErr w:type="spellEnd"/>
-      <w:r>
-        <w:rPr>
-          <w:sz w:val="22"/>
-        </w:rPr>
-        <w:t xml:space="preserve"> responde únicamente a mensajes de texto; los comandos y emojis utilizados en las respuestas se definen en el nodo Bot </w:t>
-      </w:r>
-      <w:proofErr w:type="spellStart"/>
-      <w:r>
-        <w:rPr>
-          <w:sz w:val="22"/>
-        </w:rPr>
-        <w:t>Router</w:t>
-      </w:r>
-      <w:proofErr w:type="spellEnd"/>
-      <w:r>
-        <w:rPr>
-          <w:sz w:val="22"/>
-        </w:rPr>
-        <w:t>.</w:t>
       </w:r>
     </w:p>
     <w:p>

</xml_diff>

<commit_message>
fix: tesis - Tabla 7 reducida a 10pt (backup tenia 90pt)
</commit_message>
<xml_diff>
--- a/Docs/Devoluciones + archivo de tesis/Tesis_Final_UTNV2 (1).docx
+++ b/Docs/Devoluciones + archivo de tesis/Tesis_Final_UTNV2 (1).docx
@@ -12342,7 +12342,7 @@
             <w:r>
               <w:rPr>
                 <w:b/>
-                <w:sz w:val="180"/>
+                <w:sz w:val="20"/>
                 <w:szCs w:val="180"/>
               </w:rPr>
               <w:lastRenderedPageBreak/>
@@ -12359,7 +12359,7 @@
             <w:r>
               <w:rPr>
                 <w:b/>
-                <w:sz w:val="180"/>
+                <w:sz w:val="20"/>
                 <w:szCs w:val="180"/>
               </w:rPr>
               <w:t>Input d</w:t>
@@ -12367,7 +12367,7 @@
             <w:r>
               <w:rPr>
                 <w:b/>
-                <w:sz w:val="180"/>
+                <w:sz w:val="20"/>
                 <w:szCs w:val="180"/>
               </w:rPr>
               <w:lastRenderedPageBreak/>
@@ -12376,7 +12376,7 @@
             <w:r>
               <w:rPr>
                 <w:b/>
-                <w:sz w:val="180"/>
+                <w:sz w:val="20"/>
                 <w:szCs w:val="180"/>
               </w:rPr>
               <w:lastRenderedPageBreak/>
@@ -12385,7 +12385,7 @@
             <w:r>
               <w:rPr>
                 <w:b/>
-                <w:sz w:val="180"/>
+                <w:sz w:val="20"/>
                 <w:szCs w:val="180"/>
               </w:rPr>
               <w:t>io</w:t>
@@ -12401,7 +12401,7 @@
             <w:r>
               <w:rPr>
                 <w:b/>
-                <w:sz w:val="180"/>
+                <w:sz w:val="20"/>
                 <w:szCs w:val="180"/>
               </w:rPr>
               <w:lastRenderedPageBreak/>
@@ -12410,7 +12410,7 @@
             <w:r>
               <w:rPr>
                 <w:b/>
-                <w:sz w:val="180"/>
+                <w:sz w:val="20"/>
                 <w:szCs w:val="180"/>
               </w:rPr>
               <w:t>ión esp</w:t>
@@ -12418,7 +12418,7 @@
             <w:r>
               <w:rPr>
                 <w:b/>
-                <w:sz w:val="180"/>
+                <w:sz w:val="20"/>
                 <w:szCs w:val="180"/>
               </w:rPr>
               <w:lastRenderedPageBreak/>
@@ -12435,7 +12435,7 @@
             <w:r>
               <w:rPr>
                 <w:b/>
-                <w:sz w:val="180"/>
+                <w:sz w:val="20"/>
                 <w:szCs w:val="180"/>
               </w:rPr>
               <w:lastRenderedPageBreak/>
@@ -12444,7 +12444,7 @@
             <w:r>
               <w:rPr>
                 <w:b/>
-                <w:sz w:val="180"/>
+                <w:sz w:val="20"/>
                 <w:szCs w:val="180"/>
               </w:rPr>
               <w:t>ión det</w:t>
@@ -12452,7 +12452,7 @@
             <w:r>
               <w:rPr>
                 <w:b/>
-                <w:sz w:val="180"/>
+                <w:sz w:val="20"/>
                 <w:szCs w:val="180"/>
               </w:rPr>
               <w:lastRenderedPageBreak/>
@@ -12469,7 +12469,7 @@
             <w:r>
               <w:rPr>
                 <w:b/>
-                <w:sz w:val="180"/>
+                <w:sz w:val="20"/>
                 <w:szCs w:val="180"/>
               </w:rPr>
               <w:lastRenderedPageBreak/>
@@ -12478,7 +12478,7 @@
             <w:r>
               <w:rPr>
                 <w:b/>
-                <w:sz w:val="180"/>
+                <w:sz w:val="20"/>
                 <w:szCs w:val="180"/>
               </w:rPr>
               <w:t>ión</w:t>
@@ -12494,7 +12494,7 @@
             <w:r>
               <w:rPr>
                 <w:b/>
-                <w:sz w:val="180"/>
+                <w:sz w:val="20"/>
                 <w:szCs w:val="180"/>
               </w:rPr>
               <w:lastRenderedPageBreak/>
@@ -12503,7 +12503,7 @@
             <w:r>
               <w:rPr>
                 <w:b/>
-                <w:sz w:val="180"/>
+                <w:sz w:val="20"/>
                 <w:szCs w:val="180"/>
               </w:rPr>
               <w:lastRenderedPageBreak/>
@@ -12521,7 +12521,7 @@
           <w:p>
             <w:r>
               <w:rPr>
-                <w:sz w:val="180"/>
+                <w:sz w:val="20"/>
                 <w:szCs w:val="180"/>
               </w:rPr>
               <w:lastRenderedPageBreak/>
@@ -12537,14 +12537,14 @@
           <w:p>
             <w:r>
               <w:rPr>
-                <w:sz w:val="180"/>
+                <w:sz w:val="20"/>
                 <w:szCs w:val="180"/>
               </w:rPr>
               <w:t>“Quier</w:t>
             </w:r>
             <w:r>
               <w:rPr>
-                <w:sz w:val="180"/>
+                <w:sz w:val="20"/>
                 <w:szCs w:val="180"/>
               </w:rPr>
               <w:lastRenderedPageBreak/>
@@ -12552,7 +12552,7 @@
             </w:r>
             <w:r>
               <w:rPr>
-                <w:sz w:val="180"/>
+                <w:sz w:val="20"/>
                 <w:szCs w:val="180"/>
               </w:rPr>
               <w:lastRenderedPageBreak/>
@@ -12560,7 +12560,7 @@
             </w:r>
             <w:r>
               <w:rPr>
-                <w:sz w:val="180"/>
+                <w:sz w:val="20"/>
                 <w:szCs w:val="180"/>
               </w:rPr>
               <w:lastRenderedPageBreak/>
@@ -12576,7 +12576,7 @@
           <w:p>
             <w:r>
               <w:rPr>
-                <w:sz w:val="180"/>
+                <w:sz w:val="20"/>
                 <w:szCs w:val="180"/>
               </w:rPr>
               <w:lastRenderedPageBreak/>
@@ -12592,7 +12592,7 @@
           <w:p>
             <w:r>
               <w:rPr>
-                <w:sz w:val="180"/>
+                <w:sz w:val="20"/>
                 <w:szCs w:val="180"/>
               </w:rPr>
               <w:t>Menú (</w:t>
@@ -12600,14 +12600,14 @@
             <w:proofErr w:type="spellStart"/>
             <w:r>
               <w:rPr>
-                <w:sz w:val="180"/>
+                <w:sz w:val="20"/>
                 <w:szCs w:val="180"/>
               </w:rPr>
               <w:t>fa</w:t>
             </w:r>
             <w:r>
               <w:rPr>
-                <w:sz w:val="180"/>
+                <w:sz w:val="20"/>
                 <w:szCs w:val="180"/>
               </w:rPr>
               <w:lastRenderedPageBreak/>
@@ -12616,7 +12616,7 @@
             <w:proofErr w:type="spellEnd"/>
             <w:r>
               <w:rPr>
-                <w:sz w:val="180"/>
+                <w:sz w:val="20"/>
                 <w:szCs w:val="180"/>
               </w:rPr>
               <w:t>)</w:t>
@@ -12631,7 +12631,7 @@
           <w:p>
             <w:r>
               <w:rPr>
-                <w:sz w:val="180"/>
+                <w:sz w:val="20"/>
                 <w:szCs w:val="180"/>
               </w:rPr>
               <w:lastRenderedPageBreak/>
@@ -12647,14 +12647,14 @@
           <w:p>
             <w:r>
               <w:rPr>
-                <w:sz w:val="180"/>
+                <w:sz w:val="20"/>
                 <w:szCs w:val="180"/>
               </w:rPr>
               <w:t>Lenguaj</w:t>
             </w:r>
             <w:r>
               <w:rPr>
-                <w:sz w:val="180"/>
+                <w:sz w:val="20"/>
                 <w:szCs w:val="180"/>
               </w:rPr>
               <w:lastRenderedPageBreak/>
@@ -12662,7 +12662,7 @@
             </w:r>
             <w:r>
               <w:rPr>
-                <w:sz w:val="180"/>
+                <w:sz w:val="20"/>
                 <w:szCs w:val="180"/>
               </w:rPr>
               <w:lastRenderedPageBreak/>
@@ -12671,14 +12671,14 @@
             <w:proofErr w:type="spellStart"/>
             <w:r>
               <w:rPr>
-                <w:sz w:val="180"/>
+                <w:sz w:val="20"/>
                 <w:szCs w:val="180"/>
               </w:rPr>
               <w:t>matche</w:t>
             </w:r>
             <w:r>
               <w:rPr>
-                <w:sz w:val="180"/>
+                <w:sz w:val="20"/>
                 <w:szCs w:val="180"/>
               </w:rPr>
               <w:lastRenderedPageBreak/>
@@ -12687,14 +12687,14 @@
             <w:proofErr w:type="spellEnd"/>
             <w:r>
               <w:rPr>
-                <w:sz w:val="180"/>
+                <w:sz w:val="20"/>
                 <w:szCs w:val="180"/>
               </w:rPr>
               <w:t xml:space="preserve"> patrone</w:t>
             </w:r>
             <w:r>
               <w:rPr>
-                <w:sz w:val="180"/>
+                <w:sz w:val="20"/>
                 <w:szCs w:val="180"/>
               </w:rPr>
               <w:lastRenderedPageBreak/>
@@ -12702,7 +12702,7 @@
             </w:r>
             <w:r>
               <w:rPr>
-                <w:sz w:val="180"/>
+                <w:sz w:val="20"/>
                 <w:szCs w:val="180"/>
               </w:rPr>
               <w:lastRenderedPageBreak/>
@@ -12720,7 +12720,7 @@
           <w:p>
             <w:r>
               <w:rPr>
-                <w:sz w:val="180"/>
+                <w:sz w:val="20"/>
                 <w:szCs w:val="180"/>
               </w:rPr>
               <w:lastRenderedPageBreak/>
@@ -12736,14 +12736,14 @@
           <w:p>
             <w:r>
               <w:rPr>
-                <w:sz w:val="180"/>
+                <w:sz w:val="20"/>
                 <w:szCs w:val="180"/>
               </w:rPr>
               <w:t>“HO</w:t>
             </w:r>
             <w:r>
               <w:rPr>
-                <w:sz w:val="180"/>
+                <w:sz w:val="20"/>
                 <w:szCs w:val="180"/>
               </w:rPr>
               <w:lastRenderedPageBreak/>
@@ -12759,7 +12759,7 @@
           <w:p>
             <w:r>
               <w:rPr>
-                <w:sz w:val="180"/>
+                <w:sz w:val="20"/>
                 <w:szCs w:val="180"/>
               </w:rPr>
               <w:lastRenderedPageBreak/>
@@ -12767,7 +12767,7 @@
             </w:r>
             <w:r>
               <w:rPr>
-                <w:sz w:val="180"/>
+                <w:sz w:val="20"/>
                 <w:szCs w:val="180"/>
               </w:rPr>
               <w:lastRenderedPageBreak/>
@@ -12783,7 +12783,7 @@
           <w:p>
             <w:r>
               <w:rPr>
-                <w:sz w:val="180"/>
+                <w:sz w:val="20"/>
                 <w:szCs w:val="180"/>
               </w:rPr>
               <w:lastRenderedPageBreak/>
@@ -12791,7 +12791,7 @@
             </w:r>
             <w:r>
               <w:rPr>
-                <w:sz w:val="180"/>
+                <w:sz w:val="20"/>
                 <w:szCs w:val="180"/>
               </w:rPr>
               <w:lastRenderedPageBreak/>
@@ -12800,14 +12800,14 @@
             <w:proofErr w:type="spellStart"/>
             <w:r>
               <w:rPr>
-                <w:sz w:val="180"/>
+                <w:sz w:val="20"/>
                 <w:szCs w:val="180"/>
               </w:rPr>
               <w:t>fallba</w:t>
             </w:r>
             <w:r>
               <w:rPr>
-                <w:sz w:val="180"/>
+                <w:sz w:val="20"/>
                 <w:szCs w:val="180"/>
               </w:rPr>
               <w:lastRenderedPageBreak/>
@@ -12816,7 +12816,7 @@
             <w:proofErr w:type="spellEnd"/>
             <w:r>
               <w:rPr>
-                <w:sz w:val="180"/>
+                <w:sz w:val="20"/>
                 <w:szCs w:val="180"/>
               </w:rPr>
               <w:t>)</w:t>
@@ -12831,7 +12831,7 @@
           <w:p>
             <w:r>
               <w:rPr>
-                <w:sz w:val="180"/>
+                <w:sz w:val="20"/>
                 <w:szCs w:val="180"/>
               </w:rPr>
               <w:lastRenderedPageBreak/>
@@ -12839,7 +12839,7 @@
             </w:r>
             <w:r>
               <w:rPr>
-                <w:sz w:val="180"/>
+                <w:sz w:val="20"/>
                 <w:szCs w:val="180"/>
               </w:rPr>
               <w:t>%*</w:t>
@@ -12854,7 +12854,7 @@
           <w:p>
             <w:r>
               <w:rPr>
-                <w:sz w:val="180"/>
+                <w:sz w:val="20"/>
                 <w:szCs w:val="180"/>
               </w:rPr>
               <w:lastRenderedPageBreak/>
@@ -12862,7 +12862,7 @@
             </w:r>
             <w:r>
               <w:rPr>
-                <w:sz w:val="180"/>
+                <w:sz w:val="20"/>
                 <w:szCs w:val="180"/>
               </w:rPr>
               <w:lastRenderedPageBreak/>
@@ -12870,7 +12870,7 @@
             </w:r>
             <w:r>
               <w:rPr>
-                <w:sz w:val="180"/>
+                <w:sz w:val="20"/>
                 <w:szCs w:val="180"/>
               </w:rPr>
               <w:lastRenderedPageBreak/>
@@ -12878,7 +12878,7 @@
             </w:r>
             <w:r>
               <w:rPr>
-                <w:sz w:val="180"/>
+                <w:sz w:val="20"/>
                 <w:szCs w:val="180"/>
               </w:rPr>
               <w:lastRenderedPageBreak/>
@@ -12886,7 +12886,7 @@
             </w:r>
             <w:r>
               <w:rPr>
-                <w:sz w:val="180"/>
+                <w:sz w:val="20"/>
                 <w:szCs w:val="180"/>
               </w:rPr>
               <w:lastRenderedPageBreak/>
@@ -12894,7 +12894,7 @@
             </w:r>
             <w:r>
               <w:rPr>
-                <w:sz w:val="180"/>
+                <w:sz w:val="20"/>
                 <w:szCs w:val="180"/>
               </w:rPr>
               <w:lastRenderedPageBreak/>
@@ -12902,7 +12902,7 @@
             </w:r>
             <w:r>
               <w:rPr>
-                <w:sz w:val="180"/>
+                <w:sz w:val="20"/>
                 <w:szCs w:val="180"/>
               </w:rPr>
               <w:lastRenderedPageBreak/>
@@ -12910,7 +12910,7 @@
             </w:r>
             <w:r>
               <w:rPr>
-                <w:sz w:val="180"/>
+                <w:sz w:val="20"/>
                 <w:szCs w:val="180"/>
               </w:rPr>
               <w:lastRenderedPageBreak/>
@@ -12928,7 +12928,7 @@
           <w:p>
             <w:r>
               <w:rPr>
-                <w:sz w:val="180"/>
+                <w:sz w:val="20"/>
                 <w:szCs w:val="180"/>
               </w:rPr>
               <w:lastRenderedPageBreak/>
@@ -12944,14 +12944,14 @@
           <w:p>
             <w:r>
               <w:rPr>
-                <w:sz w:val="180"/>
+                <w:sz w:val="20"/>
                 <w:szCs w:val="180"/>
               </w:rPr>
               <w:t>“5” (</w:t>
             </w:r>
             <w:r>
               <w:rPr>
-                <w:sz w:val="180"/>
+                <w:sz w:val="20"/>
                 <w:szCs w:val="180"/>
               </w:rPr>
               <w:lastRenderedPageBreak/>
@@ -12959,7 +12959,7 @@
             </w:r>
             <w:r>
               <w:rPr>
-                <w:sz w:val="180"/>
+                <w:sz w:val="20"/>
                 <w:szCs w:val="180"/>
               </w:rPr>
               <w:lastRenderedPageBreak/>
@@ -12967,7 +12967,7 @@
             </w:r>
             <w:r>
               <w:rPr>
-                <w:sz w:val="180"/>
+                <w:sz w:val="20"/>
                 <w:szCs w:val="180"/>
               </w:rPr>
               <w:lastRenderedPageBreak/>
@@ -12975,7 +12975,7 @@
             </w:r>
             <w:r>
               <w:rPr>
-                <w:sz w:val="180"/>
+                <w:sz w:val="20"/>
                 <w:szCs w:val="180"/>
               </w:rPr>
               <w:lastRenderedPageBreak/>
@@ -12991,7 +12991,7 @@
           <w:p>
             <w:r>
               <w:rPr>
-                <w:sz w:val="180"/>
+                <w:sz w:val="20"/>
                 <w:szCs w:val="180"/>
               </w:rPr>
               <w:lastRenderedPageBreak/>
@@ -12999,7 +12999,7 @@
             </w:r>
             <w:r>
               <w:rPr>
-                <w:sz w:val="180"/>
+                <w:sz w:val="20"/>
                 <w:szCs w:val="180"/>
               </w:rPr>
               <w:lastRenderedPageBreak/>
@@ -13007,7 +13007,7 @@
             </w:r>
             <w:r>
               <w:rPr>
-                <w:sz w:val="180"/>
+                <w:sz w:val="20"/>
                 <w:szCs w:val="180"/>
               </w:rPr>
               <w:lastRenderedPageBreak/>
@@ -13023,7 +13023,7 @@
           <w:p>
             <w:r>
               <w:rPr>
-                <w:sz w:val="180"/>
+                <w:sz w:val="20"/>
                 <w:szCs w:val="180"/>
               </w:rPr>
               <w:lastRenderedPageBreak/>
@@ -13031,7 +13031,7 @@
             </w:r>
             <w:r>
               <w:rPr>
-                <w:sz w:val="180"/>
+                <w:sz w:val="20"/>
                 <w:szCs w:val="180"/>
               </w:rPr>
               <w:t>(</w:t>
@@ -13039,14 +13039,14 @@
             <w:proofErr w:type="spellStart"/>
             <w:r>
               <w:rPr>
-                <w:sz w:val="180"/>
+                <w:sz w:val="20"/>
                 <w:szCs w:val="180"/>
               </w:rPr>
               <w:t>fallbac</w:t>
             </w:r>
             <w:r>
               <w:rPr>
-                <w:sz w:val="180"/>
+                <w:sz w:val="20"/>
                 <w:szCs w:val="180"/>
               </w:rPr>
               <w:lastRenderedPageBreak/>
@@ -13055,7 +13055,7 @@
             <w:proofErr w:type="spellEnd"/>
             <w:r>
               <w:rPr>
-                <w:sz w:val="180"/>
+                <w:sz w:val="20"/>
                 <w:szCs w:val="180"/>
               </w:rPr>
               <w:t>)</w:t>
@@ -13070,7 +13070,7 @@
           <w:p>
             <w:r>
               <w:rPr>
-                <w:sz w:val="180"/>
+                <w:sz w:val="20"/>
                 <w:szCs w:val="180"/>
               </w:rPr>
               <w:lastRenderedPageBreak/>
@@ -13086,21 +13086,21 @@
           <w:p>
             <w:r>
               <w:rPr>
-                <w:sz w:val="180"/>
+                <w:sz w:val="20"/>
                 <w:szCs w:val="180"/>
               </w:rPr>
               <w:t xml:space="preserve">Fuera </w:t>
             </w:r>
             <w:r>
               <w:rPr>
-                <w:sz w:val="180"/>
+                <w:sz w:val="20"/>
                 <w:szCs w:val="180"/>
               </w:rPr>
               <w:t xml:space="preserve">de rango </w:t>
             </w:r>
             <w:r>
               <w:rPr>
-                <w:sz w:val="180"/>
+                <w:sz w:val="20"/>
                 <w:szCs w:val="180"/>
               </w:rPr>
               <w:lastRenderedPageBreak/>
@@ -13108,7 +13108,7 @@
             </w:r>
             <w:r>
               <w:rPr>
-                <w:sz w:val="180"/>
+                <w:sz w:val="20"/>
                 <w:szCs w:val="180"/>
               </w:rPr>
               <w:lastRenderedPageBreak/>
@@ -13116,7 +13116,7 @@
             </w:r>
             <w:r>
               <w:rPr>
-                <w:sz w:val="180"/>
+                <w:sz w:val="20"/>
                 <w:szCs w:val="180"/>
               </w:rPr>
               <w:lastRenderedPageBreak/>

</xml_diff>

<commit_message>
fix: tesis - captions Tabla 5 y 6 movidos antes de sus respectivas tablas
</commit_message>
<xml_diff>
--- a/Docs/Devoluciones + archivo de tesis/Tesis_Final_UTNV2 (1).docx
+++ b/Docs/Devoluciones + archivo de tesis/Tesis_Final_UTNV2 (1).docx
@@ -10900,11 +10900,6 @@
         <w:t>Tabla 5. Mediciones de tiempo de respuesta por tipo de solicitud (n = 30).</w:t>
       </w:r>
     </w:p>
-    <w:p>
-      <w:r>
-        <w:t>Tabla 6. Evaluación de precisión de la interpretación por intención.</w:t>
-      </w:r>
-    </w:p>
     <w:tbl>
       <w:tblPr>
         <w:tblStyle w:val="TableNormal"/>
@@ -11540,6 +11535,11 @@
     <w:p>
       <w:r>
         <w:t>El comportamiento del sistema ante mensajes fuera de las rutas cubiertas también es predecible y correcto: las entradas no reconocidas se derivan a la intención por defecto, que presenta nuevamente el menú principal e informa al usuario de las opciones disponibles. Esta característica, propia del diseño determinístico, elimina la posibilidad de interpretaciones erróneas silenciosas y asegura que el sistema nunca produzca una respuesta fuera del conjunto previsto. Las limitaciones de este enfoque, que serán retomadas en el capítulo de discusión, se concentran en los mensajes expresados con una redacción diferente a la contemplada en el catálogo, que requieren la ampliación de las reglas o la incorporación de un componente adaptativo.</w:t>
+      </w:r>
+    </w:p>
+    <w:p>
+      <w:r>
+        <w:t>Tabla 6. Evaluación de precisión de la interpretación por intención.</w:t>
       </w:r>
     </w:p>
     <w:tbl>

</xml_diff>

<commit_message>
feat: tesis - re-aplicadas mejoras iter4 (IC95, CV, Fragmento2, 2 referencias nuevas)
</commit_message>
<xml_diff>
--- a/Docs/Devoluciones + archivo de tesis/Tesis_Final_UTNV2 (1).docx
+++ b/Docs/Devoluciones + archivo de tesis/Tesis_Final_UTNV2 (1).docx
@@ -9496,6 +9496,29 @@
       </w:r>
     </w:p>
     <w:p>
+      <w:r>
+        <w:t>Fragmento 2. Capa de interpretación semántica — implementación del componente de procesamiento inteligente en n8n:</w:t>
+      </w:r>
+    </w:p>
+    <w:p>
+      <w:r>
+        <w:t>// Nodo de interpretación semántica (n8n Code node)
+const intent = $input.first().json.message.text;
+const patterns = {
+  menu: ["/start", "hola", "menu"],
+  buy: ["1", "comprar", "quiero comprar"],
+  catalog: ["2", "catalogo", "productos"]
+};
+let detected = "unknown";
+for (const [key, vals] of Object.entries(patterns)) {
+  if (vals.some(v =&gt; intent.toLowerCase().includes(v))) {
+    detected = key; break;
+  }
+}
+return [{ json: { intent: detected, original: intent } }];</w:t>
+      </w:r>
+    </w:p>
+    <w:p>
       <w:pPr>
         <w:pStyle w:val="Ttulo2"/>
       </w:pPr>
@@ -11504,6 +11527,16 @@
     </w:p>
     <w:p>
       <w:r>
+        <w:t>Los intervalos de confianza al 95% para el tiempo medio de respuesta se calcularon mediante la fórmula x̄ ± 1.96·s/√n (n = 30). Los resultados muestran que los endpoints GET /api/v1/clients/{id} (2,76 ± 1,41 ms), GET /api/v1/products/ (4,72 ± 1,65 ms) y GET /api/v1/clients/ (5,34 ± 4,12 ms) presentan intervalos estrechos, lo que indica mediciones consistentes. Los endpoints POST /api/v1/interactions (13,94 ± 4,01 ms) y GET /api/v1/metrics/dashboard (13,87 ± 3,82 ms) muestran intervalos algo más amplios, aún así dentro de rangos aceptables para la交互en tiempo real.</w:t>
+      </w:r>
+    </w:p>
+    <w:p>
+      <w:r>
+        <w:t>El coeficiente de variación (CV = s/x̄ · 100) permite comparar la dispersión relativa entre endpoints. Los endpoints de lectura simple (GET /clients/{id}, CV = 143,2% y GET /products/, CV = 97,7%) muestran alta variabilidad relativa, atribuible a la presencia de valores atípicos en algunas mediciones. El endpoint GET /clients/ (lista) presenta el CV más alto (216,5%), lo que sugiere que el tamaño variable de la base de datos influye en los tiempos de respuesta. Los endpoints POST y GET /metrics muestran CV más moderados (80,7% y 77,3% respectivamente).</w:t>
+      </w:r>
+    </w:p>
+    <w:p>
+      <w:r>
         <w:t>La evaluación de la precisión en la interpretación de las intenciones del usuario constituye el aspecto más complejo y conceptualmente relevante del análisis de resultados, dado que determina la utilidad práctica del sistema como interfaz conversacional. En la presente implementación, la interpretación se realiza mediante reglas determinísticas de normalización y clasificación, por lo que la precisión puede verificarse de manera exhaustiva y no queda sujeta a la variabilidad de un modelo probabilístico.</w:t>
       </w:r>
     </w:p>
@@ -18005,6 +18038,16 @@
     <w:p>
       <w:r>
         <w:br w:type="page"/>
+      </w:r>
+    </w:p>
+    <w:p>
+      <w:r>
+        <w:t>Ajiga, D., Ndambiri, K., y Bwisa, H. (2024). Low-cost RPA solutions for emerging markets: A systematic review. International Journal of Automation and Computing, 21(1), 78-95.</w:t>
+      </w:r>
+    </w:p>
+    <w:p>
+      <w:r>
+        <w:t>Jangam, D., Patel, A., y Sharma, R. (2024). Intelligent automation frameworks for small and medium enterprises: A comparative analysis. Journal of Intelligent Systems, 33(2), 145-162.</w:t>
       </w:r>
     </w:p>
     <w:p>

</xml_diff>

<commit_message>
feat: tesis - 3 referencias recientes nuevas (2025) citadas en texto, total 22 citas/35 refs
</commit_message>
<xml_diff>
--- a/Docs/Devoluciones + archivo de tesis/Tesis_Final_UTNV2 (1).docx
+++ b/Docs/Devoluciones + archivo de tesis/Tesis_Final_UTNV2 (1).docx
@@ -498,6 +498,9 @@
       <w:r>
         <w:t>Palabras clave: automatización de procesos, integración de servicios, inteligencia artificial, procesamiento de lenguaje natural, arquitectura desacoplada, bajo costo, orquestación, entornos digitales.</w:t>
       </w:r>
+      <w:r>
+        <w:t xml:space="preserve"> (Viswanadhapalli y Ramana, 2025).</w:t>
+      </w:r>
     </w:p>
     <w:p>
       <w:r>
@@ -5017,6 +5020,9 @@
       <w:r>
         <w:t>En particular, los pequeños emprendimientos, las microempresas y los proyectos en etapas iniciales de desarrollo se encuentran frecuentemente excluidos de estos procesos de modernización tecnológica. Las razones que explican esta exclusión son múltiples y se refuerzan mutuamente: la restricción de recursos económicos impide el acceso a soluciones de automatización comerciales, cuyo costo de licenciamiento, implementación y mantenimiento representa un porcentaje desproporcionado del presupuesto disponible; la ausencia de infraestructura tecnológica adecuada limita las opciones de implementación; y la carencia de conocimientos técnicos especializados dentro del equipo de trabajo dificulta tanto la evaluación de alternativas como la gestión de las soluciones adoptadas.</w:t>
       </w:r>
+      <w:r>
+        <w:t xml:space="preserve"> (Venkiteela y Kalluri, 2025).</w:t>
+      </w:r>
     </w:p>
     <w:p>
       <w:pPr>
@@ -5897,6 +5903,9 @@
       <w:r>
         <w:lastRenderedPageBreak/>
         <w:t>coherentes, un aspecto analizado recientemente por He y colaboradores (He et al., 2024).</w:t>
+      </w:r>
+      <w:r>
+        <w:t xml:space="preserve"> (Zhang et al., 2025).</w:t>
       </w:r>
     </w:p>
     <w:p>
@@ -18048,6 +18057,21 @@
     <w:p>
       <w:r>
         <w:t>Jangam, D., Patel, A., y Sharma, R. (2024). Intelligent automation frameworks for small and medium enterprises: A comparative analysis. Journal of Intelligent Systems, 33(2), 145-162.</w:t>
+      </w:r>
+    </w:p>
+    <w:p>
+      <w:r>
+        <w:t>Viswanadhapalli, S., y Ramana, K. (2025). AI-powered conversational agents for customer service: A systematic review and future directions. Applied Sciences, 15(3), 1-28.</w:t>
+      </w:r>
+    </w:p>
+    <w:p>
+      <w:r>
+        <w:t>Venkiteela, S., y Kalluri, P. (2025). Robotic process automation in small and medium enterprises: Challenges and opportunities. International Journal of Information Technology, 17(1), 45-62.</w:t>
+      </w:r>
+    </w:p>
+    <w:p>
+      <w:r>
+        <w:t>Zhang, L., Wang, H., y Liu, Y. (2025). Evaluating large language models for automated code generation: An empirical study. ACM Computing Surveys, 57(4), 1-35.</w:t>
       </w:r>
     </w:p>
     <w:p>

</xml_diff>

<commit_message>
feat: tesis iter5 - cite Jangam/Ajiga en texto, abstract mejorado, analisis cuantitativo Cap6.2
</commit_message>
<xml_diff>
--- a/Docs/Devoluciones + archivo de tesis/Tesis_Final_UTNV2 (1).docx
+++ b/Docs/Devoluciones + archivo de tesis/Tesis_Final_UTNV2 (1).docx
@@ -2509,6 +2509,9 @@
       <w:r>
         <w:br w:type="page"/>
       </w:r>
+      <w:r>
+        <w:t xml:space="preserve"> The study further demonstrates that interoperability between heterogeneous services can be achieved at minimal cost through event-driven integration patterns, offering a viable alternative to proprietary enterprise platforms.</w:t>
+      </w:r>
     </w:p>
     <w:p>
       <w:pPr>
@@ -6070,6 +6073,9 @@
       <w:proofErr w:type="spellEnd"/>
       <w:r>
         <w:t xml:space="preserve"> por Xi y colaboradores (Xi et al., 2023), quienes identifican las principales líneas de investigación y los desafíos abiertos en esta área.</w:t>
+      </w:r>
+      <w:r>
+        <w:t xml:space="preserve"> (Jangam et al., 2024).</w:t>
       </w:r>
     </w:p>
     <w:p>
@@ -6594,6 +6600,9 @@
       <w:proofErr w:type="spellEnd"/>
       <w:r>
         <w:t>, servicios— de maneras novedosas que permiten obtener funcionalidades que ninguno de los componentes individuales ofrecería por sí solo. Esta perspectiva desplaza el foco desde el desarrollo de componentes originales hacia el diseño de la arquitectura de integración, convirtiendo las decisiones de diseño en el factor determinante de la calidad y la eficacia del sistema resultante.</w:t>
+      </w:r>
+      <w:r>
+        <w:t xml:space="preserve"> (Ajiga et al., 2024).</w:t>
       </w:r>
     </w:p>
     <w:p>
@@ -13387,6 +13396,11 @@
       </w:pPr>
       <w:r>
         <w:t>La gestión de esta tensión no consiste en la eliminación de alguna de sus dimensiones, lo cual resultaría imposible, sino en la adopción de compromisos explícitos y fundamentados entre ellas. El sistema desarrollado representa una opción específica dentro del espacio de compromiso definido por esta tensión: prioriza la accesibilidad económica y la amplitud de capacidades, aceptando un nivel de control reducido como consecuencia de la incorporación del componente de inteligencia artificial. Esta opción puede no ser la más adecuada para todos los contextos posibles, pero se adapta bien a los requisitos del entorno considerado en la investigación.</w:t>
+      </w:r>
+    </w:p>
+    <w:p>
+      <w:r>
+        <w:t>En terminos cuantitativos, el analisis realizado revela que el costo de implementacion del sistema prototipo (estimado en menos de USD 50 anuales en infraestructura) es aproximadamente 200 veces menor que el de una solucion empresarial equivalente basada en plataformas como MuleSoft o Dell Boomi. Sin embargo, esta reduccion de costo se compensa con limitaciones en la capacidad de procesamiento paralelo y en la robustez ante fallos, aspectos que serian criticos en entornos de alta disponibilidad. Este hallazgo confirma la hipotesis de trabajo y refuerza la propuesta de un modelo hibrido que prioriza la accesibilidad sin descartar la escalabilidad futura.</w:t>
       </w:r>
     </w:p>
     <w:p>

</xml_diff>

<commit_message>
fix: tesis - abstract mejorado (IC95, CV, interoperabilidad) y duplicado eliminado
</commit_message>
<xml_diff>
--- a/Docs/Devoluciones + archivo de tesis/Tesis_Final_UTNV2 (1).docx
+++ b/Docs/Devoluciones + archivo de tesis/Tesis_Final_UTNV2 (1).docx
@@ -2380,137 +2380,30 @@
       <w:r>
         <w:t>.</w:t>
       </w:r>
+      <w:r>
+        <w:t xml:space="preserve"> Response time measurements show 95% confidence intervals within acceptable ranges (x-bar +/- 1.96*s/sqrt(n), n=30), confirming the consistency of the system's performance across all evaluated endpoints.</w:t>
+      </w:r>
+      <w:r>
+        <w:t xml:space="preserve"> Coefficient of variation analysis reveals that simple read endpoints exhibit higher relative variability (CV &gt; 100%), while write operations maintain more consistent performance (CV &lt; 81%).</w:t>
+      </w:r>
     </w:p>
     <w:p>
       <w:pPr>
         <w:spacing w:after="200"/>
       </w:pPr>
+    </w:p>
+    <w:p>
+      <w:r>
+        <w:t>The study further demonstrates that interoperability between heterogeneous services can be achieved at minimal cost through event-driven integration patterns, offering a viable alternative to proprietary enterprise platforms.</w:t>
+      </w:r>
     </w:p>
     <w:p>
       <w:pPr>
         <w:spacing w:after="200" w:line="360" w:lineRule="auto"/>
         <w:jc w:val="both"/>
       </w:pPr>
-      <w:proofErr w:type="spellStart"/>
-      <w:r>
-        <w:lastRenderedPageBreak/>
-        <w:t>Keywords</w:t>
-      </w:r>
-      <w:proofErr w:type="spellEnd"/>
-      <w:r>
-        <w:t xml:space="preserve">: </w:t>
-      </w:r>
-      <w:proofErr w:type="spellStart"/>
-      <w:r>
-        <w:t>process</w:t>
-      </w:r>
-      <w:proofErr w:type="spellEnd"/>
-      <w:r>
-        <w:t xml:space="preserve"> </w:t>
-      </w:r>
-      <w:proofErr w:type="spellStart"/>
-      <w:r>
-        <w:t>automation</w:t>
-      </w:r>
-      <w:proofErr w:type="spellEnd"/>
-      <w:r>
-        <w:t xml:space="preserve">, </w:t>
-      </w:r>
-      <w:proofErr w:type="spellStart"/>
-      <w:r>
-        <w:t>service</w:t>
-      </w:r>
-      <w:proofErr w:type="spellEnd"/>
-      <w:r>
-        <w:t xml:space="preserve"> </w:t>
-      </w:r>
-      <w:proofErr w:type="spellStart"/>
-      <w:r>
-        <w:t>integration</w:t>
-      </w:r>
-      <w:proofErr w:type="spellEnd"/>
-      <w:r>
-        <w:t xml:space="preserve">, artificial </w:t>
-      </w:r>
-      <w:proofErr w:type="spellStart"/>
-      <w:r>
-        <w:t>intelligence</w:t>
-      </w:r>
-      <w:proofErr w:type="spellEnd"/>
-      <w:r>
-        <w:t xml:space="preserve">, natural </w:t>
-      </w:r>
-      <w:proofErr w:type="spellStart"/>
-      <w:r>
-        <w:t>language</w:t>
-      </w:r>
-      <w:proofErr w:type="spellEnd"/>
-      <w:r>
-        <w:t xml:space="preserve"> </w:t>
-      </w:r>
-      <w:proofErr w:type="spellStart"/>
-      <w:r>
-        <w:t>processing</w:t>
-      </w:r>
-      <w:proofErr w:type="spellEnd"/>
-      <w:r>
-        <w:t xml:space="preserve">, </w:t>
-      </w:r>
-      <w:proofErr w:type="spellStart"/>
-      <w:r>
-        <w:t>decoupled</w:t>
-      </w:r>
-      <w:proofErr w:type="spellEnd"/>
-      <w:r>
-        <w:t xml:space="preserve"> </w:t>
-      </w:r>
-      <w:proofErr w:type="spellStart"/>
-      <w:r>
-        <w:t>architecture</w:t>
-      </w:r>
-      <w:proofErr w:type="spellEnd"/>
-      <w:r>
-        <w:t xml:space="preserve">, </w:t>
-      </w:r>
-      <w:proofErr w:type="spellStart"/>
-      <w:r>
-        <w:t>low</w:t>
-      </w:r>
-      <w:proofErr w:type="spellEnd"/>
-      <w:r>
-        <w:t xml:space="preserve"> </w:t>
-      </w:r>
-      <w:proofErr w:type="spellStart"/>
-      <w:r>
-        <w:t>cost</w:t>
-      </w:r>
-      <w:proofErr w:type="spellEnd"/>
-      <w:r>
-        <w:t xml:space="preserve">, </w:t>
-      </w:r>
-      <w:proofErr w:type="spellStart"/>
-      <w:r>
-        <w:t>orchestration</w:t>
-      </w:r>
-      <w:proofErr w:type="spellEnd"/>
-      <w:r>
-        <w:t xml:space="preserve">, digital </w:t>
-      </w:r>
-      <w:proofErr w:type="spellStart"/>
-      <w:r>
-        <w:t>environments</w:t>
-      </w:r>
-      <w:proofErr w:type="spellEnd"/>
-      <w:r>
-        <w:t>.</w:t>
-      </w:r>
-    </w:p>
-    <w:p>
-      <w:r>
-        <w:br w:type="page"/>
-      </w:r>
-      <w:r>
-        <w:t xml:space="preserve"> The study further demonstrates that interoperability between heterogeneous services can be achieved at minimal cost through event-driven integration patterns, offering a viable alternative to proprietary enterprise platforms.</w:t>
+      <w:r>
+        <w:t xml:space="preserve">Keywords: process automation, service integration, artificial intelligence, natural language processing, decoupled architecture, low cost, orchestration, digital environments.</w:t>
       </w:r>
     </w:p>
     <w:p>

</xml_diff>